<commit_message>
docs: Manual de RRHH v2.1 — fórmulas y criterios de cálculo del finiquito con ejemplo numérico (cap. 25.1); documentación v3.1 (v254.9)
Co-Authored-By: Claude Fable 5.1 <noreply@anthropic.com>
</commit_message>
<xml_diff>
--- a/api-gateway/public/mantenedores/documentacion/descargas/Manual-RRHH-Business-Suite.docx
+++ b/api-gateway/public/mantenedores/documentacion/descargas/Manual-RRHH-Business-Suite.docx
@@ -236,7 +236,7 @@
           <w:i w:val="0"/>
           <w:sz w:val="22"/>
         </w:rPr>
-        <w:t>Versión 2.0 · 17 de septiembre de 2026 · Suite v254.8</w:t>
+        <w:t>Versión 2.1 · 17 de septiembre de 2026 · Suite v254.9</w:t>
       </w:r>
     </w:p>
     <w:p>
@@ -462,6 +462,64 @@
                 <w:sz w:val="18"/>
               </w:rPr>
               <w:t>Fusión con el Manual Operativo: calendario de obligaciones de RRHH, motores y correos automáticos, 21 procedimientos con validaciones, pagos y flujos; Anticipos y TEF, Nómina Edenred y Seguro de Salud (septiembre 2026).</w:t>
+            </w:r>
+          </w:p>
+        </w:tc>
+      </w:tr>
+      <w:tr>
+        <w:tc>
+          <w:tcPr>
+            <w:tcW w:type="dxa" w:w="907"/>
+          </w:tcPr>
+          <w:p>
+            <w:r/>
+            <w:r>
+              <w:rPr>
+                <w:sz w:val="18"/>
+              </w:rPr>
+              <w:t>2.1</w:t>
+            </w:r>
+          </w:p>
+        </w:tc>
+        <w:tc>
+          <w:tcPr>
+            <w:tcW w:type="dxa" w:w="1247"/>
+          </w:tcPr>
+          <w:p>
+            <w:r/>
+            <w:r>
+              <w:rPr>
+                <w:sz w:val="18"/>
+              </w:rPr>
+              <w:t>17-09-2026</w:t>
+            </w:r>
+          </w:p>
+        </w:tc>
+        <w:tc>
+          <w:tcPr>
+            <w:tcW w:type="dxa" w:w="2041"/>
+          </w:tcPr>
+          <w:p>
+            <w:r/>
+            <w:r>
+              <w:rPr>
+                <w:sz w:val="18"/>
+              </w:rPr>
+              <w:t>Patricio Escobar / Claude</w:t>
+            </w:r>
+          </w:p>
+        </w:tc>
+        <w:tc>
+          <w:tcPr>
+            <w:tcW w:type="dxa" w:w="5159"/>
+          </w:tcPr>
+          <w:p>
+            <w:r/>
+            <w:r>
+              <w:rPr>
+                <w:sz w:val="18"/>
+              </w:rPr>
+              <w:t>Cap. 25.1: fórmulas y criterios de cálculo del finiquito con ejemplo numérico.</w:t>
             </w:r>
           </w:p>
         </w:tc>
@@ -12370,6 +12428,1156 @@
       <w:r>
         <w:t>el Archivo Previred del último mes informa el retiro (movimiento 2) con la fecha de término. Obligatorio: si no, la AFP presume deuda previsional (DNP).</w:t>
       </w:r>
+    </w:p>
+    <w:p>
+      <w:pPr>
+        <w:pStyle w:val="Heading3"/>
+      </w:pPr>
+      <w:r>
+        <w:t>25.1 Fórmulas y criterios de cálculo del finiquito</w:t>
+      </w:r>
+    </w:p>
+    <w:p>
+      <w:pPr>
+        <w:spacing w:after="80"/>
+      </w:pPr>
+      <w:r>
+        <w:rPr>
+          <w:b w:val="0"/>
+          <w:i w:val="0"/>
+        </w:rPr>
+        <w:t>Todo sale del mismo motor (base-remuneracion.js + cuenta corriente de vacaciones + rrhh-core). Los topes (11 años, 90 UF) son paramétricos en rh_config. El anexo impreso "detalle del cálculo" muestra estos mismos pasos.</w:t>
+      </w:r>
+    </w:p>
+    <w:tbl>
+      <w:tblPr>
+        <w:tblStyle w:val="TableGrid"/>
+        <w:tblW w:type="auto" w:w="0"/>
+        <w:jc w:val="center"/>
+        <w:tblLook w:firstColumn="1" w:firstRow="1" w:lastColumn="0" w:lastRow="0" w:noHBand="0" w:noVBand="1" w:val="04A0"/>
+      </w:tblPr>
+      <w:tblGrid>
+        <w:gridCol w:w="3249"/>
+        <w:gridCol w:w="3249"/>
+        <w:gridCol w:w="3249"/>
+      </w:tblGrid>
+      <w:tr>
+        <w:tc>
+          <w:tcPr>
+            <w:tcW w:type="dxa" w:w="1928"/>
+            <w:shd w:val="clear" w:color="auto" w:fill="1F4E79"/>
+          </w:tcPr>
+          <w:p>
+            <w:r/>
+            <w:r>
+              <w:rPr>
+                <w:b/>
+                <w:color w:val="FFFFFF"/>
+                <w:sz w:val="18"/>
+              </w:rPr>
+              <w:t>Concepto</w:t>
+            </w:r>
+          </w:p>
+        </w:tc>
+        <w:tc>
+          <w:tcPr>
+            <w:tcW w:type="dxa" w:w="5443"/>
+            <w:shd w:val="clear" w:color="auto" w:fill="1F4E79"/>
+          </w:tcPr>
+          <w:p>
+            <w:r/>
+            <w:r>
+              <w:rPr>
+                <w:b/>
+                <w:color w:val="FFFFFF"/>
+                <w:sz w:val="18"/>
+              </w:rPr>
+              <w:t>Regla / fórmula</w:t>
+            </w:r>
+          </w:p>
+        </w:tc>
+        <w:tc>
+          <w:tcPr>
+            <w:tcW w:type="dxa" w:w="1984"/>
+            <w:shd w:val="clear" w:color="auto" w:fill="1F4E79"/>
+          </w:tcPr>
+          <w:p>
+            <w:r/>
+            <w:r>
+              <w:rPr>
+                <w:b/>
+                <w:color w:val="FFFFFF"/>
+                <w:sz w:val="18"/>
+              </w:rPr>
+              <w:t>Fuente</w:t>
+            </w:r>
+          </w:p>
+        </w:tc>
+      </w:tr>
+      <w:tr>
+        <w:tc>
+          <w:tcPr>
+            <w:tcW w:type="dxa" w:w="1928"/>
+          </w:tcPr>
+          <w:p>
+            <w:r/>
+            <w:r>
+              <w:rPr>
+                <w:sz w:val="18"/>
+              </w:rPr>
+              <w:t>Años de servicio</w:t>
+            </w:r>
+          </w:p>
+        </w:tc>
+        <w:tc>
+          <w:tcPr>
+            <w:tcW w:type="dxa" w:w="5443"/>
+          </w:tcPr>
+          <w:p>
+            <w:r/>
+            <w:r>
+              <w:rPr>
+                <w:sz w:val="18"/>
+              </w:rPr>
+              <w:t>meses entre ingreso y término (motor mesesAntiguedad) → años = parte entera + 1 si la fracción es ≥ 6 meses; tope 11 años (art. 163).</w:t>
+            </w:r>
+          </w:p>
+        </w:tc>
+        <w:tc>
+          <w:tcPr>
+            <w:tcW w:type="dxa" w:w="1984"/>
+          </w:tcPr>
+          <w:p>
+            <w:r/>
+            <w:r>
+              <w:rPr>
+                <w:sz w:val="18"/>
+              </w:rPr>
+              <w:t>usuarios.fecha_ingreso</w:t>
+            </w:r>
+          </w:p>
+        </w:tc>
+      </w:tr>
+      <w:tr>
+        <w:tc>
+          <w:tcPr>
+            <w:tcW w:type="dxa" w:w="1928"/>
+          </w:tcPr>
+          <w:p>
+            <w:r/>
+            <w:r>
+              <w:rPr>
+                <w:sz w:val="18"/>
+              </w:rPr>
+              <w:t>Base (art. 172)</w:t>
+            </w:r>
+          </w:p>
+        </w:tc>
+        <w:tc>
+          <w:tcPr>
+            <w:tcW w:type="dxa" w:w="5443"/>
+          </w:tcPr>
+          <w:p>
+            <w:r/>
+            <w:r>
+              <w:rPr>
+                <w:sz w:val="18"/>
+              </w:rPr>
+              <w:t>promedio del imponible de las 3 últimas liquidaciones EMITIDAS anteriores al mes del término (meses completos: no cuenta el mes de ingreso si no empezó el día 1, ni el mes del término, ni meses con licencia). Incluye comisiones, semana corrida, bonos y la gratificación mensual tal como se pagaron. Cascada: liquidaciones del motor → Libro AVSOFT (Contabilidad › Auxiliares) → sueldo base × 1,25 (estimada, con aviso).</w:t>
+            </w:r>
+          </w:p>
+        </w:tc>
+        <w:tc>
+          <w:tcPr>
+            <w:tcW w:type="dxa" w:w="1984"/>
+          </w:tcPr>
+          <w:p>
+            <w:r/>
+            <w:r>
+              <w:rPr>
+                <w:sz w:val="18"/>
+              </w:rPr>
+              <w:t>rh_liquidaciones / ctb_remun_aux / rh_fichas</w:t>
+            </w:r>
+          </w:p>
+        </w:tc>
+      </w:tr>
+      <w:tr>
+        <w:tc>
+          <w:tcPr>
+            <w:tcW w:type="dxa" w:w="1928"/>
+          </w:tcPr>
+          <w:p>
+            <w:r/>
+            <w:r>
+              <w:rPr>
+                <w:sz w:val="18"/>
+              </w:rPr>
+              <w:t>Tope de la base</w:t>
+            </w:r>
+          </w:p>
+        </w:tc>
+        <w:tc>
+          <w:tcPr>
+            <w:tcW w:type="dxa" w:w="5443"/>
+          </w:tcPr>
+          <w:p>
+            <w:r/>
+            <w:r>
+              <w:rPr>
+                <w:sz w:val="18"/>
+              </w:rPr>
+              <w:t>base topada = mín(base, 90 UF × UF del día del término).</w:t>
+            </w:r>
+          </w:p>
+        </w:tc>
+        <w:tc>
+          <w:tcPr>
+            <w:tcW w:type="dxa" w:w="1984"/>
+          </w:tcPr>
+          <w:p>
+            <w:r/>
+            <w:r>
+              <w:rPr>
+                <w:sz w:val="18"/>
+              </w:rPr>
+              <w:t>mantenedor UF</w:t>
+            </w:r>
+          </w:p>
+        </w:tc>
+      </w:tr>
+      <w:tr>
+        <w:tc>
+          <w:tcPr>
+            <w:tcW w:type="dxa" w:w="1928"/>
+          </w:tcPr>
+          <w:p>
+            <w:r/>
+            <w:r>
+              <w:rPr>
+                <w:sz w:val="18"/>
+              </w:rPr>
+              <w:t>Indemnización por años</w:t>
+            </w:r>
+          </w:p>
+        </w:tc>
+        <w:tc>
+          <w:tcPr>
+            <w:tcW w:type="dxa" w:w="5443"/>
+          </w:tcPr>
+          <w:p>
+            <w:r/>
+            <w:r>
+              <w:rPr>
+                <w:sz w:val="18"/>
+              </w:rPr>
+              <w:t>años × base topada, solo si la causal lo indica (art. 161; no en 159 ni 160).</w:t>
+            </w:r>
+          </w:p>
+        </w:tc>
+        <w:tc>
+          <w:tcPr>
+            <w:tcW w:type="dxa" w:w="1984"/>
+          </w:tcPr>
+          <w:p>
+            <w:r/>
+            <w:r>
+              <w:rPr>
+                <w:sz w:val="18"/>
+              </w:rPr>
+              <w:t>rh_finiquito_causales</w:t>
+            </w:r>
+          </w:p>
+        </w:tc>
+      </w:tr>
+      <w:tr>
+        <w:tc>
+          <w:tcPr>
+            <w:tcW w:type="dxa" w:w="1928"/>
+          </w:tcPr>
+          <w:p>
+            <w:r/>
+            <w:r>
+              <w:rPr>
+                <w:sz w:val="18"/>
+              </w:rPr>
+              <w:t>Sustitutiva del aviso</w:t>
+            </w:r>
+          </w:p>
+        </w:tc>
+        <w:tc>
+          <w:tcPr>
+            <w:tcW w:type="dxa" w:w="5443"/>
+          </w:tcPr>
+          <w:p>
+            <w:r/>
+            <w:r>
+              <w:rPr>
+                <w:sz w:val="18"/>
+              </w:rPr>
+              <w:t>base topada × 1, si la causal lleva aviso y NO se avisó con 30 días (casilla "avisado").</w:t>
+            </w:r>
+          </w:p>
+        </w:tc>
+        <w:tc>
+          <w:tcPr>
+            <w:tcW w:type="dxa" w:w="1984"/>
+          </w:tcPr>
+          <w:p>
+            <w:r/>
+            <w:r>
+              <w:rPr>
+                <w:sz w:val="18"/>
+              </w:rPr>
+              <w:t>causal + casilla</w:t>
+            </w:r>
+          </w:p>
+        </w:tc>
+      </w:tr>
+      <w:tr>
+        <w:tc>
+          <w:tcPr>
+            <w:tcW w:type="dxa" w:w="1928"/>
+          </w:tcPr>
+          <w:p>
+            <w:r/>
+            <w:r>
+              <w:rPr>
+                <w:sz w:val="18"/>
+              </w:rPr>
+              <w:t>Base del feriado</w:t>
+            </w:r>
+          </w:p>
+        </w:tc>
+        <w:tc>
+          <w:tcPr>
+            <w:tcW w:type="dxa" w:w="5443"/>
+          </w:tcPr>
+          <w:p>
+            <w:r/>
+            <w:r>
+              <w:rPr>
+                <w:sz w:val="18"/>
+              </w:rPr>
+              <w:t>mismo promedio pero SIN la gratificación mensual (dictamen DT 836/046); colación y movilización nunca entran.</w:t>
+            </w:r>
+          </w:p>
+        </w:tc>
+        <w:tc>
+          <w:tcPr>
+            <w:tcW w:type="dxa" w:w="1984"/>
+          </w:tcPr>
+          <w:p>
+            <w:r/>
+            <w:r>
+              <w:rPr>
+                <w:sz w:val="18"/>
+              </w:rPr>
+              <w:t>motor</w:t>
+            </w:r>
+          </w:p>
+        </w:tc>
+      </w:tr>
+      <w:tr>
+        <w:tc>
+          <w:tcPr>
+            <w:tcW w:type="dxa" w:w="1928"/>
+          </w:tcPr>
+          <w:p>
+            <w:r/>
+            <w:r>
+              <w:rPr>
+                <w:sz w:val="18"/>
+              </w:rPr>
+              <w:t>Feriado proporcional</w:t>
+            </w:r>
+          </w:p>
+        </w:tc>
+        <w:tc>
+          <w:tcPr>
+            <w:tcW w:type="dxa" w:w="5443"/>
+          </w:tcPr>
+          <w:p>
+            <w:r/>
+            <w:r>
+              <w:rPr>
+                <w:sz w:val="18"/>
+              </w:rPr>
+              <w:t>días hábiles disponibles de la cuenta corriente al término (devengados + proporcional por días, art. 73) → se proyectan en el calendario desde el día siguiente al término: se pagan también los sábados, domingos y festivos comprendidos → días corridos × base del feriado ÷ 30.</w:t>
+            </w:r>
+          </w:p>
+        </w:tc>
+        <w:tc>
+          <w:tcPr>
+            <w:tcW w:type="dxa" w:w="1984"/>
+          </w:tcPr>
+          <w:p>
+            <w:r/>
+            <w:r>
+              <w:rPr>
+                <w:sz w:val="18"/>
+              </w:rPr>
+              <w:t>vac-cuenta.saldoCuenta + feriados</w:t>
+            </w:r>
+          </w:p>
+        </w:tc>
+      </w:tr>
+      <w:tr>
+        <w:tc>
+          <w:tcPr>
+            <w:tcW w:type="dxa" w:w="1928"/>
+          </w:tcPr>
+          <w:p>
+            <w:r/>
+            <w:r>
+              <w:rPr>
+                <w:sz w:val="18"/>
+              </w:rPr>
+              <w:t>Anticipos y préstamos</w:t>
+            </w:r>
+          </w:p>
+        </w:tc>
+        <w:tc>
+          <w:tcPr>
+            <w:tcW w:type="dxa" w:w="5443"/>
+          </w:tcPr>
+          <w:p>
+            <w:r/>
+            <w:r>
+              <w:rPr>
+                <w:sz w:val="18"/>
+              </w:rPr>
+              <w:t>cuotas cobradas = meses desde mes_inicio hasta el mes del término (tope: total de cuotas); saldo = cuotas pendientes × valor cuota. Se precarga como descuento.</w:t>
+            </w:r>
+          </w:p>
+        </w:tc>
+        <w:tc>
+          <w:tcPr>
+            <w:tcW w:type="dxa" w:w="1984"/>
+          </w:tcPr>
+          <w:p>
+            <w:r/>
+            <w:r>
+              <w:rPr>
+                <w:sz w:val="18"/>
+              </w:rPr>
+              <w:t>rh_descuentos VIGENTE</w:t>
+            </w:r>
+          </w:p>
+        </w:tc>
+      </w:tr>
+      <w:tr>
+        <w:tc>
+          <w:tcPr>
+            <w:tcW w:type="dxa" w:w="1928"/>
+          </w:tcPr>
+          <w:p>
+            <w:r/>
+            <w:r>
+              <w:rPr>
+                <w:sz w:val="18"/>
+              </w:rPr>
+              <w:t>Otros haberes / descuentos</w:t>
+            </w:r>
+          </w:p>
+        </w:tc>
+        <w:tc>
+          <w:tcPr>
+            <w:tcW w:type="dxa" w:w="5443"/>
+          </w:tcPr>
+          <w:p>
+            <w:r/>
+            <w:r>
+              <w:rPr>
+                <w:sz w:val="18"/>
+              </w:rPr>
+              <w:t>editables antes de guardar (bono pactado, comisión devengada no pagada con reserva, etc.).</w:t>
+            </w:r>
+          </w:p>
+        </w:tc>
+        <w:tc>
+          <w:tcPr>
+            <w:tcW w:type="dxa" w:w="1984"/>
+          </w:tcPr>
+          <w:p>
+            <w:r/>
+            <w:r>
+              <w:rPr>
+                <w:sz w:val="18"/>
+              </w:rPr>
+              <w:t>RRHH</w:t>
+            </w:r>
+          </w:p>
+        </w:tc>
+      </w:tr>
+      <w:tr>
+        <w:tc>
+          <w:tcPr>
+            <w:tcW w:type="dxa" w:w="1928"/>
+          </w:tcPr>
+          <w:p>
+            <w:r/>
+            <w:r>
+              <w:rPr>
+                <w:sz w:val="18"/>
+              </w:rPr>
+              <w:t>Total finiquito</w:t>
+            </w:r>
+          </w:p>
+        </w:tc>
+        <w:tc>
+          <w:tcPr>
+            <w:tcW w:type="dxa" w:w="5443"/>
+          </w:tcPr>
+          <w:p>
+            <w:r/>
+            <w:r>
+              <w:rPr>
+                <w:sz w:val="18"/>
+              </w:rPr>
+              <w:t>indemnización por años + sustitutiva del aviso + feriado proporcional + otros haberes − saldo de préstamos − otros descuentos.</w:t>
+            </w:r>
+          </w:p>
+        </w:tc>
+        <w:tc>
+          <w:tcPr>
+            <w:tcW w:type="dxa" w:w="1984"/>
+          </w:tcPr>
+          <w:p>
+            <w:r/>
+            <w:r>
+              <w:rPr>
+                <w:sz w:val="18"/>
+              </w:rPr>
+            </w:r>
+          </w:p>
+        </w:tc>
+      </w:tr>
+      <w:tr>
+        <w:tc>
+          <w:tcPr>
+            <w:tcW w:type="dxa" w:w="1928"/>
+          </w:tcPr>
+          <w:p>
+            <w:r/>
+            <w:r>
+              <w:rPr>
+                <w:sz w:val="18"/>
+              </w:rPr>
+              <w:t>Sueldo del último mes</w:t>
+            </w:r>
+          </w:p>
+        </w:tc>
+        <w:tc>
+          <w:tcPr>
+            <w:tcW w:type="dxa" w:w="5443"/>
+          </w:tcPr>
+          <w:p>
+            <w:r/>
+            <w:r>
+              <w:rPr>
+                <w:sz w:val="18"/>
+              </w:rPr>
+              <w:t>NO va en el finiquito: se paga en la liquidación del mes, proporcional en 30avos hasta la fecha de baja (sueldo, colación y movilización; Asignación Celular completa).</w:t>
+            </w:r>
+          </w:p>
+        </w:tc>
+        <w:tc>
+          <w:tcPr>
+            <w:tcW w:type="dxa" w:w="1984"/>
+          </w:tcPr>
+          <w:p>
+            <w:r/>
+            <w:r>
+              <w:rPr>
+                <w:sz w:val="18"/>
+              </w:rPr>
+              <w:t>libro de liquidaciones</w:t>
+            </w:r>
+          </w:p>
+        </w:tc>
+      </w:tr>
+    </w:tbl>
+    <w:p>
+      <w:pPr>
+        <w:spacing w:after="40"/>
+      </w:pPr>
+    </w:p>
+    <w:p>
+      <w:pPr>
+        <w:spacing w:after="40"/>
+      </w:pPr>
+      <w:r>
+        <w:rPr>
+          <w:b/>
+          <w:i w:val="0"/>
+          <w:color w:val="1F4E79"/>
+        </w:rPr>
+        <w:t>Ejemplo numérico</w:t>
+      </w:r>
+    </w:p>
+    <w:p>
+      <w:pPr>
+        <w:spacing w:after="80"/>
+      </w:pPr>
+      <w:r>
+        <w:rPr>
+          <w:b w:val="0"/>
+          <w:i w:val="0"/>
+        </w:rPr>
+        <w:t>Colaboradora ingresada el 01-03-2021, desvinculada el 30-09-2026 por necesidades de la empresa (art. 161) sin aviso previo. Liquidaciones emitidas de junio, julio y agosto 2026 con imponibles de $1.450.000, $1.520.000 y $1.390.000 (gratificación mensual $200.000 en cada una). UF del 30-09-2026: $39.500. Saldo de vacaciones: 7 días hábiles. Préstamo de 6 cuotas de $50.000 iniciado en junio 2026.</w:t>
+      </w:r>
+    </w:p>
+    <w:tbl>
+      <w:tblPr>
+        <w:tblStyle w:val="TableGrid"/>
+        <w:tblW w:type="auto" w:w="0"/>
+        <w:jc w:val="center"/>
+        <w:tblLook w:firstColumn="1" w:firstRow="1" w:lastColumn="0" w:lastRow="0" w:noHBand="0" w:noVBand="1" w:val="04A0"/>
+      </w:tblPr>
+      <w:tblGrid>
+        <w:gridCol w:w="3249"/>
+        <w:gridCol w:w="3249"/>
+        <w:gridCol w:w="3249"/>
+      </w:tblGrid>
+      <w:tr>
+        <w:tc>
+          <w:tcPr>
+            <w:tcW w:type="dxa" w:w="2041"/>
+            <w:shd w:val="clear" w:color="auto" w:fill="1F4E79"/>
+          </w:tcPr>
+          <w:p>
+            <w:r/>
+            <w:r>
+              <w:rPr>
+                <w:b/>
+                <w:color w:val="FFFFFF"/>
+                <w:sz w:val="18"/>
+              </w:rPr>
+              <w:t>Paso</w:t>
+            </w:r>
+          </w:p>
+        </w:tc>
+        <w:tc>
+          <w:tcPr>
+            <w:tcW w:type="dxa" w:w="5329"/>
+            <w:shd w:val="clear" w:color="auto" w:fill="1F4E79"/>
+          </w:tcPr>
+          <w:p>
+            <w:r/>
+            <w:r>
+              <w:rPr>
+                <w:b/>
+                <w:color w:val="FFFFFF"/>
+                <w:sz w:val="18"/>
+              </w:rPr>
+              <w:t>Cálculo</w:t>
+            </w:r>
+          </w:p>
+        </w:tc>
+        <w:tc>
+          <w:tcPr>
+            <w:tcW w:type="dxa" w:w="1984"/>
+            <w:shd w:val="clear" w:color="auto" w:fill="1F4E79"/>
+          </w:tcPr>
+          <w:p>
+            <w:r/>
+            <w:r>
+              <w:rPr>
+                <w:b/>
+                <w:color w:val="FFFFFF"/>
+                <w:sz w:val="18"/>
+              </w:rPr>
+              <w:t>Resultado</w:t>
+            </w:r>
+          </w:p>
+        </w:tc>
+      </w:tr>
+      <w:tr>
+        <w:tc>
+          <w:tcPr>
+            <w:tcW w:type="dxa" w:w="2041"/>
+          </w:tcPr>
+          <w:p>
+            <w:r/>
+            <w:r>
+              <w:rPr>
+                <w:sz w:val="18"/>
+              </w:rPr>
+              <w:t>Años de servicio</w:t>
+            </w:r>
+          </w:p>
+        </w:tc>
+        <w:tc>
+          <w:tcPr>
+            <w:tcW w:type="dxa" w:w="5329"/>
+          </w:tcPr>
+          <w:p>
+            <w:r/>
+            <w:r>
+              <w:rPr>
+                <w:sz w:val="18"/>
+              </w:rPr>
+              <w:t>01-03-2021 → 30-09-2026 = 66 meses = 5 años y 6 meses → fracción ≥ 6 meses cuenta como año</w:t>
+            </w:r>
+          </w:p>
+        </w:tc>
+        <w:tc>
+          <w:tcPr>
+            <w:tcW w:type="dxa" w:w="1984"/>
+          </w:tcPr>
+          <w:p>
+            <w:r/>
+            <w:r>
+              <w:rPr>
+                <w:sz w:val="18"/>
+              </w:rPr>
+              <w:t>6 años</w:t>
+            </w:r>
+          </w:p>
+        </w:tc>
+      </w:tr>
+      <w:tr>
+        <w:tc>
+          <w:tcPr>
+            <w:tcW w:type="dxa" w:w="2041"/>
+          </w:tcPr>
+          <w:p>
+            <w:r/>
+            <w:r>
+              <w:rPr>
+                <w:sz w:val="18"/>
+              </w:rPr>
+              <w:t>Base art. 172</w:t>
+            </w:r>
+          </w:p>
+        </w:tc>
+        <w:tc>
+          <w:tcPr>
+            <w:tcW w:type="dxa" w:w="5329"/>
+          </w:tcPr>
+          <w:p>
+            <w:r/>
+            <w:r>
+              <w:rPr>
+                <w:sz w:val="18"/>
+              </w:rPr>
+              <w:t>(1.450.000 + 1.520.000 + 1.390.000) ÷ 3</w:t>
+            </w:r>
+          </w:p>
+        </w:tc>
+        <w:tc>
+          <w:tcPr>
+            <w:tcW w:type="dxa" w:w="1984"/>
+          </w:tcPr>
+          <w:p>
+            <w:r/>
+            <w:r>
+              <w:rPr>
+                <w:sz w:val="18"/>
+              </w:rPr>
+              <w:t>$1.453.333</w:t>
+            </w:r>
+          </w:p>
+        </w:tc>
+      </w:tr>
+      <w:tr>
+        <w:tc>
+          <w:tcPr>
+            <w:tcW w:type="dxa" w:w="2041"/>
+          </w:tcPr>
+          <w:p>
+            <w:r/>
+            <w:r>
+              <w:rPr>
+                <w:sz w:val="18"/>
+              </w:rPr>
+              <w:t>Tope 90 UF</w:t>
+            </w:r>
+          </w:p>
+        </w:tc>
+        <w:tc>
+          <w:tcPr>
+            <w:tcW w:type="dxa" w:w="5329"/>
+          </w:tcPr>
+          <w:p>
+            <w:r/>
+            <w:r>
+              <w:rPr>
+                <w:sz w:val="18"/>
+              </w:rPr>
+              <w:t>90 × 39.500 = 3.555.000 &gt; base → no aplica</w:t>
+            </w:r>
+          </w:p>
+        </w:tc>
+        <w:tc>
+          <w:tcPr>
+            <w:tcW w:type="dxa" w:w="1984"/>
+          </w:tcPr>
+          <w:p>
+            <w:r/>
+            <w:r>
+              <w:rPr>
+                <w:sz w:val="18"/>
+              </w:rPr>
+              <w:t>base topada $1.453.333</w:t>
+            </w:r>
+          </w:p>
+        </w:tc>
+      </w:tr>
+      <w:tr>
+        <w:tc>
+          <w:tcPr>
+            <w:tcW w:type="dxa" w:w="2041"/>
+          </w:tcPr>
+          <w:p>
+            <w:r/>
+            <w:r>
+              <w:rPr>
+                <w:sz w:val="18"/>
+              </w:rPr>
+              <w:t>Indemnización por años</w:t>
+            </w:r>
+          </w:p>
+        </w:tc>
+        <w:tc>
+          <w:tcPr>
+            <w:tcW w:type="dxa" w:w="5329"/>
+          </w:tcPr>
+          <w:p>
+            <w:r/>
+            <w:r>
+              <w:rPr>
+                <w:sz w:val="18"/>
+              </w:rPr>
+              <w:t>6 × 1.453.333</w:t>
+            </w:r>
+          </w:p>
+        </w:tc>
+        <w:tc>
+          <w:tcPr>
+            <w:tcW w:type="dxa" w:w="1984"/>
+          </w:tcPr>
+          <w:p>
+            <w:r/>
+            <w:r>
+              <w:rPr>
+                <w:sz w:val="18"/>
+              </w:rPr>
+              <w:t>$8.719.998</w:t>
+            </w:r>
+          </w:p>
+        </w:tc>
+      </w:tr>
+      <w:tr>
+        <w:tc>
+          <w:tcPr>
+            <w:tcW w:type="dxa" w:w="2041"/>
+          </w:tcPr>
+          <w:p>
+            <w:r/>
+            <w:r>
+              <w:rPr>
+                <w:sz w:val="18"/>
+              </w:rPr>
+              <w:t>Sustitutiva del aviso</w:t>
+            </w:r>
+          </w:p>
+        </w:tc>
+        <w:tc>
+          <w:tcPr>
+            <w:tcW w:type="dxa" w:w="5329"/>
+          </w:tcPr>
+          <w:p>
+            <w:r/>
+            <w:r>
+              <w:rPr>
+                <w:sz w:val="18"/>
+              </w:rPr>
+              <w:t>art. 161 sin aviso → 1 × base topada</w:t>
+            </w:r>
+          </w:p>
+        </w:tc>
+        <w:tc>
+          <w:tcPr>
+            <w:tcW w:type="dxa" w:w="1984"/>
+          </w:tcPr>
+          <w:p>
+            <w:r/>
+            <w:r>
+              <w:rPr>
+                <w:sz w:val="18"/>
+              </w:rPr>
+              <w:t>$1.453.333</w:t>
+            </w:r>
+          </w:p>
+        </w:tc>
+      </w:tr>
+      <w:tr>
+        <w:tc>
+          <w:tcPr>
+            <w:tcW w:type="dxa" w:w="2041"/>
+          </w:tcPr>
+          <w:p>
+            <w:r/>
+            <w:r>
+              <w:rPr>
+                <w:sz w:val="18"/>
+              </w:rPr>
+              <w:t>Base del feriado</w:t>
+            </w:r>
+          </w:p>
+        </w:tc>
+        <w:tc>
+          <w:tcPr>
+            <w:tcW w:type="dxa" w:w="5329"/>
+          </w:tcPr>
+          <w:p>
+            <w:r/>
+            <w:r>
+              <w:rPr>
+                <w:sz w:val="18"/>
+              </w:rPr>
+              <w:t>1.453.333 − 200.000 (gratificación)</w:t>
+            </w:r>
+          </w:p>
+        </w:tc>
+        <w:tc>
+          <w:tcPr>
+            <w:tcW w:type="dxa" w:w="1984"/>
+          </w:tcPr>
+          <w:p>
+            <w:r/>
+            <w:r>
+              <w:rPr>
+                <w:sz w:val="18"/>
+              </w:rPr>
+              <w:t>$1.253.333</w:t>
+            </w:r>
+          </w:p>
+        </w:tc>
+      </w:tr>
+      <w:tr>
+        <w:tc>
+          <w:tcPr>
+            <w:tcW w:type="dxa" w:w="2041"/>
+          </w:tcPr>
+          <w:p>
+            <w:r/>
+            <w:r>
+              <w:rPr>
+                <w:sz w:val="18"/>
+              </w:rPr>
+              <w:t>Feriado proporcional</w:t>
+            </w:r>
+          </w:p>
+        </w:tc>
+        <w:tc>
+          <w:tcPr>
+            <w:tcW w:type="dxa" w:w="5329"/>
+          </w:tcPr>
+          <w:p>
+            <w:r/>
+            <w:r>
+              <w:rPr>
+                <w:sz w:val="18"/>
+              </w:rPr>
+              <w:t>7 hábiles desde el 01-10-2026 → jue 1 a vie 9 de octubre = 9 días corridos (incluye sáb 3 y dom 4) → 9 × 1.253.333 ÷ 30</w:t>
+            </w:r>
+          </w:p>
+        </w:tc>
+        <w:tc>
+          <w:tcPr>
+            <w:tcW w:type="dxa" w:w="1984"/>
+          </w:tcPr>
+          <w:p>
+            <w:r/>
+            <w:r>
+              <w:rPr>
+                <w:sz w:val="18"/>
+              </w:rPr>
+              <w:t>$376.000</w:t>
+            </w:r>
+          </w:p>
+        </w:tc>
+      </w:tr>
+      <w:tr>
+        <w:tc>
+          <w:tcPr>
+            <w:tcW w:type="dxa" w:w="2041"/>
+          </w:tcPr>
+          <w:p>
+            <w:r/>
+            <w:r>
+              <w:rPr>
+                <w:sz w:val="18"/>
+              </w:rPr>
+              <w:t>Saldo del préstamo</w:t>
+            </w:r>
+          </w:p>
+        </w:tc>
+        <w:tc>
+          <w:tcPr>
+            <w:tcW w:type="dxa" w:w="5329"/>
+          </w:tcPr>
+          <w:p>
+            <w:r/>
+            <w:r>
+              <w:rPr>
+                <w:sz w:val="18"/>
+              </w:rPr>
+              <w:t>cuotas cobradas jun–sep = 4 → pendientes 2 × 50.000</w:t>
+            </w:r>
+          </w:p>
+        </w:tc>
+        <w:tc>
+          <w:tcPr>
+            <w:tcW w:type="dxa" w:w="1984"/>
+          </w:tcPr>
+          <w:p>
+            <w:r/>
+            <w:r>
+              <w:rPr>
+                <w:sz w:val="18"/>
+              </w:rPr>
+              <w:t>− $100.000</w:t>
+            </w:r>
+          </w:p>
+        </w:tc>
+      </w:tr>
+      <w:tr>
+        <w:tc>
+          <w:tcPr>
+            <w:tcW w:type="dxa" w:w="2041"/>
+          </w:tcPr>
+          <w:p>
+            <w:r/>
+            <w:r>
+              <w:rPr>
+                <w:sz w:val="18"/>
+              </w:rPr>
+              <w:t>TOTAL FINIQUITO</w:t>
+            </w:r>
+          </w:p>
+        </w:tc>
+        <w:tc>
+          <w:tcPr>
+            <w:tcW w:type="dxa" w:w="5329"/>
+          </w:tcPr>
+          <w:p>
+            <w:r/>
+            <w:r>
+              <w:rPr>
+                <w:sz w:val="18"/>
+              </w:rPr>
+              <w:t>8.719.998 + 1.453.333 + 376.000 − 100.000</w:t>
+            </w:r>
+          </w:p>
+        </w:tc>
+        <w:tc>
+          <w:tcPr>
+            <w:tcW w:type="dxa" w:w="1984"/>
+          </w:tcPr>
+          <w:p>
+            <w:r/>
+            <w:r>
+              <w:rPr>
+                <w:sz w:val="18"/>
+              </w:rPr>
+              <w:t>$10.449.331</w:t>
+            </w:r>
+          </w:p>
+        </w:tc>
+      </w:tr>
+      <w:tr>
+        <w:tc>
+          <w:tcPr>
+            <w:tcW w:type="dxa" w:w="2041"/>
+          </w:tcPr>
+          <w:p>
+            <w:r/>
+            <w:r>
+              <w:rPr>
+                <w:sz w:val="18"/>
+              </w:rPr>
+              <w:t>Aparte, en la liquidación de septiembre</w:t>
+            </w:r>
+          </w:p>
+        </w:tc>
+        <w:tc>
+          <w:tcPr>
+            <w:tcW w:type="dxa" w:w="5329"/>
+          </w:tcPr>
+          <w:p>
+            <w:r/>
+            <w:r>
+              <w:rPr>
+                <w:sz w:val="18"/>
+              </w:rPr>
+              <w:t>sueldo, colación y movilización de los 30 días trabajados (30/30) y las cuotas de descuentos del mes; el préstamo ya no descuenta más cuotas después</w:t>
+            </w:r>
+          </w:p>
+        </w:tc>
+        <w:tc>
+          <w:tcPr>
+            <w:tcW w:type="dxa" w:w="1984"/>
+          </w:tcPr>
+          <w:p>
+            <w:r/>
+            <w:r>
+              <w:rPr>
+                <w:sz w:val="18"/>
+              </w:rPr>
+              <w:t>libro de remuneraciones</w:t>
+            </w:r>
+          </w:p>
+        </w:tc>
+      </w:tr>
+    </w:tbl>
+    <w:p>
+      <w:pPr>
+        <w:spacing w:after="40"/>
+      </w:pPr>
+    </w:p>
+    <w:tbl>
+      <w:tblPr>
+        <w:tblStyle w:val="TableGrid"/>
+        <w:tblW w:type="auto" w:w="0"/>
+        <w:tblLook w:firstColumn="1" w:firstRow="1" w:lastColumn="0" w:lastRow="0" w:noHBand="0" w:noVBand="1" w:val="04A0"/>
+      </w:tblPr>
+      <w:tblGrid>
+        <w:gridCol w:w="9746"/>
+      </w:tblGrid>
+      <w:tr>
+        <w:tc>
+          <w:tcPr>
+            <w:tcW w:type="dxa" w:w="9746"/>
+            <w:shd w:val="clear" w:color="auto" w:fill="E8F0F8"/>
+          </w:tcPr>
+          <w:p>
+            <w:r/>
+            <w:r>
+              <w:rPr>
+                <w:b/>
+                <w:sz w:val="19"/>
+              </w:rPr>
+              <w:t>🔒 Cómo cuadrar a mano</w:t>
+              <w:br/>
+            </w:r>
+            <w:r>
+              <w:rPr>
+                <w:sz w:val="19"/>
+              </w:rPr>
+              <w:t>Con el anexo del finiquito a la vista: 1) verificar los 3 meses de la base y que sean completos; 2) años = meses ÷ 12 redondeando la fracción ≥ 6; 3) comparar la base con 90 UF; 4) el feriado se cuenta en el calendario, no con factor; 5) restar la gratificación solo para el feriado; 6) el saldo de préstamos = cuotas que faltan × valor cuota. Si algún número no coincide, Recalcular antes de cerrar: cerrado no se edita.</w:t>
+            </w:r>
+          </w:p>
+        </w:tc>
+      </w:tr>
+    </w:tbl>
+    <w:p>
+      <w:pPr>
+        <w:spacing w:after="40"/>
+      </w:pPr>
     </w:p>
     <w:p>
       <w:pPr>

</xml_diff>

<commit_message>
docs: Manual de RRHH v2.2 — fórmulas y criterios de cálculo de la liquidación de sueldo con ejemplo numérico (cap. 15.1); documentación v3.2 (v255.0)
Co-Authored-By: Claude Fable 5.1 <noreply@anthropic.com>
</commit_message>
<xml_diff>
--- a/api-gateway/public/mantenedores/documentacion/descargas/Manual-RRHH-Business-Suite.docx
+++ b/api-gateway/public/mantenedores/documentacion/descargas/Manual-RRHH-Business-Suite.docx
@@ -236,7 +236,7 @@
           <w:i w:val="0"/>
           <w:sz w:val="22"/>
         </w:rPr>
-        <w:t>Versión 2.1 · 17 de septiembre de 2026 · Suite v254.9</w:t>
+        <w:t>Versión 2.2 · 17 de septiembre de 2026 · Suite v255.0</w:t>
       </w:r>
     </w:p>
     <w:p>
@@ -520,6 +520,64 @@
                 <w:sz w:val="18"/>
               </w:rPr>
               <w:t>Cap. 25.1: fórmulas y criterios de cálculo del finiquito con ejemplo numérico.</w:t>
+            </w:r>
+          </w:p>
+        </w:tc>
+      </w:tr>
+      <w:tr>
+        <w:tc>
+          <w:tcPr>
+            <w:tcW w:type="dxa" w:w="907"/>
+          </w:tcPr>
+          <w:p>
+            <w:r/>
+            <w:r>
+              <w:rPr>
+                <w:sz w:val="18"/>
+              </w:rPr>
+              <w:t>2.2</w:t>
+            </w:r>
+          </w:p>
+        </w:tc>
+        <w:tc>
+          <w:tcPr>
+            <w:tcW w:type="dxa" w:w="1247"/>
+          </w:tcPr>
+          <w:p>
+            <w:r/>
+            <w:r>
+              <w:rPr>
+                <w:sz w:val="18"/>
+              </w:rPr>
+              <w:t>17-09-2026</w:t>
+            </w:r>
+          </w:p>
+        </w:tc>
+        <w:tc>
+          <w:tcPr>
+            <w:tcW w:type="dxa" w:w="2041"/>
+          </w:tcPr>
+          <w:p>
+            <w:r/>
+            <w:r>
+              <w:rPr>
+                <w:sz w:val="18"/>
+              </w:rPr>
+              <w:t>Patricio Escobar / Claude</w:t>
+            </w:r>
+          </w:p>
+        </w:tc>
+        <w:tc>
+          <w:tcPr>
+            <w:tcW w:type="dxa" w:w="5159"/>
+          </w:tcPr>
+          <w:p>
+            <w:r/>
+            <w:r>
+              <w:rPr>
+                <w:sz w:val="18"/>
+              </w:rPr>
+              <w:t>Cap. 15.1: fórmulas y criterios de cálculo de la liquidación de sueldo con ejemplo numérico.</w:t>
             </w:r>
           </w:p>
         </w:tc>
@@ -9762,6 +9820,1682 @@
       <w:r>
         <w:t>Libro de Remuneraciones Electrónico desde Contabilidad → Dirección del Trabajo.</w:t>
       </w:r>
+    </w:p>
+    <w:p>
+      <w:pPr>
+        <w:pStyle w:val="Heading3"/>
+      </w:pPr>
+      <w:r>
+        <w:t>15.1 Fórmulas y criterios de cálculo de la liquidación</w:t>
+      </w:r>
+    </w:p>
+    <w:p>
+      <w:pPr>
+        <w:spacing w:after="80"/>
+      </w:pPr>
+      <w:r>
+        <w:rPr>
+          <w:b w:val="0"/>
+          <w:i w:val="0"/>
+        </w:rPr>
+        <w:t>Motor único calcLiquidacion() (validado al peso contra AVSOFT, mayo 2026). Todos los indicadores son paramétricos en Mantenedores → Indicadores de Remuneraciones (rh_config rem_*, tasas por AFP, tramos de impuesto); UF = la del último día del mes; UTM del mes. R() = redondeo a peso.</w:t>
+      </w:r>
+    </w:p>
+    <w:tbl>
+      <w:tblPr>
+        <w:tblStyle w:val="TableGrid"/>
+        <w:tblW w:type="auto" w:w="0"/>
+        <w:jc w:val="center"/>
+        <w:tblLook w:firstColumn="1" w:firstRow="1" w:lastColumn="0" w:lastRow="0" w:noHBand="0" w:noVBand="1" w:val="04A0"/>
+      </w:tblPr>
+      <w:tblGrid>
+        <w:gridCol w:w="3249"/>
+        <w:gridCol w:w="3249"/>
+        <w:gridCol w:w="3249"/>
+      </w:tblGrid>
+      <w:tr>
+        <w:tc>
+          <w:tcPr>
+            <w:tcW w:type="dxa" w:w="2041"/>
+            <w:shd w:val="clear" w:color="auto" w:fill="1F4E79"/>
+          </w:tcPr>
+          <w:p>
+            <w:r/>
+            <w:r>
+              <w:rPr>
+                <w:b/>
+                <w:color w:val="FFFFFF"/>
+                <w:sz w:val="18"/>
+              </w:rPr>
+              <w:t>Concepto</w:t>
+            </w:r>
+          </w:p>
+        </w:tc>
+        <w:tc>
+          <w:tcPr>
+            <w:tcW w:type="dxa" w:w="5329"/>
+            <w:shd w:val="clear" w:color="auto" w:fill="1F4E79"/>
+          </w:tcPr>
+          <w:p>
+            <w:r/>
+            <w:r>
+              <w:rPr>
+                <w:b/>
+                <w:color w:val="FFFFFF"/>
+                <w:sz w:val="18"/>
+              </w:rPr>
+              <w:t>Regla / fórmula</w:t>
+            </w:r>
+          </w:p>
+        </w:tc>
+        <w:tc>
+          <w:tcPr>
+            <w:tcW w:type="dxa" w:w="1984"/>
+            <w:shd w:val="clear" w:color="auto" w:fill="1F4E79"/>
+          </w:tcPr>
+          <w:p>
+            <w:r/>
+            <w:r>
+              <w:rPr>
+                <w:b/>
+                <w:color w:val="FFFFFF"/>
+                <w:sz w:val="18"/>
+              </w:rPr>
+              <w:t>Parámetro</w:t>
+            </w:r>
+          </w:p>
+        </w:tc>
+      </w:tr>
+      <w:tr>
+        <w:tc>
+          <w:tcPr>
+            <w:tcW w:type="dxa" w:w="2041"/>
+          </w:tcPr>
+          <w:p>
+            <w:r/>
+            <w:r>
+              <w:rPr>
+                <w:sz w:val="18"/>
+              </w:rPr>
+              <w:t>Días pagados</w:t>
+            </w:r>
+          </w:p>
+        </w:tc>
+        <w:tc>
+          <w:tcPr>
+            <w:tcW w:type="dxa" w:w="5329"/>
+          </w:tcPr>
+          <w:p>
+            <w:r/>
+            <w:r>
+              <w:rPr>
+                <w:sz w:val="18"/>
+              </w:rPr>
+              <w:t>30 − días de licencia, permiso sin goce y ausencias injustificadas; ingreso o baja en el mes: solo los días entre esas fechas (baja exclusiva). Editable por mes.</w:t>
+            </w:r>
+          </w:p>
+        </w:tc>
+        <w:tc>
+          <w:tcPr>
+            <w:tcW w:type="dxa" w:w="1984"/>
+          </w:tcPr>
+          <w:p>
+            <w:r/>
+            <w:r>
+              <w:rPr>
+                <w:sz w:val="18"/>
+              </w:rPr>
+              <w:t>Ausencias, ficha</w:t>
+            </w:r>
+          </w:p>
+        </w:tc>
+      </w:tr>
+      <w:tr>
+        <w:tc>
+          <w:tcPr>
+            <w:tcW w:type="dxa" w:w="2041"/>
+          </w:tcPr>
+          <w:p>
+            <w:r/>
+            <w:r>
+              <w:rPr>
+                <w:sz w:val="18"/>
+              </w:rPr>
+              <w:t>Sueldo base</w:t>
+            </w:r>
+          </w:p>
+        </w:tc>
+        <w:tc>
+          <w:tcPr>
+            <w:tcW w:type="dxa" w:w="5329"/>
+          </w:tcPr>
+          <w:p>
+            <w:r/>
+            <w:r>
+              <w:rPr>
+                <w:sz w:val="18"/>
+              </w:rPr>
+              <w:t>sueldo de la ficha × días ÷ 30.</w:t>
+            </w:r>
+          </w:p>
+        </w:tc>
+        <w:tc>
+          <w:tcPr>
+            <w:tcW w:type="dxa" w:w="1984"/>
+          </w:tcPr>
+          <w:p>
+            <w:r/>
+            <w:r>
+              <w:rPr>
+                <w:sz w:val="18"/>
+              </w:rPr>
+              <w:t>rh_fichas.sueldo_base</w:t>
+            </w:r>
+          </w:p>
+        </w:tc>
+      </w:tr>
+      <w:tr>
+        <w:tc>
+          <w:tcPr>
+            <w:tcW w:type="dxa" w:w="2041"/>
+          </w:tcPr>
+          <w:p>
+            <w:r/>
+            <w:r>
+              <w:rPr>
+                <w:sz w:val="18"/>
+              </w:rPr>
+              <w:t>Comisiones</w:t>
+            </w:r>
+          </w:p>
+        </w:tc>
+        <w:tc>
+          <w:tcPr>
+            <w:tcW w:type="dxa" w:w="5329"/>
+          </w:tcPr>
+          <w:p>
+            <w:r/>
+            <w:r>
+              <w:rPr>
+                <w:sz w:val="18"/>
+              </w:rPr>
+              <w:t>del motor de comisiones, mes vencido (la liquidación de septiembre paga la comisión de agosto), valores firmes de la Nómina de Comisiones. Renta fija = 0.</w:t>
+            </w:r>
+          </w:p>
+        </w:tc>
+        <w:tc>
+          <w:tcPr>
+            <w:tcW w:type="dxa" w:w="1984"/>
+          </w:tcPr>
+          <w:p>
+            <w:r/>
+            <w:r>
+              <w:rPr>
+                <w:sz w:val="18"/>
+              </w:rPr>
+              <w:t>Comisiones → Nómina</w:t>
+            </w:r>
+          </w:p>
+        </w:tc>
+      </w:tr>
+      <w:tr>
+        <w:tc>
+          <w:tcPr>
+            <w:tcW w:type="dxa" w:w="2041"/>
+          </w:tcPr>
+          <w:p>
+            <w:r/>
+            <w:r>
+              <w:rPr>
+                <w:sz w:val="18"/>
+              </w:rPr>
+              <w:t>Feriado con renta variable</w:t>
+            </w:r>
+          </w:p>
+        </w:tc>
+        <w:tc>
+          <w:tcPr>
+            <w:tcW w:type="dxa" w:w="5329"/>
+          </w:tcPr>
+          <w:p>
+            <w:r/>
+            <w:r>
+              <w:rPr>
+                <w:sz w:val="18"/>
+              </w:rPr>
+              <w:t>días de vacaciones del mes × promedio de variables de los 3 últimos meses enteros ÷ 30 (art. 71 CT).</w:t>
+            </w:r>
+          </w:p>
+        </w:tc>
+        <w:tc>
+          <w:tcPr>
+            <w:tcW w:type="dxa" w:w="1984"/>
+          </w:tcPr>
+          <w:p>
+            <w:r/>
+            <w:r>
+              <w:rPr>
+                <w:sz w:val="18"/>
+              </w:rPr>
+              <w:t>motor</w:t>
+            </w:r>
+          </w:p>
+        </w:tc>
+      </w:tr>
+      <w:tr>
+        <w:tc>
+          <w:tcPr>
+            <w:tcW w:type="dxa" w:w="2041"/>
+          </w:tcPr>
+          <w:p>
+            <w:r/>
+            <w:r>
+              <w:rPr>
+                <w:sz w:val="18"/>
+              </w:rPr>
+              <w:t>Otros imponibles</w:t>
+            </w:r>
+          </w:p>
+        </w:tc>
+        <w:tc>
+          <w:tcPr>
+            <w:tcW w:type="dxa" w:w="5329"/>
+          </w:tcPr>
+          <w:p>
+            <w:r/>
+            <w:r>
+              <w:rPr>
+                <w:sz w:val="18"/>
+              </w:rPr>
+              <w:t>Adicionales imponibles (bonos, aguinaldos, viáticos, horas extras, comisión mínima garantizada, semana corrida); los marcados Líquido se convierten a bruto por bisección sobre este mismo motor.</w:t>
+            </w:r>
+          </w:p>
+        </w:tc>
+        <w:tc>
+          <w:tcPr>
+            <w:tcW w:type="dxa" w:w="1984"/>
+          </w:tcPr>
+          <w:p>
+            <w:r/>
+            <w:r>
+              <w:rPr>
+                <w:sz w:val="18"/>
+              </w:rPr>
+              <w:t>Adicionales</w:t>
+            </w:r>
+          </w:p>
+        </w:tc>
+      </w:tr>
+      <w:tr>
+        <w:tc>
+          <w:tcPr>
+            <w:tcW w:type="dxa" w:w="2041"/>
+          </w:tcPr>
+          <w:p>
+            <w:r/>
+            <w:r>
+              <w:rPr>
+                <w:sz w:val="18"/>
+              </w:rPr>
+              <w:t>Gratificación legal (art. 50)</w:t>
+            </w:r>
+          </w:p>
+        </w:tc>
+        <w:tc>
+          <w:tcPr>
+            <w:tcW w:type="dxa" w:w="5329"/>
+          </w:tcPr>
+          <w:p>
+            <w:r/>
+            <w:r>
+              <w:rPr>
+                <w:sz w:val="18"/>
+              </w:rPr>
+              <w:t>mín( 25% × (sueldo + comisiones + feriado variable + otros imponibles) , 4,75 × IMM ÷ 12 × días/30 ).</w:t>
+            </w:r>
+          </w:p>
+        </w:tc>
+        <w:tc>
+          <w:tcPr>
+            <w:tcW w:type="dxa" w:w="1984"/>
+          </w:tcPr>
+          <w:p>
+            <w:r/>
+            <w:r>
+              <w:rPr>
+                <w:sz w:val="18"/>
+              </w:rPr>
+              <w:t>rem_grat_tope_imm, rem_imm</w:t>
+            </w:r>
+          </w:p>
+        </w:tc>
+      </w:tr>
+      <w:tr>
+        <w:tc>
+          <w:tcPr>
+            <w:tcW w:type="dxa" w:w="2041"/>
+          </w:tcPr>
+          <w:p>
+            <w:r/>
+            <w:r>
+              <w:rPr>
+                <w:sz w:val="18"/>
+              </w:rPr>
+              <w:t>Total imponible</w:t>
+            </w:r>
+          </w:p>
+        </w:tc>
+        <w:tc>
+          <w:tcPr>
+            <w:tcW w:type="dxa" w:w="5329"/>
+          </w:tcPr>
+          <w:p>
+            <w:r/>
+            <w:r>
+              <w:rPr>
+                <w:sz w:val="18"/>
+              </w:rPr>
+              <w:t>sueldo + comisiones + feriado variable + otros imponibles + gratificación.</w:t>
+            </w:r>
+          </w:p>
+        </w:tc>
+        <w:tc>
+          <w:tcPr>
+            <w:tcW w:type="dxa" w:w="1984"/>
+          </w:tcPr>
+          <w:p>
+            <w:r/>
+            <w:r>
+              <w:rPr>
+                <w:sz w:val="18"/>
+              </w:rPr>
+            </w:r>
+          </w:p>
+        </w:tc>
+      </w:tr>
+      <w:tr>
+        <w:tc>
+          <w:tcPr>
+            <w:tcW w:type="dxa" w:w="2041"/>
+          </w:tcPr>
+          <w:p>
+            <w:r/>
+            <w:r>
+              <w:rPr>
+                <w:sz w:val="18"/>
+              </w:rPr>
+              <w:t>Base de cotización</w:t>
+            </w:r>
+          </w:p>
+        </w:tc>
+        <w:tc>
+          <w:tcPr>
+            <w:tcW w:type="dxa" w:w="5329"/>
+          </w:tcPr>
+          <w:p>
+            <w:r/>
+            <w:r>
+              <w:rPr>
+                <w:sz w:val="18"/>
+              </w:rPr>
+              <w:t>mín( imponible , 87,8 UF × UF × días/30 ). Los topes se prorratean por días pagados (norma Previred/DT).</w:t>
+            </w:r>
+          </w:p>
+        </w:tc>
+        <w:tc>
+          <w:tcPr>
+            <w:tcW w:type="dxa" w:w="1984"/>
+          </w:tcPr>
+          <w:p>
+            <w:r/>
+            <w:r>
+              <w:rPr>
+                <w:sz w:val="18"/>
+              </w:rPr>
+              <w:t>rem_tope_imponible_uf, rem_prorratea_topes</w:t>
+            </w:r>
+          </w:p>
+        </w:tc>
+      </w:tr>
+      <w:tr>
+        <w:tc>
+          <w:tcPr>
+            <w:tcW w:type="dxa" w:w="2041"/>
+          </w:tcPr>
+          <w:p>
+            <w:r/>
+            <w:r>
+              <w:rPr>
+                <w:sz w:val="18"/>
+              </w:rPr>
+              <w:t>AFP</w:t>
+            </w:r>
+          </w:p>
+        </w:tc>
+        <w:tc>
+          <w:tcPr>
+            <w:tcW w:type="dxa" w:w="5329"/>
+          </w:tcPr>
+          <w:p>
+            <w:r/>
+            <w:r>
+              <w:rPr>
+                <w:sz w:val="18"/>
+              </w:rPr>
+              <w:t>base de cotización × tasa de la administradora (incluye comisión). Pensionado: 0.</w:t>
+            </w:r>
+          </w:p>
+        </w:tc>
+        <w:tc>
+          <w:tcPr>
+            <w:tcW w:type="dxa" w:w="1984"/>
+          </w:tcPr>
+          <w:p>
+            <w:r/>
+            <w:r>
+              <w:rPr>
+                <w:sz w:val="18"/>
+              </w:rPr>
+              <w:t>rh_afp_tasas</w:t>
+            </w:r>
+          </w:p>
+        </w:tc>
+      </w:tr>
+      <w:tr>
+        <w:tc>
+          <w:tcPr>
+            <w:tcW w:type="dxa" w:w="2041"/>
+          </w:tcPr>
+          <w:p>
+            <w:r/>
+            <w:r>
+              <w:rPr>
+                <w:sz w:val="18"/>
+              </w:rPr>
+              <w:t>Salud 7%</w:t>
+            </w:r>
+          </w:p>
+        </w:tc>
+        <w:tc>
+          <w:tcPr>
+            <w:tcW w:type="dxa" w:w="5329"/>
+          </w:tcPr>
+          <w:p>
+            <w:r/>
+            <w:r>
+              <w:rPr>
+                <w:sz w:val="18"/>
+              </w:rPr>
+              <w:t>base de cotización × 7%. Plan Isapre pactado en UF: adicional = plan × UF − 7% legal (descuenta al líquido).</w:t>
+            </w:r>
+          </w:p>
+        </w:tc>
+        <w:tc>
+          <w:tcPr>
+            <w:tcW w:type="dxa" w:w="1984"/>
+          </w:tcPr>
+          <w:p>
+            <w:r/>
+            <w:r>
+              <w:rPr>
+                <w:sz w:val="18"/>
+              </w:rPr>
+              <w:t>rem_salud_pct, rh_fichas.plan_isapre_uf</w:t>
+            </w:r>
+          </w:p>
+        </w:tc>
+      </w:tr>
+      <w:tr>
+        <w:tc>
+          <w:tcPr>
+            <w:tcW w:type="dxa" w:w="2041"/>
+          </w:tcPr>
+          <w:p>
+            <w:r/>
+            <w:r>
+              <w:rPr>
+                <w:sz w:val="18"/>
+              </w:rPr>
+              <w:t>Seguro de cesantía (AFC)</w:t>
+            </w:r>
+          </w:p>
+        </w:tc>
+        <w:tc>
+          <w:tcPr>
+            <w:tcW w:type="dxa" w:w="5329"/>
+          </w:tcPr>
+          <w:p>
+            <w:r/>
+            <w:r>
+              <w:rPr>
+                <w:sz w:val="18"/>
+              </w:rPr>
+              <w:t>solo INDEFINIDO no pensionado: mín(imponible, 131,9 UF × UF × días/30) × 0,6%.</w:t>
+            </w:r>
+          </w:p>
+        </w:tc>
+        <w:tc>
+          <w:tcPr>
+            <w:tcW w:type="dxa" w:w="1984"/>
+          </w:tcPr>
+          <w:p>
+            <w:r/>
+            <w:r>
+              <w:rPr>
+                <w:sz w:val="18"/>
+              </w:rPr>
+              <w:t>rem_tope_afc_uf, rem_afc_trabajador_pct</w:t>
+            </w:r>
+          </w:p>
+        </w:tc>
+      </w:tr>
+      <w:tr>
+        <w:tc>
+          <w:tcPr>
+            <w:tcW w:type="dxa" w:w="2041"/>
+          </w:tcPr>
+          <w:p>
+            <w:r/>
+            <w:r>
+              <w:rPr>
+                <w:sz w:val="18"/>
+              </w:rPr>
+              <w:t>Base tributable</w:t>
+            </w:r>
+          </w:p>
+        </w:tc>
+        <w:tc>
+          <w:tcPr>
+            <w:tcW w:type="dxa" w:w="5329"/>
+          </w:tcPr>
+          <w:p>
+            <w:r/>
+            <w:r>
+              <w:rPr>
+                <w:sz w:val="18"/>
+              </w:rPr>
+              <w:t>imponible − AFP − salud pactada (7% + adicional, tope 7% del tope imponible) − AFC − APV régimen B (tope 50 UF). Motor shared/base-tributable.js (el mismo de la DJ 1887).</w:t>
+            </w:r>
+          </w:p>
+        </w:tc>
+        <w:tc>
+          <w:tcPr>
+            <w:tcW w:type="dxa" w:w="1984"/>
+          </w:tcPr>
+          <w:p>
+            <w:r/>
+            <w:r>
+              <w:rPr>
+                <w:sz w:val="18"/>
+              </w:rPr>
+              <w:t>rem_apv_tope_uf</w:t>
+            </w:r>
+          </w:p>
+        </w:tc>
+      </w:tr>
+      <w:tr>
+        <w:tc>
+          <w:tcPr>
+            <w:tcW w:type="dxa" w:w="2041"/>
+          </w:tcPr>
+          <w:p>
+            <w:r/>
+            <w:r>
+              <w:rPr>
+                <w:sz w:val="18"/>
+              </w:rPr>
+              <w:t>Impuesto único 2ª categoría</w:t>
+            </w:r>
+          </w:p>
+        </w:tc>
+        <w:tc>
+          <w:tcPr>
+            <w:tcW w:type="dxa" w:w="5329"/>
+          </w:tcPr>
+          <w:p>
+            <w:r/>
+            <w:r>
+              <w:rPr>
+                <w:sz w:val="18"/>
+              </w:rPr>
+              <w:t>base tributable ÷ UTM → tramo; impuesto = base × factor − rebaja (UTM) × UTM; mínimo 0. Tramos paramétricos (ej. 13,5–30 UTM: 4% − 0,54 UTM).</w:t>
+            </w:r>
+          </w:p>
+        </w:tc>
+        <w:tc>
+          <w:tcPr>
+            <w:tcW w:type="dxa" w:w="1984"/>
+          </w:tcPr>
+          <w:p>
+            <w:r/>
+            <w:r>
+              <w:rPr>
+                <w:sz w:val="18"/>
+              </w:rPr>
+              <w:t>rh_impuesto_tramos</w:t>
+            </w:r>
+          </w:p>
+        </w:tc>
+      </w:tr>
+      <w:tr>
+        <w:tc>
+          <w:tcPr>
+            <w:tcW w:type="dxa" w:w="2041"/>
+          </w:tcPr>
+          <w:p>
+            <w:r/>
+            <w:r>
+              <w:rPr>
+                <w:sz w:val="18"/>
+              </w:rPr>
+              <w:t>No imponibles</w:t>
+            </w:r>
+          </w:p>
+        </w:tc>
+        <w:tc>
+          <w:tcPr>
+            <w:tcW w:type="dxa" w:w="5329"/>
+          </w:tcPr>
+          <w:p>
+            <w:r/>
+            <w:r>
+              <w:rPr>
+                <w:sz w:val="18"/>
+              </w:rPr>
+              <w:t>colación y movilización de la ficha × días ÷ 30; otros no imponibles de Adicionales (Asignación Celular completa; los conceptos marcados "proporcional" en 30avos).</w:t>
+            </w:r>
+          </w:p>
+        </w:tc>
+        <w:tc>
+          <w:tcPr>
+            <w:tcW w:type="dxa" w:w="1984"/>
+          </w:tcPr>
+          <w:p>
+            <w:r/>
+            <w:r>
+              <w:rPr>
+                <w:sz w:val="18"/>
+              </w:rPr>
+              <w:t>ficha, Adicionales</w:t>
+            </w:r>
+          </w:p>
+        </w:tc>
+      </w:tr>
+      <w:tr>
+        <w:tc>
+          <w:tcPr>
+            <w:tcW w:type="dxa" w:w="2041"/>
+          </w:tcPr>
+          <w:p>
+            <w:r/>
+            <w:r>
+              <w:rPr>
+                <w:sz w:val="18"/>
+              </w:rPr>
+              <w:t>Otros descuentos</w:t>
+            </w:r>
+          </w:p>
+        </w:tc>
+        <w:tc>
+          <w:tcPr>
+            <w:tcW w:type="dxa" w:w="5329"/>
+          </w:tcPr>
+          <w:p>
+            <w:r/>
+            <w:r>
+              <w:rPr>
+                <w:sz w:val="18"/>
+              </w:rPr>
+              <w:t>cuotas del mes de Descuentos (anticipos, préstamos, varios, permanentes, Caja Los Andes, seguro de salud de cargas).</w:t>
+            </w:r>
+          </w:p>
+        </w:tc>
+        <w:tc>
+          <w:tcPr>
+            <w:tcW w:type="dxa" w:w="1984"/>
+          </w:tcPr>
+          <w:p>
+            <w:r/>
+            <w:r>
+              <w:rPr>
+                <w:sz w:val="18"/>
+              </w:rPr>
+              <w:t>Descuentos</w:t>
+            </w:r>
+          </w:p>
+        </w:tc>
+      </w:tr>
+      <w:tr>
+        <w:tc>
+          <w:tcPr>
+            <w:tcW w:type="dxa" w:w="2041"/>
+          </w:tcPr>
+          <w:p>
+            <w:r/>
+            <w:r>
+              <w:rPr>
+                <w:sz w:val="18"/>
+              </w:rPr>
+              <w:t>Líquido a pagar</w:t>
+            </w:r>
+          </w:p>
+        </w:tc>
+        <w:tc>
+          <w:tcPr>
+            <w:tcW w:type="dxa" w:w="5329"/>
+          </w:tcPr>
+          <w:p>
+            <w:r/>
+            <w:r>
+              <w:rPr>
+                <w:sz w:val="18"/>
+              </w:rPr>
+              <w:t>total haberes (imponible + no imponibles) − AFP − salud − adicional Isapre − AFC − impuesto − otros descuentos. Es lo que va a la Nómina Banco.</w:t>
+            </w:r>
+          </w:p>
+        </w:tc>
+        <w:tc>
+          <w:tcPr>
+            <w:tcW w:type="dxa" w:w="1984"/>
+          </w:tcPr>
+          <w:p>
+            <w:r/>
+            <w:r>
+              <w:rPr>
+                <w:sz w:val="18"/>
+              </w:rPr>
+            </w:r>
+          </w:p>
+        </w:tc>
+      </w:tr>
+      <w:tr>
+        <w:tc>
+          <w:tcPr>
+            <w:tcW w:type="dxa" w:w="2041"/>
+          </w:tcPr>
+          <w:p>
+            <w:r/>
+            <w:r>
+              <w:rPr>
+                <w:sz w:val="18"/>
+              </w:rPr>
+              <w:t>Aportes del empleador</w:t>
+            </w:r>
+          </w:p>
+        </w:tc>
+        <w:tc>
+          <w:tcPr>
+            <w:tcW w:type="dxa" w:w="5329"/>
+          </w:tcPr>
+          <w:p>
+            <w:r/>
+            <w:r>
+              <w:rPr>
+                <w:sz w:val="18"/>
+              </w:rPr>
+              <w:t>SIS 1,88% y mutual 0,93% + SANNA 0,03% sobre la base de cotización; AFC empleador 2,4% (indefinido) o 3% (plazo fijo) sobre la base AFC. Pensionado: sin SIS ni AFC. No afectan el líquido; van a Previred y al costo empresa.</w:t>
+            </w:r>
+          </w:p>
+        </w:tc>
+        <w:tc>
+          <w:tcPr>
+            <w:tcW w:type="dxa" w:w="1984"/>
+          </w:tcPr>
+          <w:p>
+            <w:r/>
+            <w:r>
+              <w:rPr>
+                <w:sz w:val="18"/>
+              </w:rPr>
+              <w:t>rem_sis_pct, rem_mutual_pct, rem_sanna_pct, rem_afc_emp_pct, rem_afc_emp_pfijo_pct</w:t>
+            </w:r>
+          </w:p>
+        </w:tc>
+      </w:tr>
+      <w:tr>
+        <w:tc>
+          <w:tcPr>
+            <w:tcW w:type="dxa" w:w="2041"/>
+          </w:tcPr>
+          <w:p>
+            <w:r/>
+            <w:r>
+              <w:rPr>
+                <w:sz w:val="18"/>
+              </w:rPr>
+              <w:t>Costo empresa</w:t>
+            </w:r>
+          </w:p>
+        </w:tc>
+        <w:tc>
+          <w:tcPr>
+            <w:tcW w:type="dxa" w:w="5329"/>
+          </w:tcPr>
+          <w:p>
+            <w:r/>
+            <w:r>
+              <w:rPr>
+                <w:sz w:val="18"/>
+              </w:rPr>
+              <w:t>total haberes + SIS + AFC empleador + mutual + SANNA.</w:t>
+            </w:r>
+          </w:p>
+        </w:tc>
+        <w:tc>
+          <w:tcPr>
+            <w:tcW w:type="dxa" w:w="1984"/>
+          </w:tcPr>
+          <w:p>
+            <w:r/>
+            <w:r>
+              <w:rPr>
+                <w:sz w:val="18"/>
+              </w:rPr>
+            </w:r>
+          </w:p>
+        </w:tc>
+      </w:tr>
+    </w:tbl>
+    <w:p>
+      <w:pPr>
+        <w:spacing w:after="40"/>
+      </w:pPr>
+    </w:p>
+    <w:p>
+      <w:pPr>
+        <w:spacing w:after="40"/>
+      </w:pPr>
+      <w:r>
+        <w:rPr>
+          <w:b/>
+          <w:i w:val="0"/>
+          <w:color w:val="1F4E79"/>
+        </w:rPr>
+        <w:t>Ejemplo numérico</w:t>
+      </w:r>
+    </w:p>
+    <w:p>
+      <w:pPr>
+        <w:spacing w:after="80"/>
+      </w:pPr>
+      <w:r>
+        <w:rPr>
+          <w:b w:val="0"/>
+          <w:i w:val="0"/>
+        </w:rPr>
+        <w:t>Ejecutivo con contrato indefinido, 30 días trabajados, sueldo base $900.000, comisiones del mes vencido $350.000, colación $45.000, movilización $45.000, AFP Modelo (10,58%), Fonasa, una cuota de préstamo de $50.000. Indicadores del mes: IMM $529.000, UF $39.500, UTM $68.000 (valores de ejemplo).</w:t>
+      </w:r>
+    </w:p>
+    <w:tbl>
+      <w:tblPr>
+        <w:tblStyle w:val="TableGrid"/>
+        <w:tblW w:type="auto" w:w="0"/>
+        <w:jc w:val="center"/>
+        <w:tblLook w:firstColumn="1" w:firstRow="1" w:lastColumn="0" w:lastRow="0" w:noHBand="0" w:noVBand="1" w:val="04A0"/>
+      </w:tblPr>
+      <w:tblGrid>
+        <w:gridCol w:w="3249"/>
+        <w:gridCol w:w="3249"/>
+        <w:gridCol w:w="3249"/>
+      </w:tblGrid>
+      <w:tr>
+        <w:tc>
+          <w:tcPr>
+            <w:tcW w:type="dxa" w:w="2041"/>
+            <w:shd w:val="clear" w:color="auto" w:fill="1F4E79"/>
+          </w:tcPr>
+          <w:p>
+            <w:r/>
+            <w:r>
+              <w:rPr>
+                <w:b/>
+                <w:color w:val="FFFFFF"/>
+                <w:sz w:val="18"/>
+              </w:rPr>
+              <w:t>Paso</w:t>
+            </w:r>
+          </w:p>
+        </w:tc>
+        <w:tc>
+          <w:tcPr>
+            <w:tcW w:type="dxa" w:w="5329"/>
+            <w:shd w:val="clear" w:color="auto" w:fill="1F4E79"/>
+          </w:tcPr>
+          <w:p>
+            <w:r/>
+            <w:r>
+              <w:rPr>
+                <w:b/>
+                <w:color w:val="FFFFFF"/>
+                <w:sz w:val="18"/>
+              </w:rPr>
+              <w:t>Cálculo</w:t>
+            </w:r>
+          </w:p>
+        </w:tc>
+        <w:tc>
+          <w:tcPr>
+            <w:tcW w:type="dxa" w:w="1984"/>
+            <w:shd w:val="clear" w:color="auto" w:fill="1F4E79"/>
+          </w:tcPr>
+          <w:p>
+            <w:r/>
+            <w:r>
+              <w:rPr>
+                <w:b/>
+                <w:color w:val="FFFFFF"/>
+                <w:sz w:val="18"/>
+              </w:rPr>
+              <w:t>Resultado</w:t>
+            </w:r>
+          </w:p>
+        </w:tc>
+      </w:tr>
+      <w:tr>
+        <w:tc>
+          <w:tcPr>
+            <w:tcW w:type="dxa" w:w="2041"/>
+          </w:tcPr>
+          <w:p>
+            <w:r/>
+            <w:r>
+              <w:rPr>
+                <w:sz w:val="18"/>
+              </w:rPr>
+              <w:t>Base de gratificación</w:t>
+            </w:r>
+          </w:p>
+        </w:tc>
+        <w:tc>
+          <w:tcPr>
+            <w:tcW w:type="dxa" w:w="5329"/>
+          </w:tcPr>
+          <w:p>
+            <w:r/>
+            <w:r>
+              <w:rPr>
+                <w:sz w:val="18"/>
+              </w:rPr>
+              <w:t>900.000 + 350.000</w:t>
+            </w:r>
+          </w:p>
+        </w:tc>
+        <w:tc>
+          <w:tcPr>
+            <w:tcW w:type="dxa" w:w="1984"/>
+          </w:tcPr>
+          <w:p>
+            <w:r/>
+            <w:r>
+              <w:rPr>
+                <w:sz w:val="18"/>
+              </w:rPr>
+              <w:t>$1.250.000</w:t>
+            </w:r>
+          </w:p>
+        </w:tc>
+      </w:tr>
+      <w:tr>
+        <w:tc>
+          <w:tcPr>
+            <w:tcW w:type="dxa" w:w="2041"/>
+          </w:tcPr>
+          <w:p>
+            <w:r/>
+            <w:r>
+              <w:rPr>
+                <w:sz w:val="18"/>
+              </w:rPr>
+              <w:t>Gratificación</w:t>
+            </w:r>
+          </w:p>
+        </w:tc>
+        <w:tc>
+          <w:tcPr>
+            <w:tcW w:type="dxa" w:w="5329"/>
+          </w:tcPr>
+          <w:p>
+            <w:r/>
+            <w:r>
+              <w:rPr>
+                <w:sz w:val="18"/>
+              </w:rPr>
+              <w:t>25% = 312.500; tope 4,75 × 529.000 ÷ 12 = 209.396 → se paga el tope</w:t>
+            </w:r>
+          </w:p>
+        </w:tc>
+        <w:tc>
+          <w:tcPr>
+            <w:tcW w:type="dxa" w:w="1984"/>
+          </w:tcPr>
+          <w:p>
+            <w:r/>
+            <w:r>
+              <w:rPr>
+                <w:sz w:val="18"/>
+              </w:rPr>
+              <w:t>$209.396</w:t>
+            </w:r>
+          </w:p>
+        </w:tc>
+      </w:tr>
+      <w:tr>
+        <w:tc>
+          <w:tcPr>
+            <w:tcW w:type="dxa" w:w="2041"/>
+          </w:tcPr>
+          <w:p>
+            <w:r/>
+            <w:r>
+              <w:rPr>
+                <w:sz w:val="18"/>
+              </w:rPr>
+              <w:t>Total imponible</w:t>
+            </w:r>
+          </w:p>
+        </w:tc>
+        <w:tc>
+          <w:tcPr>
+            <w:tcW w:type="dxa" w:w="5329"/>
+          </w:tcPr>
+          <w:p>
+            <w:r/>
+            <w:r>
+              <w:rPr>
+                <w:sz w:val="18"/>
+              </w:rPr>
+              <w:t>1.250.000 + 209.396</w:t>
+            </w:r>
+          </w:p>
+        </w:tc>
+        <w:tc>
+          <w:tcPr>
+            <w:tcW w:type="dxa" w:w="1984"/>
+          </w:tcPr>
+          <w:p>
+            <w:r/>
+            <w:r>
+              <w:rPr>
+                <w:sz w:val="18"/>
+              </w:rPr>
+              <w:t>$1.459.396</w:t>
+            </w:r>
+          </w:p>
+        </w:tc>
+      </w:tr>
+      <w:tr>
+        <w:tc>
+          <w:tcPr>
+            <w:tcW w:type="dxa" w:w="2041"/>
+          </w:tcPr>
+          <w:p>
+            <w:r/>
+            <w:r>
+              <w:rPr>
+                <w:sz w:val="18"/>
+              </w:rPr>
+              <w:t>Base de cotización</w:t>
+            </w:r>
+          </w:p>
+        </w:tc>
+        <w:tc>
+          <w:tcPr>
+            <w:tcW w:type="dxa" w:w="5329"/>
+          </w:tcPr>
+          <w:p>
+            <w:r/>
+            <w:r>
+              <w:rPr>
+                <w:sz w:val="18"/>
+              </w:rPr>
+              <w:t>tope 87,8 × 39.500 = 3.468.100 &gt; imponible → sin tope</w:t>
+            </w:r>
+          </w:p>
+        </w:tc>
+        <w:tc>
+          <w:tcPr>
+            <w:tcW w:type="dxa" w:w="1984"/>
+          </w:tcPr>
+          <w:p>
+            <w:r/>
+            <w:r>
+              <w:rPr>
+                <w:sz w:val="18"/>
+              </w:rPr>
+              <w:t>$1.459.396</w:t>
+            </w:r>
+          </w:p>
+        </w:tc>
+      </w:tr>
+      <w:tr>
+        <w:tc>
+          <w:tcPr>
+            <w:tcW w:type="dxa" w:w="2041"/>
+          </w:tcPr>
+          <w:p>
+            <w:r/>
+            <w:r>
+              <w:rPr>
+                <w:sz w:val="18"/>
+              </w:rPr>
+              <w:t>AFP Modelo</w:t>
+            </w:r>
+          </w:p>
+        </w:tc>
+        <w:tc>
+          <w:tcPr>
+            <w:tcW w:type="dxa" w:w="5329"/>
+          </w:tcPr>
+          <w:p>
+            <w:r/>
+            <w:r>
+              <w:rPr>
+                <w:sz w:val="18"/>
+              </w:rPr>
+              <w:t>1.459.396 × 10,58%</w:t>
+            </w:r>
+          </w:p>
+        </w:tc>
+        <w:tc>
+          <w:tcPr>
+            <w:tcW w:type="dxa" w:w="1984"/>
+          </w:tcPr>
+          <w:p>
+            <w:r/>
+            <w:r>
+              <w:rPr>
+                <w:sz w:val="18"/>
+              </w:rPr>
+              <w:t>− $154.404</w:t>
+            </w:r>
+          </w:p>
+        </w:tc>
+      </w:tr>
+      <w:tr>
+        <w:tc>
+          <w:tcPr>
+            <w:tcW w:type="dxa" w:w="2041"/>
+          </w:tcPr>
+          <w:p>
+            <w:r/>
+            <w:r>
+              <w:rPr>
+                <w:sz w:val="18"/>
+              </w:rPr>
+              <w:t>Salud 7%</w:t>
+            </w:r>
+          </w:p>
+        </w:tc>
+        <w:tc>
+          <w:tcPr>
+            <w:tcW w:type="dxa" w:w="5329"/>
+          </w:tcPr>
+          <w:p>
+            <w:r/>
+            <w:r>
+              <w:rPr>
+                <w:sz w:val="18"/>
+              </w:rPr>
+              <w:t>1.459.396 × 7%</w:t>
+            </w:r>
+          </w:p>
+        </w:tc>
+        <w:tc>
+          <w:tcPr>
+            <w:tcW w:type="dxa" w:w="1984"/>
+          </w:tcPr>
+          <w:p>
+            <w:r/>
+            <w:r>
+              <w:rPr>
+                <w:sz w:val="18"/>
+              </w:rPr>
+              <w:t>− $102.158</w:t>
+            </w:r>
+          </w:p>
+        </w:tc>
+      </w:tr>
+      <w:tr>
+        <w:tc>
+          <w:tcPr>
+            <w:tcW w:type="dxa" w:w="2041"/>
+          </w:tcPr>
+          <w:p>
+            <w:r/>
+            <w:r>
+              <w:rPr>
+                <w:sz w:val="18"/>
+              </w:rPr>
+              <w:t>AFC trabajador</w:t>
+            </w:r>
+          </w:p>
+        </w:tc>
+        <w:tc>
+          <w:tcPr>
+            <w:tcW w:type="dxa" w:w="5329"/>
+          </w:tcPr>
+          <w:p>
+            <w:r/>
+            <w:r>
+              <w:rPr>
+                <w:sz w:val="18"/>
+              </w:rPr>
+              <w:t>1.459.396 × 0,6% (tope 131,9 UF no aplica)</w:t>
+            </w:r>
+          </w:p>
+        </w:tc>
+        <w:tc>
+          <w:tcPr>
+            <w:tcW w:type="dxa" w:w="1984"/>
+          </w:tcPr>
+          <w:p>
+            <w:r/>
+            <w:r>
+              <w:rPr>
+                <w:sz w:val="18"/>
+              </w:rPr>
+              <w:t>− $8.756</w:t>
+            </w:r>
+          </w:p>
+        </w:tc>
+      </w:tr>
+      <w:tr>
+        <w:tc>
+          <w:tcPr>
+            <w:tcW w:type="dxa" w:w="2041"/>
+          </w:tcPr>
+          <w:p>
+            <w:r/>
+            <w:r>
+              <w:rPr>
+                <w:sz w:val="18"/>
+              </w:rPr>
+              <w:t>Base tributable</w:t>
+            </w:r>
+          </w:p>
+        </w:tc>
+        <w:tc>
+          <w:tcPr>
+            <w:tcW w:type="dxa" w:w="5329"/>
+          </w:tcPr>
+          <w:p>
+            <w:r/>
+            <w:r>
+              <w:rPr>
+                <w:sz w:val="18"/>
+              </w:rPr>
+              <w:t>1.459.396 − 154.404 − 102.158 − 8.756</w:t>
+            </w:r>
+          </w:p>
+        </w:tc>
+        <w:tc>
+          <w:tcPr>
+            <w:tcW w:type="dxa" w:w="1984"/>
+          </w:tcPr>
+          <w:p>
+            <w:r/>
+            <w:r>
+              <w:rPr>
+                <w:sz w:val="18"/>
+              </w:rPr>
+              <w:t>$1.194.078</w:t>
+            </w:r>
+          </w:p>
+        </w:tc>
+      </w:tr>
+      <w:tr>
+        <w:tc>
+          <w:tcPr>
+            <w:tcW w:type="dxa" w:w="2041"/>
+          </w:tcPr>
+          <w:p>
+            <w:r/>
+            <w:r>
+              <w:rPr>
+                <w:sz w:val="18"/>
+              </w:rPr>
+              <w:t>Impuesto único</w:t>
+            </w:r>
+          </w:p>
+        </w:tc>
+        <w:tc>
+          <w:tcPr>
+            <w:tcW w:type="dxa" w:w="5329"/>
+          </w:tcPr>
+          <w:p>
+            <w:r/>
+            <w:r>
+              <w:rPr>
+                <w:sz w:val="18"/>
+              </w:rPr>
+              <w:t>1.194.078 ÷ 68.000 = 17,56 UTM → tramo 13,5–30: 1.194.078 × 4% − 0,54 × 68.000 = 47.763 − 36.720</w:t>
+            </w:r>
+          </w:p>
+        </w:tc>
+        <w:tc>
+          <w:tcPr>
+            <w:tcW w:type="dxa" w:w="1984"/>
+          </w:tcPr>
+          <w:p>
+            <w:r/>
+            <w:r>
+              <w:rPr>
+                <w:sz w:val="18"/>
+              </w:rPr>
+              <w:t>− $11.043</w:t>
+            </w:r>
+          </w:p>
+        </w:tc>
+      </w:tr>
+      <w:tr>
+        <w:tc>
+          <w:tcPr>
+            <w:tcW w:type="dxa" w:w="2041"/>
+          </w:tcPr>
+          <w:p>
+            <w:r/>
+            <w:r>
+              <w:rPr>
+                <w:sz w:val="18"/>
+              </w:rPr>
+              <w:t>No imponibles</w:t>
+            </w:r>
+          </w:p>
+        </w:tc>
+        <w:tc>
+          <w:tcPr>
+            <w:tcW w:type="dxa" w:w="5329"/>
+          </w:tcPr>
+          <w:p>
+            <w:r/>
+            <w:r>
+              <w:rPr>
+                <w:sz w:val="18"/>
+              </w:rPr>
+              <w:t>colación 45.000 + movilización 45.000 (30/30)</w:t>
+            </w:r>
+          </w:p>
+        </w:tc>
+        <w:tc>
+          <w:tcPr>
+            <w:tcW w:type="dxa" w:w="1984"/>
+          </w:tcPr>
+          <w:p>
+            <w:r/>
+            <w:r>
+              <w:rPr>
+                <w:sz w:val="18"/>
+              </w:rPr>
+              <w:t>$90.000</w:t>
+            </w:r>
+          </w:p>
+        </w:tc>
+      </w:tr>
+      <w:tr>
+        <w:tc>
+          <w:tcPr>
+            <w:tcW w:type="dxa" w:w="2041"/>
+          </w:tcPr>
+          <w:p>
+            <w:r/>
+            <w:r>
+              <w:rPr>
+                <w:sz w:val="18"/>
+              </w:rPr>
+              <w:t>Total haberes</w:t>
+            </w:r>
+          </w:p>
+        </w:tc>
+        <w:tc>
+          <w:tcPr>
+            <w:tcW w:type="dxa" w:w="5329"/>
+          </w:tcPr>
+          <w:p>
+            <w:r/>
+            <w:r>
+              <w:rPr>
+                <w:sz w:val="18"/>
+              </w:rPr>
+              <w:t>1.459.396 + 90.000</w:t>
+            </w:r>
+          </w:p>
+        </w:tc>
+        <w:tc>
+          <w:tcPr>
+            <w:tcW w:type="dxa" w:w="1984"/>
+          </w:tcPr>
+          <w:p>
+            <w:r/>
+            <w:r>
+              <w:rPr>
+                <w:sz w:val="18"/>
+              </w:rPr>
+              <w:t>$1.549.396</w:t>
+            </w:r>
+          </w:p>
+        </w:tc>
+      </w:tr>
+      <w:tr>
+        <w:tc>
+          <w:tcPr>
+            <w:tcW w:type="dxa" w:w="2041"/>
+          </w:tcPr>
+          <w:p>
+            <w:r/>
+            <w:r>
+              <w:rPr>
+                <w:sz w:val="18"/>
+              </w:rPr>
+              <w:t>Otros descuentos</w:t>
+            </w:r>
+          </w:p>
+        </w:tc>
+        <w:tc>
+          <w:tcPr>
+            <w:tcW w:type="dxa" w:w="5329"/>
+          </w:tcPr>
+          <w:p>
+            <w:r/>
+            <w:r>
+              <w:rPr>
+                <w:sz w:val="18"/>
+              </w:rPr>
+              <w:t>cuota préstamo</w:t>
+            </w:r>
+          </w:p>
+        </w:tc>
+        <w:tc>
+          <w:tcPr>
+            <w:tcW w:type="dxa" w:w="1984"/>
+          </w:tcPr>
+          <w:p>
+            <w:r/>
+            <w:r>
+              <w:rPr>
+                <w:sz w:val="18"/>
+              </w:rPr>
+              <w:t>− $50.000</w:t>
+            </w:r>
+          </w:p>
+        </w:tc>
+      </w:tr>
+      <w:tr>
+        <w:tc>
+          <w:tcPr>
+            <w:tcW w:type="dxa" w:w="2041"/>
+          </w:tcPr>
+          <w:p>
+            <w:r/>
+            <w:r>
+              <w:rPr>
+                <w:sz w:val="18"/>
+              </w:rPr>
+              <w:t>LÍQUIDO A PAGAR</w:t>
+            </w:r>
+          </w:p>
+        </w:tc>
+        <w:tc>
+          <w:tcPr>
+            <w:tcW w:type="dxa" w:w="5329"/>
+          </w:tcPr>
+          <w:p>
+            <w:r/>
+            <w:r>
+              <w:rPr>
+                <w:sz w:val="18"/>
+              </w:rPr>
+              <w:t>1.549.396 − 154.404 − 102.158 − 8.756 − 11.043 − 50.000</w:t>
+            </w:r>
+          </w:p>
+        </w:tc>
+        <w:tc>
+          <w:tcPr>
+            <w:tcW w:type="dxa" w:w="1984"/>
+          </w:tcPr>
+          <w:p>
+            <w:r/>
+            <w:r>
+              <w:rPr>
+                <w:sz w:val="18"/>
+              </w:rPr>
+              <w:t>$1.223.035</w:t>
+            </w:r>
+          </w:p>
+        </w:tc>
+      </w:tr>
+      <w:tr>
+        <w:tc>
+          <w:tcPr>
+            <w:tcW w:type="dxa" w:w="2041"/>
+          </w:tcPr>
+          <w:p>
+            <w:r/>
+            <w:r>
+              <w:rPr>
+                <w:sz w:val="18"/>
+              </w:rPr>
+              <w:t>Aportes empleador</w:t>
+            </w:r>
+          </w:p>
+        </w:tc>
+        <w:tc>
+          <w:tcPr>
+            <w:tcW w:type="dxa" w:w="5329"/>
+          </w:tcPr>
+          <w:p>
+            <w:r/>
+            <w:r>
+              <w:rPr>
+                <w:sz w:val="18"/>
+              </w:rPr>
+              <w:t>SIS 1,88% = 27.437 · AFC 2,4% = 35.026 · mutual 0,93% = 13.572 · SANNA 0,03% = 438</w:t>
+            </w:r>
+          </w:p>
+        </w:tc>
+        <w:tc>
+          <w:tcPr>
+            <w:tcW w:type="dxa" w:w="1984"/>
+          </w:tcPr>
+          <w:p>
+            <w:r/>
+            <w:r>
+              <w:rPr>
+                <w:sz w:val="18"/>
+              </w:rPr>
+              <w:t>$76.473</w:t>
+            </w:r>
+          </w:p>
+        </w:tc>
+      </w:tr>
+      <w:tr>
+        <w:tc>
+          <w:tcPr>
+            <w:tcW w:type="dxa" w:w="2041"/>
+          </w:tcPr>
+          <w:p>
+            <w:r/>
+            <w:r>
+              <w:rPr>
+                <w:sz w:val="18"/>
+              </w:rPr>
+              <w:t>COSTO EMPRESA</w:t>
+            </w:r>
+          </w:p>
+        </w:tc>
+        <w:tc>
+          <w:tcPr>
+            <w:tcW w:type="dxa" w:w="5329"/>
+          </w:tcPr>
+          <w:p>
+            <w:r/>
+            <w:r>
+              <w:rPr>
+                <w:sz w:val="18"/>
+              </w:rPr>
+              <w:t>1.549.396 + 76.473</w:t>
+            </w:r>
+          </w:p>
+        </w:tc>
+        <w:tc>
+          <w:tcPr>
+            <w:tcW w:type="dxa" w:w="1984"/>
+          </w:tcPr>
+          <w:p>
+            <w:r/>
+            <w:r>
+              <w:rPr>
+                <w:sz w:val="18"/>
+              </w:rPr>
+              <w:t>$1.625.869</w:t>
+            </w:r>
+          </w:p>
+        </w:tc>
+      </w:tr>
+    </w:tbl>
+    <w:p>
+      <w:pPr>
+        <w:spacing w:after="40"/>
+      </w:pPr>
+    </w:p>
+    <w:tbl>
+      <w:tblPr>
+        <w:tblStyle w:val="TableGrid"/>
+        <w:tblW w:type="auto" w:w="0"/>
+        <w:tblLook w:firstColumn="1" w:firstRow="1" w:lastColumn="0" w:lastRow="0" w:noHBand="0" w:noVBand="1" w:val="04A0"/>
+      </w:tblPr>
+      <w:tblGrid>
+        <w:gridCol w:w="9746"/>
+      </w:tblGrid>
+      <w:tr>
+        <w:tc>
+          <w:tcPr>
+            <w:tcW w:type="dxa" w:w="9746"/>
+            <w:shd w:val="clear" w:color="auto" w:fill="E8F0F8"/>
+          </w:tcPr>
+          <w:p>
+            <w:r/>
+            <w:r>
+              <w:rPr>
+                <w:b/>
+                <w:sz w:val="19"/>
+              </w:rPr>
+              <w:t>🔒 Cómo cuadrar a mano</w:t>
+              <w:br/>
+            </w:r>
+            <w:r>
+              <w:rPr>
+                <w:sz w:val="19"/>
+              </w:rPr>
+              <w:t>1) días pagados y sueldo en 30avos; 2) gratificación: 25% o el tope (4,75 IMM/12), el menor; 3) imponible contra el tope de 87,8 UF (prorrateado si hay menos de 30 días); 4) AFP con la tasa de SU administradora; 5) salud 7% + adicional Isapre si tiene plan en UF; 6) AFC solo indefinidos; 7) impuesto sobre la base tributable en UTM; 8) restar las cuotas de Descuentos. La vista previa por persona muestra cada línea con estos nombres; si algo no cuadra, corregir la fuente (ficha, adicional o descuento), nunca el número.</w:t>
+            </w:r>
+          </w:p>
+        </w:tc>
+      </w:tr>
+    </w:tbl>
+    <w:p>
+      <w:pPr>
+        <w:spacing w:after="40"/>
+      </w:pPr>
     </w:p>
     <w:p>
       <w:pPr>

</xml_diff>

<commit_message>
docs: Manual de RRHH v2.3 — fórmulas de la cuenta corriente de vacaciones, feriado progresivo, proporcional y provisión contable con ejemplo numérico (cap. 11.1); documentación v3.3 (v255.1)
Co-Authored-By: Claude Fable 5.1 <noreply@anthropic.com>
</commit_message>
<xml_diff>
--- a/api-gateway/public/mantenedores/documentacion/descargas/Manual-RRHH-Business-Suite.docx
+++ b/api-gateway/public/mantenedores/documentacion/descargas/Manual-RRHH-Business-Suite.docx
@@ -236,7 +236,7 @@
           <w:i w:val="0"/>
           <w:sz w:val="22"/>
         </w:rPr>
-        <w:t>Versión 2.2 · 17 de septiembre de 2026 · Suite v255.0</w:t>
+        <w:t>Versión 2.3 · 17 de septiembre de 2026 · Suite v255.1</w:t>
       </w:r>
     </w:p>
     <w:p>
@@ -578,6 +578,64 @@
                 <w:sz w:val="18"/>
               </w:rPr>
               <w:t>Cap. 15.1: fórmulas y criterios de cálculo de la liquidación de sueldo con ejemplo numérico.</w:t>
+            </w:r>
+          </w:p>
+        </w:tc>
+      </w:tr>
+      <w:tr>
+        <w:tc>
+          <w:tcPr>
+            <w:tcW w:type="dxa" w:w="907"/>
+          </w:tcPr>
+          <w:p>
+            <w:r/>
+            <w:r>
+              <w:rPr>
+                <w:sz w:val="18"/>
+              </w:rPr>
+              <w:t>2.3</w:t>
+            </w:r>
+          </w:p>
+        </w:tc>
+        <w:tc>
+          <w:tcPr>
+            <w:tcW w:type="dxa" w:w="1247"/>
+          </w:tcPr>
+          <w:p>
+            <w:r/>
+            <w:r>
+              <w:rPr>
+                <w:sz w:val="18"/>
+              </w:rPr>
+              <w:t>17-09-2026</w:t>
+            </w:r>
+          </w:p>
+        </w:tc>
+        <w:tc>
+          <w:tcPr>
+            <w:tcW w:type="dxa" w:w="2041"/>
+          </w:tcPr>
+          <w:p>
+            <w:r/>
+            <w:r>
+              <w:rPr>
+                <w:sz w:val="18"/>
+              </w:rPr>
+              <w:t>Patricio Escobar / Claude</w:t>
+            </w:r>
+          </w:p>
+        </w:tc>
+        <w:tc>
+          <w:tcPr>
+            <w:tcW w:type="dxa" w:w="5159"/>
+          </w:tcPr>
+          <w:p>
+            <w:r/>
+            <w:r>
+              <w:rPr>
+                <w:sz w:val="18"/>
+              </w:rPr>
+              <w:t>Cap. 11.1: fórmulas de la cuenta corriente de vacaciones, feriado progresivo, proporcional y provisión contable, con ejemplo numérico.</w:t>
             </w:r>
           </w:p>
         </w:tc>
@@ -8500,6 +8558,1244 @@
       <w:r>
         <w:t>Saldos del equipo muestra la provisión en pesos por persona (saldo × sueldo base ÷ 30) y el total; al cierre de mes se guarda el snapshot y sale el asiento por la variación (4002030 → 2106030 o liberación).</w:t>
       </w:r>
+    </w:p>
+    <w:p>
+      <w:pPr>
+        <w:pStyle w:val="Heading3"/>
+      </w:pPr>
+      <w:r>
+        <w:t>11.1 Fórmulas y criterios de cálculo: cuenta corriente y provisión</w:t>
+      </w:r>
+    </w:p>
+    <w:p>
+      <w:pPr>
+        <w:spacing w:after="80"/>
+      </w:pPr>
+      <w:r>
+        <w:rPr>
+          <w:b w:val="0"/>
+          <w:i w:val="0"/>
+        </w:rPr>
+        <w:t>Motor único vac-cuenta.saldoCuenta() (lo usan el formulario, la cartola, Saldos del equipo, el finiquito y la provisión) + base-remuneracion.js + rrhh-core.provisionVacaciones(). Días anuales paramétricos (vac_dias_anuales = 15).</w:t>
+      </w:r>
+    </w:p>
+    <w:tbl>
+      <w:tblPr>
+        <w:tblStyle w:val="TableGrid"/>
+        <w:tblW w:type="auto" w:w="0"/>
+        <w:jc w:val="center"/>
+        <w:tblLook w:firstColumn="1" w:firstRow="1" w:lastColumn="0" w:lastRow="0" w:noHBand="0" w:noVBand="1" w:val="04A0"/>
+      </w:tblPr>
+      <w:tblGrid>
+        <w:gridCol w:w="3249"/>
+        <w:gridCol w:w="3249"/>
+        <w:gridCol w:w="3249"/>
+      </w:tblGrid>
+      <w:tr>
+        <w:tc>
+          <w:tcPr>
+            <w:tcW w:type="dxa" w:w="2041"/>
+            <w:shd w:val="clear" w:color="auto" w:fill="1F4E79"/>
+          </w:tcPr>
+          <w:p>
+            <w:r/>
+            <w:r>
+              <w:rPr>
+                <w:b/>
+                <w:color w:val="FFFFFF"/>
+                <w:sz w:val="18"/>
+              </w:rPr>
+              <w:t>Concepto</w:t>
+            </w:r>
+          </w:p>
+        </w:tc>
+        <w:tc>
+          <w:tcPr>
+            <w:tcW w:type="dxa" w:w="5329"/>
+            <w:shd w:val="clear" w:color="auto" w:fill="1F4E79"/>
+          </w:tcPr>
+          <w:p>
+            <w:r/>
+            <w:r>
+              <w:rPr>
+                <w:b/>
+                <w:color w:val="FFFFFF"/>
+                <w:sz w:val="18"/>
+              </w:rPr>
+              <w:t>Regla / fórmula</w:t>
+            </w:r>
+          </w:p>
+        </w:tc>
+        <w:tc>
+          <w:tcPr>
+            <w:tcW w:type="dxa" w:w="1984"/>
+            <w:shd w:val="clear" w:color="auto" w:fill="1F4E79"/>
+          </w:tcPr>
+          <w:p>
+            <w:r/>
+            <w:r>
+              <w:rPr>
+                <w:b/>
+                <w:color w:val="FFFFFF"/>
+                <w:sz w:val="18"/>
+              </w:rPr>
+              <w:t>Fuente</w:t>
+            </w:r>
+          </w:p>
+        </w:tc>
+      </w:tr>
+      <w:tr>
+        <w:tc>
+          <w:tcPr>
+            <w:tcW w:type="dxa" w:w="2041"/>
+          </w:tcPr>
+          <w:p>
+            <w:r/>
+            <w:r>
+              <w:rPr>
+                <w:sz w:val="18"/>
+              </w:rPr>
+              <w:t>Período</w:t>
+            </w:r>
+          </w:p>
+        </w:tc>
+        <w:tc>
+          <w:tcPr>
+            <w:tcW w:type="dxa" w:w="5329"/>
+          </w:tcPr>
+          <w:p>
+            <w:r/>
+            <w:r>
+              <w:rPr>
+                <w:sz w:val="18"/>
+              </w:rPr>
+              <w:t>año de servicio contado desde la fecha de ingreso (aniversario a aniversario). Meses totales = meses completos entre ingreso y hoy; períodos cumplidos = meses ÷ 12 (entero); meses en curso = resto.</w:t>
+            </w:r>
+          </w:p>
+        </w:tc>
+        <w:tc>
+          <w:tcPr>
+            <w:tcW w:type="dxa" w:w="1984"/>
+          </w:tcPr>
+          <w:p>
+            <w:r/>
+            <w:r>
+              <w:rPr>
+                <w:sz w:val="18"/>
+              </w:rPr>
+              <w:t>usuarios.fecha_ingreso</w:t>
+            </w:r>
+          </w:p>
+        </w:tc>
+      </w:tr>
+      <w:tr>
+        <w:tc>
+          <w:tcPr>
+            <w:tcW w:type="dxa" w:w="2041"/>
+          </w:tcPr>
+          <w:p>
+            <w:r/>
+            <w:r>
+              <w:rPr>
+                <w:sz w:val="18"/>
+              </w:rPr>
+              <w:t>Devengo (abono)</w:t>
+            </w:r>
+          </w:p>
+        </w:tc>
+        <w:tc>
+          <w:tcPr>
+            <w:tcW w:type="dxa" w:w="5329"/>
+          </w:tcPr>
+          <w:p>
+            <w:r/>
+            <w:r>
+              <w:rPr>
+                <w:sz w:val="18"/>
+              </w:rPr>
+              <w:t>al cumplir cada período: 15 días hábiles (DEVENGO) + el feriado progresivo del período (PROGRESIVO). Lo hace el motor diario; si aún no está depositado, el saldo lo cuenta igual ("períodos virtuales").</w:t>
+            </w:r>
+          </w:p>
+        </w:tc>
+        <w:tc>
+          <w:tcPr>
+            <w:tcW w:type="dxa" w:w="1984"/>
+          </w:tcPr>
+          <w:p>
+            <w:r/>
+            <w:r>
+              <w:rPr>
+                <w:sz w:val="18"/>
+              </w:rPr>
+              <w:t>rh_vac_movimientos</w:t>
+            </w:r>
+          </w:p>
+        </w:tc>
+      </w:tr>
+      <w:tr>
+        <w:tc>
+          <w:tcPr>
+            <w:tcW w:type="dxa" w:w="2041"/>
+          </w:tcPr>
+          <w:p>
+            <w:r/>
+            <w:r>
+              <w:rPr>
+                <w:sz w:val="18"/>
+              </w:rPr>
+              <w:t>Feriado progresivo (art. 68)</w:t>
+            </w:r>
+          </w:p>
+        </w:tc>
+        <w:tc>
+          <w:tcPr>
+            <w:tcW w:type="dxa" w:w="5329"/>
+          </w:tcPr>
+          <w:p>
+            <w:r/>
+            <w:r>
+              <w:rPr>
+                <w:sz w:val="18"/>
+              </w:rPr>
+              <w:t>días extra del período N = entero( (años previos + N − 10) ÷ 3 ), mínimo 0. Los años previos se declaran en la ficha y exigen CERTIFICADO AFP. Convención (20-08-2026): se cuentan los años al CIERRE del período.</w:t>
+            </w:r>
+          </w:p>
+        </w:tc>
+        <w:tc>
+          <w:tcPr>
+            <w:tcW w:type="dxa" w:w="1984"/>
+          </w:tcPr>
+          <w:p>
+            <w:r/>
+            <w:r>
+              <w:rPr>
+                <w:sz w:val="18"/>
+              </w:rPr>
+              <w:t>rh_fichas.anos_trabajados_previos</w:t>
+            </w:r>
+          </w:p>
+        </w:tc>
+      </w:tr>
+      <w:tr>
+        <w:tc>
+          <w:tcPr>
+            <w:tcW w:type="dxa" w:w="2041"/>
+          </w:tcPr>
+          <w:p>
+            <w:r/>
+            <w:r>
+              <w:rPr>
+                <w:sz w:val="18"/>
+              </w:rPr>
+              <w:t>Cargo (uso)</w:t>
+            </w:r>
+          </w:p>
+        </w:tc>
+        <w:tc>
+          <w:tcPr>
+            <w:tcW w:type="dxa" w:w="5329"/>
+          </w:tcPr>
+          <w:p>
+            <w:r/>
+            <w:r>
+              <w:rPr>
+                <w:sz w:val="18"/>
+              </w:rPr>
+              <w:t>al aprobarse una solicitud: días hábiles entre fecha desde y hasta (sin sábados, domingos ni feriados) → TOMADO, descontando del período más antiguo (FIFO).</w:t>
+            </w:r>
+          </w:p>
+        </w:tc>
+        <w:tc>
+          <w:tcPr>
+            <w:tcW w:type="dxa" w:w="1984"/>
+          </w:tcPr>
+          <w:p>
+            <w:r/>
+            <w:r>
+              <w:rPr>
+                <w:sz w:val="18"/>
+              </w:rPr>
+              <w:t>rh_vacaciones + Feriados</w:t>
+            </w:r>
+          </w:p>
+        </w:tc>
+      </w:tr>
+      <w:tr>
+        <w:tc>
+          <w:tcPr>
+            <w:tcW w:type="dxa" w:w="2041"/>
+          </w:tcPr>
+          <w:p>
+            <w:r/>
+            <w:r>
+              <w:rPr>
+                <w:sz w:val="18"/>
+              </w:rPr>
+              <w:t>Ajuste</w:t>
+            </w:r>
+          </w:p>
+        </w:tc>
+        <w:tc>
+          <w:tcPr>
+            <w:tcW w:type="dxa" w:w="5329"/>
+          </w:tcPr>
+          <w:p>
+            <w:r/>
+            <w:r>
+              <w:rPr>
+                <w:sz w:val="18"/>
+              </w:rPr>
+              <w:t>movimiento manual de RRHH, con motivo, solo para cuadrar el histórico de AVSOFT una vez.</w:t>
+            </w:r>
+          </w:p>
+        </w:tc>
+        <w:tc>
+          <w:tcPr>
+            <w:tcW w:type="dxa" w:w="1984"/>
+          </w:tcPr>
+          <w:p>
+            <w:r/>
+            <w:r>
+              <w:rPr>
+                <w:sz w:val="18"/>
+              </w:rPr>
+              <w:t>RRHH</w:t>
+            </w:r>
+          </w:p>
+        </w:tc>
+      </w:tr>
+      <w:tr>
+        <w:tc>
+          <w:tcPr>
+            <w:tcW w:type="dxa" w:w="2041"/>
+          </w:tcPr>
+          <w:p>
+            <w:r/>
+            <w:r>
+              <w:rPr>
+                <w:sz w:val="18"/>
+              </w:rPr>
+              <w:t>Saldo de períodos</w:t>
+            </w:r>
+          </w:p>
+        </w:tc>
+        <w:tc>
+          <w:tcPr>
+            <w:tcW w:type="dxa" w:w="5329"/>
+          </w:tcPr>
+          <w:p>
+            <w:r/>
+            <w:r>
+              <w:rPr>
+                <w:sz w:val="18"/>
+              </w:rPr>
+              <w:t>suma de abonos (devengos + progresivos + ajustes) − cargos, a la fecha.</w:t>
+            </w:r>
+          </w:p>
+        </w:tc>
+        <w:tc>
+          <w:tcPr>
+            <w:tcW w:type="dxa" w:w="1984"/>
+          </w:tcPr>
+          <w:p>
+            <w:r/>
+            <w:r>
+              <w:rPr>
+                <w:sz w:val="18"/>
+              </w:rPr>
+              <w:t>motor</w:t>
+            </w:r>
+          </w:p>
+        </w:tc>
+      </w:tr>
+      <w:tr>
+        <w:tc>
+          <w:tcPr>
+            <w:tcW w:type="dxa" w:w="2041"/>
+          </w:tcPr>
+          <w:p>
+            <w:r/>
+            <w:r>
+              <w:rPr>
+                <w:sz w:val="18"/>
+              </w:rPr>
+              <w:t>Proporcional en curso (art. 73)</w:t>
+            </w:r>
+          </w:p>
+        </w:tc>
+        <w:tc>
+          <w:tcPr>
+            <w:tcW w:type="dxa" w:w="5329"/>
+          </w:tcPr>
+          <w:p>
+            <w:r/>
+            <w:r>
+              <w:rPr>
+                <w:sz w:val="18"/>
+              </w:rPr>
+              <w:t>(meses en curso + fracción del mes) × (15 + progresivo del período en curso) ÷ 12. Fracción = días desde el último aniversario mensual ÷ días de ese mes. 2 decimales.</w:t>
+            </w:r>
+          </w:p>
+        </w:tc>
+        <w:tc>
+          <w:tcPr>
+            <w:tcW w:type="dxa" w:w="1984"/>
+          </w:tcPr>
+          <w:p>
+            <w:r/>
+            <w:r>
+              <w:rPr>
+                <w:sz w:val="18"/>
+              </w:rPr>
+              <w:t>motor</w:t>
+            </w:r>
+          </w:p>
+        </w:tc>
+      </w:tr>
+      <w:tr>
+        <w:tc>
+          <w:tcPr>
+            <w:tcW w:type="dxa" w:w="2041"/>
+          </w:tcPr>
+          <w:p>
+            <w:r/>
+            <w:r>
+              <w:rPr>
+                <w:sz w:val="18"/>
+              </w:rPr>
+              <w:t>Disponibles</w:t>
+            </w:r>
+          </w:p>
+        </w:tc>
+        <w:tc>
+          <w:tcPr>
+            <w:tcW w:type="dxa" w:w="5329"/>
+          </w:tcPr>
+          <w:p>
+            <w:r/>
+            <w:r>
+              <w:rPr>
+                <w:sz w:val="18"/>
+              </w:rPr>
+              <w:t>saldo de períodos + proporcional en curso. Es lo que muestra el formulario, lo que puede pedir el colaborador y lo que paga el finiquito.</w:t>
+            </w:r>
+          </w:p>
+        </w:tc>
+        <w:tc>
+          <w:tcPr>
+            <w:tcW w:type="dxa" w:w="1984"/>
+          </w:tcPr>
+          <w:p>
+            <w:r/>
+            <w:r>
+              <w:rPr>
+                <w:sz w:val="18"/>
+              </w:rPr>
+              <w:t>motor</w:t>
+            </w:r>
+          </w:p>
+        </w:tc>
+      </w:tr>
+      <w:tr>
+        <w:tc>
+          <w:tcPr>
+            <w:tcW w:type="dxa" w:w="2041"/>
+          </w:tcPr>
+          <w:p>
+            <w:r/>
+            <w:r>
+              <w:rPr>
+                <w:sz w:val="18"/>
+              </w:rPr>
+              <w:t>Base de la provisión</w:t>
+            </w:r>
+          </w:p>
+        </w:tc>
+        <w:tc>
+          <w:tcPr>
+            <w:tcW w:type="dxa" w:w="5329"/>
+          </w:tcPr>
+          <w:p>
+            <w:r/>
+            <w:r>
+              <w:rPr>
+                <w:sz w:val="18"/>
+              </w:rPr>
+              <w:t>promedio del imponible de las 3 últimas liquidaciones emitidas SIN gratificación (base del feriado); cascada motor → AVSOFT → sueldo base.</w:t>
+            </w:r>
+          </w:p>
+        </w:tc>
+        <w:tc>
+          <w:tcPr>
+            <w:tcW w:type="dxa" w:w="1984"/>
+          </w:tcPr>
+          <w:p>
+            <w:r/>
+            <w:r>
+              <w:rPr>
+                <w:sz w:val="18"/>
+              </w:rPr>
+              <w:t>base-remuneracion.js</w:t>
+            </w:r>
+          </w:p>
+        </w:tc>
+      </w:tr>
+      <w:tr>
+        <w:tc>
+          <w:tcPr>
+            <w:tcW w:type="dxa" w:w="2041"/>
+          </w:tcPr>
+          <w:p>
+            <w:r/>
+            <w:r>
+              <w:rPr>
+                <w:sz w:val="18"/>
+              </w:rPr>
+              <w:t>Provisión por persona</w:t>
+            </w:r>
+          </w:p>
+        </w:tc>
+        <w:tc>
+          <w:tcPr>
+            <w:tcW w:type="dxa" w:w="5329"/>
+          </w:tcPr>
+          <w:p>
+            <w:r/>
+            <w:r>
+              <w:rPr>
+                <w:sz w:val="18"/>
+              </w:rPr>
+              <w:t>disponibles × 1,4 × base ÷ 30 (el 1,4 convierte hábiles en corridos de forma aproximada; el finiquito real los proyecta en el calendario).</w:t>
+            </w:r>
+          </w:p>
+        </w:tc>
+        <w:tc>
+          <w:tcPr>
+            <w:tcW w:type="dxa" w:w="1984"/>
+          </w:tcPr>
+          <w:p>
+            <w:r/>
+            <w:r>
+              <w:rPr>
+                <w:sz w:val="18"/>
+              </w:rPr>
+              <w:t>rrhh-core.provisionVacaciones</w:t>
+            </w:r>
+          </w:p>
+        </w:tc>
+      </w:tr>
+      <w:tr>
+        <w:tc>
+          <w:tcPr>
+            <w:tcW w:type="dxa" w:w="2041"/>
+          </w:tcPr>
+          <w:p>
+            <w:r/>
+            <w:r>
+              <w:rPr>
+                <w:sz w:val="18"/>
+              </w:rPr>
+              <w:t>Provisión del equipo</w:t>
+            </w:r>
+          </w:p>
+        </w:tc>
+        <w:tc>
+          <w:tcPr>
+            <w:tcW w:type="dxa" w:w="5329"/>
+          </w:tcPr>
+          <w:p>
+            <w:r/>
+            <w:r>
+              <w:rPr>
+                <w:sz w:val="18"/>
+              </w:rPr>
+              <w:t>suma de las provisiones de los activos (Saldos del equipo). Al cierre de mes se guarda el snapshot.</w:t>
+            </w:r>
+          </w:p>
+        </w:tc>
+        <w:tc>
+          <w:tcPr>
+            <w:tcW w:type="dxa" w:w="1984"/>
+          </w:tcPr>
+          <w:p>
+            <w:r/>
+            <w:r>
+              <w:rPr>
+                <w:sz w:val="18"/>
+              </w:rPr>
+              <w:t>Cierre de Mes</w:t>
+            </w:r>
+          </w:p>
+        </w:tc>
+      </w:tr>
+      <w:tr>
+        <w:tc>
+          <w:tcPr>
+            <w:tcW w:type="dxa" w:w="2041"/>
+          </w:tcPr>
+          <w:p>
+            <w:r/>
+            <w:r>
+              <w:rPr>
+                <w:sz w:val="18"/>
+              </w:rPr>
+              <w:t>Asiento mensual</w:t>
+            </w:r>
+          </w:p>
+        </w:tc>
+        <w:tc>
+          <w:tcPr>
+            <w:tcW w:type="dxa" w:w="5329"/>
+          </w:tcPr>
+          <w:p>
+            <w:r/>
+            <w:r>
+              <w:rPr>
+                <w:sz w:val="18"/>
+              </w:rPr>
+              <w:t>variación = provisión de este mes − provisión del mes anterior. Si sube: DEBE 4002030 Gasto provisión / HABER 2106030 Provisión por pagar (constitución). Si baja: al revés (liberación). Regla paramétrica en Reglas de Centralización.</w:t>
+            </w:r>
+          </w:p>
+        </w:tc>
+        <w:tc>
+          <w:tcPr>
+            <w:tcW w:type="dxa" w:w="1984"/>
+          </w:tcPr>
+          <w:p>
+            <w:r/>
+            <w:r>
+              <w:rPr>
+                <w:sz w:val="18"/>
+              </w:rPr>
+              <w:t>motor-asientos</w:t>
+            </w:r>
+          </w:p>
+        </w:tc>
+      </w:tr>
+      <w:tr>
+        <w:tc>
+          <w:tcPr>
+            <w:tcW w:type="dxa" w:w="2041"/>
+          </w:tcPr>
+          <w:p>
+            <w:r/>
+            <w:r>
+              <w:rPr>
+                <w:sz w:val="18"/>
+              </w:rPr>
+              <w:t>Pago</w:t>
+            </w:r>
+          </w:p>
+        </w:tc>
+        <w:tc>
+          <w:tcPr>
+            <w:tcW w:type="dxa" w:w="5329"/>
+          </w:tcPr>
+          <w:p>
+            <w:r/>
+            <w:r>
+              <w:rPr>
+                <w:sz w:val="18"/>
+              </w:rPr>
+              <w:t>las vacaciones tomadas se pagan en la liquidación normal del mes (sueldo completo; con renta variable además el feriado variable, cap. 15). Al término, el saldo se paga en el finiquito (cap. 25).</w:t>
+            </w:r>
+          </w:p>
+        </w:tc>
+        <w:tc>
+          <w:tcPr>
+            <w:tcW w:type="dxa" w:w="1984"/>
+          </w:tcPr>
+          <w:p>
+            <w:r/>
+            <w:r>
+              <w:rPr>
+                <w:sz w:val="18"/>
+              </w:rPr>
+            </w:r>
+          </w:p>
+        </w:tc>
+      </w:tr>
+    </w:tbl>
+    <w:p>
+      <w:pPr>
+        <w:spacing w:after="40"/>
+      </w:pPr>
+    </w:p>
+    <w:p>
+      <w:pPr>
+        <w:spacing w:after="40"/>
+      </w:pPr>
+      <w:r>
+        <w:rPr>
+          <w:b/>
+          <w:i w:val="0"/>
+          <w:color w:val="1F4E79"/>
+        </w:rPr>
+        <w:t>Ejemplo numérico</w:t>
+      </w:r>
+    </w:p>
+    <w:p>
+      <w:pPr>
+        <w:spacing w:after="80"/>
+      </w:pPr>
+      <w:r>
+        <w:rPr>
+          <w:b w:val="0"/>
+          <w:i w:val="0"/>
+        </w:rPr>
+        <w:t>Colaboradora ingresada el 01-03-2021, con 8 años previos declarados (certificado AFP en la carpeta), consultada el 17-09-2026. Ha tomado 40 días hábiles. Base del feriado (promedio 3 últimas liquidaciones sin gratificación): $1.253.333.</w:t>
+      </w:r>
+    </w:p>
+    <w:tbl>
+      <w:tblPr>
+        <w:tblStyle w:val="TableGrid"/>
+        <w:tblW w:type="auto" w:w="0"/>
+        <w:jc w:val="center"/>
+        <w:tblLook w:firstColumn="1" w:firstRow="1" w:lastColumn="0" w:lastRow="0" w:noHBand="0" w:noVBand="1" w:val="04A0"/>
+      </w:tblPr>
+      <w:tblGrid>
+        <w:gridCol w:w="3249"/>
+        <w:gridCol w:w="3249"/>
+        <w:gridCol w:w="3249"/>
+      </w:tblGrid>
+      <w:tr>
+        <w:tc>
+          <w:tcPr>
+            <w:tcW w:type="dxa" w:w="2041"/>
+            <w:shd w:val="clear" w:color="auto" w:fill="1F4E79"/>
+          </w:tcPr>
+          <w:p>
+            <w:r/>
+            <w:r>
+              <w:rPr>
+                <w:b/>
+                <w:color w:val="FFFFFF"/>
+                <w:sz w:val="18"/>
+              </w:rPr>
+              <w:t>Paso</w:t>
+            </w:r>
+          </w:p>
+        </w:tc>
+        <w:tc>
+          <w:tcPr>
+            <w:tcW w:type="dxa" w:w="5329"/>
+            <w:shd w:val="clear" w:color="auto" w:fill="1F4E79"/>
+          </w:tcPr>
+          <w:p>
+            <w:r/>
+            <w:r>
+              <w:rPr>
+                <w:b/>
+                <w:color w:val="FFFFFF"/>
+                <w:sz w:val="18"/>
+              </w:rPr>
+              <w:t>Cálculo</w:t>
+            </w:r>
+          </w:p>
+        </w:tc>
+        <w:tc>
+          <w:tcPr>
+            <w:tcW w:type="dxa" w:w="1984"/>
+            <w:shd w:val="clear" w:color="auto" w:fill="1F4E79"/>
+          </w:tcPr>
+          <w:p>
+            <w:r/>
+            <w:r>
+              <w:rPr>
+                <w:b/>
+                <w:color w:val="FFFFFF"/>
+                <w:sz w:val="18"/>
+              </w:rPr>
+              <w:t>Resultado</w:t>
+            </w:r>
+          </w:p>
+        </w:tc>
+      </w:tr>
+      <w:tr>
+        <w:tc>
+          <w:tcPr>
+            <w:tcW w:type="dxa" w:w="2041"/>
+          </w:tcPr>
+          <w:p>
+            <w:r/>
+            <w:r>
+              <w:rPr>
+                <w:sz w:val="18"/>
+              </w:rPr>
+              <w:t>Meses de servicio</w:t>
+            </w:r>
+          </w:p>
+        </w:tc>
+        <w:tc>
+          <w:tcPr>
+            <w:tcW w:type="dxa" w:w="5329"/>
+          </w:tcPr>
+          <w:p>
+            <w:r/>
+            <w:r>
+              <w:rPr>
+                <w:sz w:val="18"/>
+              </w:rPr>
+              <w:t>01-03-2021 → 17-09-2026 = 66 meses → 5 períodos cumplidos, 6 meses en curso (período 6)</w:t>
+            </w:r>
+          </w:p>
+        </w:tc>
+        <w:tc>
+          <w:tcPr>
+            <w:tcW w:type="dxa" w:w="1984"/>
+          </w:tcPr>
+          <w:p>
+            <w:r/>
+            <w:r>
+              <w:rPr>
+                <w:sz w:val="18"/>
+              </w:rPr>
+              <w:t>5 períodos + 6 meses</w:t>
+            </w:r>
+          </w:p>
+        </w:tc>
+      </w:tr>
+      <w:tr>
+        <w:tc>
+          <w:tcPr>
+            <w:tcW w:type="dxa" w:w="2041"/>
+          </w:tcPr>
+          <w:p>
+            <w:r/>
+            <w:r>
+              <w:rPr>
+                <w:sz w:val="18"/>
+              </w:rPr>
+              <w:t>Progresivo por período</w:t>
+            </w:r>
+          </w:p>
+        </w:tc>
+        <w:tc>
+          <w:tcPr>
+            <w:tcW w:type="dxa" w:w="5329"/>
+          </w:tcPr>
+          <w:p>
+            <w:r/>
+            <w:r>
+              <w:rPr>
+                <w:sz w:val="18"/>
+              </w:rPr>
+              <w:t>N=1..4: entero((8+N−10)÷3) = 0 · N=5: entero(3÷3) = 1 · N=6: entero(4÷3) = 1</w:t>
+            </w:r>
+          </w:p>
+        </w:tc>
+        <w:tc>
+          <w:tcPr>
+            <w:tcW w:type="dxa" w:w="1984"/>
+          </w:tcPr>
+          <w:p>
+            <w:r/>
+            <w:r>
+              <w:rPr>
+                <w:sz w:val="18"/>
+              </w:rPr>
+              <w:t>1 día desde el período 5</w:t>
+            </w:r>
+          </w:p>
+        </w:tc>
+      </w:tr>
+      <w:tr>
+        <w:tc>
+          <w:tcPr>
+            <w:tcW w:type="dxa" w:w="2041"/>
+          </w:tcPr>
+          <w:p>
+            <w:r/>
+            <w:r>
+              <w:rPr>
+                <w:sz w:val="18"/>
+              </w:rPr>
+              <w:t>Abonos</w:t>
+            </w:r>
+          </w:p>
+        </w:tc>
+        <w:tc>
+          <w:tcPr>
+            <w:tcW w:type="dxa" w:w="5329"/>
+          </w:tcPr>
+          <w:p>
+            <w:r/>
+            <w:r>
+              <w:rPr>
+                <w:sz w:val="18"/>
+              </w:rPr>
+              <w:t>5 × 15 + 1 (progresivo del período 5)</w:t>
+            </w:r>
+          </w:p>
+        </w:tc>
+        <w:tc>
+          <w:tcPr>
+            <w:tcW w:type="dxa" w:w="1984"/>
+          </w:tcPr>
+          <w:p>
+            <w:r/>
+            <w:r>
+              <w:rPr>
+                <w:sz w:val="18"/>
+              </w:rPr>
+              <w:t>76 días</w:t>
+            </w:r>
+          </w:p>
+        </w:tc>
+      </w:tr>
+      <w:tr>
+        <w:tc>
+          <w:tcPr>
+            <w:tcW w:type="dxa" w:w="2041"/>
+          </w:tcPr>
+          <w:p>
+            <w:r/>
+            <w:r>
+              <w:rPr>
+                <w:sz w:val="18"/>
+              </w:rPr>
+              <w:t>Cargos</w:t>
+            </w:r>
+          </w:p>
+        </w:tc>
+        <w:tc>
+          <w:tcPr>
+            <w:tcW w:type="dxa" w:w="5329"/>
+          </w:tcPr>
+          <w:p>
+            <w:r/>
+            <w:r>
+              <w:rPr>
+                <w:sz w:val="18"/>
+              </w:rPr>
+              <w:t>vacaciones aprobadas (días hábiles)</w:t>
+            </w:r>
+          </w:p>
+        </w:tc>
+        <w:tc>
+          <w:tcPr>
+            <w:tcW w:type="dxa" w:w="1984"/>
+          </w:tcPr>
+          <w:p>
+            <w:r/>
+            <w:r>
+              <w:rPr>
+                <w:sz w:val="18"/>
+              </w:rPr>
+              <w:t>− 40 días</w:t>
+            </w:r>
+          </w:p>
+        </w:tc>
+      </w:tr>
+      <w:tr>
+        <w:tc>
+          <w:tcPr>
+            <w:tcW w:type="dxa" w:w="2041"/>
+          </w:tcPr>
+          <w:p>
+            <w:r/>
+            <w:r>
+              <w:rPr>
+                <w:sz w:val="18"/>
+              </w:rPr>
+              <w:t>Saldo de períodos</w:t>
+            </w:r>
+          </w:p>
+        </w:tc>
+        <w:tc>
+          <w:tcPr>
+            <w:tcW w:type="dxa" w:w="5329"/>
+          </w:tcPr>
+          <w:p>
+            <w:r/>
+            <w:r>
+              <w:rPr>
+                <w:sz w:val="18"/>
+              </w:rPr>
+              <w:t>76 − 40</w:t>
+            </w:r>
+          </w:p>
+        </w:tc>
+        <w:tc>
+          <w:tcPr>
+            <w:tcW w:type="dxa" w:w="1984"/>
+          </w:tcPr>
+          <w:p>
+            <w:r/>
+            <w:r>
+              <w:rPr>
+                <w:sz w:val="18"/>
+              </w:rPr>
+              <w:t>36 días</w:t>
+            </w:r>
+          </w:p>
+        </w:tc>
+      </w:tr>
+      <w:tr>
+        <w:tc>
+          <w:tcPr>
+            <w:tcW w:type="dxa" w:w="2041"/>
+          </w:tcPr>
+          <w:p>
+            <w:r/>
+            <w:r>
+              <w:rPr>
+                <w:sz w:val="18"/>
+              </w:rPr>
+              <w:t>Proporcional en curso</w:t>
+            </w:r>
+          </w:p>
+        </w:tc>
+        <w:tc>
+          <w:tcPr>
+            <w:tcW w:type="dxa" w:w="5329"/>
+          </w:tcPr>
+          <w:p>
+            <w:r/>
+            <w:r>
+              <w:rPr>
+                <w:sz w:val="18"/>
+              </w:rPr>
+              <w:t>fracción del mes: 16 días desde el 01-09 ÷ 30 = 0,53 → (6 + 0,53) × (15 + 1) ÷ 12</w:t>
+            </w:r>
+          </w:p>
+        </w:tc>
+        <w:tc>
+          <w:tcPr>
+            <w:tcW w:type="dxa" w:w="1984"/>
+          </w:tcPr>
+          <w:p>
+            <w:r/>
+            <w:r>
+              <w:rPr>
+                <w:sz w:val="18"/>
+              </w:rPr>
+              <w:t>8,71 días</w:t>
+            </w:r>
+          </w:p>
+        </w:tc>
+      </w:tr>
+      <w:tr>
+        <w:tc>
+          <w:tcPr>
+            <w:tcW w:type="dxa" w:w="2041"/>
+          </w:tcPr>
+          <w:p>
+            <w:r/>
+            <w:r>
+              <w:rPr>
+                <w:sz w:val="18"/>
+              </w:rPr>
+              <w:t>DISPONIBLES</w:t>
+            </w:r>
+          </w:p>
+        </w:tc>
+        <w:tc>
+          <w:tcPr>
+            <w:tcW w:type="dxa" w:w="5329"/>
+          </w:tcPr>
+          <w:p>
+            <w:r/>
+            <w:r>
+              <w:rPr>
+                <w:sz w:val="18"/>
+              </w:rPr>
+              <w:t>36 + 8,71</w:t>
+            </w:r>
+          </w:p>
+        </w:tc>
+        <w:tc>
+          <w:tcPr>
+            <w:tcW w:type="dxa" w:w="1984"/>
+          </w:tcPr>
+          <w:p>
+            <w:r/>
+            <w:r>
+              <w:rPr>
+                <w:sz w:val="18"/>
+              </w:rPr>
+              <w:t>44,71 días hábiles</w:t>
+            </w:r>
+          </w:p>
+        </w:tc>
+      </w:tr>
+      <w:tr>
+        <w:tc>
+          <w:tcPr>
+            <w:tcW w:type="dxa" w:w="2041"/>
+          </w:tcPr>
+          <w:p>
+            <w:r/>
+            <w:r>
+              <w:rPr>
+                <w:sz w:val="18"/>
+              </w:rPr>
+              <w:t>Provisión</w:t>
+            </w:r>
+          </w:p>
+        </w:tc>
+        <w:tc>
+          <w:tcPr>
+            <w:tcW w:type="dxa" w:w="5329"/>
+          </w:tcPr>
+          <w:p>
+            <w:r/>
+            <w:r>
+              <w:rPr>
+                <w:sz w:val="18"/>
+              </w:rPr>
+              <w:t>44,71 × 1,4 × 1.253.333 ÷ 30</w:t>
+            </w:r>
+          </w:p>
+        </w:tc>
+        <w:tc>
+          <w:tcPr>
+            <w:tcW w:type="dxa" w:w="1984"/>
+          </w:tcPr>
+          <w:p>
+            <w:r/>
+            <w:r>
+              <w:rPr>
+                <w:sz w:val="18"/>
+              </w:rPr>
+              <w:t>$2.615.038</w:t>
+            </w:r>
+          </w:p>
+        </w:tc>
+      </w:tr>
+      <w:tr>
+        <w:tc>
+          <w:tcPr>
+            <w:tcW w:type="dxa" w:w="2041"/>
+          </w:tcPr>
+          <w:p>
+            <w:r/>
+            <w:r>
+              <w:rPr>
+                <w:sz w:val="18"/>
+              </w:rPr>
+              <w:t>Asiento del mes (equipo)</w:t>
+            </w:r>
+          </w:p>
+        </w:tc>
+        <w:tc>
+          <w:tcPr>
+            <w:tcW w:type="dxa" w:w="5329"/>
+          </w:tcPr>
+          <w:p>
+            <w:r/>
+            <w:r>
+              <w:rPr>
+                <w:sz w:val="18"/>
+              </w:rPr>
+              <w:t>provisión total agosto $38.000.000 → septiembre $40.500.000: variación +2.500.000</w:t>
+            </w:r>
+          </w:p>
+        </w:tc>
+        <w:tc>
+          <w:tcPr>
+            <w:tcW w:type="dxa" w:w="1984"/>
+          </w:tcPr>
+          <w:p>
+            <w:r/>
+            <w:r>
+              <w:rPr>
+                <w:sz w:val="18"/>
+              </w:rPr>
+              <w:t>DEBE 4002030 / HABER 2106030 $2.500.000</w:t>
+            </w:r>
+          </w:p>
+        </w:tc>
+      </w:tr>
+      <w:tr>
+        <w:tc>
+          <w:tcPr>
+            <w:tcW w:type="dxa" w:w="2041"/>
+          </w:tcPr>
+          <w:p>
+            <w:r/>
+            <w:r>
+              <w:rPr>
+                <w:sz w:val="18"/>
+              </w:rPr>
+              <w:t>Si pide 10 días hábiles</w:t>
+            </w:r>
+          </w:p>
+        </w:tc>
+        <w:tc>
+          <w:tcPr>
+            <w:tcW w:type="dxa" w:w="5329"/>
+          </w:tcPr>
+          <w:p>
+            <w:r/>
+            <w:r>
+              <w:rPr>
+                <w:sz w:val="18"/>
+              </w:rPr>
+              <w:t>del 05-10 al 16-10-2026 → cargo 10 (FIFO al período más antiguo) → disponibles 34,71; comprobante con folio y QR; se pagan en la liquidación de octubre</w:t>
+            </w:r>
+          </w:p>
+        </w:tc>
+        <w:tc>
+          <w:tcPr>
+            <w:tcW w:type="dxa" w:w="1984"/>
+          </w:tcPr>
+          <w:p>
+            <w:r/>
+            <w:r>
+              <w:rPr>
+                <w:sz w:val="18"/>
+              </w:rPr>
+              <w:t>34,71 días</w:t>
+            </w:r>
+          </w:p>
+        </w:tc>
+      </w:tr>
+    </w:tbl>
+    <w:p>
+      <w:pPr>
+        <w:spacing w:after="40"/>
+      </w:pPr>
+    </w:p>
+    <w:tbl>
+      <w:tblPr>
+        <w:tblStyle w:val="TableGrid"/>
+        <w:tblW w:type="auto" w:w="0"/>
+        <w:tblLook w:firstColumn="1" w:firstRow="1" w:lastColumn="0" w:lastRow="0" w:noHBand="0" w:noVBand="1" w:val="04A0"/>
+      </w:tblPr>
+      <w:tblGrid>
+        <w:gridCol w:w="9746"/>
+      </w:tblGrid>
+      <w:tr>
+        <w:tc>
+          <w:tcPr>
+            <w:tcW w:type="dxa" w:w="9746"/>
+            <w:shd w:val="clear" w:color="auto" w:fill="E8F0F8"/>
+          </w:tcPr>
+          <w:p>
+            <w:r/>
+            <w:r>
+              <w:rPr>
+                <w:b/>
+                <w:sz w:val="19"/>
+              </w:rPr>
+              <w:t>🔒 Cómo cuadrar a mano</w:t>
+              <w:br/>
+            </w:r>
+            <w:r>
+              <w:rPr>
+                <w:sz w:val="19"/>
+              </w:rPr>
+              <w:t>1) contar los períodos cumplidos desde la fecha de ingreso; 2) 15 por período + progresivo si (previos + N − 10) ÷ 3 ≥ 1; 3) restar los días hábiles de cada vacación aprobada (no corridos); 4) sumar el proporcional del período en curso por meses y fracción; 5) provisión = disponibles × 1,4 × base sin gratificación ÷ 30. El extracto de la cuenta corriente muestra cada movimiento con saldo acumulado; si no cuadra con AVSOFT, se corrige con UN ajuste con motivo, nunca editando devengos.</w:t>
+            </w:r>
+          </w:p>
+        </w:tc>
+      </w:tr>
+    </w:tbl>
+    <w:p>
+      <w:pPr>
+        <w:spacing w:after="40"/>
+      </w:pPr>
     </w:p>
     <w:p>
       <w:pPr>

</xml_diff>

<commit_message>
docs: Manual de RRHH v2.4 — fórmulas de la comisión del ejecutivo (cap. 16.1) y finiquito de plazo fijo con tabla de causales (cap. 25.2), ambos con ejemplo numérico; documentación v3.4 (v255.2)
Co-Authored-By: Claude Fable 5.1 <noreply@anthropic.com>
</commit_message>
<xml_diff>
--- a/api-gateway/public/mantenedores/documentacion/descargas/Manual-RRHH-Business-Suite.docx
+++ b/api-gateway/public/mantenedores/documentacion/descargas/Manual-RRHH-Business-Suite.docx
@@ -236,7 +236,7 @@
           <w:i w:val="0"/>
           <w:sz w:val="22"/>
         </w:rPr>
-        <w:t>Versión 2.3 · 17 de septiembre de 2026 · Suite v255.1</w:t>
+        <w:t>Versión 2.4 · 17 de septiembre de 2026 · Suite v255.2</w:t>
       </w:r>
     </w:p>
     <w:p>
@@ -636,6 +636,64 @@
                 <w:sz w:val="18"/>
               </w:rPr>
               <w:t>Cap. 11.1: fórmulas de la cuenta corriente de vacaciones, feriado progresivo, proporcional y provisión contable, con ejemplo numérico.</w:t>
+            </w:r>
+          </w:p>
+        </w:tc>
+      </w:tr>
+      <w:tr>
+        <w:tc>
+          <w:tcPr>
+            <w:tcW w:type="dxa" w:w="907"/>
+          </w:tcPr>
+          <w:p>
+            <w:r/>
+            <w:r>
+              <w:rPr>
+                <w:sz w:val="18"/>
+              </w:rPr>
+              <w:t>2.4</w:t>
+            </w:r>
+          </w:p>
+        </w:tc>
+        <w:tc>
+          <w:tcPr>
+            <w:tcW w:type="dxa" w:w="1247"/>
+          </w:tcPr>
+          <w:p>
+            <w:r/>
+            <w:r>
+              <w:rPr>
+                <w:sz w:val="18"/>
+              </w:rPr>
+              <w:t>17-09-2026</w:t>
+            </w:r>
+          </w:p>
+        </w:tc>
+        <w:tc>
+          <w:tcPr>
+            <w:tcW w:type="dxa" w:w="2041"/>
+          </w:tcPr>
+          <w:p>
+            <w:r/>
+            <w:r>
+              <w:rPr>
+                <w:sz w:val="18"/>
+              </w:rPr>
+              <w:t>Patricio Escobar / Claude</w:t>
+            </w:r>
+          </w:p>
+        </w:tc>
+        <w:tc>
+          <w:tcPr>
+            <w:tcW w:type="dxa" w:w="5159"/>
+          </w:tcPr>
+          <w:p>
+            <w:r/>
+            <w:r>
+              <w:rPr>
+                <w:sz w:val="18"/>
+              </w:rPr>
+              <w:t>Cap. 16.1: fórmulas de la comisión del ejecutivo con ejemplo; cap. 25.2: finiquito de plazo fijo, tabla de causales y ejemplo.</w:t>
             </w:r>
           </w:p>
         </w:tc>
@@ -13003,6 +13061,1508 @@
     </w:p>
     <w:p>
       <w:pPr>
+        <w:pStyle w:val="Heading3"/>
+      </w:pPr>
+      <w:r>
+        <w:t>16.1 Fórmulas y criterios de cálculo de la comisión del ejecutivo</w:t>
+      </w:r>
+    </w:p>
+    <w:p>
+      <w:pPr>
+        <w:spacing w:after="80"/>
+      </w:pPr>
+      <w:r>
+        <w:rPr>
+          <w:b w:val="0"/>
+          <w:i w:val="0"/>
+        </w:rPr>
+        <w:t>Motor único shared/comision-ejecutivo.js (función pura, con tests) leído por Comisiones → Revisión, la Nómina de Comisiones y el libro. Todas las variables viven en Comisiones → Variables con vigencia por mes y bitácora; los valores de abajo son los del anexo 08-2026. RRHH no calcula: recibe la nómina, pero debe poder leerla.</w:t>
+      </w:r>
+    </w:p>
+    <w:tbl>
+      <w:tblPr>
+        <w:tblStyle w:val="TableGrid"/>
+        <w:tblW w:type="auto" w:w="0"/>
+        <w:jc w:val="center"/>
+        <w:tblLook w:firstColumn="1" w:firstRow="1" w:lastColumn="0" w:lastRow="0" w:noHBand="0" w:noVBand="1" w:val="04A0"/>
+      </w:tblPr>
+      <w:tblGrid>
+        <w:gridCol w:w="3249"/>
+        <w:gridCol w:w="3249"/>
+        <w:gridCol w:w="3249"/>
+      </w:tblGrid>
+      <w:tr>
+        <w:tc>
+          <w:tcPr>
+            <w:tcW w:type="dxa" w:w="1814"/>
+            <w:shd w:val="clear" w:color="auto" w:fill="1F4E79"/>
+          </w:tcPr>
+          <w:p>
+            <w:r/>
+            <w:r>
+              <w:rPr>
+                <w:b/>
+                <w:color w:val="FFFFFF"/>
+                <w:sz w:val="18"/>
+              </w:rPr>
+              <w:t>Capa</w:t>
+            </w:r>
+          </w:p>
+        </w:tc>
+        <w:tc>
+          <w:tcPr>
+            <w:tcW w:type="dxa" w:w="5272"/>
+            <w:shd w:val="clear" w:color="auto" w:fill="1F4E79"/>
+          </w:tcPr>
+          <w:p>
+            <w:r/>
+            <w:r>
+              <w:rPr>
+                <w:b/>
+                <w:color w:val="FFFFFF"/>
+                <w:sz w:val="18"/>
+              </w:rPr>
+              <w:t>Regla / fórmula</w:t>
+            </w:r>
+          </w:p>
+        </w:tc>
+        <w:tc>
+          <w:tcPr>
+            <w:tcW w:type="dxa" w:w="2268"/>
+            <w:shd w:val="clear" w:color="auto" w:fill="1F4E79"/>
+          </w:tcPr>
+          <w:p>
+            <w:r/>
+            <w:r>
+              <w:rPr>
+                <w:b/>
+                <w:color w:val="FFFFFF"/>
+                <w:sz w:val="18"/>
+              </w:rPr>
+              <w:t>Variable (valor vigente)</w:t>
+            </w:r>
+          </w:p>
+        </w:tc>
+      </w:tr>
+      <w:tr>
+        <w:tc>
+          <w:tcPr>
+            <w:tcW w:type="dxa" w:w="1814"/>
+          </w:tcPr>
+          <w:p>
+            <w:r/>
+            <w:r>
+              <w:rPr>
+                <w:sz w:val="18"/>
+              </w:rPr>
+              <w:t>Universo</w:t>
+            </w:r>
+          </w:p>
+        </w:tc>
+        <w:tc>
+          <w:tcPr>
+            <w:tcW w:type="dxa" w:w="5272"/>
+          </w:tcPr>
+          <w:p>
+            <w:r/>
+            <w:r>
+              <w:rPr>
+                <w:sz w:val="18"/>
+              </w:rPr>
+              <w:t>créditos OTORGADOS del ejecutivo en el mes de producción (fecha_otorgado). Externos y renta fija no comisionan.</w:t>
+            </w:r>
+          </w:p>
+        </w:tc>
+        <w:tc>
+          <w:tcPr>
+            <w:tcW w:type="dxa" w:w="2268"/>
+          </w:tcPr>
+          <w:p>
+            <w:r/>
+            <w:r>
+              <w:rPr>
+                <w:sz w:val="18"/>
+              </w:rPr>
+              <w:t>creditos, ficha (tipo de renta)</w:t>
+            </w:r>
+          </w:p>
+        </w:tc>
+      </w:tr>
+      <w:tr>
+        <w:tc>
+          <w:tcPr>
+            <w:tcW w:type="dxa" w:w="1814"/>
+          </w:tcPr>
+          <w:p>
+            <w:r/>
+            <w:r>
+              <w:rPr>
+                <w:sz w:val="18"/>
+              </w:rPr>
+              <w:t>Piso (gate)</w:t>
+            </w:r>
+          </w:p>
+        </w:tc>
+        <w:tc>
+          <w:tcPr>
+            <w:tcW w:type="dxa" w:w="5272"/>
+          </w:tcPr>
+          <w:p>
+            <w:r/>
+            <w:r>
+              <w:rPr>
+                <w:sz w:val="18"/>
+              </w:rPr>
+              <w:t>si Σ monto financiado del mes &lt; mínimo → comisión 0. Exento quien lleva menos de N meses enteros en la empresa (fecha de ingreso de Usuarios al último día del mes).</w:t>
+            </w:r>
+          </w:p>
+        </w:tc>
+        <w:tc>
+          <w:tcPr>
+            <w:tcW w:type="dxa" w:w="2268"/>
+          </w:tcPr>
+          <w:p>
+            <w:r/>
+            <w:r>
+              <w:rPr>
+                <w:sz w:val="18"/>
+              </w:rPr>
+              <w:t>minimo_monto $35.000.000 · minimo_meses_exencion 3</w:t>
+            </w:r>
+          </w:p>
+        </w:tc>
+      </w:tr>
+      <w:tr>
+        <w:tc>
+          <w:tcPr>
+            <w:tcW w:type="dxa" w:w="1814"/>
+          </w:tcPr>
+          <w:p>
+            <w:r/>
+            <w:r>
+              <w:rPr>
+                <w:sz w:val="18"/>
+              </w:rPr>
+              <w:t>Incentivo base</w:t>
+            </w:r>
+          </w:p>
+        </w:tc>
+        <w:tc>
+          <w:tcPr>
+            <w:tcW w:type="dxa" w:w="5272"/>
+          </w:tcPr>
+          <w:p>
+            <w:r/>
+            <w:r>
+              <w:rPr>
+                <w:sz w:val="18"/>
+              </w:rPr>
+              <w:t>Σ monto financiado con plazo &lt; 24 × pct_24 + Σ monto con plazo ≥ 24 × pct_mas24 (con tramo_24_tasa_menor=1 el 24 exacto paga la menor).</w:t>
+            </w:r>
+          </w:p>
+        </w:tc>
+        <w:tc>
+          <w:tcPr>
+            <w:tcW w:type="dxa" w:w="2268"/>
+          </w:tcPr>
+          <w:p>
+            <w:r/>
+            <w:r>
+              <w:rPr>
+                <w:sz w:val="18"/>
+              </w:rPr>
+              <w:t>pct_24 0,75% · pct_mas24 1,00%</w:t>
+            </w:r>
+          </w:p>
+        </w:tc>
+      </w:tr>
+      <w:tr>
+        <w:tc>
+          <w:tcPr>
+            <w:tcW w:type="dxa" w:w="1814"/>
+          </w:tcPr>
+          <w:p>
+            <w:r/>
+            <w:r>
+              <w:rPr>
+                <w:sz w:val="18"/>
+              </w:rPr>
+              <w:t>NCNU</w:t>
+            </w:r>
+          </w:p>
+        </w:tc>
+        <w:tc>
+          <w:tcPr>
+            <w:tcW w:type="dxa" w:w="5272"/>
+          </w:tcPr>
+          <w:p>
+            <w:r/>
+            <w:r>
+              <w:rPr>
+                <w:sz w:val="18"/>
+              </w:rPr>
+              <w:t>universo de medición de seguros: AUTOFIN, no CORFO, no UNIDAD. Para cesantía se excluyen además los clientes independientes (marca manual en Revisión).</w:t>
+            </w:r>
+          </w:p>
+        </w:tc>
+        <w:tc>
+          <w:tcPr>
+            <w:tcW w:type="dxa" w:w="2268"/>
+          </w:tcPr>
+          <w:p>
+            <w:r/>
+            <w:r>
+              <w:rPr>
+                <w:sz w:val="18"/>
+              </w:rPr>
+              <w:t>—</w:t>
+            </w:r>
+          </w:p>
+        </w:tc>
+      </w:tr>
+      <w:tr>
+        <w:tc>
+          <w:tcPr>
+            <w:tcW w:type="dxa" w:w="1814"/>
+          </w:tcPr>
+          <w:p>
+            <w:r/>
+            <w:r>
+              <w:rPr>
+                <w:sz w:val="18"/>
+              </w:rPr>
+              <w:t>Cruces</w:t>
+            </w:r>
+          </w:p>
+        </w:tc>
+        <w:tc>
+          <w:tcPr>
+            <w:tcW w:type="dxa" w:w="5272"/>
+          </w:tcPr>
+          <w:p>
+            <w:r/>
+            <w:r>
+              <w:rPr>
+                <w:sz w:val="18"/>
+              </w:rPr>
+              <w:t>cruce_rdh = NCNU con RDH ÷ NCNU · cruce_cesantía = con cesantía ÷ NCNU asegurables · cruce_rep = con reparaciones ÷ NCNU. Cada uno cumple solo si supera su umbral.</w:t>
+            </w:r>
+          </w:p>
+        </w:tc>
+        <w:tc>
+          <w:tcPr>
+            <w:tcW w:type="dxa" w:w="2268"/>
+          </w:tcPr>
+          <w:p>
+            <w:r/>
+            <w:r>
+              <w:rPr>
+                <w:sz w:val="18"/>
+              </w:rPr>
+              <w:t>umbral_rdh 99% · umbral_cesantia 65% · umbral_rep 55%</w:t>
+            </w:r>
+          </w:p>
+        </w:tc>
+      </w:tr>
+      <w:tr>
+        <w:tc>
+          <w:tcPr>
+            <w:tcW w:type="dxa" w:w="1814"/>
+          </w:tcPr>
+          <w:p>
+            <w:r/>
+            <w:r>
+              <w:rPr>
+                <w:sz w:val="18"/>
+              </w:rPr>
+              <w:t>Calidad</w:t>
+            </w:r>
+          </w:p>
+        </w:tc>
+        <w:tc>
+          <w:tcPr>
+            <w:tcW w:type="dxa" w:w="5272"/>
+          </w:tcPr>
+          <w:p>
+            <w:r/>
+            <w:r>
+              <w:rPr>
+                <w:sz w:val="18"/>
+              </w:rPr>
+              <w:t>todo o nada: 100% si los créditos UNIDAD del mes ≥ meta, si no 0 (calidad_proporcional=1: ops ÷ meta topado). Peso 0 en el anexo vigente.</w:t>
+            </w:r>
+          </w:p>
+        </w:tc>
+        <w:tc>
+          <w:tcPr>
+            <w:tcW w:type="dxa" w:w="2268"/>
+          </w:tcPr>
+          <w:p>
+            <w:r/>
+            <w:r>
+              <w:rPr>
+                <w:sz w:val="18"/>
+              </w:rPr>
+              <w:t>meta_unidad 3 · peso_calidad 0</w:t>
+            </w:r>
+          </w:p>
+        </w:tc>
+      </w:tr>
+      <w:tr>
+        <w:tc>
+          <w:tcPr>
+            <w:tcW w:type="dxa" w:w="1814"/>
+          </w:tcPr>
+          <w:p>
+            <w:r/>
+            <w:r>
+              <w:rPr>
+                <w:sz w:val="18"/>
+              </w:rPr>
+              <w:t>Ajuste por indicador</w:t>
+            </w:r>
+          </w:p>
+        </w:tc>
+        <w:tc>
+          <w:tcPr>
+            <w:tcW w:type="dxa" w:w="5272"/>
+          </w:tcPr>
+          <w:p>
+            <w:r/>
+            <w:r>
+              <w:rPr>
+                <w:sz w:val="18"/>
+              </w:rPr>
+              <w:t>ajuste = cruce (si cumple) × peso × factor_max. Los pesos suman 1; el factor total máximo es factor_max.</w:t>
+            </w:r>
+          </w:p>
+        </w:tc>
+        <w:tc>
+          <w:tcPr>
+            <w:tcW w:type="dxa" w:w="2268"/>
+          </w:tcPr>
+          <w:p>
+            <w:r/>
+            <w:r>
+              <w:rPr>
+                <w:sz w:val="18"/>
+              </w:rPr>
+              <w:t>peso_rdh 0,33 · peso_cesantia 0,34 · peso_rep 0,33 · factor_max 0,66</w:t>
+            </w:r>
+          </w:p>
+        </w:tc>
+      </w:tr>
+      <w:tr>
+        <w:tc>
+          <w:tcPr>
+            <w:tcW w:type="dxa" w:w="1814"/>
+          </w:tcPr>
+          <w:p>
+            <w:r/>
+            <w:r>
+              <w:rPr>
+                <w:sz w:val="18"/>
+              </w:rPr>
+              <w:t>Bonos</w:t>
+            </w:r>
+          </w:p>
+        </w:tc>
+        <w:tc>
+          <w:tcPr>
+            <w:tcW w:type="dxa" w:w="5272"/>
+          </w:tcPr>
+          <w:p>
+            <w:r/>
+            <w:r>
+              <w:rPr>
+                <w:sz w:val="18"/>
+              </w:rPr>
+              <w:t>cada bono = base de las ops NCNU que LLEVAN ese seguro (Σ monto × tasa de su tramo) × su ajuste (bono_sobre_base_total=1: sobre el incentivo base total). Bono calidad = incentivo base × ajuste calidad.</w:t>
+            </w:r>
+          </w:p>
+        </w:tc>
+        <w:tc>
+          <w:tcPr>
+            <w:tcW w:type="dxa" w:w="2268"/>
+          </w:tcPr>
+          <w:p>
+            <w:r/>
+            <w:r>
+              <w:rPr>
+                <w:sz w:val="18"/>
+              </w:rPr>
+              <w:t>bono_sobre_base_total 0</w:t>
+            </w:r>
+          </w:p>
+        </w:tc>
+      </w:tr>
+      <w:tr>
+        <w:tc>
+          <w:tcPr>
+            <w:tcW w:type="dxa" w:w="1814"/>
+          </w:tcPr>
+          <w:p>
+            <w:r/>
+            <w:r>
+              <w:rPr>
+                <w:sz w:val="18"/>
+              </w:rPr>
+              <w:t>Incentivo final</w:t>
+            </w:r>
+          </w:p>
+        </w:tc>
+        <w:tc>
+          <w:tcPr>
+            <w:tcW w:type="dxa" w:w="5272"/>
+          </w:tcPr>
+          <w:p>
+            <w:r/>
+            <w:r>
+              <w:rPr>
+                <w:sz w:val="18"/>
+              </w:rPr>
+              <w:t>incentivo base + bono RDH + bono cesantía + bono reparaciones + bono calidad.</w:t>
+            </w:r>
+          </w:p>
+        </w:tc>
+        <w:tc>
+          <w:tcPr>
+            <w:tcW w:type="dxa" w:w="2268"/>
+          </w:tcPr>
+          <w:p>
+            <w:r/>
+            <w:r>
+              <w:rPr>
+                <w:sz w:val="18"/>
+              </w:rPr>
+            </w:r>
+          </w:p>
+        </w:tc>
+      </w:tr>
+      <w:tr>
+        <w:tc>
+          <w:tcPr>
+            <w:tcW w:type="dxa" w:w="1814"/>
+          </w:tcPr>
+          <w:p>
+            <w:r/>
+            <w:r>
+              <w:rPr>
+                <w:sz w:val="18"/>
+              </w:rPr>
+              <w:t>Semana corrida (art. 45)</w:t>
+            </w:r>
+          </w:p>
+        </w:tc>
+        <w:tc>
+          <w:tcPr>
+            <w:tcW w:type="dxa" w:w="5272"/>
+          </w:tcPr>
+          <w:p>
+            <w:r/>
+            <w:r>
+              <w:rPr>
+                <w:sz w:val="18"/>
+              </w:rPr>
+              <w:t>factor del mes = 1 + (domingos + festivos) ÷ (días lunes a sábado no feriados). Con semana_corrida_calc=0 se usa el multiplicador fijo.</w:t>
+            </w:r>
+          </w:p>
+        </w:tc>
+        <w:tc>
+          <w:tcPr>
+            <w:tcW w:type="dxa" w:w="2268"/>
+          </w:tcPr>
+          <w:p>
+            <w:r/>
+            <w:r>
+              <w:rPr>
+                <w:sz w:val="18"/>
+              </w:rPr>
+              <w:t>semana_corrida_calc 1 · semana_corrida 1,1667 (fijo)</w:t>
+            </w:r>
+          </w:p>
+        </w:tc>
+      </w:tr>
+      <w:tr>
+        <w:tc>
+          <w:tcPr>
+            <w:tcW w:type="dxa" w:w="1814"/>
+          </w:tcPr>
+          <w:p>
+            <w:r/>
+            <w:r>
+              <w:rPr>
+                <w:sz w:val="18"/>
+              </w:rPr>
+              <w:t>Descuentos por prepago / anulación</w:t>
+            </w:r>
+          </w:p>
+        </w:tc>
+        <w:tc>
+          <w:tcPr>
+            <w:tcW w:type="dxa" w:w="5272"/>
+          </w:tcPr>
+          <w:p>
+            <w:r/>
+            <w:r>
+              <w:rPr>
+                <w:sz w:val="18"/>
+              </w:rPr>
+              <w:t>lo pagado por esa op (de la foto firme del mes en que comisionó): anulación → 100%; prepago con hasta 3 cuotas pagadas → 100%, hasta 6 → 50%, más → 0. Se imputa al mes siguiente al hecho (o al mes de Revisión si es manual). Nunca deja la comisión en negativo: el saldo pasa al mes siguiente.</w:t>
+            </w:r>
+          </w:p>
+        </w:tc>
+        <w:tc>
+          <w:tcPr>
+            <w:tcW w:type="dxa" w:w="2268"/>
+          </w:tcPr>
+          <w:p>
+            <w:r/>
+            <w:r>
+              <w:rPr>
+                <w:sz w:val="18"/>
+              </w:rPr>
+              <w:t>dcto_pct_anul 1 · dcto_cuotas_t1 3 / dcto_pct_t1 1 · dcto_cuotas_t2 6 / dcto_pct_t2 0,5</w:t>
+            </w:r>
+          </w:p>
+        </w:tc>
+      </w:tr>
+      <w:tr>
+        <w:tc>
+          <w:tcPr>
+            <w:tcW w:type="dxa" w:w="1814"/>
+          </w:tcPr>
+          <w:p>
+            <w:r/>
+            <w:r>
+              <w:rPr>
+                <w:sz w:val="18"/>
+              </w:rPr>
+              <w:t>Comisión a pagar</w:t>
+            </w:r>
+          </w:p>
+        </w:tc>
+        <w:tc>
+          <w:tcPr>
+            <w:tcW w:type="dxa" w:w="5272"/>
+          </w:tcPr>
+          <w:p>
+            <w:r/>
+            <w:r>
+              <w:rPr>
+                <w:sz w:val="18"/>
+              </w:rPr>
+              <w:t>(incentivo final × factor semana corrida) − descuentos ± ajustes manuales. Al aprobar queda FIRME (foto); la Nómina de Comisiones la congela; llega a la liquidación del mes siguiente (mes vencido) como "Comisiones".</w:t>
+            </w:r>
+          </w:p>
+        </w:tc>
+        <w:tc>
+          <w:tcPr>
+            <w:tcW w:type="dxa" w:w="2268"/>
+          </w:tcPr>
+          <w:p>
+            <w:r/>
+            <w:r>
+              <w:rPr>
+                <w:sz w:val="18"/>
+              </w:rPr>
+              <w:t>comisiones_aprobaciones.foto_json</w:t>
+            </w:r>
+          </w:p>
+        </w:tc>
+      </w:tr>
+      <w:tr>
+        <w:tc>
+          <w:tcPr>
+            <w:tcW w:type="dxa" w:w="1814"/>
+          </w:tcPr>
+          <w:p>
+            <w:r/>
+            <w:r>
+              <w:rPr>
+                <w:sz w:val="18"/>
+              </w:rPr>
+              <w:t>Comisión mínima garantizada</w:t>
+            </w:r>
+          </w:p>
+        </w:tc>
+        <w:tc>
+          <w:tcPr>
+            <w:tcW w:type="dxa" w:w="5272"/>
+          </w:tcPr>
+          <w:p>
+            <w:r/>
+            <w:r>
+              <w:rPr>
+                <w:sz w:val="18"/>
+              </w:rPr>
+              <w:t>si el ejecutivo tiene un mínimo pactado (Adicionales), la liquidación paga solo la diferencia cuando la comisión del mes vencido no lo alcanza.</w:t>
+            </w:r>
+          </w:p>
+        </w:tc>
+        <w:tc>
+          <w:tcPr>
+            <w:tcW w:type="dxa" w:w="2268"/>
+          </w:tcPr>
+          <w:p>
+            <w:r/>
+            <w:r>
+              <w:rPr>
+                <w:sz w:val="18"/>
+              </w:rPr>
+              <w:t>Adicionales</w:t>
+            </w:r>
+          </w:p>
+        </w:tc>
+      </w:tr>
+    </w:tbl>
+    <w:p>
+      <w:pPr>
+        <w:spacing w:after="40"/>
+      </w:pPr>
+    </w:p>
+    <w:p>
+      <w:pPr>
+        <w:spacing w:after="40"/>
+      </w:pPr>
+      <w:r>
+        <w:rPr>
+          <w:b/>
+          <w:i w:val="0"/>
+          <w:color w:val="1F4E79"/>
+        </w:rPr>
+        <w:t>Ejemplo numérico (agosto 2026)</w:t>
+      </w:r>
+    </w:p>
+    <w:p>
+      <w:pPr>
+        <w:spacing w:after="80"/>
+      </w:pPr>
+      <w:r>
+        <w:rPr>
+          <w:b w:val="0"/>
+          <w:i w:val="0"/>
+        </w:rPr>
+        <w:t>Ejecutivo con 10 créditos otorgados en agosto por $60.000.000: 3 con plazo menor a 24 cuotas ($12.000.000) y 7 con 24 o más ($48.000.000). De los 10, 1 es CORFO y 1 es UNIDAD → NCNU = 8 (2 de plazo corto por $8.000.000 y 6 largos por $40.000.000). Los 8 llevan RDH; 1 cliente es independiente → base de cesantía 7, de los cuales 5 llevan cesantía (1 corto de $4.000.000 y 4 largos de $28.000.000); 4 llevan reparaciones.</w:t>
+      </w:r>
+    </w:p>
+    <w:tbl>
+      <w:tblPr>
+        <w:tblStyle w:val="TableGrid"/>
+        <w:tblW w:type="auto" w:w="0"/>
+        <w:jc w:val="center"/>
+        <w:tblLook w:firstColumn="1" w:firstRow="1" w:lastColumn="0" w:lastRow="0" w:noHBand="0" w:noVBand="1" w:val="04A0"/>
+      </w:tblPr>
+      <w:tblGrid>
+        <w:gridCol w:w="3249"/>
+        <w:gridCol w:w="3249"/>
+        <w:gridCol w:w="3249"/>
+      </w:tblGrid>
+      <w:tr>
+        <w:tc>
+          <w:tcPr>
+            <w:tcW w:type="dxa" w:w="2041"/>
+            <w:shd w:val="clear" w:color="auto" w:fill="1F4E79"/>
+          </w:tcPr>
+          <w:p>
+            <w:r/>
+            <w:r>
+              <w:rPr>
+                <w:b/>
+                <w:color w:val="FFFFFF"/>
+                <w:sz w:val="18"/>
+              </w:rPr>
+              <w:t>Paso</w:t>
+            </w:r>
+          </w:p>
+        </w:tc>
+        <w:tc>
+          <w:tcPr>
+            <w:tcW w:type="dxa" w:w="5329"/>
+            <w:shd w:val="clear" w:color="auto" w:fill="1F4E79"/>
+          </w:tcPr>
+          <w:p>
+            <w:r/>
+            <w:r>
+              <w:rPr>
+                <w:b/>
+                <w:color w:val="FFFFFF"/>
+                <w:sz w:val="18"/>
+              </w:rPr>
+              <w:t>Cálculo</w:t>
+            </w:r>
+          </w:p>
+        </w:tc>
+        <w:tc>
+          <w:tcPr>
+            <w:tcW w:type="dxa" w:w="1984"/>
+            <w:shd w:val="clear" w:color="auto" w:fill="1F4E79"/>
+          </w:tcPr>
+          <w:p>
+            <w:r/>
+            <w:r>
+              <w:rPr>
+                <w:b/>
+                <w:color w:val="FFFFFF"/>
+                <w:sz w:val="18"/>
+              </w:rPr>
+              <w:t>Resultado</w:t>
+            </w:r>
+          </w:p>
+        </w:tc>
+      </w:tr>
+      <w:tr>
+        <w:tc>
+          <w:tcPr>
+            <w:tcW w:type="dxa" w:w="2041"/>
+          </w:tcPr>
+          <w:p>
+            <w:r/>
+            <w:r>
+              <w:rPr>
+                <w:sz w:val="18"/>
+              </w:rPr>
+              <w:t>Piso</w:t>
+            </w:r>
+          </w:p>
+        </w:tc>
+        <w:tc>
+          <w:tcPr>
+            <w:tcW w:type="dxa" w:w="5329"/>
+          </w:tcPr>
+          <w:p>
+            <w:r/>
+            <w:r>
+              <w:rPr>
+                <w:sz w:val="18"/>
+              </w:rPr>
+              <w:t>60.000.000 ≥ 35.000.000</w:t>
+            </w:r>
+          </w:p>
+        </w:tc>
+        <w:tc>
+          <w:tcPr>
+            <w:tcW w:type="dxa" w:w="1984"/>
+          </w:tcPr>
+          <w:p>
+            <w:r/>
+            <w:r>
+              <w:rPr>
+                <w:sz w:val="18"/>
+              </w:rPr>
+              <w:t>cumple</w:t>
+            </w:r>
+          </w:p>
+        </w:tc>
+      </w:tr>
+      <w:tr>
+        <w:tc>
+          <w:tcPr>
+            <w:tcW w:type="dxa" w:w="2041"/>
+          </w:tcPr>
+          <w:p>
+            <w:r/>
+            <w:r>
+              <w:rPr>
+                <w:sz w:val="18"/>
+              </w:rPr>
+              <w:t>Incentivo base</w:t>
+            </w:r>
+          </w:p>
+        </w:tc>
+        <w:tc>
+          <w:tcPr>
+            <w:tcW w:type="dxa" w:w="5329"/>
+          </w:tcPr>
+          <w:p>
+            <w:r/>
+            <w:r>
+              <w:rPr>
+                <w:sz w:val="18"/>
+              </w:rPr>
+              <w:t>12.000.000 × 0,75% + 48.000.000 × 1,00% = 90.000 + 480.000</w:t>
+            </w:r>
+          </w:p>
+        </w:tc>
+        <w:tc>
+          <w:tcPr>
+            <w:tcW w:type="dxa" w:w="1984"/>
+          </w:tcPr>
+          <w:p>
+            <w:r/>
+            <w:r>
+              <w:rPr>
+                <w:sz w:val="18"/>
+              </w:rPr>
+              <w:t>$570.000</w:t>
+            </w:r>
+          </w:p>
+        </w:tc>
+      </w:tr>
+      <w:tr>
+        <w:tc>
+          <w:tcPr>
+            <w:tcW w:type="dxa" w:w="2041"/>
+          </w:tcPr>
+          <w:p>
+            <w:r/>
+            <w:r>
+              <w:rPr>
+                <w:sz w:val="18"/>
+              </w:rPr>
+              <w:t>Cruce RDH</w:t>
+            </w:r>
+          </w:p>
+        </w:tc>
+        <w:tc>
+          <w:tcPr>
+            <w:tcW w:type="dxa" w:w="5329"/>
+          </w:tcPr>
+          <w:p>
+            <w:r/>
+            <w:r>
+              <w:rPr>
+                <w:sz w:val="18"/>
+              </w:rPr>
+              <w:t>8 ÷ 8 = 100% &gt; 99%</w:t>
+            </w:r>
+          </w:p>
+        </w:tc>
+        <w:tc>
+          <w:tcPr>
+            <w:tcW w:type="dxa" w:w="1984"/>
+          </w:tcPr>
+          <w:p>
+            <w:r/>
+            <w:r>
+              <w:rPr>
+                <w:sz w:val="18"/>
+              </w:rPr>
+              <w:t>cumple</w:t>
+            </w:r>
+          </w:p>
+        </w:tc>
+      </w:tr>
+      <w:tr>
+        <w:tc>
+          <w:tcPr>
+            <w:tcW w:type="dxa" w:w="2041"/>
+          </w:tcPr>
+          <w:p>
+            <w:r/>
+            <w:r>
+              <w:rPr>
+                <w:sz w:val="18"/>
+              </w:rPr>
+              <w:t>Cruce cesantía</w:t>
+            </w:r>
+          </w:p>
+        </w:tc>
+        <w:tc>
+          <w:tcPr>
+            <w:tcW w:type="dxa" w:w="5329"/>
+          </w:tcPr>
+          <w:p>
+            <w:r/>
+            <w:r>
+              <w:rPr>
+                <w:sz w:val="18"/>
+              </w:rPr>
+              <w:t>5 ÷ 7 = 71,4% &gt; 65%</w:t>
+            </w:r>
+          </w:p>
+        </w:tc>
+        <w:tc>
+          <w:tcPr>
+            <w:tcW w:type="dxa" w:w="1984"/>
+          </w:tcPr>
+          <w:p>
+            <w:r/>
+            <w:r>
+              <w:rPr>
+                <w:sz w:val="18"/>
+              </w:rPr>
+              <w:t>cumple</w:t>
+            </w:r>
+          </w:p>
+        </w:tc>
+      </w:tr>
+      <w:tr>
+        <w:tc>
+          <w:tcPr>
+            <w:tcW w:type="dxa" w:w="2041"/>
+          </w:tcPr>
+          <w:p>
+            <w:r/>
+            <w:r>
+              <w:rPr>
+                <w:sz w:val="18"/>
+              </w:rPr>
+              <w:t>Cruce reparaciones</w:t>
+            </w:r>
+          </w:p>
+        </w:tc>
+        <w:tc>
+          <w:tcPr>
+            <w:tcW w:type="dxa" w:w="5329"/>
+          </w:tcPr>
+          <w:p>
+            <w:r/>
+            <w:r>
+              <w:rPr>
+                <w:sz w:val="18"/>
+              </w:rPr>
+              <w:t>4 ÷ 8 = 50% ≤ 55%</w:t>
+            </w:r>
+          </w:p>
+        </w:tc>
+        <w:tc>
+          <w:tcPr>
+            <w:tcW w:type="dxa" w:w="1984"/>
+          </w:tcPr>
+          <w:p>
+            <w:r/>
+            <w:r>
+              <w:rPr>
+                <w:sz w:val="18"/>
+              </w:rPr>
+              <w:t>NO cumple → 0</w:t>
+            </w:r>
+          </w:p>
+        </w:tc>
+      </w:tr>
+      <w:tr>
+        <w:tc>
+          <w:tcPr>
+            <w:tcW w:type="dxa" w:w="2041"/>
+          </w:tcPr>
+          <w:p>
+            <w:r/>
+            <w:r>
+              <w:rPr>
+                <w:sz w:val="18"/>
+              </w:rPr>
+              <w:t>Ajuste RDH</w:t>
+            </w:r>
+          </w:p>
+        </w:tc>
+        <w:tc>
+          <w:tcPr>
+            <w:tcW w:type="dxa" w:w="5329"/>
+          </w:tcPr>
+          <w:p>
+            <w:r/>
+            <w:r>
+              <w:rPr>
+                <w:sz w:val="18"/>
+              </w:rPr>
+              <w:t>1,00 × 0,33 × 0,66</w:t>
+            </w:r>
+          </w:p>
+        </w:tc>
+        <w:tc>
+          <w:tcPr>
+            <w:tcW w:type="dxa" w:w="1984"/>
+          </w:tcPr>
+          <w:p>
+            <w:r/>
+            <w:r>
+              <w:rPr>
+                <w:sz w:val="18"/>
+              </w:rPr>
+              <w:t>0,2178</w:t>
+            </w:r>
+          </w:p>
+        </w:tc>
+      </w:tr>
+      <w:tr>
+        <w:tc>
+          <w:tcPr>
+            <w:tcW w:type="dxa" w:w="2041"/>
+          </w:tcPr>
+          <w:p>
+            <w:r/>
+            <w:r>
+              <w:rPr>
+                <w:sz w:val="18"/>
+              </w:rPr>
+              <w:t>Ajuste cesantía</w:t>
+            </w:r>
+          </w:p>
+        </w:tc>
+        <w:tc>
+          <w:tcPr>
+            <w:tcW w:type="dxa" w:w="5329"/>
+          </w:tcPr>
+          <w:p>
+            <w:r/>
+            <w:r>
+              <w:rPr>
+                <w:sz w:val="18"/>
+              </w:rPr>
+              <w:t>0,714 × 0,34 × 0,66</w:t>
+            </w:r>
+          </w:p>
+        </w:tc>
+        <w:tc>
+          <w:tcPr>
+            <w:tcW w:type="dxa" w:w="1984"/>
+          </w:tcPr>
+          <w:p>
+            <w:r/>
+            <w:r>
+              <w:rPr>
+                <w:sz w:val="18"/>
+              </w:rPr>
+              <w:t>0,1603</w:t>
+            </w:r>
+          </w:p>
+        </w:tc>
+      </w:tr>
+      <w:tr>
+        <w:tc>
+          <w:tcPr>
+            <w:tcW w:type="dxa" w:w="2041"/>
+          </w:tcPr>
+          <w:p>
+            <w:r/>
+            <w:r>
+              <w:rPr>
+                <w:sz w:val="18"/>
+              </w:rPr>
+              <w:t>Base RDH</w:t>
+            </w:r>
+          </w:p>
+        </w:tc>
+        <w:tc>
+          <w:tcPr>
+            <w:tcW w:type="dxa" w:w="5329"/>
+          </w:tcPr>
+          <w:p>
+            <w:r/>
+            <w:r>
+              <w:rPr>
+                <w:sz w:val="18"/>
+              </w:rPr>
+              <w:t>ops NCNU con RDH: 8.000.000 × 0,75% + 40.000.000 × 1% = 60.000 + 400.000</w:t>
+            </w:r>
+          </w:p>
+        </w:tc>
+        <w:tc>
+          <w:tcPr>
+            <w:tcW w:type="dxa" w:w="1984"/>
+          </w:tcPr>
+          <w:p>
+            <w:r/>
+            <w:r>
+              <w:rPr>
+                <w:sz w:val="18"/>
+              </w:rPr>
+              <w:t>$460.000</w:t>
+            </w:r>
+          </w:p>
+        </w:tc>
+      </w:tr>
+      <w:tr>
+        <w:tc>
+          <w:tcPr>
+            <w:tcW w:type="dxa" w:w="2041"/>
+          </w:tcPr>
+          <w:p>
+            <w:r/>
+            <w:r>
+              <w:rPr>
+                <w:sz w:val="18"/>
+              </w:rPr>
+              <w:t>Bono RDH</w:t>
+            </w:r>
+          </w:p>
+        </w:tc>
+        <w:tc>
+          <w:tcPr>
+            <w:tcW w:type="dxa" w:w="5329"/>
+          </w:tcPr>
+          <w:p>
+            <w:r/>
+            <w:r>
+              <w:rPr>
+                <w:sz w:val="18"/>
+              </w:rPr>
+              <w:t>460.000 × 0,2178</w:t>
+            </w:r>
+          </w:p>
+        </w:tc>
+        <w:tc>
+          <w:tcPr>
+            <w:tcW w:type="dxa" w:w="1984"/>
+          </w:tcPr>
+          <w:p>
+            <w:r/>
+            <w:r>
+              <w:rPr>
+                <w:sz w:val="18"/>
+              </w:rPr>
+              <w:t>$100.188</w:t>
+            </w:r>
+          </w:p>
+        </w:tc>
+      </w:tr>
+      <w:tr>
+        <w:tc>
+          <w:tcPr>
+            <w:tcW w:type="dxa" w:w="2041"/>
+          </w:tcPr>
+          <w:p>
+            <w:r/>
+            <w:r>
+              <w:rPr>
+                <w:sz w:val="18"/>
+              </w:rPr>
+              <w:t>Base cesantía</w:t>
+            </w:r>
+          </w:p>
+        </w:tc>
+        <w:tc>
+          <w:tcPr>
+            <w:tcW w:type="dxa" w:w="5329"/>
+          </w:tcPr>
+          <w:p>
+            <w:r/>
+            <w:r>
+              <w:rPr>
+                <w:sz w:val="18"/>
+              </w:rPr>
+              <w:t>ops con cesantía: 4.000.000 × 0,75% + 28.000.000 × 1% = 30.000 + 280.000</w:t>
+            </w:r>
+          </w:p>
+        </w:tc>
+        <w:tc>
+          <w:tcPr>
+            <w:tcW w:type="dxa" w:w="1984"/>
+          </w:tcPr>
+          <w:p>
+            <w:r/>
+            <w:r>
+              <w:rPr>
+                <w:sz w:val="18"/>
+              </w:rPr>
+              <w:t>$310.000</w:t>
+            </w:r>
+          </w:p>
+        </w:tc>
+      </w:tr>
+      <w:tr>
+        <w:tc>
+          <w:tcPr>
+            <w:tcW w:type="dxa" w:w="2041"/>
+          </w:tcPr>
+          <w:p>
+            <w:r/>
+            <w:r>
+              <w:rPr>
+                <w:sz w:val="18"/>
+              </w:rPr>
+              <w:t>Bono cesantía</w:t>
+            </w:r>
+          </w:p>
+        </w:tc>
+        <w:tc>
+          <w:tcPr>
+            <w:tcW w:type="dxa" w:w="5329"/>
+          </w:tcPr>
+          <w:p>
+            <w:r/>
+            <w:r>
+              <w:rPr>
+                <w:sz w:val="18"/>
+              </w:rPr>
+              <w:t>310.000 × 0,1603</w:t>
+            </w:r>
+          </w:p>
+        </w:tc>
+        <w:tc>
+          <w:tcPr>
+            <w:tcW w:type="dxa" w:w="1984"/>
+          </w:tcPr>
+          <w:p>
+            <w:r/>
+            <w:r>
+              <w:rPr>
+                <w:sz w:val="18"/>
+              </w:rPr>
+              <w:t>$49.689</w:t>
+            </w:r>
+          </w:p>
+        </w:tc>
+      </w:tr>
+      <w:tr>
+        <w:tc>
+          <w:tcPr>
+            <w:tcW w:type="dxa" w:w="2041"/>
+          </w:tcPr>
+          <w:p>
+            <w:r/>
+            <w:r>
+              <w:rPr>
+                <w:sz w:val="18"/>
+              </w:rPr>
+              <w:t>Incentivo final</w:t>
+            </w:r>
+          </w:p>
+        </w:tc>
+        <w:tc>
+          <w:tcPr>
+            <w:tcW w:type="dxa" w:w="5329"/>
+          </w:tcPr>
+          <w:p>
+            <w:r/>
+            <w:r>
+              <w:rPr>
+                <w:sz w:val="18"/>
+              </w:rPr>
+              <w:t>570.000 + 100.188 + 49.689</w:t>
+            </w:r>
+          </w:p>
+        </w:tc>
+        <w:tc>
+          <w:tcPr>
+            <w:tcW w:type="dxa" w:w="1984"/>
+          </w:tcPr>
+          <w:p>
+            <w:r/>
+            <w:r>
+              <w:rPr>
+                <w:sz w:val="18"/>
+              </w:rPr>
+              <w:t>$719.877</w:t>
+            </w:r>
+          </w:p>
+        </w:tc>
+      </w:tr>
+      <w:tr>
+        <w:tc>
+          <w:tcPr>
+            <w:tcW w:type="dxa" w:w="2041"/>
+          </w:tcPr>
+          <w:p>
+            <w:r/>
+            <w:r>
+              <w:rPr>
+                <w:sz w:val="18"/>
+              </w:rPr>
+              <w:t>Semana corrida agosto 2026</w:t>
+            </w:r>
+          </w:p>
+        </w:tc>
+        <w:tc>
+          <w:tcPr>
+            <w:tcW w:type="dxa" w:w="5329"/>
+          </w:tcPr>
+          <w:p>
+            <w:r/>
+            <w:r>
+              <w:rPr>
+                <w:sz w:val="18"/>
+              </w:rPr>
+              <w:t>5 domingos + 1 festivo (sáb 15) = 6; días L-S no feriados = 31 − 5 − 1 = 25 → 1 + 6 ÷ 25</w:t>
+            </w:r>
+          </w:p>
+        </w:tc>
+        <w:tc>
+          <w:tcPr>
+            <w:tcW w:type="dxa" w:w="1984"/>
+          </w:tcPr>
+          <w:p>
+            <w:r/>
+            <w:r>
+              <w:rPr>
+                <w:sz w:val="18"/>
+              </w:rPr>
+              <w:t>× 1,24</w:t>
+            </w:r>
+          </w:p>
+        </w:tc>
+      </w:tr>
+      <w:tr>
+        <w:tc>
+          <w:tcPr>
+            <w:tcW w:type="dxa" w:w="2041"/>
+          </w:tcPr>
+          <w:p>
+            <w:r/>
+            <w:r>
+              <w:rPr>
+                <w:sz w:val="18"/>
+              </w:rPr>
+              <w:t>Comisión del mes</w:t>
+            </w:r>
+          </w:p>
+        </w:tc>
+        <w:tc>
+          <w:tcPr>
+            <w:tcW w:type="dxa" w:w="5329"/>
+          </w:tcPr>
+          <w:p>
+            <w:r/>
+            <w:r>
+              <w:rPr>
+                <w:sz w:val="18"/>
+              </w:rPr>
+              <w:t>719.877 × 1,24</w:t>
+            </w:r>
+          </w:p>
+        </w:tc>
+        <w:tc>
+          <w:tcPr>
+            <w:tcW w:type="dxa" w:w="1984"/>
+          </w:tcPr>
+          <w:p>
+            <w:r/>
+            <w:r>
+              <w:rPr>
+                <w:sz w:val="18"/>
+              </w:rPr>
+              <w:t>$892.647</w:t>
+            </w:r>
+          </w:p>
+        </w:tc>
+      </w:tr>
+      <w:tr>
+        <w:tc>
+          <w:tcPr>
+            <w:tcW w:type="dxa" w:w="2041"/>
+          </w:tcPr>
+          <w:p>
+            <w:r/>
+            <w:r>
+              <w:rPr>
+                <w:sz w:val="18"/>
+              </w:rPr>
+              <w:t>Descuento</w:t>
+            </w:r>
+          </w:p>
+        </w:tc>
+        <w:tc>
+          <w:tcPr>
+            <w:tcW w:type="dxa" w:w="5329"/>
+          </w:tcPr>
+          <w:p>
+            <w:r/>
+            <w:r>
+              <w:rPr>
+                <w:sz w:val="18"/>
+              </w:rPr>
+              <w:t>una op de julio ($3.000.000, plazo largo, sin bonos) se prepagó con 2 cuotas pagadas → 100% de lo pagado por ella: 30.000 × 1,24 (semana corrida de julio 1,20 en el ejemplo) ≈ 36.000</w:t>
+            </w:r>
+          </w:p>
+        </w:tc>
+        <w:tc>
+          <w:tcPr>
+            <w:tcW w:type="dxa" w:w="1984"/>
+          </w:tcPr>
+          <w:p>
+            <w:r/>
+            <w:r>
+              <w:rPr>
+                <w:sz w:val="18"/>
+              </w:rPr>
+              <w:t>− $36.000</w:t>
+            </w:r>
+          </w:p>
+        </w:tc>
+      </w:tr>
+      <w:tr>
+        <w:tc>
+          <w:tcPr>
+            <w:tcW w:type="dxa" w:w="2041"/>
+          </w:tcPr>
+          <w:p>
+            <w:r/>
+            <w:r>
+              <w:rPr>
+                <w:sz w:val="18"/>
+              </w:rPr>
+              <w:t>A PAGAR (liquidación de septiembre)</w:t>
+            </w:r>
+          </w:p>
+        </w:tc>
+        <w:tc>
+          <w:tcPr>
+            <w:tcW w:type="dxa" w:w="5329"/>
+          </w:tcPr>
+          <w:p>
+            <w:r/>
+            <w:r>
+              <w:rPr>
+                <w:sz w:val="18"/>
+              </w:rPr>
+              <w:t>892.647 − 36.000</w:t>
+            </w:r>
+          </w:p>
+        </w:tc>
+        <w:tc>
+          <w:tcPr>
+            <w:tcW w:type="dxa" w:w="1984"/>
+          </w:tcPr>
+          <w:p>
+            <w:r/>
+            <w:r>
+              <w:rPr>
+                <w:sz w:val="18"/>
+              </w:rPr>
+              <w:t>$856.647</w:t>
+            </w:r>
+          </w:p>
+        </w:tc>
+      </w:tr>
+    </w:tbl>
+    <w:p>
+      <w:pPr>
+        <w:spacing w:after="40"/>
+      </w:pPr>
+    </w:p>
+    <w:tbl>
+      <w:tblPr>
+        <w:tblStyle w:val="TableGrid"/>
+        <w:tblW w:type="auto" w:w="0"/>
+        <w:tblLook w:firstColumn="1" w:firstRow="1" w:lastColumn="0" w:lastRow="0" w:noHBand="0" w:noVBand="1" w:val="04A0"/>
+      </w:tblPr>
+      <w:tblGrid>
+        <w:gridCol w:w="9746"/>
+      </w:tblGrid>
+      <w:tr>
+        <w:tc>
+          <w:tcPr>
+            <w:tcW w:type="dxa" w:w="9746"/>
+            <w:shd w:val="clear" w:color="auto" w:fill="E8F0F8"/>
+          </w:tcPr>
+          <w:p>
+            <w:r/>
+            <w:r>
+              <w:rPr>
+                <w:b/>
+                <w:sz w:val="19"/>
+              </w:rPr>
+              <w:t>🔒 Cómo cuadrar a mano</w:t>
+              <w:br/>
+            </w:r>
+            <w:r>
+              <w:rPr>
+                <w:sz w:val="19"/>
+              </w:rPr>
+              <w:t>Revisión de Comisiones muestra cada capa con estos mismos nombres (piso, incentivo base por tramo, cruces vs umbral, ajustes, bases y bonos, factor de semana corrida, descuentos). Si la Nómina de Comisiones no coincide con la liquidación: 1) ver si el mes está aprobado con "Valores firmes"; 2) comparar la nómina con el aviso verde del libro; 3) si cambió después, Operaciones debe Rechazar, corregir y volver a Aprobar y regenerar la nómina (con motivo). RRHH nunca edita la comisión en el libro.</w:t>
+            </w:r>
+          </w:p>
+        </w:tc>
+      </w:tr>
+    </w:tbl>
+    <w:p>
+      <w:pPr>
+        <w:spacing w:after="40"/>
+      </w:pPr>
+    </w:p>
+    <w:p>
+      <w:pPr>
         <w:spacing w:after="160"/>
         <w:jc w:val="center"/>
       </w:pPr>
@@ -16599,6 +18159,1156 @@
                 <w:sz w:val="19"/>
               </w:rPr>
               <w:t>Con el anexo del finiquito a la vista: 1) verificar los 3 meses de la base y que sean completos; 2) años = meses ÷ 12 redondeando la fracción ≥ 6; 3) comparar la base con 90 UF; 4) el feriado se cuenta en el calendario, no con factor; 5) restar la gratificación solo para el feriado; 6) el saldo de préstamos = cuotas que faltan × valor cuota. Si algún número no coincide, Recalcular antes de cerrar: cerrado no se edita.</w:t>
+            </w:r>
+          </w:p>
+        </w:tc>
+      </w:tr>
+    </w:tbl>
+    <w:p>
+      <w:pPr>
+        <w:spacing w:after="40"/>
+      </w:pPr>
+    </w:p>
+    <w:p>
+      <w:pPr>
+        <w:pStyle w:val="Heading3"/>
+      </w:pPr>
+      <w:r>
+        <w:t>25.2 Finiquito de contrato a plazo fijo</w:t>
+      </w:r>
+    </w:p>
+    <w:p>
+      <w:pPr>
+        <w:spacing w:after="80"/>
+      </w:pPr>
+      <w:r>
+        <w:rPr>
+          <w:b w:val="0"/>
+          <w:i w:val="0"/>
+        </w:rPr>
+        <w:t>El motor es el mismo; lo que cambia es la causal. El catálogo rh_finiquito_causales define por causal si lleva indemnización por años y mes de aviso:</w:t>
+      </w:r>
+    </w:p>
+    <w:tbl>
+      <w:tblPr>
+        <w:tblStyle w:val="TableGrid"/>
+        <w:tblW w:type="auto" w:w="0"/>
+        <w:jc w:val="center"/>
+        <w:tblLook w:firstColumn="1" w:firstRow="1" w:lastColumn="0" w:lastRow="0" w:noHBand="0" w:noVBand="1" w:val="04A0"/>
+      </w:tblPr>
+      <w:tblGrid>
+        <w:gridCol w:w="2436"/>
+        <w:gridCol w:w="2436"/>
+        <w:gridCol w:w="2436"/>
+        <w:gridCol w:w="2436"/>
+      </w:tblGrid>
+      <w:tr>
+        <w:tc>
+          <w:tcPr>
+            <w:tcW w:type="dxa" w:w="2381"/>
+            <w:shd w:val="clear" w:color="auto" w:fill="1F4E79"/>
+          </w:tcPr>
+          <w:p>
+            <w:r/>
+            <w:r>
+              <w:rPr>
+                <w:b/>
+                <w:color w:val="FFFFFF"/>
+                <w:sz w:val="18"/>
+              </w:rPr>
+              <w:t>Causal</w:t>
+            </w:r>
+          </w:p>
+        </w:tc>
+        <w:tc>
+          <w:tcPr>
+            <w:tcW w:type="dxa" w:w="1474"/>
+            <w:shd w:val="clear" w:color="auto" w:fill="1F4E79"/>
+          </w:tcPr>
+          <w:p>
+            <w:r/>
+            <w:r>
+              <w:rPr>
+                <w:b/>
+                <w:color w:val="FFFFFF"/>
+                <w:sz w:val="18"/>
+              </w:rPr>
+              <w:t>Indemniza años</w:t>
+            </w:r>
+          </w:p>
+        </w:tc>
+        <w:tc>
+          <w:tcPr>
+            <w:tcW w:type="dxa" w:w="1587"/>
+            <w:shd w:val="clear" w:color="auto" w:fill="1F4E79"/>
+          </w:tcPr>
+          <w:p>
+            <w:r/>
+            <w:r>
+              <w:rPr>
+                <w:b/>
+                <w:color w:val="FFFFFF"/>
+                <w:sz w:val="18"/>
+              </w:rPr>
+              <w:t>Mes de aviso</w:t>
+            </w:r>
+          </w:p>
+        </w:tc>
+        <w:tc>
+          <w:tcPr>
+            <w:tcW w:type="dxa" w:w="3912"/>
+            <w:shd w:val="clear" w:color="auto" w:fill="1F4E79"/>
+          </w:tcPr>
+          <w:p>
+            <w:r/>
+            <w:r>
+              <w:rPr>
+                <w:b/>
+                <w:color w:val="FFFFFF"/>
+                <w:sz w:val="18"/>
+              </w:rPr>
+              <w:t>Cuándo se usa</w:t>
+            </w:r>
+          </w:p>
+        </w:tc>
+      </w:tr>
+      <w:tr>
+        <w:tc>
+          <w:tcPr>
+            <w:tcW w:type="dxa" w:w="2381"/>
+          </w:tcPr>
+          <w:p>
+            <w:r/>
+            <w:r>
+              <w:rPr>
+                <w:sz w:val="18"/>
+              </w:rPr>
+              <w:t>159-1 Mutuo acuerdo</w:t>
+            </w:r>
+          </w:p>
+        </w:tc>
+        <w:tc>
+          <w:tcPr>
+            <w:tcW w:type="dxa" w:w="1474"/>
+          </w:tcPr>
+          <w:p>
+            <w:r/>
+            <w:r>
+              <w:rPr>
+                <w:sz w:val="18"/>
+              </w:rPr>
+              <w:t>No</w:t>
+            </w:r>
+          </w:p>
+        </w:tc>
+        <w:tc>
+          <w:tcPr>
+            <w:tcW w:type="dxa" w:w="1587"/>
+          </w:tcPr>
+          <w:p>
+            <w:r/>
+            <w:r>
+              <w:rPr>
+                <w:sz w:val="18"/>
+              </w:rPr>
+              <w:t>No</w:t>
+            </w:r>
+          </w:p>
+        </w:tc>
+        <w:tc>
+          <w:tcPr>
+            <w:tcW w:type="dxa" w:w="3912"/>
+          </w:tcPr>
+          <w:p>
+            <w:r/>
+            <w:r>
+              <w:rPr>
+                <w:sz w:val="18"/>
+              </w:rPr>
+              <w:t>Acuerdo de las partes (puede pactarse un monto voluntario como otro haber).</w:t>
+            </w:r>
+          </w:p>
+        </w:tc>
+      </w:tr>
+      <w:tr>
+        <w:tc>
+          <w:tcPr>
+            <w:tcW w:type="dxa" w:w="2381"/>
+          </w:tcPr>
+          <w:p>
+            <w:r/>
+            <w:r>
+              <w:rPr>
+                <w:sz w:val="18"/>
+              </w:rPr>
+              <w:t>159-2 Renuncia</w:t>
+            </w:r>
+          </w:p>
+        </w:tc>
+        <w:tc>
+          <w:tcPr>
+            <w:tcW w:type="dxa" w:w="1474"/>
+          </w:tcPr>
+          <w:p>
+            <w:r/>
+            <w:r>
+              <w:rPr>
+                <w:sz w:val="18"/>
+              </w:rPr>
+              <w:t>No</w:t>
+            </w:r>
+          </w:p>
+        </w:tc>
+        <w:tc>
+          <w:tcPr>
+            <w:tcW w:type="dxa" w:w="1587"/>
+          </w:tcPr>
+          <w:p>
+            <w:r/>
+            <w:r>
+              <w:rPr>
+                <w:sz w:val="18"/>
+              </w:rPr>
+              <w:t>No</w:t>
+            </w:r>
+          </w:p>
+        </w:tc>
+        <w:tc>
+          <w:tcPr>
+            <w:tcW w:type="dxa" w:w="3912"/>
+          </w:tcPr>
+          <w:p>
+            <w:r/>
+            <w:r>
+              <w:rPr>
+                <w:sz w:val="18"/>
+              </w:rPr>
+              <w:t>Renuncia con 30 días de aviso del trabajador.</w:t>
+            </w:r>
+          </w:p>
+        </w:tc>
+      </w:tr>
+      <w:tr>
+        <w:tc>
+          <w:tcPr>
+            <w:tcW w:type="dxa" w:w="2381"/>
+          </w:tcPr>
+          <w:p>
+            <w:r/>
+            <w:r>
+              <w:rPr>
+                <w:sz w:val="18"/>
+              </w:rPr>
+              <w:t>159-4 Vencimiento del plazo</w:t>
+            </w:r>
+          </w:p>
+        </w:tc>
+        <w:tc>
+          <w:tcPr>
+            <w:tcW w:type="dxa" w:w="1474"/>
+          </w:tcPr>
+          <w:p>
+            <w:r/>
+            <w:r>
+              <w:rPr>
+                <w:sz w:val="18"/>
+              </w:rPr>
+              <w:t>No</w:t>
+            </w:r>
+          </w:p>
+        </w:tc>
+        <w:tc>
+          <w:tcPr>
+            <w:tcW w:type="dxa" w:w="1587"/>
+          </w:tcPr>
+          <w:p>
+            <w:r/>
+            <w:r>
+              <w:rPr>
+                <w:sz w:val="18"/>
+              </w:rPr>
+              <w:t>No</w:t>
+            </w:r>
+          </w:p>
+        </w:tc>
+        <w:tc>
+          <w:tcPr>
+            <w:tcW w:type="dxa" w:w="3912"/>
+          </w:tcPr>
+          <w:p>
+            <w:r/>
+            <w:r>
+              <w:rPr>
+                <w:sz w:val="18"/>
+              </w:rPr>
+              <w:t>Contrato a plazo fijo que termina en su fecha.</w:t>
+            </w:r>
+          </w:p>
+        </w:tc>
+      </w:tr>
+      <w:tr>
+        <w:tc>
+          <w:tcPr>
+            <w:tcW w:type="dxa" w:w="2381"/>
+          </w:tcPr>
+          <w:p>
+            <w:r/>
+            <w:r>
+              <w:rPr>
+                <w:sz w:val="18"/>
+              </w:rPr>
+              <w:t>159-5 Conclusión del trabajo</w:t>
+            </w:r>
+          </w:p>
+        </w:tc>
+        <w:tc>
+          <w:tcPr>
+            <w:tcW w:type="dxa" w:w="1474"/>
+          </w:tcPr>
+          <w:p>
+            <w:r/>
+            <w:r>
+              <w:rPr>
+                <w:sz w:val="18"/>
+              </w:rPr>
+              <w:t>No</w:t>
+            </w:r>
+          </w:p>
+        </w:tc>
+        <w:tc>
+          <w:tcPr>
+            <w:tcW w:type="dxa" w:w="1587"/>
+          </w:tcPr>
+          <w:p>
+            <w:r/>
+            <w:r>
+              <w:rPr>
+                <w:sz w:val="18"/>
+              </w:rPr>
+              <w:t>No</w:t>
+            </w:r>
+          </w:p>
+        </w:tc>
+        <w:tc>
+          <w:tcPr>
+            <w:tcW w:type="dxa" w:w="3912"/>
+          </w:tcPr>
+          <w:p>
+            <w:r/>
+            <w:r>
+              <w:rPr>
+                <w:sz w:val="18"/>
+              </w:rPr>
+              <w:t>Obra o faena.</w:t>
+            </w:r>
+          </w:p>
+        </w:tc>
+      </w:tr>
+      <w:tr>
+        <w:tc>
+          <w:tcPr>
+            <w:tcW w:type="dxa" w:w="2381"/>
+          </w:tcPr>
+          <w:p>
+            <w:r/>
+            <w:r>
+              <w:rPr>
+                <w:sz w:val="18"/>
+              </w:rPr>
+              <w:t>159-6 Caso fortuito</w:t>
+            </w:r>
+          </w:p>
+        </w:tc>
+        <w:tc>
+          <w:tcPr>
+            <w:tcW w:type="dxa" w:w="1474"/>
+          </w:tcPr>
+          <w:p>
+            <w:r/>
+            <w:r>
+              <w:rPr>
+                <w:sz w:val="18"/>
+              </w:rPr>
+              <w:t>No</w:t>
+            </w:r>
+          </w:p>
+        </w:tc>
+        <w:tc>
+          <w:tcPr>
+            <w:tcW w:type="dxa" w:w="1587"/>
+          </w:tcPr>
+          <w:p>
+            <w:r/>
+            <w:r>
+              <w:rPr>
+                <w:sz w:val="18"/>
+              </w:rPr>
+              <w:t>No</w:t>
+            </w:r>
+          </w:p>
+        </w:tc>
+        <w:tc>
+          <w:tcPr>
+            <w:tcW w:type="dxa" w:w="3912"/>
+          </w:tcPr>
+          <w:p>
+            <w:r/>
+            <w:r>
+              <w:rPr>
+                <w:sz w:val="18"/>
+              </w:rPr>
+              <w:t>Fuerza mayor.</w:t>
+            </w:r>
+          </w:p>
+        </w:tc>
+      </w:tr>
+      <w:tr>
+        <w:tc>
+          <w:tcPr>
+            <w:tcW w:type="dxa" w:w="2381"/>
+          </w:tcPr>
+          <w:p>
+            <w:r/>
+            <w:r>
+              <w:rPr>
+                <w:sz w:val="18"/>
+              </w:rPr>
+              <w:t>160 Caducidad</w:t>
+            </w:r>
+          </w:p>
+        </w:tc>
+        <w:tc>
+          <w:tcPr>
+            <w:tcW w:type="dxa" w:w="1474"/>
+          </w:tcPr>
+          <w:p>
+            <w:r/>
+            <w:r>
+              <w:rPr>
+                <w:sz w:val="18"/>
+              </w:rPr>
+              <w:t>No</w:t>
+            </w:r>
+          </w:p>
+        </w:tc>
+        <w:tc>
+          <w:tcPr>
+            <w:tcW w:type="dxa" w:w="1587"/>
+          </w:tcPr>
+          <w:p>
+            <w:r/>
+            <w:r>
+              <w:rPr>
+                <w:sz w:val="18"/>
+              </w:rPr>
+              <w:t>No</w:t>
+            </w:r>
+          </w:p>
+        </w:tc>
+        <w:tc>
+          <w:tcPr>
+            <w:tcW w:type="dxa" w:w="3912"/>
+          </w:tcPr>
+          <w:p>
+            <w:r/>
+            <w:r>
+              <w:rPr>
+                <w:sz w:val="18"/>
+              </w:rPr>
+              <w:t>Causales imputables al trabajador (ej. ausencias art. 160 N°3 detectadas por el sistema).</w:t>
+            </w:r>
+          </w:p>
+        </w:tc>
+      </w:tr>
+      <w:tr>
+        <w:tc>
+          <w:tcPr>
+            <w:tcW w:type="dxa" w:w="2381"/>
+          </w:tcPr>
+          <w:p>
+            <w:r/>
+            <w:r>
+              <w:rPr>
+                <w:sz w:val="18"/>
+              </w:rPr>
+              <w:t>161-1 Necesidades de la empresa</w:t>
+            </w:r>
+          </w:p>
+        </w:tc>
+        <w:tc>
+          <w:tcPr>
+            <w:tcW w:type="dxa" w:w="1474"/>
+          </w:tcPr>
+          <w:p>
+            <w:r/>
+            <w:r>
+              <w:rPr>
+                <w:sz w:val="18"/>
+              </w:rPr>
+              <w:t>Sí</w:t>
+            </w:r>
+          </w:p>
+        </w:tc>
+        <w:tc>
+          <w:tcPr>
+            <w:tcW w:type="dxa" w:w="1587"/>
+          </w:tcPr>
+          <w:p>
+            <w:r/>
+            <w:r>
+              <w:rPr>
+                <w:sz w:val="18"/>
+              </w:rPr>
+              <w:t>Sí (si no se avisó)</w:t>
+            </w:r>
+          </w:p>
+        </w:tc>
+        <w:tc>
+          <w:tcPr>
+            <w:tcW w:type="dxa" w:w="3912"/>
+          </w:tcPr>
+          <w:p>
+            <w:r/>
+            <w:r>
+              <w:rPr>
+                <w:sz w:val="18"/>
+              </w:rPr>
+              <w:t>Indefinidos.</w:t>
+            </w:r>
+          </w:p>
+        </w:tc>
+      </w:tr>
+      <w:tr>
+        <w:tc>
+          <w:tcPr>
+            <w:tcW w:type="dxa" w:w="2381"/>
+          </w:tcPr>
+          <w:p>
+            <w:r/>
+            <w:r>
+              <w:rPr>
+                <w:sz w:val="18"/>
+              </w:rPr>
+              <w:t>161-2 Desahucio</w:t>
+            </w:r>
+          </w:p>
+        </w:tc>
+        <w:tc>
+          <w:tcPr>
+            <w:tcW w:type="dxa" w:w="1474"/>
+          </w:tcPr>
+          <w:p>
+            <w:r/>
+            <w:r>
+              <w:rPr>
+                <w:sz w:val="18"/>
+              </w:rPr>
+              <w:t>Sí</w:t>
+            </w:r>
+          </w:p>
+        </w:tc>
+        <w:tc>
+          <w:tcPr>
+            <w:tcW w:type="dxa" w:w="1587"/>
+          </w:tcPr>
+          <w:p>
+            <w:r/>
+            <w:r>
+              <w:rPr>
+                <w:sz w:val="18"/>
+              </w:rPr>
+              <w:t>Sí (si no se avisó)</w:t>
+            </w:r>
+          </w:p>
+        </w:tc>
+        <w:tc>
+          <w:tcPr>
+            <w:tcW w:type="dxa" w:w="3912"/>
+          </w:tcPr>
+          <w:p>
+            <w:r/>
+            <w:r>
+              <w:rPr>
+                <w:sz w:val="18"/>
+              </w:rPr>
+              <w:t>Cargos de confianza.</w:t>
+            </w:r>
+          </w:p>
+        </w:tc>
+      </w:tr>
+    </w:tbl>
+    <w:p>
+      <w:pPr>
+        <w:spacing w:after="40"/>
+      </w:pPr>
+    </w:p>
+    <w:p>
+      <w:pPr>
+        <w:pStyle w:val="ListBullet"/>
+        <w:spacing w:after="40"/>
+      </w:pPr>
+      <w:r>
+        <w:rPr>
+          <w:b/>
+        </w:rPr>
+        <w:t xml:space="preserve">Reglas del plazo fijo que el sistema aplica: </w:t>
+      </w:r>
+      <w:r>
+        <w:t>la ficha guarda hasta dos vencimientos (contrato y una renovación); 30 días antes de cada uno avisa a RRHH por campana; si el último vence y la persona sigue activa, la ficha pasa sola a INDEFINIDO (art. 159 N°4: continuar prestando servicios con conocimiento del empleador) y se avisa; una segunda renovación también lo vuelve indefinido (registrar como tal, no como tercer vencimiento). Máximo legal 1 año (2 para profesionales).</w:t>
+      </w:r>
+    </w:p>
+    <w:p>
+      <w:pPr>
+        <w:pStyle w:val="ListBullet"/>
+        <w:spacing w:after="40"/>
+      </w:pPr>
+      <w:r>
+        <w:rPr>
+          <w:b/>
+        </w:rPr>
+        <w:t xml:space="preserve">Lo que NO calcula el motor: </w:t>
+      </w:r>
+      <w:r>
+        <w:t>si el empleador termina el plazo fijo ANTES del vencimiento sin causal, corresponde el lucro cesante (las remuneraciones que faltaban hasta el vencimiento). Se agrega como "otro haber" con asesoría legal.</w:t>
+      </w:r>
+    </w:p>
+    <w:p>
+      <w:pPr>
+        <w:pStyle w:val="ListBullet"/>
+        <w:spacing w:after="40"/>
+      </w:pPr>
+      <w:r>
+        <w:rPr>
+          <w:b/>
+        </w:rPr>
+        <w:t xml:space="preserve">Diferencias en la liquidación: </w:t>
+      </w:r>
+      <w:r>
+        <w:t>el plazo fijo no cotiza AFC como trabajador (el empleador paga 3% en vez de 2,4%), no tiene seguro complementario de salud ni casilla en su nómina, y en Edenred y vacaciones se trata igual que cualquier contrato.</w:t>
+      </w:r>
+    </w:p>
+    <w:p>
+      <w:pPr>
+        <w:spacing w:after="40"/>
+      </w:pPr>
+      <w:r>
+        <w:rPr>
+          <w:b/>
+          <w:i w:val="0"/>
+          <w:color w:val="1F4E79"/>
+        </w:rPr>
+        <w:t>Ejemplo numérico</w:t>
+      </w:r>
+    </w:p>
+    <w:p>
+      <w:pPr>
+        <w:spacing w:after="80"/>
+      </w:pPr>
+      <w:r>
+        <w:rPr>
+          <w:b w:val="0"/>
+          <w:i w:val="0"/>
+        </w:rPr>
+        <w:t>Colaborador a plazo fijo del 01-03-2026 al 31-08-2026, sueldo base $700.000 sin variable (gratificación mensual $175.000), término por vencimiento del plazo (159-4). No tomó vacaciones. Anticipo de 3 cuotas de $60.000 iniciado en julio.</w:t>
+      </w:r>
+    </w:p>
+    <w:tbl>
+      <w:tblPr>
+        <w:tblStyle w:val="TableGrid"/>
+        <w:tblW w:type="auto" w:w="0"/>
+        <w:jc w:val="center"/>
+        <w:tblLook w:firstColumn="1" w:firstRow="1" w:lastColumn="0" w:lastRow="0" w:noHBand="0" w:noVBand="1" w:val="04A0"/>
+      </w:tblPr>
+      <w:tblGrid>
+        <w:gridCol w:w="3249"/>
+        <w:gridCol w:w="3249"/>
+        <w:gridCol w:w="3249"/>
+      </w:tblGrid>
+      <w:tr>
+        <w:tc>
+          <w:tcPr>
+            <w:tcW w:type="dxa" w:w="2041"/>
+            <w:shd w:val="clear" w:color="auto" w:fill="1F4E79"/>
+          </w:tcPr>
+          <w:p>
+            <w:r/>
+            <w:r>
+              <w:rPr>
+                <w:b/>
+                <w:color w:val="FFFFFF"/>
+                <w:sz w:val="18"/>
+              </w:rPr>
+              <w:t>Paso</w:t>
+            </w:r>
+          </w:p>
+        </w:tc>
+        <w:tc>
+          <w:tcPr>
+            <w:tcW w:type="dxa" w:w="5329"/>
+            <w:shd w:val="clear" w:color="auto" w:fill="1F4E79"/>
+          </w:tcPr>
+          <w:p>
+            <w:r/>
+            <w:r>
+              <w:rPr>
+                <w:b/>
+                <w:color w:val="FFFFFF"/>
+                <w:sz w:val="18"/>
+              </w:rPr>
+              <w:t>Cálculo</w:t>
+            </w:r>
+          </w:p>
+        </w:tc>
+        <w:tc>
+          <w:tcPr>
+            <w:tcW w:type="dxa" w:w="1984"/>
+            <w:shd w:val="clear" w:color="auto" w:fill="1F4E79"/>
+          </w:tcPr>
+          <w:p>
+            <w:r/>
+            <w:r>
+              <w:rPr>
+                <w:b/>
+                <w:color w:val="FFFFFF"/>
+                <w:sz w:val="18"/>
+              </w:rPr>
+              <w:t>Resultado</w:t>
+            </w:r>
+          </w:p>
+        </w:tc>
+      </w:tr>
+      <w:tr>
+        <w:tc>
+          <w:tcPr>
+            <w:tcW w:type="dxa" w:w="2041"/>
+          </w:tcPr>
+          <w:p>
+            <w:r/>
+            <w:r>
+              <w:rPr>
+                <w:sz w:val="18"/>
+              </w:rPr>
+              <w:t>Años de servicio</w:t>
+            </w:r>
+          </w:p>
+        </w:tc>
+        <w:tc>
+          <w:tcPr>
+            <w:tcW w:type="dxa" w:w="5329"/>
+          </w:tcPr>
+          <w:p>
+            <w:r/>
+            <w:r>
+              <w:rPr>
+                <w:sz w:val="18"/>
+              </w:rPr>
+              <w:t>6 meses → 0 años; la causal 159-4 no indemniza de todas formas</w:t>
+            </w:r>
+          </w:p>
+        </w:tc>
+        <w:tc>
+          <w:tcPr>
+            <w:tcW w:type="dxa" w:w="1984"/>
+          </w:tcPr>
+          <w:p>
+            <w:r/>
+            <w:r>
+              <w:rPr>
+                <w:sz w:val="18"/>
+              </w:rPr>
+              <w:t>$0</w:t>
+            </w:r>
+          </w:p>
+        </w:tc>
+      </w:tr>
+      <w:tr>
+        <w:tc>
+          <w:tcPr>
+            <w:tcW w:type="dxa" w:w="2041"/>
+          </w:tcPr>
+          <w:p>
+            <w:r/>
+            <w:r>
+              <w:rPr>
+                <w:sz w:val="18"/>
+              </w:rPr>
+              <w:t>Mes de aviso</w:t>
+            </w:r>
+          </w:p>
+        </w:tc>
+        <w:tc>
+          <w:tcPr>
+            <w:tcW w:type="dxa" w:w="5329"/>
+          </w:tcPr>
+          <w:p>
+            <w:r/>
+            <w:r>
+              <w:rPr>
+                <w:sz w:val="18"/>
+              </w:rPr>
+              <w:t>la causal no lo lleva</w:t>
+            </w:r>
+          </w:p>
+        </w:tc>
+        <w:tc>
+          <w:tcPr>
+            <w:tcW w:type="dxa" w:w="1984"/>
+          </w:tcPr>
+          <w:p>
+            <w:r/>
+            <w:r>
+              <w:rPr>
+                <w:sz w:val="18"/>
+              </w:rPr>
+              <w:t>$0</w:t>
+            </w:r>
+          </w:p>
+        </w:tc>
+      </w:tr>
+      <w:tr>
+        <w:tc>
+          <w:tcPr>
+            <w:tcW w:type="dxa" w:w="2041"/>
+          </w:tcPr>
+          <w:p>
+            <w:r/>
+            <w:r>
+              <w:rPr>
+                <w:sz w:val="18"/>
+              </w:rPr>
+              <w:t>Base del feriado</w:t>
+            </w:r>
+          </w:p>
+        </w:tc>
+        <w:tc>
+          <w:tcPr>
+            <w:tcW w:type="dxa" w:w="5329"/>
+          </w:tcPr>
+          <w:p>
+            <w:r/>
+            <w:r>
+              <w:rPr>
+                <w:sz w:val="18"/>
+              </w:rPr>
+              <w:t>promedio imponible de mayo, junio y julio (875.000) sin gratificación (175.000)</w:t>
+            </w:r>
+          </w:p>
+        </w:tc>
+        <w:tc>
+          <w:tcPr>
+            <w:tcW w:type="dxa" w:w="1984"/>
+          </w:tcPr>
+          <w:p>
+            <w:r/>
+            <w:r>
+              <w:rPr>
+                <w:sz w:val="18"/>
+              </w:rPr>
+              <w:t>$700.000</w:t>
+            </w:r>
+          </w:p>
+        </w:tc>
+      </w:tr>
+      <w:tr>
+        <w:tc>
+          <w:tcPr>
+            <w:tcW w:type="dxa" w:w="2041"/>
+          </w:tcPr>
+          <w:p>
+            <w:r/>
+            <w:r>
+              <w:rPr>
+                <w:sz w:val="18"/>
+              </w:rPr>
+              <w:t>Saldo de vacaciones</w:t>
+            </w:r>
+          </w:p>
+        </w:tc>
+        <w:tc>
+          <w:tcPr>
+            <w:tcW w:type="dxa" w:w="5329"/>
+          </w:tcPr>
+          <w:p>
+            <w:r/>
+            <w:r>
+              <w:rPr>
+                <w:sz w:val="18"/>
+              </w:rPr>
+              <w:t>sin período cumplido → solo proporcional: 5 meses completos + 30/31 del mes en curso = 5,97 × 15 ÷ 12</w:t>
+            </w:r>
+          </w:p>
+        </w:tc>
+        <w:tc>
+          <w:tcPr>
+            <w:tcW w:type="dxa" w:w="1984"/>
+          </w:tcPr>
+          <w:p>
+            <w:r/>
+            <w:r>
+              <w:rPr>
+                <w:sz w:val="18"/>
+              </w:rPr>
+              <w:t>7,46 días hábiles</w:t>
+            </w:r>
+          </w:p>
+        </w:tc>
+      </w:tr>
+      <w:tr>
+        <w:tc>
+          <w:tcPr>
+            <w:tcW w:type="dxa" w:w="2041"/>
+          </w:tcPr>
+          <w:p>
+            <w:r/>
+            <w:r>
+              <w:rPr>
+                <w:sz w:val="18"/>
+              </w:rPr>
+              <w:t>Feriado proporcional</w:t>
+            </w:r>
+          </w:p>
+        </w:tc>
+        <w:tc>
+          <w:tcPr>
+            <w:tcW w:type="dxa" w:w="5329"/>
+          </w:tcPr>
+          <w:p>
+            <w:r/>
+            <w:r>
+              <w:rPr>
+                <w:sz w:val="18"/>
+              </w:rPr>
+              <w:t>proyectado desde el 01-09-2026: mar 1 a mié 9 = 7 hábiles (9 corridos, con sáb 5 y dom 6) + 0,46 del jueves 10 → 9,46 corridos × 700.000 ÷ 30</w:t>
+            </w:r>
+          </w:p>
+        </w:tc>
+        <w:tc>
+          <w:tcPr>
+            <w:tcW w:type="dxa" w:w="1984"/>
+          </w:tcPr>
+          <w:p>
+            <w:r/>
+            <w:r>
+              <w:rPr>
+                <w:sz w:val="18"/>
+              </w:rPr>
+              <w:t>$220.733</w:t>
+            </w:r>
+          </w:p>
+        </w:tc>
+      </w:tr>
+      <w:tr>
+        <w:tc>
+          <w:tcPr>
+            <w:tcW w:type="dxa" w:w="2041"/>
+          </w:tcPr>
+          <w:p>
+            <w:r/>
+            <w:r>
+              <w:rPr>
+                <w:sz w:val="18"/>
+              </w:rPr>
+              <w:t>Saldo del anticipo</w:t>
+            </w:r>
+          </w:p>
+        </w:tc>
+        <w:tc>
+          <w:tcPr>
+            <w:tcW w:type="dxa" w:w="5329"/>
+          </w:tcPr>
+          <w:p>
+            <w:r/>
+            <w:r>
+              <w:rPr>
+                <w:sz w:val="18"/>
+              </w:rPr>
+              <w:t>cuotas cobradas jul y ago = 2 → pendiente 1 × 60.000</w:t>
+            </w:r>
+          </w:p>
+        </w:tc>
+        <w:tc>
+          <w:tcPr>
+            <w:tcW w:type="dxa" w:w="1984"/>
+          </w:tcPr>
+          <w:p>
+            <w:r/>
+            <w:r>
+              <w:rPr>
+                <w:sz w:val="18"/>
+              </w:rPr>
+              <w:t>− $60.000</w:t>
+            </w:r>
+          </w:p>
+        </w:tc>
+      </w:tr>
+      <w:tr>
+        <w:tc>
+          <w:tcPr>
+            <w:tcW w:type="dxa" w:w="2041"/>
+          </w:tcPr>
+          <w:p>
+            <w:r/>
+            <w:r>
+              <w:rPr>
+                <w:sz w:val="18"/>
+              </w:rPr>
+              <w:t>TOTAL FINIQUITO</w:t>
+            </w:r>
+          </w:p>
+        </w:tc>
+        <w:tc>
+          <w:tcPr>
+            <w:tcW w:type="dxa" w:w="5329"/>
+          </w:tcPr>
+          <w:p>
+            <w:r/>
+            <w:r>
+              <w:rPr>
+                <w:sz w:val="18"/>
+              </w:rPr>
+              <w:t>0 + 0 + 220.733 − 60.000</w:t>
+            </w:r>
+          </w:p>
+        </w:tc>
+        <w:tc>
+          <w:tcPr>
+            <w:tcW w:type="dxa" w:w="1984"/>
+          </w:tcPr>
+          <w:p>
+            <w:r/>
+            <w:r>
+              <w:rPr>
+                <w:sz w:val="18"/>
+              </w:rPr>
+              <w:t>$160.733</w:t>
+            </w:r>
+          </w:p>
+        </w:tc>
+      </w:tr>
+      <w:tr>
+        <w:tc>
+          <w:tcPr>
+            <w:tcW w:type="dxa" w:w="2041"/>
+          </w:tcPr>
+          <w:p>
+            <w:r/>
+            <w:r>
+              <w:rPr>
+                <w:sz w:val="18"/>
+              </w:rPr>
+              <w:t>Aparte, liquidación de agosto</w:t>
+            </w:r>
+          </w:p>
+        </w:tc>
+        <w:tc>
+          <w:tcPr>
+            <w:tcW w:type="dxa" w:w="5329"/>
+          </w:tcPr>
+          <w:p>
+            <w:r/>
+            <w:r>
+              <w:rPr>
+                <w:sz w:val="18"/>
+              </w:rPr>
+              <w:t>sueldo completo (30/30) + gratificación + colación/movilización, menos la 2ª cuota del anticipo y descuentos legales (sin AFC)</w:t>
+            </w:r>
+          </w:p>
+        </w:tc>
+        <w:tc>
+          <w:tcPr>
+            <w:tcW w:type="dxa" w:w="1984"/>
+          </w:tcPr>
+          <w:p>
+            <w:r/>
+            <w:r>
+              <w:rPr>
+                <w:sz w:val="18"/>
+              </w:rPr>
+              <w:t>libro de remuneraciones</w:t>
+            </w:r>
+          </w:p>
+        </w:tc>
+      </w:tr>
+      <w:tr>
+        <w:tc>
+          <w:tcPr>
+            <w:tcW w:type="dxa" w:w="2041"/>
+          </w:tcPr>
+          <w:p>
+            <w:r/>
+            <w:r>
+              <w:rPr>
+                <w:sz w:val="18"/>
+              </w:rPr>
+              <w:t>Previred</w:t>
+            </w:r>
+          </w:p>
+        </w:tc>
+        <w:tc>
+          <w:tcPr>
+            <w:tcW w:type="dxa" w:w="5329"/>
+          </w:tcPr>
+          <w:p>
+            <w:r/>
+            <w:r>
+              <w:rPr>
+                <w:sz w:val="18"/>
+              </w:rPr>
+              <w:t>el Archivo Previred de agosto informa el retiro (movimiento 2) con fecha 31-08-2026</w:t>
+            </w:r>
+          </w:p>
+        </w:tc>
+        <w:tc>
+          <w:tcPr>
+            <w:tcW w:type="dxa" w:w="1984"/>
+          </w:tcPr>
+          <w:p>
+            <w:r/>
+            <w:r>
+              <w:rPr>
+                <w:sz w:val="18"/>
+              </w:rPr>
+              <w:t>obligatorio</w:t>
+            </w:r>
+          </w:p>
+        </w:tc>
+      </w:tr>
+    </w:tbl>
+    <w:p>
+      <w:pPr>
+        <w:spacing w:after="40"/>
+      </w:pPr>
+    </w:p>
+    <w:tbl>
+      <w:tblPr>
+        <w:tblStyle w:val="TableGrid"/>
+        <w:tblW w:type="auto" w:w="0"/>
+        <w:tblLook w:firstColumn="1" w:firstRow="1" w:lastColumn="0" w:lastRow="0" w:noHBand="0" w:noVBand="1" w:val="04A0"/>
+      </w:tblPr>
+      <w:tblGrid>
+        <w:gridCol w:w="9746"/>
+      </w:tblGrid>
+      <w:tr>
+        <w:tc>
+          <w:tcPr>
+            <w:tcW w:type="dxa" w:w="9746"/>
+            <w:shd w:val="clear" w:color="auto" w:fill="FFF4CE"/>
+          </w:tcPr>
+          <w:p>
+            <w:r/>
+            <w:r>
+              <w:rPr>
+                <w:b/>
+                <w:sz w:val="19"/>
+              </w:rPr>
+              <w:t>⚠ OJO</w:t>
+              <w:br/>
+            </w:r>
+            <w:r>
+              <w:rPr>
+                <w:sz w:val="19"/>
+              </w:rPr>
+              <w:t>Si el mismo contrato hubiera seguido activo el 01-09 sin finiquito, el motor rrhh-plazo-fijo lo habría pasado a INDEFINIDO y el aviso del seguro habría salido: desvincular a un plazo fijo es siempre en su fecha o antes, nunca "después de que venció".</w:t>
             </w:r>
           </w:p>
         </w:tc>

</xml_diff>

<commit_message>
docs: Manual de RRHH v2.5 — fórmulas y ejemplos numéricos de la nómina Edenred (cap. 17.1) y del seguro de salud (cap. 18.3); documentación v3.5 (v255.3)
Co-Authored-By: Claude Fable 5.1 <noreply@anthropic.com>
</commit_message>
<xml_diff>
--- a/api-gateway/public/mantenedores/documentacion/descargas/Manual-RRHH-Business-Suite.docx
+++ b/api-gateway/public/mantenedores/documentacion/descargas/Manual-RRHH-Business-Suite.docx
@@ -236,7 +236,7 @@
           <w:i w:val="0"/>
           <w:sz w:val="22"/>
         </w:rPr>
-        <w:t>Versión 2.4 · 17 de septiembre de 2026 · Suite v255.2</w:t>
+        <w:t>Versión 2.5 · 17 de septiembre de 2026 · Suite v255.3</w:t>
       </w:r>
     </w:p>
     <w:p>
@@ -694,6 +694,64 @@
                 <w:sz w:val="18"/>
               </w:rPr>
               <w:t>Cap. 16.1: fórmulas de la comisión del ejecutivo con ejemplo; cap. 25.2: finiquito de plazo fijo, tabla de causales y ejemplo.</w:t>
+            </w:r>
+          </w:p>
+        </w:tc>
+      </w:tr>
+      <w:tr>
+        <w:tc>
+          <w:tcPr>
+            <w:tcW w:type="dxa" w:w="907"/>
+          </w:tcPr>
+          <w:p>
+            <w:r/>
+            <w:r>
+              <w:rPr>
+                <w:sz w:val="18"/>
+              </w:rPr>
+              <w:t>2.5</w:t>
+            </w:r>
+          </w:p>
+        </w:tc>
+        <w:tc>
+          <w:tcPr>
+            <w:tcW w:type="dxa" w:w="1247"/>
+          </w:tcPr>
+          <w:p>
+            <w:r/>
+            <w:r>
+              <w:rPr>
+                <w:sz w:val="18"/>
+              </w:rPr>
+              <w:t>17-09-2026</w:t>
+            </w:r>
+          </w:p>
+        </w:tc>
+        <w:tc>
+          <w:tcPr>
+            <w:tcW w:type="dxa" w:w="2041"/>
+          </w:tcPr>
+          <w:p>
+            <w:r/>
+            <w:r>
+              <w:rPr>
+                <w:sz w:val="18"/>
+              </w:rPr>
+              <w:t>Patricio Escobar / Claude</w:t>
+            </w:r>
+          </w:p>
+        </w:tc>
+        <w:tc>
+          <w:tcPr>
+            <w:tcW w:type="dxa" w:w="5159"/>
+          </w:tcPr>
+          <w:p>
+            <w:r/>
+            <w:r>
+              <w:rPr>
+                <w:sz w:val="18"/>
+              </w:rPr>
+              <w:t>Cap. 17.1: fórmulas de la nómina Edenred con ejemplo; cap. 18.3: fórmulas del seguro de salud (esperado, cuadratura, quién paga, descuentos) con ejemplo.</w:t>
             </w:r>
           </w:p>
         </w:tc>
@@ -14874,6 +14932,893 @@
     </w:p>
     <w:p>
       <w:pPr>
+        <w:pStyle w:val="Heading3"/>
+      </w:pPr>
+      <w:r>
+        <w:t>17.1 Fórmulas y criterios de cálculo de la nómina Edenred</w:t>
+      </w:r>
+    </w:p>
+    <w:p>
+      <w:pPr>
+        <w:spacing w:after="80"/>
+      </w:pPr>
+      <w:r>
+        <w:rPr>
+          <w:b w:val="0"/>
+          <w:i w:val="0"/>
+        </w:rPr>
+        <w:t>Motor único edenred.controller (habilesRango + calcularMes). Parámetros en la pestaña Parámetros de la card, con vigencia por mes (rh_edenred_param): monto diario, feriados descuentan, tipos de ausencia que descuentan, áreas de lunes a sábado, Nombre Sucursal.</w:t>
+      </w:r>
+    </w:p>
+    <w:tbl>
+      <w:tblPr>
+        <w:tblStyle w:val="TableGrid"/>
+        <w:tblW w:type="auto" w:w="0"/>
+        <w:jc w:val="center"/>
+        <w:tblLook w:firstColumn="1" w:firstRow="1" w:lastColumn="0" w:lastRow="0" w:noHBand="0" w:noVBand="1" w:val="04A0"/>
+      </w:tblPr>
+      <w:tblGrid>
+        <w:gridCol w:w="3249"/>
+        <w:gridCol w:w="3249"/>
+        <w:gridCol w:w="3249"/>
+      </w:tblGrid>
+      <w:tr>
+        <w:tc>
+          <w:tcPr>
+            <w:tcW w:type="dxa" w:w="1928"/>
+            <w:shd w:val="clear" w:color="auto" w:fill="1F4E79"/>
+          </w:tcPr>
+          <w:p>
+            <w:r/>
+            <w:r>
+              <w:rPr>
+                <w:b/>
+                <w:color w:val="FFFFFF"/>
+                <w:sz w:val="18"/>
+              </w:rPr>
+              <w:t>Concepto</w:t>
+            </w:r>
+          </w:p>
+        </w:tc>
+        <w:tc>
+          <w:tcPr>
+            <w:tcW w:type="dxa" w:w="5443"/>
+            <w:shd w:val="clear" w:color="auto" w:fill="1F4E79"/>
+          </w:tcPr>
+          <w:p>
+            <w:r/>
+            <w:r>
+              <w:rPr>
+                <w:b/>
+                <w:color w:val="FFFFFF"/>
+                <w:sz w:val="18"/>
+              </w:rPr>
+              <w:t>Regla / fórmula</w:t>
+            </w:r>
+          </w:p>
+        </w:tc>
+        <w:tc>
+          <w:tcPr>
+            <w:tcW w:type="dxa" w:w="1984"/>
+            <w:shd w:val="clear" w:color="auto" w:fill="1F4E79"/>
+          </w:tcPr>
+          <w:p>
+            <w:r/>
+            <w:r>
+              <w:rPr>
+                <w:b/>
+                <w:color w:val="FFFFFF"/>
+                <w:sz w:val="18"/>
+              </w:rPr>
+              <w:t>Parámetro</w:t>
+            </w:r>
+          </w:p>
+        </w:tc>
+      </w:tr>
+      <w:tr>
+        <w:tc>
+          <w:tcPr>
+            <w:tcW w:type="dxa" w:w="1928"/>
+          </w:tcPr>
+          <w:p>
+            <w:r/>
+            <w:r>
+              <w:rPr>
+                <w:sz w:val="18"/>
+              </w:rPr>
+              <w:t>Quién va</w:t>
+            </w:r>
+          </w:p>
+        </w:tc>
+        <w:tc>
+          <w:tcPr>
+            <w:tcW w:type="dxa" w:w="5443"/>
+          </w:tcPr>
+          <w:p>
+            <w:r/>
+            <w:r>
+              <w:rPr>
+                <w:sz w:val="18"/>
+              </w:rPr>
+              <w:t>colaboradores con sueldo base y la casilla Tarjeta Edenred en la ficha, activos en el mes (o con baja dentro del mes).</w:t>
+            </w:r>
+          </w:p>
+        </w:tc>
+        <w:tc>
+          <w:tcPr>
+            <w:tcW w:type="dxa" w:w="1984"/>
+          </w:tcPr>
+          <w:p>
+            <w:r/>
+            <w:r>
+              <w:rPr>
+                <w:sz w:val="18"/>
+              </w:rPr>
+              <w:t>rh_fichas.edenred</w:t>
+            </w:r>
+          </w:p>
+        </w:tc>
+      </w:tr>
+      <w:tr>
+        <w:tc>
+          <w:tcPr>
+            <w:tcW w:type="dxa" w:w="1928"/>
+          </w:tcPr>
+          <w:p>
+            <w:r/>
+            <w:r>
+              <w:rPr>
+                <w:sz w:val="18"/>
+              </w:rPr>
+              <w:t>Calendario de la persona</w:t>
+            </w:r>
+          </w:p>
+        </w:tc>
+        <w:tc>
+          <w:tcPr>
+            <w:tcW w:type="dxa" w:w="5443"/>
+          </w:tcPr>
+          <w:p>
+            <w:r/>
+            <w:r>
+              <w:rPr>
+                <w:sz w:val="18"/>
+              </w:rPr>
+              <w:t>lunes a viernes; si su centro de costo está en las áreas L-S, también los sábados. Nunca domingos.</w:t>
+            </w:r>
+          </w:p>
+        </w:tc>
+        <w:tc>
+          <w:tcPr>
+            <w:tcW w:type="dxa" w:w="1984"/>
+          </w:tcPr>
+          <w:p>
+            <w:r/>
+            <w:r>
+              <w:rPr>
+                <w:sz w:val="18"/>
+              </w:rPr>
+              <w:t>areas_sabado (COMERCIAL)</w:t>
+            </w:r>
+          </w:p>
+        </w:tc>
+      </w:tr>
+      <w:tr>
+        <w:tc>
+          <w:tcPr>
+            <w:tcW w:type="dxa" w:w="1928"/>
+          </w:tcPr>
+          <w:p>
+            <w:r/>
+            <w:r>
+              <w:rPr>
+                <w:sz w:val="18"/>
+              </w:rPr>
+              <w:t>Días hábiles del mes</w:t>
+            </w:r>
+          </w:p>
+        </w:tc>
+        <w:tc>
+          <w:tcPr>
+            <w:tcW w:type="dxa" w:w="5443"/>
+          </w:tcPr>
+          <w:p>
+            <w:r/>
+            <w:r>
+              <w:rPr>
+                <w:sz w:val="18"/>
+              </w:rPr>
+              <w:t>días del calendario de la persona entre el 1 y el último día del mes, sin feriados legales (si descuenta_feriados = 1). Ingreso o baja en el mes: solo desde el ingreso y hasta el día anterior a la baja (baja exclusiva).</w:t>
+            </w:r>
+          </w:p>
+        </w:tc>
+        <w:tc>
+          <w:tcPr>
+            <w:tcW w:type="dxa" w:w="1984"/>
+          </w:tcPr>
+          <w:p>
+            <w:r/>
+            <w:r>
+              <w:rPr>
+                <w:sz w:val="18"/>
+              </w:rPr>
+              <w:t>descuenta_feriados 1 · Feriados</w:t>
+            </w:r>
+          </w:p>
+        </w:tc>
+      </w:tr>
+      <w:tr>
+        <w:tc>
+          <w:tcPr>
+            <w:tcW w:type="dxa" w:w="1928"/>
+          </w:tcPr>
+          <w:p>
+            <w:r/>
+            <w:r>
+              <w:rPr>
+                <w:sz w:val="18"/>
+              </w:rPr>
+              <w:t>Faltas del mes anterior</w:t>
+            </w:r>
+          </w:p>
+        </w:tc>
+        <w:tc>
+          <w:tcPr>
+            <w:tcW w:type="dxa" w:w="5443"/>
+          </w:tcPr>
+          <w:p>
+            <w:r/>
+            <w:r>
+              <w:rPr>
+                <w:sz w:val="18"/>
+              </w:rPr>
+              <w:t>días del calendario de la persona cubiertos por ausencias APROBADAS del mes anterior de los tipos configurados (licencia médica, permiso sin goce, ausencia injustificada, vacaciones), contados con el mismo criterio de feriados.</w:t>
+            </w:r>
+          </w:p>
+        </w:tc>
+        <w:tc>
+          <w:tcPr>
+            <w:tcW w:type="dxa" w:w="1984"/>
+          </w:tcPr>
+          <w:p>
+            <w:r/>
+            <w:r>
+              <w:rPr>
+                <w:sz w:val="18"/>
+              </w:rPr>
+              <w:t>tipos_descuento</w:t>
+            </w:r>
+          </w:p>
+        </w:tc>
+      </w:tr>
+      <w:tr>
+        <w:tc>
+          <w:tcPr>
+            <w:tcW w:type="dxa" w:w="1928"/>
+          </w:tcPr>
+          <w:p>
+            <w:r/>
+            <w:r>
+              <w:rPr>
+                <w:sz w:val="18"/>
+              </w:rPr>
+              <w:t>Ajuste en días</w:t>
+            </w:r>
+          </w:p>
+        </w:tc>
+        <w:tc>
+          <w:tcPr>
+            <w:tcW w:type="dxa" w:w="5443"/>
+          </w:tcPr>
+          <w:p>
+            <w:r/>
+            <w:r>
+              <w:rPr>
+                <w:sz w:val="18"/>
+              </w:rPr>
+              <w:t>entero o decimal, positivo (premio, días extra) o negativo (descuento no registrado), con observación obligatoria; solo antes de generar.</w:t>
+            </w:r>
+          </w:p>
+        </w:tc>
+        <w:tc>
+          <w:tcPr>
+            <w:tcW w:type="dxa" w:w="1984"/>
+          </w:tcPr>
+          <w:p>
+            <w:r/>
+            <w:r>
+              <w:rPr>
+                <w:sz w:val="18"/>
+              </w:rPr>
+              <w:t>rh_edenred_ajustes</w:t>
+            </w:r>
+          </w:p>
+        </w:tc>
+      </w:tr>
+      <w:tr>
+        <w:tc>
+          <w:tcPr>
+            <w:tcW w:type="dxa" w:w="1928"/>
+          </w:tcPr>
+          <w:p>
+            <w:r/>
+            <w:r>
+              <w:rPr>
+                <w:sz w:val="18"/>
+              </w:rPr>
+              <w:t>Carga del mes</w:t>
+            </w:r>
+          </w:p>
+        </w:tc>
+        <w:tc>
+          <w:tcPr>
+            <w:tcW w:type="dxa" w:w="5443"/>
+          </w:tcPr>
+          <w:p>
+            <w:r/>
+            <w:r>
+              <w:rPr>
+                <w:sz w:val="18"/>
+              </w:rPr>
+              <w:t>máx( 0 , (días hábiles − faltas + ajuste) × monto diario ), redondeado a peso.</w:t>
+            </w:r>
+          </w:p>
+        </w:tc>
+        <w:tc>
+          <w:tcPr>
+            <w:tcW w:type="dxa" w:w="1984"/>
+          </w:tcPr>
+          <w:p>
+            <w:r/>
+            <w:r>
+              <w:rPr>
+                <w:sz w:val="18"/>
+              </w:rPr>
+              <w:t>monto_diario $3.600</w:t>
+            </w:r>
+          </w:p>
+        </w:tc>
+      </w:tr>
+      <w:tr>
+        <w:tc>
+          <w:tcPr>
+            <w:tcW w:type="dxa" w:w="1928"/>
+          </w:tcPr>
+          <w:p>
+            <w:r/>
+            <w:r>
+              <w:rPr>
+                <w:sz w:val="18"/>
+              </w:rPr>
+              <w:t>Total a pagar a Edenred</w:t>
+            </w:r>
+          </w:p>
+        </w:tc>
+        <w:tc>
+          <w:tcPr>
+            <w:tcW w:type="dxa" w:w="5443"/>
+          </w:tcPr>
+          <w:p>
+            <w:r/>
+            <w:r>
+              <w:rPr>
+                <w:sz w:val="18"/>
+              </w:rPr>
+              <w:t>Σ cargas de la nómina generada = monto de la ODP a Edenred (Otros, exento).</w:t>
+            </w:r>
+          </w:p>
+        </w:tc>
+        <w:tc>
+          <w:tcPr>
+            <w:tcW w:type="dxa" w:w="1984"/>
+          </w:tcPr>
+          <w:p>
+            <w:r/>
+            <w:r>
+              <w:rPr>
+                <w:sz w:val="18"/>
+              </w:rPr>
+              <w:t>ODP</w:t>
+            </w:r>
+          </w:p>
+        </w:tc>
+      </w:tr>
+      <w:tr>
+        <w:tc>
+          <w:tcPr>
+            <w:tcW w:type="dxa" w:w="1928"/>
+          </w:tcPr>
+          <w:p>
+            <w:r/>
+            <w:r>
+              <w:rPr>
+                <w:sz w:val="18"/>
+              </w:rPr>
+              <w:t>Cuándo</w:t>
+            </w:r>
+          </w:p>
+        </w:tc>
+        <w:tc>
+          <w:tcPr>
+            <w:tcW w:type="dxa" w:w="5443"/>
+          </w:tcPr>
+          <w:p>
+            <w:r/>
+            <w:r>
+              <w:rPr>
+                <w:sz w:val="18"/>
+              </w:rPr>
+              <w:t>se genera el último día hábil del mes ANTERIOR (adelantado); aviso 09:00 si falta. Quien se retira después de generada conserva lo cargado (no se descuenta en el finiquito).</w:t>
+            </w:r>
+          </w:p>
+        </w:tc>
+        <w:tc>
+          <w:tcPr>
+            <w:tcW w:type="dxa" w:w="1984"/>
+          </w:tcPr>
+          <w:p>
+            <w:r/>
+            <w:r>
+              <w:rPr>
+                <w:sz w:val="18"/>
+              </w:rPr>
+              <w:t>edenred-aviso-generar</w:t>
+            </w:r>
+          </w:p>
+        </w:tc>
+      </w:tr>
+      <w:tr>
+        <w:tc>
+          <w:tcPr>
+            <w:tcW w:type="dxa" w:w="1928"/>
+          </w:tcPr>
+          <w:p>
+            <w:r/>
+            <w:r>
+              <w:rPr>
+                <w:sz w:val="18"/>
+              </w:rPr>
+              <w:t>Cambios de parámetro</w:t>
+            </w:r>
+          </w:p>
+        </w:tc>
+        <w:tc>
+          <w:tcPr>
+            <w:tcW w:type="dxa" w:w="5443"/>
+          </w:tcPr>
+          <w:p>
+            <w:r/>
+            <w:r>
+              <w:rPr>
+                <w:sz w:val="18"/>
+              </w:rPr>
+              <w:t>rigen desde un mes sin nómina generada; el historial nunca se recalcula.</w:t>
+            </w:r>
+          </w:p>
+        </w:tc>
+        <w:tc>
+          <w:tcPr>
+            <w:tcW w:type="dxa" w:w="1984"/>
+          </w:tcPr>
+          <w:p>
+            <w:r/>
+            <w:r>
+              <w:rPr>
+                <w:sz w:val="18"/>
+              </w:rPr>
+              <w:t>mes_desde</w:t>
+            </w:r>
+          </w:p>
+        </w:tc>
+      </w:tr>
+    </w:tbl>
+    <w:p>
+      <w:pPr>
+        <w:spacing w:after="40"/>
+      </w:pPr>
+    </w:p>
+    <w:p>
+      <w:pPr>
+        <w:spacing w:after="40"/>
+      </w:pPr>
+      <w:r>
+        <w:rPr>
+          <w:b/>
+          <w:i w:val="0"/>
+          <w:color w:val="1F4E79"/>
+        </w:rPr>
+        <w:t>Ejemplo numérico (nómina de octubre 2026, generada el 30-09-2026)</w:t>
+      </w:r>
+    </w:p>
+    <w:p>
+      <w:pPr>
+        <w:spacing w:after="80"/>
+      </w:pPr>
+      <w:r>
+        <w:rPr>
+          <w:b w:val="0"/>
+          <w:i w:val="0"/>
+        </w:rPr>
+        <w:t>Octubre 2026 tiene 22 días lunes a viernes y 5 sábados; feriados: lunes 12 y sábado 31. Monto diario $3.600. Tres casos: administrativa (L-V), ejecutivo COMERCIAL (L-S) con licencia en septiembre, y un ingreso el 19-10.</w:t>
+      </w:r>
+    </w:p>
+    <w:tbl>
+      <w:tblPr>
+        <w:tblStyle w:val="TableGrid"/>
+        <w:tblW w:type="auto" w:w="0"/>
+        <w:jc w:val="center"/>
+        <w:tblLook w:firstColumn="1" w:firstRow="1" w:lastColumn="0" w:lastRow="0" w:noHBand="0" w:noVBand="1" w:val="04A0"/>
+      </w:tblPr>
+      <w:tblGrid>
+        <w:gridCol w:w="3249"/>
+        <w:gridCol w:w="3249"/>
+        <w:gridCol w:w="3249"/>
+      </w:tblGrid>
+      <w:tr>
+        <w:tc>
+          <w:tcPr>
+            <w:tcW w:type="dxa" w:w="2948"/>
+            <w:shd w:val="clear" w:color="auto" w:fill="1F4E79"/>
+          </w:tcPr>
+          <w:p>
+            <w:r/>
+            <w:r>
+              <w:rPr>
+                <w:b/>
+                <w:color w:val="FFFFFF"/>
+                <w:sz w:val="18"/>
+              </w:rPr>
+              <w:t>Caso</w:t>
+            </w:r>
+          </w:p>
+        </w:tc>
+        <w:tc>
+          <w:tcPr>
+            <w:tcW w:type="dxa" w:w="4706"/>
+            <w:shd w:val="clear" w:color="auto" w:fill="1F4E79"/>
+          </w:tcPr>
+          <w:p>
+            <w:r/>
+            <w:r>
+              <w:rPr>
+                <w:b/>
+                <w:color w:val="FFFFFF"/>
+                <w:sz w:val="18"/>
+              </w:rPr>
+              <w:t>Cálculo</w:t>
+            </w:r>
+          </w:p>
+        </w:tc>
+        <w:tc>
+          <w:tcPr>
+            <w:tcW w:type="dxa" w:w="1701"/>
+            <w:shd w:val="clear" w:color="auto" w:fill="1F4E79"/>
+          </w:tcPr>
+          <w:p>
+            <w:r/>
+            <w:r>
+              <w:rPr>
+                <w:b/>
+                <w:color w:val="FFFFFF"/>
+                <w:sz w:val="18"/>
+              </w:rPr>
+              <w:t>Carga</w:t>
+            </w:r>
+          </w:p>
+        </w:tc>
+      </w:tr>
+      <w:tr>
+        <w:tc>
+          <w:tcPr>
+            <w:tcW w:type="dxa" w:w="2948"/>
+          </w:tcPr>
+          <w:p>
+            <w:r/>
+            <w:r>
+              <w:rPr>
+                <w:sz w:val="18"/>
+              </w:rPr>
+              <w:t>Administrativa L-V, sin faltas</w:t>
+            </w:r>
+          </w:p>
+        </w:tc>
+        <w:tc>
+          <w:tcPr>
+            <w:tcW w:type="dxa" w:w="4706"/>
+          </w:tcPr>
+          <w:p>
+            <w:r/>
+            <w:r>
+              <w:rPr>
+                <w:sz w:val="18"/>
+              </w:rPr>
+              <w:t>22 − 1 feriado (lun 12) = 21 días × 3.600</w:t>
+            </w:r>
+          </w:p>
+        </w:tc>
+        <w:tc>
+          <w:tcPr>
+            <w:tcW w:type="dxa" w:w="1701"/>
+          </w:tcPr>
+          <w:p>
+            <w:r/>
+            <w:r>
+              <w:rPr>
+                <w:sz w:val="18"/>
+              </w:rPr>
+              <w:t>$75.600</w:t>
+            </w:r>
+          </w:p>
+        </w:tc>
+      </w:tr>
+      <w:tr>
+        <w:tc>
+          <w:tcPr>
+            <w:tcW w:type="dxa" w:w="2948"/>
+          </w:tcPr>
+          <w:p>
+            <w:r/>
+            <w:r>
+              <w:rPr>
+                <w:sz w:val="18"/>
+              </w:rPr>
+              <w:t>Ejecutivo COMERCIAL L-S, licencia del 14 al 18 de septiembre (5 días L-V)</w:t>
+            </w:r>
+          </w:p>
+        </w:tc>
+        <w:tc>
+          <w:tcPr>
+            <w:tcW w:type="dxa" w:w="4706"/>
+          </w:tcPr>
+          <w:p>
+            <w:r/>
+            <w:r>
+              <w:rPr>
+                <w:sz w:val="18"/>
+              </w:rPr>
+              <w:t>días: 21 + 5 sábados − sáb 31 feriado = 25 · faltas: 5 · (25 − 5) × 3.600</w:t>
+            </w:r>
+          </w:p>
+        </w:tc>
+        <w:tc>
+          <w:tcPr>
+            <w:tcW w:type="dxa" w:w="1701"/>
+          </w:tcPr>
+          <w:p>
+            <w:r/>
+            <w:r>
+              <w:rPr>
+                <w:sz w:val="18"/>
+              </w:rPr>
+              <w:t>$72.000</w:t>
+            </w:r>
+          </w:p>
+        </w:tc>
+      </w:tr>
+      <w:tr>
+        <w:tc>
+          <w:tcPr>
+            <w:tcW w:type="dxa" w:w="2948"/>
+          </w:tcPr>
+          <w:p>
+            <w:r/>
+            <w:r>
+              <w:rPr>
+                <w:sz w:val="18"/>
+              </w:rPr>
+              <w:t>Mismo ejecutivo con premio de 2 días (ajuste +2, observación "meta de septiembre")</w:t>
+            </w:r>
+          </w:p>
+        </w:tc>
+        <w:tc>
+          <w:tcPr>
+            <w:tcW w:type="dxa" w:w="4706"/>
+          </w:tcPr>
+          <w:p>
+            <w:r/>
+            <w:r>
+              <w:rPr>
+                <w:sz w:val="18"/>
+              </w:rPr>
+              <w:t>(25 − 5 + 2) × 3.600</w:t>
+            </w:r>
+          </w:p>
+        </w:tc>
+        <w:tc>
+          <w:tcPr>
+            <w:tcW w:type="dxa" w:w="1701"/>
+          </w:tcPr>
+          <w:p>
+            <w:r/>
+            <w:r>
+              <w:rPr>
+                <w:sz w:val="18"/>
+              </w:rPr>
+              <w:t>$79.200</w:t>
+            </w:r>
+          </w:p>
+        </w:tc>
+      </w:tr>
+      <w:tr>
+        <w:tc>
+          <w:tcPr>
+            <w:tcW w:type="dxa" w:w="2948"/>
+          </w:tcPr>
+          <w:p>
+            <w:r/>
+            <w:r>
+              <w:rPr>
+                <w:sz w:val="18"/>
+              </w:rPr>
+              <w:t>Ingreso el lunes 19-10, área L-V</w:t>
+            </w:r>
+          </w:p>
+        </w:tc>
+        <w:tc>
+          <w:tcPr>
+            <w:tcW w:type="dxa" w:w="4706"/>
+          </w:tcPr>
+          <w:p>
+            <w:r/>
+            <w:r>
+              <w:rPr>
+                <w:sz w:val="18"/>
+              </w:rPr>
+              <w:t>días 19 al 30: 10 días hábiles (sin feriado) × 3.600</w:t>
+            </w:r>
+          </w:p>
+        </w:tc>
+        <w:tc>
+          <w:tcPr>
+            <w:tcW w:type="dxa" w:w="1701"/>
+          </w:tcPr>
+          <w:p>
+            <w:r/>
+            <w:r>
+              <w:rPr>
+                <w:sz w:val="18"/>
+              </w:rPr>
+              <w:t>$36.000</w:t>
+            </w:r>
+          </w:p>
+        </w:tc>
+      </w:tr>
+      <w:tr>
+        <w:tc>
+          <w:tcPr>
+            <w:tcW w:type="dxa" w:w="2948"/>
+          </w:tcPr>
+          <w:p>
+            <w:r/>
+            <w:r>
+              <w:rPr>
+                <w:sz w:val="18"/>
+              </w:rPr>
+              <w:t>Baja el viernes 16-10, área L-V</w:t>
+            </w:r>
+          </w:p>
+        </w:tc>
+        <w:tc>
+          <w:tcPr>
+            <w:tcW w:type="dxa" w:w="4706"/>
+          </w:tcPr>
+          <w:p>
+            <w:r/>
+            <w:r>
+              <w:rPr>
+                <w:sz w:val="18"/>
+              </w:rPr>
+              <w:t>días 1 al 15 (baja exclusiva): 10 hábiles (el 12 es feriado) × 3.600</w:t>
+            </w:r>
+          </w:p>
+        </w:tc>
+        <w:tc>
+          <w:tcPr>
+            <w:tcW w:type="dxa" w:w="1701"/>
+          </w:tcPr>
+          <w:p>
+            <w:r/>
+            <w:r>
+              <w:rPr>
+                <w:sz w:val="18"/>
+              </w:rPr>
+              <w:t>$36.000</w:t>
+            </w:r>
+          </w:p>
+        </w:tc>
+      </w:tr>
+      <w:tr>
+        <w:tc>
+          <w:tcPr>
+            <w:tcW w:type="dxa" w:w="2948"/>
+          </w:tcPr>
+          <w:p>
+            <w:r/>
+            <w:r>
+              <w:rPr>
+                <w:sz w:val="18"/>
+              </w:rPr>
+              <w:t>Total nómina (los 4 casos, sin el premio)</w:t>
+            </w:r>
+          </w:p>
+        </w:tc>
+        <w:tc>
+          <w:tcPr>
+            <w:tcW w:type="dxa" w:w="4706"/>
+          </w:tcPr>
+          <w:p>
+            <w:r/>
+            <w:r>
+              <w:rPr>
+                <w:sz w:val="18"/>
+              </w:rPr>
+              <w:t>75.600 + 72.000 + 36.000 + 36.000</w:t>
+            </w:r>
+          </w:p>
+        </w:tc>
+        <w:tc>
+          <w:tcPr>
+            <w:tcW w:type="dxa" w:w="1701"/>
+          </w:tcPr>
+          <w:p>
+            <w:r/>
+            <w:r>
+              <w:rPr>
+                <w:sz w:val="18"/>
+              </w:rPr>
+              <w:t>$219.600 → ODP a Edenred</w:t>
+            </w:r>
+          </w:p>
+        </w:tc>
+      </w:tr>
+    </w:tbl>
+    <w:p>
+      <w:pPr>
+        <w:spacing w:after="40"/>
+      </w:pPr>
+    </w:p>
+    <w:tbl>
+      <w:tblPr>
+        <w:tblStyle w:val="TableGrid"/>
+        <w:tblW w:type="auto" w:w="0"/>
+        <w:tblLook w:firstColumn="1" w:firstRow="1" w:lastColumn="0" w:lastRow="0" w:noHBand="0" w:noVBand="1" w:val="04A0"/>
+      </w:tblPr>
+      <w:tblGrid>
+        <w:gridCol w:w="9746"/>
+      </w:tblGrid>
+      <w:tr>
+        <w:tc>
+          <w:tcPr>
+            <w:tcW w:type="dxa" w:w="9746"/>
+            <w:shd w:val="clear" w:color="auto" w:fill="E8F0F8"/>
+          </w:tcPr>
+          <w:p>
+            <w:r/>
+            <w:r>
+              <w:rPr>
+                <w:b/>
+                <w:sz w:val="19"/>
+              </w:rPr>
+              <w:t>🔒 Cómo cuadrar a mano</w:t>
+              <w:br/>
+            </w:r>
+            <w:r>
+              <w:rPr>
+                <w:sz w:val="19"/>
+              </w:rPr>
+              <w:t>Días del mes = contar en el calendario L-V (o L-S si es comercial) quitando feriados; faltas = las ausencias aprobadas del mes ANTERIOR, no de este; ajuste = el que anotó el lápiz; carga = días × $3.600. La columna Detalle de la fila muestra qué ausencia descontó y cuántos días. Si un feriado no está en el mantenedor, la nómina pagará ese día: revisar Feriados antes de generar.</w:t>
+            </w:r>
+          </w:p>
+        </w:tc>
+      </w:tr>
+    </w:tbl>
+    <w:p>
+      <w:pPr>
+        <w:spacing w:after="40"/>
+      </w:pPr>
+    </w:p>
+    <w:p>
+      <w:pPr>
         <w:pStyle w:val="ListBullet"/>
         <w:spacing w:after="40"/>
       </w:pPr>
@@ -15316,6 +16261,1245 @@
       <w:r>
         <w:t>a la aseguradora por el total del cupón (Otros / EXENTO), con cupón y nómina adjuntos, correo seguro_odp_contabilidad a Contabilidad cc RRHH y quien emitió. En ese momento nacen los descuentos VARIOS de 1 cuota por empleado ("Seguro complementario de salud — N cargas") que salen en la liquidación del mes.</w:t>
       </w:r>
+    </w:p>
+    <w:p>
+      <w:pPr>
+        <w:pStyle w:val="Heading3"/>
+      </w:pPr>
+      <w:r>
+        <w:t>18.3 Fórmulas y criterios de cálculo del seguro</w:t>
+      </w:r>
+    </w:p>
+    <w:p>
+      <w:pPr>
+        <w:spacing w:after="80"/>
+      </w:pPr>
+      <w:r>
+        <w:rPr>
+          <w:b w:val="0"/>
+          <w:i w:val="0"/>
+        </w:rPr>
+        <w:t>Motor único seguro-salud.controller (calcularMes, esperadoDe, cuadrar, leerCupon). Parámetros con vigencia por mes en rh_seguro_param; póliza en rh_seguro_poliza.</w:t>
+      </w:r>
+    </w:p>
+    <w:tbl>
+      <w:tblPr>
+        <w:tblStyle w:val="TableGrid"/>
+        <w:tblW w:type="auto" w:w="0"/>
+        <w:jc w:val="center"/>
+        <w:tblLook w:firstColumn="1" w:firstRow="1" w:lastColumn="0" w:lastRow="0" w:noHBand="0" w:noVBand="1" w:val="04A0"/>
+      </w:tblPr>
+      <w:tblGrid>
+        <w:gridCol w:w="3249"/>
+        <w:gridCol w:w="3249"/>
+        <w:gridCol w:w="3249"/>
+      </w:tblGrid>
+      <w:tr>
+        <w:tc>
+          <w:tcPr>
+            <w:tcW w:type="dxa" w:w="2041"/>
+            <w:shd w:val="clear" w:color="auto" w:fill="1F4E79"/>
+          </w:tcPr>
+          <w:p>
+            <w:r/>
+            <w:r>
+              <w:rPr>
+                <w:b/>
+                <w:color w:val="FFFFFF"/>
+                <w:sz w:val="18"/>
+              </w:rPr>
+              <w:t>Concepto</w:t>
+            </w:r>
+          </w:p>
+        </w:tc>
+        <w:tc>
+          <w:tcPr>
+            <w:tcW w:type="dxa" w:w="5329"/>
+            <w:shd w:val="clear" w:color="auto" w:fill="1F4E79"/>
+          </w:tcPr>
+          <w:p>
+            <w:r/>
+            <w:r>
+              <w:rPr>
+                <w:b/>
+                <w:color w:val="FFFFFF"/>
+                <w:sz w:val="18"/>
+              </w:rPr>
+              <w:t>Regla / fórmula</w:t>
+            </w:r>
+          </w:p>
+        </w:tc>
+        <w:tc>
+          <w:tcPr>
+            <w:tcW w:type="dxa" w:w="1984"/>
+            <w:shd w:val="clear" w:color="auto" w:fill="1F4E79"/>
+          </w:tcPr>
+          <w:p>
+            <w:r/>
+            <w:r>
+              <w:rPr>
+                <w:b/>
+                <w:color w:val="FFFFFF"/>
+                <w:sz w:val="18"/>
+              </w:rPr>
+              <w:t>Parámetro</w:t>
+            </w:r>
+          </w:p>
+        </w:tc>
+      </w:tr>
+      <w:tr>
+        <w:tc>
+          <w:tcPr>
+            <w:tcW w:type="dxa" w:w="2041"/>
+          </w:tcPr>
+          <w:p>
+            <w:r/>
+            <w:r>
+              <w:rPr>
+                <w:sz w:val="18"/>
+              </w:rPr>
+              <w:t>Titular</w:t>
+            </w:r>
+          </w:p>
+        </w:tc>
+        <w:tc>
+          <w:tcPr>
+            <w:tcW w:type="dxa" w:w="5329"/>
+          </w:tcPr>
+          <w:p>
+            <w:r/>
+            <w:r>
+              <w:rPr>
+                <w:sz w:val="18"/>
+              </w:rPr>
+              <w:t>contrato INDEFINIDO con sueldo base y casilla seguro_salud = 1. La prima del titular la paga siempre la empresa.</w:t>
+            </w:r>
+          </w:p>
+        </w:tc>
+        <w:tc>
+          <w:tcPr>
+            <w:tcW w:type="dxa" w:w="1984"/>
+          </w:tcPr>
+          <w:p>
+            <w:r/>
+            <w:r>
+              <w:rPr>
+                <w:sz w:val="18"/>
+              </w:rPr>
+              <w:t>prima_titular 1,7511 UF (2026, por confirmar)</w:t>
+            </w:r>
+          </w:p>
+        </w:tc>
+      </w:tr>
+      <w:tr>
+        <w:tc>
+          <w:tcPr>
+            <w:tcW w:type="dxa" w:w="2041"/>
+          </w:tcPr>
+          <w:p>
+            <w:r/>
+            <w:r>
+              <w:rPr>
+                <w:sz w:val="18"/>
+              </w:rPr>
+              <w:t>UF del mes</w:t>
+            </w:r>
+          </w:p>
+        </w:tc>
+        <w:tc>
+          <w:tcPr>
+            <w:tcW w:type="dxa" w:w="5329"/>
+          </w:tcPr>
+          <w:p>
+            <w:r/>
+            <w:r>
+              <w:rPr>
+                <w:sz w:val="18"/>
+              </w:rPr>
+              <w:t>UF del día 1 del mes de la nómina (moneda UF); prima en pesos = prima × UF, redondeada.</w:t>
+            </w:r>
+          </w:p>
+        </w:tc>
+        <w:tc>
+          <w:tcPr>
+            <w:tcW w:type="dxa" w:w="1984"/>
+          </w:tcPr>
+          <w:p>
+            <w:r/>
+            <w:r>
+              <w:rPr>
+                <w:sz w:val="18"/>
+              </w:rPr>
+              <w:t>mantenedor UF</w:t>
+            </w:r>
+          </w:p>
+        </w:tc>
+      </w:tr>
+      <w:tr>
+        <w:tc>
+          <w:tcPr>
+            <w:tcW w:type="dxa" w:w="2041"/>
+          </w:tcPr>
+          <w:p>
+            <w:r/>
+            <w:r>
+              <w:rPr>
+                <w:sz w:val="18"/>
+              </w:rPr>
+              <w:t>Edad de la carga</w:t>
+            </w:r>
+          </w:p>
+        </w:tc>
+        <w:tc>
+          <w:tcPr>
+            <w:tcW w:type="dxa" w:w="5329"/>
+          </w:tcPr>
+          <w:p>
+            <w:r/>
+            <w:r>
+              <w:rPr>
+                <w:sz w:val="18"/>
+              </w:rPr>
+              <w:t>edad cumplida al día 1 del mes.</w:t>
+            </w:r>
+          </w:p>
+        </w:tc>
+        <w:tc>
+          <w:tcPr>
+            <w:tcW w:type="dxa" w:w="1984"/>
+          </w:tcPr>
+          <w:p>
+            <w:r/>
+            <w:r>
+              <w:rPr>
+                <w:sz w:val="18"/>
+              </w:rPr>
+              <w:t>fecha_nacimiento</w:t>
+            </w:r>
+          </w:p>
+        </w:tc>
+      </w:tr>
+      <w:tr>
+        <w:tc>
+          <w:tcPr>
+            <w:tcW w:type="dxa" w:w="2041"/>
+          </w:tcPr>
+          <w:p>
+            <w:r/>
+            <w:r>
+              <w:rPr>
+                <w:sz w:val="18"/>
+              </w:rPr>
+              <w:t>Estudiante</w:t>
+            </w:r>
+          </w:p>
+        </w:tc>
+        <w:tc>
+          <w:tcPr>
+            <w:tcW w:type="dxa" w:w="5329"/>
+          </w:tcPr>
+          <w:p>
+            <w:r/>
+            <w:r>
+              <w:rPr>
+                <w:sz w:val="18"/>
+              </w:rPr>
+              <w:t>hijo con certificado de estudios marcado, póliza vigente al día 1 y edad ≤ edad máxima de estudiante.</w:t>
+            </w:r>
+          </w:p>
+        </w:tc>
+        <w:tc>
+          <w:tcPr>
+            <w:tcW w:type="dxa" w:w="1984"/>
+          </w:tcPr>
+          <w:p>
+            <w:r/>
+            <w:r>
+              <w:rPr>
+                <w:sz w:val="18"/>
+              </w:rPr>
+              <w:t>edad_max_estudiante 27 · rh_seguro_poliza.vigencia_hasta</w:t>
+            </w:r>
+          </w:p>
+        </w:tc>
+      </w:tr>
+      <w:tr>
+        <w:tc>
+          <w:tcPr>
+            <w:tcW w:type="dxa" w:w="2041"/>
+          </w:tcPr>
+          <w:p>
+            <w:r/>
+            <w:r>
+              <w:rPr>
+                <w:sz w:val="18"/>
+              </w:rPr>
+              <w:t>Excede edad</w:t>
+            </w:r>
+          </w:p>
+        </w:tc>
+        <w:tc>
+          <w:tcPr>
+            <w:tcW w:type="dxa" w:w="5329"/>
+          </w:tcPr>
+          <w:p>
+            <w:r/>
+            <w:r>
+              <w:rPr>
+                <w:sz w:val="18"/>
+              </w:rPr>
+              <w:t>hijo con edad &gt; edad máxima y que no es estudiante → fuera de la nómina (rojo). Certificado vencido = tenía certificado pero la póliza ya se renovó.</w:t>
+            </w:r>
+          </w:p>
+        </w:tc>
+        <w:tc>
+          <w:tcPr>
+            <w:tcW w:type="dxa" w:w="1984"/>
+          </w:tcPr>
+          <w:p>
+            <w:r/>
+            <w:r>
+              <w:rPr>
+                <w:sz w:val="18"/>
+              </w:rPr>
+              <w:t>edad_max_hijo 23</w:t>
+            </w:r>
+          </w:p>
+        </w:tc>
+      </w:tr>
+      <w:tr>
+        <w:tc>
+          <w:tcPr>
+            <w:tcW w:type="dxa" w:w="2041"/>
+          </w:tcPr>
+          <w:p>
+            <w:r/>
+            <w:r>
+              <w:rPr>
+                <w:sz w:val="18"/>
+              </w:rPr>
+              <w:t>Carga incluida</w:t>
+            </w:r>
+          </w:p>
+        </w:tc>
+        <w:tc>
+          <w:tcPr>
+            <w:tcW w:type="dxa" w:w="5329"/>
+          </w:tcPr>
+          <w:p>
+            <w:r/>
+            <w:r>
+              <w:rPr>
+                <w:sz w:val="18"/>
+              </w:rPr>
+              <w:t>casilla Seguro marcada, titular incluido y no excede edad.</w:t>
+            </w:r>
+          </w:p>
+        </w:tc>
+        <w:tc>
+          <w:tcPr>
+            <w:tcW w:type="dxa" w:w="1984"/>
+          </w:tcPr>
+          <w:p>
+            <w:r/>
+            <w:r>
+              <w:rPr>
+                <w:sz w:val="18"/>
+              </w:rPr>
+              <w:t>rh_cargas.en_seguro</w:t>
+            </w:r>
+          </w:p>
+        </w:tc>
+      </w:tr>
+      <w:tr>
+        <w:tc>
+          <w:tcPr>
+            <w:tcW w:type="dxa" w:w="2041"/>
+          </w:tcPr>
+          <w:p>
+            <w:r/>
+            <w:r>
+              <w:rPr>
+                <w:sz w:val="18"/>
+              </w:rPr>
+              <w:t>Quién paga la carga</w:t>
+            </w:r>
+          </w:p>
+        </w:tc>
+        <w:tc>
+          <w:tcPr>
+            <w:tcW w:type="dxa" w:w="5329"/>
+          </w:tcPr>
+          <w:p>
+            <w:r/>
+            <w:r>
+              <w:rPr>
+                <w:sz w:val="18"/>
+              </w:rPr>
+              <w:t>EMPRESA si el titular ingresó hasta la fecha de corte; si no, EMPLEADO. El selector Paga de la carga manda sobre la regla.</w:t>
+            </w:r>
+          </w:p>
+        </w:tc>
+        <w:tc>
+          <w:tcPr>
+            <w:tcW w:type="dxa" w:w="1984"/>
+          </w:tcPr>
+          <w:p>
+            <w:r/>
+            <w:r>
+              <w:rPr>
+                <w:sz w:val="18"/>
+              </w:rPr>
+              <w:t>corte_cargas_empresa · rh_cargas.paga</w:t>
+            </w:r>
+          </w:p>
+        </w:tc>
+      </w:tr>
+      <w:tr>
+        <w:tc>
+          <w:tcPr>
+            <w:tcW w:type="dxa" w:w="2041"/>
+          </w:tcPr>
+          <w:p>
+            <w:r/>
+            <w:r>
+              <w:rPr>
+                <w:sz w:val="18"/>
+              </w:rPr>
+              <w:t>Costo por titular</w:t>
+            </w:r>
+          </w:p>
+        </w:tc>
+        <w:tc>
+          <w:tcPr>
+            <w:tcW w:type="dxa" w:w="5329"/>
+          </w:tcPr>
+          <w:p>
+            <w:r/>
+            <w:r>
+              <w:rPr>
+                <w:sz w:val="18"/>
+              </w:rPr>
+              <w:t>costo empresa = prima titular + Σ primas de cargas EMPRESA · descuento empleado = Σ primas de cargas EMPLEADO.</w:t>
+            </w:r>
+          </w:p>
+        </w:tc>
+        <w:tc>
+          <w:tcPr>
+            <w:tcW w:type="dxa" w:w="1984"/>
+          </w:tcPr>
+          <w:p>
+            <w:r/>
+            <w:r>
+              <w:rPr>
+                <w:sz w:val="18"/>
+              </w:rPr>
+              <w:t>prima_carga (hoy 0)</w:t>
+            </w:r>
+          </w:p>
+        </w:tc>
+      </w:tr>
+      <w:tr>
+        <w:tc>
+          <w:tcPr>
+            <w:tcW w:type="dxa" w:w="2041"/>
+          </w:tcPr>
+          <w:p>
+            <w:r/>
+            <w:r>
+              <w:rPr>
+                <w:sz w:val="18"/>
+              </w:rPr>
+              <w:t>Esperado del mes (UF)</w:t>
+            </w:r>
+          </w:p>
+        </w:tc>
+        <w:tc>
+          <w:tcPr>
+            <w:tcW w:type="dxa" w:w="5329"/>
+          </w:tcPr>
+          <w:p>
+            <w:r/>
+            <w:r>
+              <w:rPr>
+                <w:sz w:val="18"/>
+              </w:rPr>
+              <w:t>titulares × prima titular + cargas incluidas × prima carga.</w:t>
+            </w:r>
+          </w:p>
+        </w:tc>
+        <w:tc>
+          <w:tcPr>
+            <w:tcW w:type="dxa" w:w="1984"/>
+          </w:tcPr>
+          <w:p>
+            <w:r/>
+            <w:r>
+              <w:rPr>
+                <w:sz w:val="18"/>
+              </w:rPr>
+              <w:t>esperadoDe</w:t>
+            </w:r>
+          </w:p>
+        </w:tc>
+      </w:tr>
+      <w:tr>
+        <w:tc>
+          <w:tcPr>
+            <w:tcW w:type="dxa" w:w="2041"/>
+          </w:tcPr>
+          <w:p>
+            <w:r/>
+            <w:r>
+              <w:rPr>
+                <w:sz w:val="18"/>
+              </w:rPr>
+              <w:t>Cuadratura</w:t>
+            </w:r>
+          </w:p>
+        </w:tc>
+        <w:tc>
+          <w:tcPr>
+            <w:tcW w:type="dxa" w:w="5329"/>
+          </w:tcPr>
+          <w:p>
+            <w:r/>
+            <w:r>
+              <w:rPr>
+                <w:sz w:val="18"/>
+              </w:rPr>
+              <w:t>diferencia = prima del período del cupón − esperado; cuadra si |diferencia| ≤ tolerancia.</w:t>
+            </w:r>
+          </w:p>
+        </w:tc>
+        <w:tc>
+          <w:tcPr>
+            <w:tcW w:type="dxa" w:w="1984"/>
+          </w:tcPr>
+          <w:p>
+            <w:r/>
+            <w:r>
+              <w:rPr>
+                <w:sz w:val="18"/>
+              </w:rPr>
+              <w:t>tolerancia_uf 0,05</w:t>
+            </w:r>
+          </w:p>
+        </w:tc>
+      </w:tr>
+      <w:tr>
+        <w:tc>
+          <w:tcPr>
+            <w:tcW w:type="dxa" w:w="2041"/>
+          </w:tcPr>
+          <w:p>
+            <w:r/>
+            <w:r>
+              <w:rPr>
+                <w:sz w:val="18"/>
+              </w:rPr>
+              <w:t>Total a pagar (ODP)</w:t>
+            </w:r>
+          </w:p>
+        </w:tc>
+        <w:tc>
+          <w:tcPr>
+            <w:tcW w:type="dxa" w:w="5329"/>
+          </w:tcPr>
+          <w:p>
+            <w:r/>
+            <w:r>
+              <w:rPr>
+                <w:sz w:val="18"/>
+              </w:rPr>
+              <w:t>UF total del cupón (período ± ajustes de períodos anteriores) × UF de cobro del cupón = total en pesos del cupón. La ODP se emite por el total del cupón, no por lo esperado.</w:t>
+            </w:r>
+          </w:p>
+        </w:tc>
+        <w:tc>
+          <w:tcPr>
+            <w:tcW w:type="dxa" w:w="1984"/>
+          </w:tcPr>
+          <w:p>
+            <w:r/>
+            <w:r>
+              <w:rPr>
+                <w:sz w:val="18"/>
+              </w:rPr>
+              <w:t>cupón MetLife</w:t>
+            </w:r>
+          </w:p>
+        </w:tc>
+      </w:tr>
+      <w:tr>
+        <w:tc>
+          <w:tcPr>
+            <w:tcW w:type="dxa" w:w="2041"/>
+          </w:tcPr>
+          <w:p>
+            <w:r/>
+            <w:r>
+              <w:rPr>
+                <w:sz w:val="18"/>
+              </w:rPr>
+              <w:t>Descuento al empleado</w:t>
+            </w:r>
+          </w:p>
+        </w:tc>
+        <w:tc>
+          <w:tcPr>
+            <w:tcW w:type="dxa" w:w="5329"/>
+          </w:tcPr>
+          <w:p>
+            <w:r/>
+            <w:r>
+              <w:rPr>
+                <w:sz w:val="18"/>
+              </w:rPr>
+              <w:t>al emitir la ODP: por cada titular con cargas EMPLEADO, un descuento VARIOS de 1 cuota = Σ primas de esas cargas (en pesos, UF del día 1), glosa "Seguro complementario de salud — N cargas".</w:t>
+            </w:r>
+          </w:p>
+        </w:tc>
+        <w:tc>
+          <w:tcPr>
+            <w:tcW w:type="dxa" w:w="1984"/>
+          </w:tcPr>
+          <w:p>
+            <w:r/>
+            <w:r>
+              <w:rPr>
+                <w:sz w:val="18"/>
+              </w:rPr>
+              <w:t>rh_descuentos.seguro_mes</w:t>
+            </w:r>
+          </w:p>
+        </w:tc>
+      </w:tr>
+      <w:tr>
+        <w:tc>
+          <w:tcPr>
+            <w:tcW w:type="dxa" w:w="2041"/>
+          </w:tcPr>
+          <w:p>
+            <w:r/>
+            <w:r>
+              <w:rPr>
+                <w:sz w:val="18"/>
+              </w:rPr>
+              <w:t>Acción por carga fuera (cruce con la nómina de cotización)</w:t>
+            </w:r>
+          </w:p>
+        </w:tc>
+        <w:tc>
+          <w:tcPr>
+            <w:tcW w:type="dxa" w:w="5329"/>
+          </w:tcPr>
+          <w:p>
+            <w:r/>
+            <w:r>
+              <w:rPr>
+                <w:sz w:val="18"/>
+              </w:rPr>
+              <w:t>titular no encontrado → ALERTA · hijo con edad ≤ edad máxima → ALERTA · edad máxima &lt; edad ≤ estudiante → PEDIR_CERTIFICADO · mayor → FUERA_EDAD · asegurado sin ficha → "sobran".</w:t>
+            </w:r>
+          </w:p>
+        </w:tc>
+        <w:tc>
+          <w:tcPr>
+            <w:tcW w:type="dxa" w:w="1984"/>
+          </w:tcPr>
+          <w:p>
+            <w:r/>
+            <w:r>
+              <w:rPr>
+                <w:sz w:val="18"/>
+              </w:rPr>
+              <w:t>subirCotizacion</w:t>
+            </w:r>
+          </w:p>
+        </w:tc>
+      </w:tr>
+      <w:tr>
+        <w:tc>
+          <w:tcPr>
+            <w:tcW w:type="dxa" w:w="2041"/>
+          </w:tcPr>
+          <w:p>
+            <w:r/>
+            <w:r>
+              <w:rPr>
+                <w:sz w:val="18"/>
+              </w:rPr>
+              <w:t>Aviso de certificado</w:t>
+            </w:r>
+          </w:p>
+        </w:tc>
+        <w:tc>
+          <w:tcPr>
+            <w:tcW w:type="dxa" w:w="5329"/>
+          </w:tcPr>
+          <w:p>
+            <w:r/>
+            <w:r>
+              <w:rPr>
+                <w:sz w:val="18"/>
+              </w:rPr>
+              <w:t>certificado_dias_antes (30) antes de cumplir edad máxima + 1, si no hay certificado vigente; plazo de entrega certificado_plazo_dias (5).</w:t>
+            </w:r>
+          </w:p>
+        </w:tc>
+        <w:tc>
+          <w:tcPr>
+            <w:tcW w:type="dxa" w:w="1984"/>
+          </w:tcPr>
+          <w:p>
+            <w:r/>
+            <w:r>
+              <w:rPr>
+                <w:sz w:val="18"/>
+              </w:rPr>
+              <w:t>seguro-certificado-aviso</w:t>
+            </w:r>
+          </w:p>
+        </w:tc>
+      </w:tr>
+    </w:tbl>
+    <w:p>
+      <w:pPr>
+        <w:spacing w:after="40"/>
+      </w:pPr>
+    </w:p>
+    <w:p>
+      <w:pPr>
+        <w:spacing w:after="40"/>
+      </w:pPr>
+      <w:r>
+        <w:rPr>
+          <w:b/>
+          <w:i w:val="0"/>
+          <w:color w:val="1F4E79"/>
+        </w:rPr>
+        <w:t>Ejemplo numérico (octubre 2026)</w:t>
+      </w:r>
+    </w:p>
+    <w:p>
+      <w:pPr>
+        <w:spacing w:after="80"/>
+      </w:pPr>
+      <w:r>
+        <w:rPr>
+          <w:b w:val="0"/>
+          <w:i w:val="0"/>
+        </w:rPr>
+        <w:t>Parámetros: prima titular 1,7511 UF, prima por carga 0,50 UF (valor hipotético para el ejemplo; hoy es 0), tolerancia 0,05 UF, edad máxima 23, estudiante 27, corte "empresa paga cargas" 31-12-2024. UF del 01-10-2026: $39.500. Nómina: 21 titulares indefinidos; cargas: Pato (ingresó 2015) 2 hijos de 19 y 21; Dagoberto (ingresó 2025) cónyuge y 1 hijo de 25 con certificado vigente; Leonardo (ingresó 2023) 1 hijo de 24 sin certificado.</w:t>
+      </w:r>
+    </w:p>
+    <w:tbl>
+      <w:tblPr>
+        <w:tblStyle w:val="TableGrid"/>
+        <w:tblW w:type="auto" w:w="0"/>
+        <w:jc w:val="center"/>
+        <w:tblLook w:firstColumn="1" w:firstRow="1" w:lastColumn="0" w:lastRow="0" w:noHBand="0" w:noVBand="1" w:val="04A0"/>
+      </w:tblPr>
+      <w:tblGrid>
+        <w:gridCol w:w="3249"/>
+        <w:gridCol w:w="3249"/>
+        <w:gridCol w:w="3249"/>
+      </w:tblGrid>
+      <w:tr>
+        <w:tc>
+          <w:tcPr>
+            <w:tcW w:type="dxa" w:w="2041"/>
+            <w:shd w:val="clear" w:color="auto" w:fill="1F4E79"/>
+          </w:tcPr>
+          <w:p>
+            <w:r/>
+            <w:r>
+              <w:rPr>
+                <w:b/>
+                <w:color w:val="FFFFFF"/>
+                <w:sz w:val="18"/>
+              </w:rPr>
+              <w:t>Paso</w:t>
+            </w:r>
+          </w:p>
+        </w:tc>
+        <w:tc>
+          <w:tcPr>
+            <w:tcW w:type="dxa" w:w="5329"/>
+            <w:shd w:val="clear" w:color="auto" w:fill="1F4E79"/>
+          </w:tcPr>
+          <w:p>
+            <w:r/>
+            <w:r>
+              <w:rPr>
+                <w:b/>
+                <w:color w:val="FFFFFF"/>
+                <w:sz w:val="18"/>
+              </w:rPr>
+              <w:t>Cálculo</w:t>
+            </w:r>
+          </w:p>
+        </w:tc>
+        <w:tc>
+          <w:tcPr>
+            <w:tcW w:type="dxa" w:w="1984"/>
+            <w:shd w:val="clear" w:color="auto" w:fill="1F4E79"/>
+          </w:tcPr>
+          <w:p>
+            <w:r/>
+            <w:r>
+              <w:rPr>
+                <w:b/>
+                <w:color w:val="FFFFFF"/>
+                <w:sz w:val="18"/>
+              </w:rPr>
+              <w:t>Resultado</w:t>
+            </w:r>
+          </w:p>
+        </w:tc>
+      </w:tr>
+      <w:tr>
+        <w:tc>
+          <w:tcPr>
+            <w:tcW w:type="dxa" w:w="2041"/>
+          </w:tcPr>
+          <w:p>
+            <w:r/>
+            <w:r>
+              <w:rPr>
+                <w:sz w:val="18"/>
+              </w:rPr>
+              <w:t>Cargas incluidas</w:t>
+            </w:r>
+          </w:p>
+        </w:tc>
+        <w:tc>
+          <w:tcPr>
+            <w:tcW w:type="dxa" w:w="5329"/>
+          </w:tcPr>
+          <w:p>
+            <w:r/>
+            <w:r>
+              <w:rPr>
+                <w:sz w:val="18"/>
+              </w:rPr>
+              <w:t>Pato 2 (EMPRESA, ingresó antes del corte) · Dagoberto 2 (EMPLEADO: cónyuge + hijo estudiante ≤ 27) · Leonardo: hijo de 24 &gt; 23 sin certificado → EXCEDE EDAD, fuera (rojo)</w:t>
+            </w:r>
+          </w:p>
+        </w:tc>
+        <w:tc>
+          <w:tcPr>
+            <w:tcW w:type="dxa" w:w="1984"/>
+          </w:tcPr>
+          <w:p>
+            <w:r/>
+            <w:r>
+              <w:rPr>
+                <w:sz w:val="18"/>
+              </w:rPr>
+              <w:t>4 cargas</w:t>
+            </w:r>
+          </w:p>
+        </w:tc>
+      </w:tr>
+      <w:tr>
+        <w:tc>
+          <w:tcPr>
+            <w:tcW w:type="dxa" w:w="2041"/>
+          </w:tcPr>
+          <w:p>
+            <w:r/>
+            <w:r>
+              <w:rPr>
+                <w:sz w:val="18"/>
+              </w:rPr>
+              <w:t>Esperado (UF)</w:t>
+            </w:r>
+          </w:p>
+        </w:tc>
+        <w:tc>
+          <w:tcPr>
+            <w:tcW w:type="dxa" w:w="5329"/>
+          </w:tcPr>
+          <w:p>
+            <w:r/>
+            <w:r>
+              <w:rPr>
+                <w:sz w:val="18"/>
+              </w:rPr>
+              <w:t>21 × 1,7511 + 4 × 0,50 = 36,7731 + 2,00</w:t>
+            </w:r>
+          </w:p>
+        </w:tc>
+        <w:tc>
+          <w:tcPr>
+            <w:tcW w:type="dxa" w:w="1984"/>
+          </w:tcPr>
+          <w:p>
+            <w:r/>
+            <w:r>
+              <w:rPr>
+                <w:sz w:val="18"/>
+              </w:rPr>
+              <w:t>38,77 UF</w:t>
+            </w:r>
+          </w:p>
+        </w:tc>
+      </w:tr>
+      <w:tr>
+        <w:tc>
+          <w:tcPr>
+            <w:tcW w:type="dxa" w:w="2041"/>
+          </w:tcPr>
+          <w:p>
+            <w:r/>
+            <w:r>
+              <w:rPr>
+                <w:sz w:val="18"/>
+              </w:rPr>
+              <w:t>Cupón MetLife</w:t>
+            </w:r>
+          </w:p>
+        </w:tc>
+        <w:tc>
+          <w:tcPr>
+            <w:tcW w:type="dxa" w:w="5329"/>
+          </w:tcPr>
+          <w:p>
+            <w:r/>
+            <w:r>
+              <w:rPr>
+                <w:sz w:val="18"/>
+              </w:rPr>
+              <w:t>prima del período 38,80 UF; ajustes de períodos anteriores −1,20 UF (baja de agosto); UF de cobro $39.841,72; total 37,60 × 39.841,72</w:t>
+            </w:r>
+          </w:p>
+        </w:tc>
+        <w:tc>
+          <w:tcPr>
+            <w:tcW w:type="dxa" w:w="1984"/>
+          </w:tcPr>
+          <w:p>
+            <w:r/>
+            <w:r>
+              <w:rPr>
+                <w:sz w:val="18"/>
+              </w:rPr>
+              <w:t>$1.498.049</w:t>
+            </w:r>
+          </w:p>
+        </w:tc>
+      </w:tr>
+      <w:tr>
+        <w:tc>
+          <w:tcPr>
+            <w:tcW w:type="dxa" w:w="2041"/>
+          </w:tcPr>
+          <w:p>
+            <w:r/>
+            <w:r>
+              <w:rPr>
+                <w:sz w:val="18"/>
+              </w:rPr>
+              <w:t>Cuadratura</w:t>
+            </w:r>
+          </w:p>
+        </w:tc>
+        <w:tc>
+          <w:tcPr>
+            <w:tcW w:type="dxa" w:w="5329"/>
+          </w:tcPr>
+          <w:p>
+            <w:r/>
+            <w:r>
+              <w:rPr>
+                <w:sz w:val="18"/>
+              </w:rPr>
+              <w:t>38,80 − 38,77 = 0,03 ≤ 0,05</w:t>
+            </w:r>
+          </w:p>
+        </w:tc>
+        <w:tc>
+          <w:tcPr>
+            <w:tcW w:type="dxa" w:w="1984"/>
+          </w:tcPr>
+          <w:p>
+            <w:r/>
+            <w:r>
+              <w:rPr>
+                <w:sz w:val="18"/>
+              </w:rPr>
+              <w:t>CUADRA</w:t>
+            </w:r>
+          </w:p>
+        </w:tc>
+      </w:tr>
+      <w:tr>
+        <w:tc>
+          <w:tcPr>
+            <w:tcW w:type="dxa" w:w="2041"/>
+          </w:tcPr>
+          <w:p>
+            <w:r/>
+            <w:r>
+              <w:rPr>
+                <w:sz w:val="18"/>
+              </w:rPr>
+              <w:t>Nómina de cotización</w:t>
+            </w:r>
+          </w:p>
+        </w:tc>
+        <w:tc>
+          <w:tcPr>
+            <w:tcW w:type="dxa" w:w="5329"/>
+          </w:tcPr>
+          <w:p>
+            <w:r/>
+            <w:r>
+              <w:rPr>
+                <w:sz w:val="18"/>
+              </w:rPr>
+              <w:t>trae a los 21 titulares y 4 cargas; además trae a "Carlos Moreno" sin ficha → sobran 1 (avisar a la aseguradora); el hijo de Leonardo no viene → FUERA_EDAD (nada que hacer salvo certificado)</w:t>
+            </w:r>
+          </w:p>
+        </w:tc>
+        <w:tc>
+          <w:tcPr>
+            <w:tcW w:type="dxa" w:w="1984"/>
+          </w:tcPr>
+          <w:p>
+            <w:r/>
+            <w:r>
+              <w:rPr>
+                <w:sz w:val="18"/>
+              </w:rPr>
+              <w:t>1 sobra, 1 fuera</w:t>
+            </w:r>
+          </w:p>
+        </w:tc>
+      </w:tr>
+      <w:tr>
+        <w:tc>
+          <w:tcPr>
+            <w:tcW w:type="dxa" w:w="2041"/>
+          </w:tcPr>
+          <w:p>
+            <w:r/>
+            <w:r>
+              <w:rPr>
+                <w:sz w:val="18"/>
+              </w:rPr>
+              <w:t>ODP a MetLife</w:t>
+            </w:r>
+          </w:p>
+        </w:tc>
+        <w:tc>
+          <w:tcPr>
+            <w:tcW w:type="dxa" w:w="5329"/>
+          </w:tcPr>
+          <w:p>
+            <w:r/>
+            <w:r>
+              <w:rPr>
+                <w:sz w:val="18"/>
+              </w:rPr>
+              <w:t>por el total del cupón, Otros / exento, con cupón y nómina adjuntos; correo a Contabilidad cc RRHH</w:t>
+            </w:r>
+          </w:p>
+        </w:tc>
+        <w:tc>
+          <w:tcPr>
+            <w:tcW w:type="dxa" w:w="1984"/>
+          </w:tcPr>
+          <w:p>
+            <w:r/>
+            <w:r>
+              <w:rPr>
+                <w:sz w:val="18"/>
+              </w:rPr>
+              <w:t>$1.498.049</w:t>
+            </w:r>
+          </w:p>
+        </w:tc>
+      </w:tr>
+      <w:tr>
+        <w:tc>
+          <w:tcPr>
+            <w:tcW w:type="dxa" w:w="2041"/>
+          </w:tcPr>
+          <w:p>
+            <w:r/>
+            <w:r>
+              <w:rPr>
+                <w:sz w:val="18"/>
+              </w:rPr>
+              <w:t>Descuento a Dagoberto</w:t>
+            </w:r>
+          </w:p>
+        </w:tc>
+        <w:tc>
+          <w:tcPr>
+            <w:tcW w:type="dxa" w:w="5329"/>
+          </w:tcPr>
+          <w:p>
+            <w:r/>
+            <w:r>
+              <w:rPr>
+                <w:sz w:val="18"/>
+              </w:rPr>
+              <w:t>2 cargas EMPLEADO × 0,50 UF × 39.500 = 39.500 → descuento VARIOS 1 cuota en la liquidación de octubre</w:t>
+            </w:r>
+          </w:p>
+        </w:tc>
+        <w:tc>
+          <w:tcPr>
+            <w:tcW w:type="dxa" w:w="1984"/>
+          </w:tcPr>
+          <w:p>
+            <w:r/>
+            <w:r>
+              <w:rPr>
+                <w:sz w:val="18"/>
+              </w:rPr>
+              <w:t>$39.500</w:t>
+            </w:r>
+          </w:p>
+        </w:tc>
+      </w:tr>
+      <w:tr>
+        <w:tc>
+          <w:tcPr>
+            <w:tcW w:type="dxa" w:w="2041"/>
+          </w:tcPr>
+          <w:p>
+            <w:r/>
+            <w:r>
+              <w:rPr>
+                <w:sz w:val="18"/>
+              </w:rPr>
+              <w:t>Costo empresa del mes</w:t>
+            </w:r>
+          </w:p>
+        </w:tc>
+        <w:tc>
+          <w:tcPr>
+            <w:tcW w:type="dxa" w:w="5329"/>
+          </w:tcPr>
+          <w:p>
+            <w:r/>
+            <w:r>
+              <w:rPr>
+                <w:sz w:val="18"/>
+              </w:rPr>
+              <w:t>1.498.049 − 39.500 (recuperado del empleado)</w:t>
+            </w:r>
+          </w:p>
+        </w:tc>
+        <w:tc>
+          <w:tcPr>
+            <w:tcW w:type="dxa" w:w="1984"/>
+          </w:tcPr>
+          <w:p>
+            <w:r/>
+            <w:r>
+              <w:rPr>
+                <w:sz w:val="18"/>
+              </w:rPr>
+              <w:t>$1.458.549</w:t>
+            </w:r>
+          </w:p>
+        </w:tc>
+      </w:tr>
+      <w:tr>
+        <w:tc>
+          <w:tcPr>
+            <w:tcW w:type="dxa" w:w="2041"/>
+          </w:tcPr>
+          <w:p>
+            <w:r/>
+            <w:r>
+              <w:rPr>
+                <w:sz w:val="18"/>
+              </w:rPr>
+              <w:t>Si NO cuadrara</w:t>
+            </w:r>
+          </w:p>
+        </w:tc>
+        <w:tc>
+          <w:tcPr>
+            <w:tcW w:type="dxa" w:w="5329"/>
+          </w:tcPr>
+          <w:p>
+            <w:r/>
+            <w:r>
+              <w:rPr>
+                <w:sz w:val="18"/>
+              </w:rPr>
+              <w:t>cupón 40,55 UF → diferencia +1,78 &gt; 0,05: campana a RRHH y Gerente de Finanzas; RRHH revisa la nómina de cotización (probablemente un titular inscrito que el sistema no tiene marcado) y da su OK con motivo, o corrige la ficha y vuelve a cuadrar</w:t>
+            </w:r>
+          </w:p>
+        </w:tc>
+        <w:tc>
+          <w:tcPr>
+            <w:tcW w:type="dxa" w:w="1984"/>
+          </w:tcPr>
+          <w:p>
+            <w:r/>
+            <w:r>
+              <w:rPr>
+                <w:sz w:val="18"/>
+              </w:rPr>
+              <w:t>NO_CUADRA → OK_RRHH</w:t>
+            </w:r>
+          </w:p>
+        </w:tc>
+      </w:tr>
+    </w:tbl>
+    <w:p>
+      <w:pPr>
+        <w:spacing w:after="40"/>
+      </w:pPr>
+    </w:p>
+    <w:tbl>
+      <w:tblPr>
+        <w:tblStyle w:val="TableGrid"/>
+        <w:tblW w:type="auto" w:w="0"/>
+        <w:tblLook w:firstColumn="1" w:firstRow="1" w:lastColumn="0" w:lastRow="0" w:noHBand="0" w:noVBand="1" w:val="04A0"/>
+      </w:tblPr>
+      <w:tblGrid>
+        <w:gridCol w:w="9746"/>
+      </w:tblGrid>
+      <w:tr>
+        <w:tc>
+          <w:tcPr>
+            <w:tcW w:type="dxa" w:w="9746"/>
+            <w:shd w:val="clear" w:color="auto" w:fill="E8F0F8"/>
+          </w:tcPr>
+          <w:p>
+            <w:r/>
+            <w:r>
+              <w:rPr>
+                <w:b/>
+                <w:sz w:val="19"/>
+              </w:rPr>
+              <w:t>🔒 Cómo cuadrar a mano</w:t>
+              <w:br/>
+            </w:r>
+            <w:r>
+              <w:rPr>
+                <w:sz w:val="19"/>
+              </w:rPr>
+              <w:t>esperado = titulares con casilla × prima titular + cargas con casilla (sin exceder edad) × prima carga, todo en UF; compararlo con la "prima del período" del cupón (no con el total, que trae ajustes retroactivos). Si difiere en más de 0,05 UF, la nómina de cotización dice quién sobra o falta. La ODP siempre va por el total del cupón; lo que se corrige es la ficha, nunca el monto.</w:t>
+            </w:r>
+          </w:p>
+        </w:tc>
+      </w:tr>
+    </w:tbl>
+    <w:p>
+      <w:pPr>
+        <w:spacing w:after="40"/>
+      </w:pPr>
     </w:p>
     <w:p>
       <w:pPr>

</xml_diff>

<commit_message>
docs: Manual de RRHH v2.6 — fórmulas de anticipos y préstamos (cuota francesa, TMC, tope 15%, mes de inicio, saldo al finiquito) con ejemplo numérico (cap. 13.3); documentación v3.6 (v255.4)
Co-Authored-By: Claude Fable 5.1 <noreply@anthropic.com>
</commit_message>
<xml_diff>
--- a/api-gateway/public/mantenedores/documentacion/descargas/Manual-RRHH-Business-Suite.docx
+++ b/api-gateway/public/mantenedores/documentacion/descargas/Manual-RRHH-Business-Suite.docx
@@ -236,7 +236,7 @@
           <w:i w:val="0"/>
           <w:sz w:val="22"/>
         </w:rPr>
-        <w:t>Versión 2.5 · 17 de septiembre de 2026 · Suite v255.3</w:t>
+        <w:t>Versión 2.6 · 17 de septiembre de 2026 · Suite v255.4</w:t>
       </w:r>
     </w:p>
     <w:p>
@@ -752,6 +752,64 @@
                 <w:sz w:val="18"/>
               </w:rPr>
               <w:t>Cap. 17.1: fórmulas de la nómina Edenred con ejemplo; cap. 18.3: fórmulas del seguro de salud (esperado, cuadratura, quién paga, descuentos) con ejemplo.</w:t>
+            </w:r>
+          </w:p>
+        </w:tc>
+      </w:tr>
+      <w:tr>
+        <w:tc>
+          <w:tcPr>
+            <w:tcW w:type="dxa" w:w="907"/>
+          </w:tcPr>
+          <w:p>
+            <w:r/>
+            <w:r>
+              <w:rPr>
+                <w:sz w:val="18"/>
+              </w:rPr>
+              <w:t>2.6</w:t>
+            </w:r>
+          </w:p>
+        </w:tc>
+        <w:tc>
+          <w:tcPr>
+            <w:tcW w:type="dxa" w:w="1247"/>
+          </w:tcPr>
+          <w:p>
+            <w:r/>
+            <w:r>
+              <w:rPr>
+                <w:sz w:val="18"/>
+              </w:rPr>
+              <w:t>17-09-2026</w:t>
+            </w:r>
+          </w:p>
+        </w:tc>
+        <w:tc>
+          <w:tcPr>
+            <w:tcW w:type="dxa" w:w="2041"/>
+          </w:tcPr>
+          <w:p>
+            <w:r/>
+            <w:r>
+              <w:rPr>
+                <w:sz w:val="18"/>
+              </w:rPr>
+              <w:t>Patricio Escobar / Claude</w:t>
+            </w:r>
+          </w:p>
+        </w:tc>
+        <w:tc>
+          <w:tcPr>
+            <w:tcW w:type="dxa" w:w="5159"/>
+          </w:tcPr>
+          <w:p>
+            <w:r/>
+            <w:r>
+              <w:rPr>
+                <w:sz w:val="18"/>
+              </w:rPr>
+              <w:t>Cap. 13.3: fórmulas de anticipos y préstamos (cuota francesa, TMC, tope 15%, mes de inicio, saldo al finiquito) con ejemplo.</w:t>
             </w:r>
           </w:p>
         </w:tc>
@@ -10567,6 +10625,1244 @@
       <w:r>
         <w:t>Pago a la Caja (Máxima 4): al EMITIR el mes se emite sola la ODP a Caja Los Andes por el total retenido, con detalle por colaborador y vencimiento el día 10 del mes siguiente; no se duplica.</w:t>
       </w:r>
+    </w:p>
+    <w:p>
+      <w:pPr>
+        <w:pStyle w:val="Heading3"/>
+      </w:pPr>
+      <w:r>
+        <w:t>13.3 Fórmulas y criterios de cálculo de anticipos y préstamos</w:t>
+      </w:r>
+    </w:p>
+    <w:p>
+      <w:pPr>
+        <w:spacing w:after="80"/>
+      </w:pPr>
+      <w:r>
+        <w:rPr>
+          <w:b w:val="0"/>
+          <w:i w:val="0"/>
+        </w:rPr>
+        <w:t>Motor único rrhh-core.cuotaFrancesa() (el mismo del preview en pantalla, de Solicitudes y del registro directo) y cuotaEnMes() para saber qué cuota toca cada mes. La TMC vigente sale del mantenedor Tasas (tasa mensual, operaciones menores).</w:t>
+      </w:r>
+    </w:p>
+    <w:tbl>
+      <w:tblPr>
+        <w:tblStyle w:val="TableGrid"/>
+        <w:tblW w:type="auto" w:w="0"/>
+        <w:jc w:val="center"/>
+        <w:tblLook w:firstColumn="1" w:firstRow="1" w:lastColumn="0" w:lastRow="0" w:noHBand="0" w:noVBand="1" w:val="04A0"/>
+      </w:tblPr>
+      <w:tblGrid>
+        <w:gridCol w:w="3249"/>
+        <w:gridCol w:w="3249"/>
+        <w:gridCol w:w="3249"/>
+      </w:tblGrid>
+      <w:tr>
+        <w:tc>
+          <w:tcPr>
+            <w:tcW w:type="dxa" w:w="1928"/>
+            <w:shd w:val="clear" w:color="auto" w:fill="1F4E79"/>
+          </w:tcPr>
+          <w:p>
+            <w:r/>
+            <w:r>
+              <w:rPr>
+                <w:b/>
+                <w:color w:val="FFFFFF"/>
+                <w:sz w:val="18"/>
+              </w:rPr>
+              <w:t>Concepto</w:t>
+            </w:r>
+          </w:p>
+        </w:tc>
+        <w:tc>
+          <w:tcPr>
+            <w:tcW w:type="dxa" w:w="5443"/>
+            <w:shd w:val="clear" w:color="auto" w:fill="1F4E79"/>
+          </w:tcPr>
+          <w:p>
+            <w:r/>
+            <w:r>
+              <w:rPr>
+                <w:b/>
+                <w:color w:val="FFFFFF"/>
+                <w:sz w:val="18"/>
+              </w:rPr>
+              <w:t>Regla / fórmula</w:t>
+            </w:r>
+          </w:p>
+        </w:tc>
+        <w:tc>
+          <w:tcPr>
+            <w:tcW w:type="dxa" w:w="1984"/>
+            <w:shd w:val="clear" w:color="auto" w:fill="1F4E79"/>
+          </w:tcPr>
+          <w:p>
+            <w:r/>
+            <w:r>
+              <w:rPr>
+                <w:b/>
+                <w:color w:val="FFFFFF"/>
+                <w:sz w:val="18"/>
+              </w:rPr>
+              <w:t>Fuente</w:t>
+            </w:r>
+          </w:p>
+        </w:tc>
+      </w:tr>
+      <w:tr>
+        <w:tc>
+          <w:tcPr>
+            <w:tcW w:type="dxa" w:w="1928"/>
+          </w:tcPr>
+          <w:p>
+            <w:r/>
+            <w:r>
+              <w:rPr>
+                <w:sz w:val="18"/>
+              </w:rPr>
+              <w:t>Anticipo</w:t>
+            </w:r>
+          </w:p>
+        </w:tc>
+        <w:tc>
+          <w:tcPr>
+            <w:tcW w:type="dxa" w:w="5443"/>
+          </w:tcPr>
+          <w:p>
+            <w:r/>
+            <w:r>
+              <w:rPr>
+                <w:sz w:val="18"/>
+              </w:rPr>
+              <w:t>sin interés: cuota = monto ÷ N cuotas (redondeada). Con N = 1 es un anticipo de sueldo que se descuenta completo en la próxima liquidación.</w:t>
+            </w:r>
+          </w:p>
+        </w:tc>
+        <w:tc>
+          <w:tcPr>
+            <w:tcW w:type="dxa" w:w="1984"/>
+          </w:tcPr>
+          <w:p>
+            <w:r/>
+            <w:r>
+              <w:rPr>
+                <w:sz w:val="18"/>
+              </w:rPr>
+              <w:t>rh_descuentos ANTICIPO</w:t>
+            </w:r>
+          </w:p>
+        </w:tc>
+      </w:tr>
+      <w:tr>
+        <w:tc>
+          <w:tcPr>
+            <w:tcW w:type="dxa" w:w="1928"/>
+          </w:tcPr>
+          <w:p>
+            <w:r/>
+            <w:r>
+              <w:rPr>
+                <w:sz w:val="18"/>
+              </w:rPr>
+              <w:t>Préstamo</w:t>
+            </w:r>
+          </w:p>
+        </w:tc>
+        <w:tc>
+          <w:tcPr>
+            <w:tcW w:type="dxa" w:w="5443"/>
+          </w:tcPr>
+          <w:p>
+            <w:r/>
+            <w:r>
+              <w:rPr>
+                <w:sz w:val="18"/>
+              </w:rPr>
+              <w:t>cuota francesa: cuota = M × i ÷ (1 − (1 + i)^−n), con i = tasa mensual ÷ 100 y n cuotas. Solo capital + interés (sin seguros ni gastos). Con tasa 0 es M ÷ n.</w:t>
+            </w:r>
+          </w:p>
+        </w:tc>
+        <w:tc>
+          <w:tcPr>
+            <w:tcW w:type="dxa" w:w="1984"/>
+          </w:tcPr>
+          <w:p>
+            <w:r/>
+            <w:r>
+              <w:rPr>
+                <w:sz w:val="18"/>
+              </w:rPr>
+              <w:t>rrhh-core.cuotaFrancesa</w:t>
+            </w:r>
+          </w:p>
+        </w:tc>
+      </w:tr>
+      <w:tr>
+        <w:tc>
+          <w:tcPr>
+            <w:tcW w:type="dxa" w:w="1928"/>
+          </w:tcPr>
+          <w:p>
+            <w:r/>
+            <w:r>
+              <w:rPr>
+                <w:sz w:val="18"/>
+              </w:rPr>
+              <w:t>Tope de tasa</w:t>
+            </w:r>
+          </w:p>
+        </w:tc>
+        <w:tc>
+          <w:tcPr>
+            <w:tcW w:type="dxa" w:w="5443"/>
+          </w:tcPr>
+          <w:p>
+            <w:r/>
+            <w:r>
+              <w:rPr>
+                <w:sz w:val="18"/>
+              </w:rPr>
+              <w:t>la tasa mensual no puede superar la TMC vigente; se valida al guardar (Descuentos) y al aprobar (Solicitudes).</w:t>
+            </w:r>
+          </w:p>
+        </w:tc>
+        <w:tc>
+          <w:tcPr>
+            <w:tcW w:type="dxa" w:w="1984"/>
+          </w:tcPr>
+          <w:p>
+            <w:r/>
+            <w:r>
+              <w:rPr>
+                <w:sz w:val="18"/>
+              </w:rPr>
+              <w:t>tasas.tasa_mensual_menor</w:t>
+            </w:r>
+          </w:p>
+        </w:tc>
+      </w:tr>
+      <w:tr>
+        <w:tc>
+          <w:tcPr>
+            <w:tcW w:type="dxa" w:w="1928"/>
+          </w:tcPr>
+          <w:p>
+            <w:r/>
+            <w:r>
+              <w:rPr>
+                <w:sz w:val="18"/>
+              </w:rPr>
+              <w:t>Tope del 15% (art. 58 CT)</w:t>
+            </w:r>
+          </w:p>
+        </w:tc>
+        <w:tc>
+          <w:tcPr>
+            <w:tcW w:type="dxa" w:w="5443"/>
+          </w:tcPr>
+          <w:p>
+            <w:r/>
+            <w:r>
+              <w:rPr>
+                <w:sz w:val="18"/>
+              </w:rPr>
+              <w:t>la cuota no puede superar el 15% de la remuneración total (total haberes de la última liquidación EMITIDA; si no hay, sueldo base). Lo valida el paso RRHH de Solicitudes; en el registro directo de Descuentos queda a criterio de RRHH.</w:t>
+            </w:r>
+          </w:p>
+        </w:tc>
+        <w:tc>
+          <w:tcPr>
+            <w:tcW w:type="dxa" w:w="1984"/>
+          </w:tcPr>
+          <w:p>
+            <w:r/>
+            <w:r>
+              <w:rPr>
+                <w:sz w:val="18"/>
+              </w:rPr>
+              <w:t>solicitudes.validarTope15</w:t>
+            </w:r>
+          </w:p>
+        </w:tc>
+      </w:tr>
+      <w:tr>
+        <w:tc>
+          <w:tcPr>
+            <w:tcW w:type="dxa" w:w="1928"/>
+          </w:tcPr>
+          <w:p>
+            <w:r/>
+            <w:r>
+              <w:rPr>
+                <w:sz w:val="18"/>
+              </w:rPr>
+              <w:t>Total a devolver</w:t>
+            </w:r>
+          </w:p>
+        </w:tc>
+        <w:tc>
+          <w:tcPr>
+            <w:tcW w:type="dxa" w:w="5443"/>
+          </w:tcPr>
+          <w:p>
+            <w:r/>
+            <w:r>
+              <w:rPr>
+                <w:sz w:val="18"/>
+              </w:rPr>
+              <w:t>cuota × n; interés total = cuota × n − M.</w:t>
+            </w:r>
+          </w:p>
+        </w:tc>
+        <w:tc>
+          <w:tcPr>
+            <w:tcW w:type="dxa" w:w="1984"/>
+          </w:tcPr>
+          <w:p>
+            <w:r/>
+            <w:r>
+              <w:rPr>
+                <w:sz w:val="18"/>
+              </w:rPr>
+            </w:r>
+          </w:p>
+        </w:tc>
+      </w:tr>
+      <w:tr>
+        <w:tc>
+          <w:tcPr>
+            <w:tcW w:type="dxa" w:w="1928"/>
+          </w:tcPr>
+          <w:p>
+            <w:r/>
+            <w:r>
+              <w:rPr>
+                <w:sz w:val="18"/>
+              </w:rPr>
+              <w:t>Mes de inicio</w:t>
+            </w:r>
+          </w:p>
+        </w:tc>
+        <w:tc>
+          <w:tcPr>
+            <w:tcW w:type="dxa" w:w="5443"/>
+          </w:tcPr>
+          <w:p>
+            <w:r/>
+            <w:r>
+              <w:rPr>
+                <w:sz w:val="18"/>
+              </w:rPr>
+              <w:t>la próxima liquidación que se emita: el mes en curso si aún no está emitida; si ya lo está, el mes siguiente.</w:t>
+            </w:r>
+          </w:p>
+        </w:tc>
+        <w:tc>
+          <w:tcPr>
+            <w:tcW w:type="dxa" w:w="1984"/>
+          </w:tcPr>
+          <w:p>
+            <w:r/>
+            <w:r>
+              <w:rPr>
+                <w:sz w:val="18"/>
+              </w:rPr>
+              <w:t>mes_inicio</w:t>
+            </w:r>
+          </w:p>
+        </w:tc>
+      </w:tr>
+      <w:tr>
+        <w:tc>
+          <w:tcPr>
+            <w:tcW w:type="dxa" w:w="1928"/>
+          </w:tcPr>
+          <w:p>
+            <w:r/>
+            <w:r>
+              <w:rPr>
+                <w:sz w:val="18"/>
+              </w:rPr>
+              <w:t>Cuota del mes m</w:t>
+            </w:r>
+          </w:p>
+        </w:tc>
+        <w:tc>
+          <w:tcPr>
+            <w:tcW w:type="dxa" w:w="5443"/>
+          </w:tcPr>
+          <w:p>
+            <w:r/>
+            <w:r>
+              <w:rPr>
+                <w:sz w:val="18"/>
+              </w:rPr>
+              <w:t>k = meses entre mes_inicio y m; toca si 0 ≤ k &lt; n. Cae en "Otros Dcto." con su glosa. En UF/UTM/USD la cuota de origen se convierte con el indicador del mes.</w:t>
+            </w:r>
+          </w:p>
+        </w:tc>
+        <w:tc>
+          <w:tcPr>
+            <w:tcW w:type="dxa" w:w="1984"/>
+          </w:tcPr>
+          <w:p>
+            <w:r/>
+            <w:r>
+              <w:rPr>
+                <w:sz w:val="18"/>
+              </w:rPr>
+              <w:t>cuotaEnMes</w:t>
+            </w:r>
+          </w:p>
+        </w:tc>
+      </w:tr>
+      <w:tr>
+        <w:tc>
+          <w:tcPr>
+            <w:tcW w:type="dxa" w:w="1928"/>
+          </w:tcPr>
+          <w:p>
+            <w:r/>
+            <w:r>
+              <w:rPr>
+                <w:sz w:val="18"/>
+              </w:rPr>
+              <w:t>Pagado como anticipo (Adicionales)</w:t>
+            </w:r>
+          </w:p>
+        </w:tc>
+        <w:tc>
+          <w:tcPr>
+            <w:tcW w:type="dxa" w:w="5443"/>
+          </w:tcPr>
+          <w:p>
+            <w:r/>
+            <w:r>
+              <w:rPr>
+                <w:sz w:val="18"/>
+              </w:rPr>
+              <w:t>un haber ya transferido por fuera genera además un descuento ANTICIPO de 1 cuota en el mismo mes por lo efectivamente pagado (el líquido, si el haber es bruto): la liquidación muestra el haber y el descuento, y el líquido no lo repite.</w:t>
+            </w:r>
+          </w:p>
+        </w:tc>
+        <w:tc>
+          <w:tcPr>
+            <w:tcW w:type="dxa" w:w="1984"/>
+          </w:tcPr>
+          <w:p>
+            <w:r/>
+            <w:r>
+              <w:rPr>
+                <w:sz w:val="18"/>
+              </w:rPr>
+              <w:t>rh_adicionales + rh_descuentos</w:t>
+            </w:r>
+          </w:p>
+        </w:tc>
+      </w:tr>
+      <w:tr>
+        <w:tc>
+          <w:tcPr>
+            <w:tcW w:type="dxa" w:w="1928"/>
+          </w:tcPr>
+          <w:p>
+            <w:r/>
+            <w:r>
+              <w:rPr>
+                <w:sz w:val="18"/>
+              </w:rPr>
+              <w:t>Desembolso</w:t>
+            </w:r>
+          </w:p>
+        </w:tc>
+        <w:tc>
+          <w:tcPr>
+            <w:tcW w:type="dxa" w:w="5443"/>
+          </w:tcPr>
+          <w:p>
+            <w:r/>
+            <w:r>
+              <w:rPr>
+                <w:sz w:val="18"/>
+              </w:rPr>
+              <w:t>por Solicitudes: ODP automática (categoría REMUNERACIONES, a nombre del colaborador) + campana a Tesorería. Por Descuentos: RRHH lo junta en un lote TEF Santander (cap. 14) que emite la ODP "de acuerdo a nómina adjunta".</w:t>
+            </w:r>
+          </w:p>
+        </w:tc>
+        <w:tc>
+          <w:tcPr>
+            <w:tcW w:type="dxa" w:w="1984"/>
+          </w:tcPr>
+          <w:p>
+            <w:r/>
+            <w:r>
+              <w:rPr>
+                <w:sz w:val="18"/>
+              </w:rPr>
+              <w:t>ODP / TEF</w:t>
+            </w:r>
+          </w:p>
+        </w:tc>
+      </w:tr>
+      <w:tr>
+        <w:tc>
+          <w:tcPr>
+            <w:tcW w:type="dxa" w:w="1928"/>
+          </w:tcPr>
+          <w:p>
+            <w:r/>
+            <w:r>
+              <w:rPr>
+                <w:sz w:val="18"/>
+              </w:rPr>
+              <w:t>Contabilidad</w:t>
+            </w:r>
+          </w:p>
+        </w:tc>
+        <w:tc>
+          <w:tcPr>
+            <w:tcW w:type="dxa" w:w="5443"/>
+          </w:tcPr>
+          <w:p>
+            <w:r/>
+            <w:r>
+              <w:rPr>
+                <w:sz w:val="18"/>
+              </w:rPr>
+              <w:t>al pagar la ODP: anticipo → 1105010 ANTICIPO REMUNERACIONES contra banco; préstamo → 1105020 PRÉSTAMOS EMPLEADOS contra banco (cuenta por cobrar al personal). Cada cuota descontada rebaja el líquido del mes en el asiento de remuneraciones.</w:t>
+            </w:r>
+          </w:p>
+        </w:tc>
+        <w:tc>
+          <w:tcPr>
+            <w:tcW w:type="dxa" w:w="1984"/>
+          </w:tcPr>
+          <w:p>
+            <w:r/>
+            <w:r>
+              <w:rPr>
+                <w:sz w:val="18"/>
+              </w:rPr>
+              <w:t>motor-asientos</w:t>
+            </w:r>
+          </w:p>
+        </w:tc>
+      </w:tr>
+      <w:tr>
+        <w:tc>
+          <w:tcPr>
+            <w:tcW w:type="dxa" w:w="1928"/>
+          </w:tcPr>
+          <w:p>
+            <w:r/>
+            <w:r>
+              <w:rPr>
+                <w:sz w:val="18"/>
+              </w:rPr>
+              <w:t>Anular</w:t>
+            </w:r>
+          </w:p>
+        </w:tc>
+        <w:tc>
+          <w:tcPr>
+            <w:tcW w:type="dxa" w:w="5443"/>
+          </w:tcPr>
+          <w:p>
+            <w:r/>
+            <w:r>
+              <w:rPr>
+                <w:sz w:val="18"/>
+              </w:rPr>
+              <w:t>detiene las cuotas futuras; lo ya descontado no se toca. Un anticipo aprobado en Solicitudes anulado exige anular la ODP aparte.</w:t>
+            </w:r>
+          </w:p>
+        </w:tc>
+        <w:tc>
+          <w:tcPr>
+            <w:tcW w:type="dxa" w:w="1984"/>
+          </w:tcPr>
+          <w:p>
+            <w:r/>
+            <w:r>
+              <w:rPr>
+                <w:sz w:val="18"/>
+              </w:rPr>
+              <w:t>estado</w:t>
+            </w:r>
+          </w:p>
+        </w:tc>
+      </w:tr>
+      <w:tr>
+        <w:tc>
+          <w:tcPr>
+            <w:tcW w:type="dxa" w:w="1928"/>
+          </w:tcPr>
+          <w:p>
+            <w:r/>
+            <w:r>
+              <w:rPr>
+                <w:sz w:val="18"/>
+              </w:rPr>
+              <w:t>Al finiquito</w:t>
+            </w:r>
+          </w:p>
+        </w:tc>
+        <w:tc>
+          <w:tcPr>
+            <w:tcW w:type="dxa" w:w="5443"/>
+          </w:tcPr>
+          <w:p>
+            <w:r/>
+            <w:r>
+              <w:rPr>
+                <w:sz w:val="18"/>
+              </w:rPr>
+              <w:t>saldo = cuotas pendientes × valor cuota (cuotas cobradas = meses desde mes_inicio hasta el mes del término, tope n); se precarga como descuento del finiquito y las cuotas futuras se anulan.</w:t>
+            </w:r>
+          </w:p>
+        </w:tc>
+        <w:tc>
+          <w:tcPr>
+            <w:tcW w:type="dxa" w:w="1984"/>
+          </w:tcPr>
+          <w:p>
+            <w:r/>
+            <w:r>
+              <w:rPr>
+                <w:sz w:val="18"/>
+              </w:rPr>
+              <w:t>cap. 25.1</w:t>
+            </w:r>
+          </w:p>
+        </w:tc>
+      </w:tr>
+      <w:tr>
+        <w:tc>
+          <w:tcPr>
+            <w:tcW w:type="dxa" w:w="1928"/>
+          </w:tcPr>
+          <w:p>
+            <w:r/>
+            <w:r>
+              <w:rPr>
+                <w:sz w:val="18"/>
+              </w:rPr>
+              <w:t>Convenio</w:t>
+            </w:r>
+          </w:p>
+        </w:tc>
+        <w:tc>
+          <w:tcPr>
+            <w:tcW w:type="dxa" w:w="5443"/>
+          </w:tcPr>
+          <w:p>
+            <w:r/>
+            <w:r>
+              <w:rPr>
+                <w:sz w:val="18"/>
+              </w:rPr>
+              <w:t>cada anticipo o préstamo imprime su convenio de descuento (detalle de cuotas); firmado y subido a la carpeta (CONVENIO DESCUENTO) o, si vino por Solicitudes, la doble firma FES ya es el acuerdo escrito.</w:t>
+            </w:r>
+          </w:p>
+        </w:tc>
+        <w:tc>
+          <w:tcPr>
+            <w:tcW w:type="dxa" w:w="1984"/>
+          </w:tcPr>
+          <w:p>
+            <w:r/>
+            <w:r>
+              <w:rPr>
+                <w:sz w:val="18"/>
+              </w:rPr>
+              <w:t>rh_docs</w:t>
+            </w:r>
+          </w:p>
+        </w:tc>
+      </w:tr>
+    </w:tbl>
+    <w:p>
+      <w:pPr>
+        <w:spacing w:after="40"/>
+      </w:pPr>
+    </w:p>
+    <w:p>
+      <w:pPr>
+        <w:spacing w:after="40"/>
+      </w:pPr>
+      <w:r>
+        <w:rPr>
+          <w:b/>
+          <w:i w:val="0"/>
+          <w:color w:val="1F4E79"/>
+        </w:rPr>
+        <w:t>Ejemplo numérico</w:t>
+      </w:r>
+    </w:p>
+    <w:p>
+      <w:pPr>
+        <w:spacing w:after="80"/>
+      </w:pPr>
+      <w:r>
+        <w:rPr>
+          <w:b w:val="0"/>
+          <w:i w:val="0"/>
+        </w:rPr>
+        <w:t>Colaboradora con última liquidación emitida de $1.549.396 en total haberes. Solicita por Solicitudes un préstamo de $1.200.000 en 12 cuotas; RRHH fija 1,5% mensual (TMC vigente del ejemplo: 2,3%). Aprobado el 17-09-2026 con las liquidaciones de septiembre aún no emitidas. Además, en Adicionales se le registró un aguinaldo de $70.000 líquidos "pagado como anticipo" el 15-09.</w:t>
+      </w:r>
+    </w:p>
+    <w:tbl>
+      <w:tblPr>
+        <w:tblStyle w:val="TableGrid"/>
+        <w:tblW w:type="auto" w:w="0"/>
+        <w:jc w:val="center"/>
+        <w:tblLook w:firstColumn="1" w:firstRow="1" w:lastColumn="0" w:lastRow="0" w:noHBand="0" w:noVBand="1" w:val="04A0"/>
+      </w:tblPr>
+      <w:tblGrid>
+        <w:gridCol w:w="3249"/>
+        <w:gridCol w:w="3249"/>
+        <w:gridCol w:w="3249"/>
+      </w:tblGrid>
+      <w:tr>
+        <w:tc>
+          <w:tcPr>
+            <w:tcW w:type="dxa" w:w="2041"/>
+            <w:shd w:val="clear" w:color="auto" w:fill="1F4E79"/>
+          </w:tcPr>
+          <w:p>
+            <w:r/>
+            <w:r>
+              <w:rPr>
+                <w:b/>
+                <w:color w:val="FFFFFF"/>
+                <w:sz w:val="18"/>
+              </w:rPr>
+              <w:t>Paso</w:t>
+            </w:r>
+          </w:p>
+        </w:tc>
+        <w:tc>
+          <w:tcPr>
+            <w:tcW w:type="dxa" w:w="5329"/>
+            <w:shd w:val="clear" w:color="auto" w:fill="1F4E79"/>
+          </w:tcPr>
+          <w:p>
+            <w:r/>
+            <w:r>
+              <w:rPr>
+                <w:b/>
+                <w:color w:val="FFFFFF"/>
+                <w:sz w:val="18"/>
+              </w:rPr>
+              <w:t>Cálculo</w:t>
+            </w:r>
+          </w:p>
+        </w:tc>
+        <w:tc>
+          <w:tcPr>
+            <w:tcW w:type="dxa" w:w="1984"/>
+            <w:shd w:val="clear" w:color="auto" w:fill="1F4E79"/>
+          </w:tcPr>
+          <w:p>
+            <w:r/>
+            <w:r>
+              <w:rPr>
+                <w:b/>
+                <w:color w:val="FFFFFF"/>
+                <w:sz w:val="18"/>
+              </w:rPr>
+              <w:t>Resultado</w:t>
+            </w:r>
+          </w:p>
+        </w:tc>
+      </w:tr>
+      <w:tr>
+        <w:tc>
+          <w:tcPr>
+            <w:tcW w:type="dxa" w:w="2041"/>
+          </w:tcPr>
+          <w:p>
+            <w:r/>
+            <w:r>
+              <w:rPr>
+                <w:sz w:val="18"/>
+              </w:rPr>
+              <w:t>Tasa vs TMC</w:t>
+            </w:r>
+          </w:p>
+        </w:tc>
+        <w:tc>
+          <w:tcPr>
+            <w:tcW w:type="dxa" w:w="5329"/>
+          </w:tcPr>
+          <w:p>
+            <w:r/>
+            <w:r>
+              <w:rPr>
+                <w:sz w:val="18"/>
+              </w:rPr>
+              <w:t>1,5% ≤ 2,3%</w:t>
+            </w:r>
+          </w:p>
+        </w:tc>
+        <w:tc>
+          <w:tcPr>
+            <w:tcW w:type="dxa" w:w="1984"/>
+          </w:tcPr>
+          <w:p>
+            <w:r/>
+            <w:r>
+              <w:rPr>
+                <w:sz w:val="18"/>
+              </w:rPr>
+              <w:t>ok</w:t>
+            </w:r>
+          </w:p>
+        </w:tc>
+      </w:tr>
+      <w:tr>
+        <w:tc>
+          <w:tcPr>
+            <w:tcW w:type="dxa" w:w="2041"/>
+          </w:tcPr>
+          <w:p>
+            <w:r/>
+            <w:r>
+              <w:rPr>
+                <w:sz w:val="18"/>
+              </w:rPr>
+              <w:t>Cuota francesa</w:t>
+            </w:r>
+          </w:p>
+        </w:tc>
+        <w:tc>
+          <w:tcPr>
+            <w:tcW w:type="dxa" w:w="5329"/>
+          </w:tcPr>
+          <w:p>
+            <w:r/>
+            <w:r>
+              <w:rPr>
+                <w:sz w:val="18"/>
+              </w:rPr>
+              <w:t>1.200.000 × 0,015 ÷ (1 − 1,015^−12) = 18.000 ÷ 0,16362</w:t>
+            </w:r>
+          </w:p>
+        </w:tc>
+        <w:tc>
+          <w:tcPr>
+            <w:tcW w:type="dxa" w:w="1984"/>
+          </w:tcPr>
+          <w:p>
+            <w:r/>
+            <w:r>
+              <w:rPr>
+                <w:sz w:val="18"/>
+              </w:rPr>
+              <w:t>$110.016</w:t>
+            </w:r>
+          </w:p>
+        </w:tc>
+      </w:tr>
+      <w:tr>
+        <w:tc>
+          <w:tcPr>
+            <w:tcW w:type="dxa" w:w="2041"/>
+          </w:tcPr>
+          <w:p>
+            <w:r/>
+            <w:r>
+              <w:rPr>
+                <w:sz w:val="18"/>
+              </w:rPr>
+              <w:t>Tope 15%</w:t>
+            </w:r>
+          </w:p>
+        </w:tc>
+        <w:tc>
+          <w:tcPr>
+            <w:tcW w:type="dxa" w:w="5329"/>
+          </w:tcPr>
+          <w:p>
+            <w:r/>
+            <w:r>
+              <w:rPr>
+                <w:sz w:val="18"/>
+              </w:rPr>
+              <w:t>1.549.396 × 15% = 232.409 ≥ 110.016</w:t>
+            </w:r>
+          </w:p>
+        </w:tc>
+        <w:tc>
+          <w:tcPr>
+            <w:tcW w:type="dxa" w:w="1984"/>
+          </w:tcPr>
+          <w:p>
+            <w:r/>
+            <w:r>
+              <w:rPr>
+                <w:sz w:val="18"/>
+              </w:rPr>
+              <w:t>ok (si fueran 6 cuotas, $210.630, también; 4 cuotas, $311.324, NO: pediría más cuotas)</w:t>
+            </w:r>
+          </w:p>
+        </w:tc>
+      </w:tr>
+      <w:tr>
+        <w:tc>
+          <w:tcPr>
+            <w:tcW w:type="dxa" w:w="2041"/>
+          </w:tcPr>
+          <w:p>
+            <w:r/>
+            <w:r>
+              <w:rPr>
+                <w:sz w:val="18"/>
+              </w:rPr>
+              <w:t>Total a devolver</w:t>
+            </w:r>
+          </w:p>
+        </w:tc>
+        <w:tc>
+          <w:tcPr>
+            <w:tcW w:type="dxa" w:w="5329"/>
+          </w:tcPr>
+          <w:p>
+            <w:r/>
+            <w:r>
+              <w:rPr>
+                <w:sz w:val="18"/>
+              </w:rPr>
+              <w:t>110.016 × 12 = 1.320.192 → interés total 120.192</w:t>
+            </w:r>
+          </w:p>
+        </w:tc>
+        <w:tc>
+          <w:tcPr>
+            <w:tcW w:type="dxa" w:w="1984"/>
+          </w:tcPr>
+          <w:p>
+            <w:r/>
+            <w:r>
+              <w:rPr>
+                <w:sz w:val="18"/>
+              </w:rPr>
+              <w:t>$1.320.192</w:t>
+            </w:r>
+          </w:p>
+        </w:tc>
+      </w:tr>
+      <w:tr>
+        <w:tc>
+          <w:tcPr>
+            <w:tcW w:type="dxa" w:w="2041"/>
+          </w:tcPr>
+          <w:p>
+            <w:r/>
+            <w:r>
+              <w:rPr>
+                <w:sz w:val="18"/>
+              </w:rPr>
+              <w:t>Mes de inicio</w:t>
+            </w:r>
+          </w:p>
+        </w:tc>
+        <w:tc>
+          <w:tcPr>
+            <w:tcW w:type="dxa" w:w="5329"/>
+          </w:tcPr>
+          <w:p>
+            <w:r/>
+            <w:r>
+              <w:rPr>
+                <w:sz w:val="18"/>
+              </w:rPr>
+              <w:t>septiembre no emitido → primera cuota en la liquidación de septiembre 2026, última en agosto 2027</w:t>
+            </w:r>
+          </w:p>
+        </w:tc>
+        <w:tc>
+          <w:tcPr>
+            <w:tcW w:type="dxa" w:w="1984"/>
+          </w:tcPr>
+          <w:p>
+            <w:r/>
+            <w:r>
+              <w:rPr>
+                <w:sz w:val="18"/>
+              </w:rPr>
+              <w:t>2026-09 → 2027-08</w:t>
+            </w:r>
+          </w:p>
+        </w:tc>
+      </w:tr>
+      <w:tr>
+        <w:tc>
+          <w:tcPr>
+            <w:tcW w:type="dxa" w:w="2041"/>
+          </w:tcPr>
+          <w:p>
+            <w:r/>
+            <w:r>
+              <w:rPr>
+                <w:sz w:val="18"/>
+              </w:rPr>
+              <w:t>Desglose 1ª cuota</w:t>
+            </w:r>
+          </w:p>
+        </w:tc>
+        <w:tc>
+          <w:tcPr>
+            <w:tcW w:type="dxa" w:w="5329"/>
+          </w:tcPr>
+          <w:p>
+            <w:r/>
+            <w:r>
+              <w:rPr>
+                <w:sz w:val="18"/>
+              </w:rPr>
+              <w:t>interés 1.200.000 × 1,5% = 18.000; capital 92.016; saldo 1.107.984 (2ª: interés 16.620 / capital 93.396; 3ª: 15.219 / 94.797)</w:t>
+            </w:r>
+          </w:p>
+        </w:tc>
+        <w:tc>
+          <w:tcPr>
+            <w:tcW w:type="dxa" w:w="1984"/>
+          </w:tcPr>
+          <w:p>
+            <w:r/>
+            <w:r>
+              <w:rPr>
+                <w:sz w:val="18"/>
+              </w:rPr>
+              <w:t>solo informativo: la liquidación descuenta la cuota completa</w:t>
+            </w:r>
+          </w:p>
+        </w:tc>
+      </w:tr>
+      <w:tr>
+        <w:tc>
+          <w:tcPr>
+            <w:tcW w:type="dxa" w:w="2041"/>
+          </w:tcPr>
+          <w:p>
+            <w:r/>
+            <w:r>
+              <w:rPr>
+                <w:sz w:val="18"/>
+              </w:rPr>
+              <w:t>Desembolso</w:t>
+            </w:r>
+          </w:p>
+        </w:tc>
+        <w:tc>
+          <w:tcPr>
+            <w:tcW w:type="dxa" w:w="5329"/>
+          </w:tcPr>
+          <w:p>
+            <w:r/>
+            <w:r>
+              <w:rPr>
+                <w:sz w:val="18"/>
+              </w:rPr>
+              <w:t>ODP a nombre de la colaboradora por $1.200.000, campana a Tesorería; al pagarla: DEBE 1105020 / HABER Banco</w:t>
+            </w:r>
+          </w:p>
+        </w:tc>
+        <w:tc>
+          <w:tcPr>
+            <w:tcW w:type="dxa" w:w="1984"/>
+          </w:tcPr>
+          <w:p>
+            <w:r/>
+            <w:r>
+              <w:rPr>
+                <w:sz w:val="18"/>
+              </w:rPr>
+              <w:t>$1.200.000</w:t>
+            </w:r>
+          </w:p>
+        </w:tc>
+      </w:tr>
+      <w:tr>
+        <w:tc>
+          <w:tcPr>
+            <w:tcW w:type="dxa" w:w="2041"/>
+          </w:tcPr>
+          <w:p>
+            <w:r/>
+            <w:r>
+              <w:rPr>
+                <w:sz w:val="18"/>
+              </w:rPr>
+              <w:t>Aguinaldo pagado como anticipo</w:t>
+            </w:r>
+          </w:p>
+        </w:tc>
+        <w:tc>
+          <w:tcPr>
+            <w:tcW w:type="dxa" w:w="5329"/>
+          </w:tcPr>
+          <w:p>
+            <w:r/>
+            <w:r>
+              <w:rPr>
+                <w:sz w:val="18"/>
+              </w:rPr>
+              <w:t>haber Aguinaldo $70.000 líquido (bruto según su AFP/salud) + descuento ANTICIPO 1 cuota $70.000 en septiembre; TEF Fiestas Patrias ya transferido el 15-09</w:t>
+            </w:r>
+          </w:p>
+        </w:tc>
+        <w:tc>
+          <w:tcPr>
+            <w:tcW w:type="dxa" w:w="1984"/>
+          </w:tcPr>
+          <w:p>
+            <w:r/>
+            <w:r>
+              <w:rPr>
+                <w:sz w:val="18"/>
+              </w:rPr>
+              <w:t>líquido no cambia</w:t>
+            </w:r>
+          </w:p>
+        </w:tc>
+      </w:tr>
+      <w:tr>
+        <w:tc>
+          <w:tcPr>
+            <w:tcW w:type="dxa" w:w="2041"/>
+          </w:tcPr>
+          <w:p>
+            <w:r/>
+            <w:r>
+              <w:rPr>
+                <w:sz w:val="18"/>
+              </w:rPr>
+              <w:t>Liquidación de septiembre</w:t>
+            </w:r>
+          </w:p>
+        </w:tc>
+        <w:tc>
+          <w:tcPr>
+            <w:tcW w:type="dxa" w:w="5329"/>
+          </w:tcPr>
+          <w:p>
+            <w:r/>
+            <w:r>
+              <w:rPr>
+                <w:sz w:val="18"/>
+              </w:rPr>
+              <w:t>Otros Dcto.: "Préstamo al personal cuota 1/12" 110.016 + "Anticipo Aguinaldo Fiestas Patrias" 70.000</w:t>
+            </w:r>
+          </w:p>
+        </w:tc>
+        <w:tc>
+          <w:tcPr>
+            <w:tcW w:type="dxa" w:w="1984"/>
+          </w:tcPr>
+          <w:p>
+            <w:r/>
+            <w:r>
+              <w:rPr>
+                <w:sz w:val="18"/>
+              </w:rPr>
+              <w:t>− $180.016</w:t>
+            </w:r>
+          </w:p>
+        </w:tc>
+      </w:tr>
+      <w:tr>
+        <w:tc>
+          <w:tcPr>
+            <w:tcW w:type="dxa" w:w="2041"/>
+          </w:tcPr>
+          <w:p>
+            <w:r/>
+            <w:r>
+              <w:rPr>
+                <w:sz w:val="18"/>
+              </w:rPr>
+              <w:t>Si se va el 31-12-2026</w:t>
+            </w:r>
+          </w:p>
+        </w:tc>
+        <w:tc>
+          <w:tcPr>
+            <w:tcW w:type="dxa" w:w="5329"/>
+          </w:tcPr>
+          <w:p>
+            <w:r/>
+            <w:r>
+              <w:rPr>
+                <w:sz w:val="18"/>
+              </w:rPr>
+              <w:t>cuotas cobradas sep–dic = 4 → pendientes 8 × 110.016 = 880.128 → descuento del finiquito; cuotas futuras anuladas</w:t>
+            </w:r>
+          </w:p>
+        </w:tc>
+        <w:tc>
+          <w:tcPr>
+            <w:tcW w:type="dxa" w:w="1984"/>
+          </w:tcPr>
+          <w:p>
+            <w:r/>
+            <w:r>
+              <w:rPr>
+                <w:sz w:val="18"/>
+              </w:rPr>
+              <w:t>− $880.128</w:t>
+            </w:r>
+          </w:p>
+        </w:tc>
+      </w:tr>
+    </w:tbl>
+    <w:p>
+      <w:pPr>
+        <w:spacing w:after="40"/>
+      </w:pPr>
+    </w:p>
+    <w:tbl>
+      <w:tblPr>
+        <w:tblStyle w:val="TableGrid"/>
+        <w:tblW w:type="auto" w:w="0"/>
+        <w:tblLook w:firstColumn="1" w:firstRow="1" w:lastColumn="0" w:lastRow="0" w:noHBand="0" w:noVBand="1" w:val="04A0"/>
+      </w:tblPr>
+      <w:tblGrid>
+        <w:gridCol w:w="9746"/>
+      </w:tblGrid>
+      <w:tr>
+        <w:tc>
+          <w:tcPr>
+            <w:tcW w:type="dxa" w:w="9746"/>
+            <w:shd w:val="clear" w:color="auto" w:fill="E8F0F8"/>
+          </w:tcPr>
+          <w:p>
+            <w:r/>
+            <w:r>
+              <w:rPr>
+                <w:b/>
+                <w:sz w:val="19"/>
+              </w:rPr>
+              <w:t>🔒 Cómo cuadrar a mano</w:t>
+              <w:br/>
+            </w:r>
+            <w:r>
+              <w:rPr>
+                <w:sz w:val="19"/>
+              </w:rPr>
+              <w:t>cuota = M × i ÷ (1 − (1+i)^−n) con la tasa en fracción (1,5% = 0,015); comprobar que ≤ TMC y que la cuota ≤ 15% del total haberes de la última liquidación; contar las cuotas desde el mes de inicio (la pestaña Cuotas del mes las lista con su N/M); el saldo al finiquito son las cuotas que faltan por el valor de la cuota, sin recalcular intereses.</w:t>
+            </w:r>
+          </w:p>
+        </w:tc>
+      </w:tr>
+    </w:tbl>
+    <w:p>
+      <w:pPr>
+        <w:spacing w:after="40"/>
+      </w:pPr>
     </w:p>
     <w:p>
       <w:pPr>

</xml_diff>

<commit_message>
feat(rrhh): tope 15% art. 58 CT también al registrar anticipos y préstamos directo en Descuentos — motor único services/rrhh/src/tope-descuento.js compartido con Solicitudes; procesos cap. 18 y Manual de RRHH (v255.5)
Co-Authored-By: Claude Fable 5.1 <noreply@anthropic.com>
</commit_message>
<xml_diff>
--- a/api-gateway/public/mantenedores/documentacion/descargas/Manual-RRHH-Business-Suite.docx
+++ b/api-gateway/public/mantenedores/documentacion/descargas/Manual-RRHH-Business-Suite.docx
@@ -236,7 +236,7 @@
           <w:i w:val="0"/>
           <w:sz w:val="22"/>
         </w:rPr>
-        <w:t>Versión 2.6 · 17 de septiembre de 2026 · Suite v255.4</w:t>
+        <w:t>Versión 2.6 · 17 de septiembre de 2026 · Suite v255.5</w:t>
       </w:r>
     </w:p>
     <w:p>
@@ -10868,7 +10868,7 @@
               <w:rPr>
                 <w:sz w:val="18"/>
               </w:rPr>
-              <w:t>la cuota no puede superar el 15% de la remuneración total (total haberes de la última liquidación EMITIDA; si no hay, sueldo base). Lo valida el paso RRHH de Solicitudes; en el registro directo de Descuentos queda a criterio de RRHH.</w:t>
+              <w:t>la cuota no puede superar el 15% de la remuneración total (total haberes de la última liquidación EMITIDA; si no hay, sueldo base). Se valida al aprobar en Solicitudes y al registrar directo en Descuentos (anticipo y préstamo por persona); el error dice el máximo permitido.</w:t>
             </w:r>
           </w:p>
         </w:tc>
@@ -10882,7 +10882,7 @@
               <w:rPr>
                 <w:sz w:val="18"/>
               </w:rPr>
-              <w:t>solicitudes.validarTope15</w:t>
+              <w:t>tope-descuento.validarTope15</w:t>
             </w:r>
           </w:p>
         </w:tc>

</xml_diff>

<commit_message>
docs: Manual de RRHH v2.7 — horas extraordinarias (art. 32) y semana corrida (art. 45) con fórmulas y ejemplo numérico (cap. 15.2); documentación v3.7 (v255.7)
Co-Authored-By: Claude Fable 5.1 <noreply@anthropic.com>
</commit_message>
<xml_diff>
--- a/api-gateway/public/mantenedores/documentacion/descargas/Manual-RRHH-Business-Suite.docx
+++ b/api-gateway/public/mantenedores/documentacion/descargas/Manual-RRHH-Business-Suite.docx
@@ -236,7 +236,7 @@
           <w:i w:val="0"/>
           <w:sz w:val="22"/>
         </w:rPr>
-        <w:t>Versión 2.6 · 17 de septiembre de 2026 · Suite v255.5</w:t>
+        <w:t>Versión 2.7 · 17 de septiembre de 2026 · Suite v255.7</w:t>
       </w:r>
     </w:p>
     <w:p>
@@ -810,6 +810,64 @@
                 <w:sz w:val="18"/>
               </w:rPr>
               <w:t>Cap. 13.3: fórmulas de anticipos y préstamos (cuota francesa, TMC, tope 15%, mes de inicio, saldo al finiquito) con ejemplo.</w:t>
+            </w:r>
+          </w:p>
+        </w:tc>
+      </w:tr>
+      <w:tr>
+        <w:tc>
+          <w:tcPr>
+            <w:tcW w:type="dxa" w:w="907"/>
+          </w:tcPr>
+          <w:p>
+            <w:r/>
+            <w:r>
+              <w:rPr>
+                <w:sz w:val="18"/>
+              </w:rPr>
+              <w:t>2.7</w:t>
+            </w:r>
+          </w:p>
+        </w:tc>
+        <w:tc>
+          <w:tcPr>
+            <w:tcW w:type="dxa" w:w="1247"/>
+          </w:tcPr>
+          <w:p>
+            <w:r/>
+            <w:r>
+              <w:rPr>
+                <w:sz w:val="18"/>
+              </w:rPr>
+              <w:t>17-09-2026</w:t>
+            </w:r>
+          </w:p>
+        </w:tc>
+        <w:tc>
+          <w:tcPr>
+            <w:tcW w:type="dxa" w:w="2041"/>
+          </w:tcPr>
+          <w:p>
+            <w:r/>
+            <w:r>
+              <w:rPr>
+                <w:sz w:val="18"/>
+              </w:rPr>
+              <w:t>Patricio Escobar / Claude</w:t>
+            </w:r>
+          </w:p>
+        </w:tc>
+        <w:tc>
+          <w:tcPr>
+            <w:tcW w:type="dxa" w:w="5159"/>
+          </w:tcPr>
+          <w:p>
+            <w:r/>
+            <w:r>
+              <w:rPr>
+                <w:sz w:val="18"/>
+              </w:rPr>
+              <w:t>Cap. 15.2: horas extraordinarias (art. 32) y semana corrida (art. 45) con ejemplo.</w:t>
             </w:r>
           </w:p>
         </w:tc>
@@ -14195,6 +14253,1143 @@
                 <w:sz w:val="19"/>
               </w:rPr>
               <w:t>1) días pagados y sueldo en 30avos; 2) gratificación: 25% o el tope (4,75 IMM/12), el menor; 3) imponible contra el tope de 87,8 UF (prorrateado si hay menos de 30 días); 4) AFP con la tasa de SU administradora; 5) salud 7% + adicional Isapre si tiene plan en UF; 6) AFC solo indefinidos; 7) impuesto sobre la base tributable en UTM; 8) restar las cuotas de Descuentos. La vista previa por persona muestra cada línea con estos nombres; si algo no cuadra, corregir la fuente (ficha, adicional o descuento), nunca el número.</w:t>
+            </w:r>
+          </w:p>
+        </w:tc>
+      </w:tr>
+    </w:tbl>
+    <w:p>
+      <w:pPr>
+        <w:spacing w:after="40"/>
+      </w:pPr>
+    </w:p>
+    <w:p>
+      <w:pPr>
+        <w:pStyle w:val="Heading3"/>
+      </w:pPr>
+      <w:r>
+        <w:t>15.2 Horas extraordinarias y semana corrida</w:t>
+      </w:r>
+    </w:p>
+    <w:p>
+      <w:pPr>
+        <w:spacing w:after="80"/>
+      </w:pPr>
+      <w:r>
+        <w:rPr>
+          <w:b w:val="0"/>
+          <w:i w:val="0"/>
+        </w:rPr>
+        <w:t>Dos motores únicos: shared/horas-extras.js (art. 32 CT) para el valor de la hora extra que se digita en Adicionales, y shared/semana-corrida.js (art. 45 CT) para el factor mensual que multiplica la comisión de los ejecutivos con jornada de lunes a sábado (y el Bono Jefe Comercial). Ninguno se escribe a mano: RRHH digita horas, el sistema pone el monto; la semana corrida viene dentro de la comisión que manda Operaciones.</w:t>
+      </w:r>
+    </w:p>
+    <w:tbl>
+      <w:tblPr>
+        <w:tblStyle w:val="TableGrid"/>
+        <w:tblW w:type="auto" w:w="0"/>
+        <w:jc w:val="center"/>
+        <w:tblLook w:firstColumn="1" w:firstRow="1" w:lastColumn="0" w:lastRow="0" w:noHBand="0" w:noVBand="1" w:val="04A0"/>
+      </w:tblPr>
+      <w:tblGrid>
+        <w:gridCol w:w="3249"/>
+        <w:gridCol w:w="3249"/>
+        <w:gridCol w:w="3249"/>
+      </w:tblGrid>
+      <w:tr>
+        <w:tc>
+          <w:tcPr>
+            <w:tcW w:type="dxa" w:w="1928"/>
+            <w:shd w:val="clear" w:color="auto" w:fill="1F4E79"/>
+          </w:tcPr>
+          <w:p>
+            <w:r/>
+            <w:r>
+              <w:rPr>
+                <w:b/>
+                <w:color w:val="FFFFFF"/>
+                <w:sz w:val="18"/>
+              </w:rPr>
+              <w:t>Concepto</w:t>
+            </w:r>
+          </w:p>
+        </w:tc>
+        <w:tc>
+          <w:tcPr>
+            <w:tcW w:type="dxa" w:w="5443"/>
+            <w:shd w:val="clear" w:color="auto" w:fill="1F4E79"/>
+          </w:tcPr>
+          <w:p>
+            <w:r/>
+            <w:r>
+              <w:rPr>
+                <w:b/>
+                <w:color w:val="FFFFFF"/>
+                <w:sz w:val="18"/>
+              </w:rPr>
+              <w:t>Regla / fórmula</w:t>
+            </w:r>
+          </w:p>
+        </w:tc>
+        <w:tc>
+          <w:tcPr>
+            <w:tcW w:type="dxa" w:w="1984"/>
+            <w:shd w:val="clear" w:color="auto" w:fill="1F4E79"/>
+          </w:tcPr>
+          <w:p>
+            <w:r/>
+            <w:r>
+              <w:rPr>
+                <w:b/>
+                <w:color w:val="FFFFFF"/>
+                <w:sz w:val="18"/>
+              </w:rPr>
+              <w:t>Parámetro</w:t>
+            </w:r>
+          </w:p>
+        </w:tc>
+      </w:tr>
+      <w:tr>
+        <w:tc>
+          <w:tcPr>
+            <w:tcW w:type="dxa" w:w="1928"/>
+          </w:tcPr>
+          <w:p>
+            <w:r/>
+            <w:r>
+              <w:rPr>
+                <w:sz w:val="18"/>
+              </w:rPr>
+              <w:t>Base de la hora extra</w:t>
+            </w:r>
+          </w:p>
+        </w:tc>
+        <w:tc>
+          <w:tcPr>
+            <w:tcW w:type="dxa" w:w="5443"/>
+          </w:tcPr>
+          <w:p>
+            <w:r/>
+            <w:r>
+              <w:rPr>
+                <w:sz w:val="18"/>
+              </w:rPr>
+              <w:t>SUELDO BASE de la ficha (sueldo convenido para la jornada ordinaria). Nunca el imponible: bonos, comisiones y gratificación no entran.</w:t>
+            </w:r>
+          </w:p>
+        </w:tc>
+        <w:tc>
+          <w:tcPr>
+            <w:tcW w:type="dxa" w:w="1984"/>
+          </w:tcPr>
+          <w:p>
+            <w:r/>
+            <w:r>
+              <w:rPr>
+                <w:sz w:val="18"/>
+              </w:rPr>
+              <w:t>rh_fichas.sueldo_base</w:t>
+            </w:r>
+          </w:p>
+        </w:tc>
+      </w:tr>
+      <w:tr>
+        <w:tc>
+          <w:tcPr>
+            <w:tcW w:type="dxa" w:w="1928"/>
+          </w:tcPr>
+          <w:p>
+            <w:r/>
+            <w:r>
+              <w:rPr>
+                <w:sz w:val="18"/>
+              </w:rPr>
+              <w:t>Jornada semanal</w:t>
+            </w:r>
+          </w:p>
+        </w:tc>
+        <w:tc>
+          <w:tcPr>
+            <w:tcW w:type="dxa" w:w="5443"/>
+          </w:tcPr>
+          <w:p>
+            <w:r/>
+            <w:r>
+              <w:rPr>
+                <w:sz w:val="18"/>
+              </w:rPr>
+              <w:t>la de la ficha si es especial (horas digitadas); si tiene 40 h marcada, 40; si no, la general (44 h desde el 26-04-2026, Ley 21.561; 42 h en 2027, 40 h en 2028).</w:t>
+            </w:r>
+          </w:p>
+        </w:tc>
+        <w:tc>
+          <w:tcPr>
+            <w:tcW w:type="dxa" w:w="1984"/>
+          </w:tcPr>
+          <w:p>
+            <w:r/>
+            <w:r>
+              <w:rPr>
+                <w:sz w:val="18"/>
+              </w:rPr>
+              <w:t>jornada_especial_hrs · jornada_40h · he_jornada_semanal 44</w:t>
+            </w:r>
+          </w:p>
+        </w:tc>
+      </w:tr>
+      <w:tr>
+        <w:tc>
+          <w:tcPr>
+            <w:tcW w:type="dxa" w:w="1928"/>
+          </w:tcPr>
+          <w:p>
+            <w:r/>
+            <w:r>
+              <w:rPr>
+                <w:sz w:val="18"/>
+              </w:rPr>
+              <w:t>Hora ordinaria</w:t>
+            </w:r>
+          </w:p>
+        </w:tc>
+        <w:tc>
+          <w:tcPr>
+            <w:tcW w:type="dxa" w:w="5443"/>
+          </w:tcPr>
+          <w:p>
+            <w:r/>
+            <w:r>
+              <w:rPr>
+                <w:sz w:val="18"/>
+              </w:rPr>
+              <w:t>sueldo base × 7 ÷ (30 × jornada semanal). El 7/30 lleva el sueldo mensual a semanal.</w:t>
+            </w:r>
+          </w:p>
+        </w:tc>
+        <w:tc>
+          <w:tcPr>
+            <w:tcW w:type="dxa" w:w="1984"/>
+          </w:tcPr>
+          <w:p>
+            <w:r/>
+            <w:r>
+              <w:rPr>
+                <w:sz w:val="18"/>
+              </w:rPr>
+            </w:r>
+          </w:p>
+        </w:tc>
+      </w:tr>
+      <w:tr>
+        <w:tc>
+          <w:tcPr>
+            <w:tcW w:type="dxa" w:w="1928"/>
+          </w:tcPr>
+          <w:p>
+            <w:r/>
+            <w:r>
+              <w:rPr>
+                <w:sz w:val="18"/>
+              </w:rPr>
+              <w:t>Hora extraordinaria</w:t>
+            </w:r>
+          </w:p>
+        </w:tc>
+        <w:tc>
+          <w:tcPr>
+            <w:tcW w:type="dxa" w:w="5443"/>
+          </w:tcPr>
+          <w:p>
+            <w:r/>
+            <w:r>
+              <w:rPr>
+                <w:sz w:val="18"/>
+              </w:rPr>
+              <w:t>hora ordinaria × (1 + recargo). Recargo legal mínimo 50%.</w:t>
+            </w:r>
+          </w:p>
+        </w:tc>
+        <w:tc>
+          <w:tcPr>
+            <w:tcW w:type="dxa" w:w="1984"/>
+          </w:tcPr>
+          <w:p>
+            <w:r/>
+            <w:r>
+              <w:rPr>
+                <w:sz w:val="18"/>
+              </w:rPr>
+              <w:t>he_recargo_pct 50</w:t>
+            </w:r>
+          </w:p>
+        </w:tc>
+      </w:tr>
+      <w:tr>
+        <w:tc>
+          <w:tcPr>
+            <w:tcW w:type="dxa" w:w="1928"/>
+          </w:tcPr>
+          <w:p>
+            <w:r/>
+            <w:r>
+              <w:rPr>
+                <w:sz w:val="18"/>
+              </w:rPr>
+              <w:t>Factor</w:t>
+            </w:r>
+          </w:p>
+        </w:tc>
+        <w:tc>
+          <w:tcPr>
+            <w:tcW w:type="dxa" w:w="5443"/>
+          </w:tcPr>
+          <w:p>
+            <w:r/>
+            <w:r>
+              <w:rPr>
+                <w:sz w:val="18"/>
+              </w:rPr>
+              <w:t>7 × 1,5 ÷ (30 × jornada): 0,0077778 con 45 h (tabla clásica), 0,0079545 con 44 h, 0,00875 con 40 h.</w:t>
+            </w:r>
+          </w:p>
+        </w:tc>
+        <w:tc>
+          <w:tcPr>
+            <w:tcW w:type="dxa" w:w="1984"/>
+          </w:tcPr>
+          <w:p>
+            <w:r/>
+            <w:r>
+              <w:rPr>
+                <w:sz w:val="18"/>
+              </w:rPr>
+            </w:r>
+          </w:p>
+        </w:tc>
+      </w:tr>
+      <w:tr>
+        <w:tc>
+          <w:tcPr>
+            <w:tcW w:type="dxa" w:w="1928"/>
+          </w:tcPr>
+          <w:p>
+            <w:r/>
+            <w:r>
+              <w:rPr>
+                <w:sz w:val="18"/>
+              </w:rPr>
+              <w:t>Monto</w:t>
+            </w:r>
+          </w:p>
+        </w:tc>
+        <w:tc>
+          <w:tcPr>
+            <w:tcW w:type="dxa" w:w="5443"/>
+          </w:tcPr>
+          <w:p>
+            <w:r/>
+            <w:r>
+              <w:rPr>
+                <w:sz w:val="18"/>
+              </w:rPr>
+              <w:t>horas (admite medias horas) × valor exacto sin redondear, redondeado UNA vez al final. El servidor recalcula al guardar aunque la pantalla mande un monto.</w:t>
+            </w:r>
+          </w:p>
+        </w:tc>
+        <w:tc>
+          <w:tcPr>
+            <w:tcW w:type="dxa" w:w="1984"/>
+          </w:tcPr>
+          <w:p>
+            <w:r/>
+            <w:r>
+              <w:rPr>
+                <w:sz w:val="18"/>
+              </w:rPr>
+              <w:t>Adicionales, causal Horas Extras</w:t>
+            </w:r>
+          </w:p>
+        </w:tc>
+      </w:tr>
+      <w:tr>
+        <w:tc>
+          <w:tcPr>
+            <w:tcW w:type="dxa" w:w="1928"/>
+          </w:tcPr>
+          <w:p>
+            <w:r/>
+            <w:r>
+              <w:rPr>
+                <w:sz w:val="18"/>
+              </w:rPr>
+              <w:t>No aplica</w:t>
+            </w:r>
+          </w:p>
+        </w:tc>
+        <w:tc>
+          <w:tcPr>
+            <w:tcW w:type="dxa" w:w="5443"/>
+          </w:tcPr>
+          <w:p>
+            <w:r/>
+            <w:r>
+              <w:rPr>
+                <w:sz w:val="18"/>
+              </w:rPr>
+              <w:t>Art. 22 (excluido de jornada) y ficha sin sueldo base: el motor responde "no aplica" con motivo y no deja guardar; nunca devuelve 0.</w:t>
+            </w:r>
+          </w:p>
+        </w:tc>
+        <w:tc>
+          <w:tcPr>
+            <w:tcW w:type="dxa" w:w="1984"/>
+          </w:tcPr>
+          <w:p>
+            <w:r/>
+            <w:r>
+              <w:rPr>
+                <w:sz w:val="18"/>
+              </w:rPr>
+              <w:t>jornada_art22</w:t>
+            </w:r>
+          </w:p>
+        </w:tc>
+      </w:tr>
+      <w:tr>
+        <w:tc>
+          <w:tcPr>
+            <w:tcW w:type="dxa" w:w="1928"/>
+          </w:tcPr>
+          <w:p>
+            <w:r/>
+            <w:r>
+              <w:rPr>
+                <w:sz w:val="18"/>
+              </w:rPr>
+              <w:t>En la liquidación</w:t>
+            </w:r>
+          </w:p>
+        </w:tc>
+        <w:tc>
+          <w:tcPr>
+            <w:tcW w:type="dxa" w:w="5443"/>
+          </w:tcPr>
+          <w:p>
+            <w:r/>
+            <w:r>
+              <w:rPr>
+                <w:sz w:val="18"/>
+              </w:rPr>
+              <w:t>entra como Otro Imponible con su nombre; se cotiza y tributa; entra en la base de gratificación.</w:t>
+            </w:r>
+          </w:p>
+        </w:tc>
+        <w:tc>
+          <w:tcPr>
+            <w:tcW w:type="dxa" w:w="1984"/>
+          </w:tcPr>
+          <w:p>
+            <w:r/>
+            <w:r>
+              <w:rPr>
+                <w:sz w:val="18"/>
+              </w:rPr>
+              <w:t>cap. 15.1</w:t>
+            </w:r>
+          </w:p>
+        </w:tc>
+      </w:tr>
+      <w:tr>
+        <w:tc>
+          <w:tcPr>
+            <w:tcW w:type="dxa" w:w="1928"/>
+          </w:tcPr>
+          <w:p>
+            <w:r/>
+            <w:r>
+              <w:rPr>
+                <w:sz w:val="18"/>
+              </w:rPr>
+              <w:t>Límite legal</w:t>
+            </w:r>
+          </w:p>
+        </w:tc>
+        <w:tc>
+          <w:tcPr>
+            <w:tcW w:type="dxa" w:w="5443"/>
+          </w:tcPr>
+          <w:p>
+            <w:r/>
+            <w:r>
+              <w:rPr>
+                <w:sz w:val="18"/>
+              </w:rPr>
+              <w:t>máximo 2 horas extra por día y solo con pacto escrito temporal (art. 31): lo controla RRHH con Asistencia (Workera); el sistema no lo bloquea.</w:t>
+            </w:r>
+          </w:p>
+        </w:tc>
+        <w:tc>
+          <w:tcPr>
+            <w:tcW w:type="dxa" w:w="1984"/>
+          </w:tcPr>
+          <w:p>
+            <w:r/>
+            <w:r>
+              <w:rPr>
+                <w:sz w:val="18"/>
+              </w:rPr>
+              <w:t>Asistencia</w:t>
+            </w:r>
+          </w:p>
+        </w:tc>
+      </w:tr>
+      <w:tr>
+        <w:tc>
+          <w:tcPr>
+            <w:tcW w:type="dxa" w:w="1928"/>
+          </w:tcPr>
+          <w:p>
+            <w:r/>
+            <w:r>
+              <w:rPr>
+                <w:sz w:val="18"/>
+              </w:rPr>
+              <w:t>Semana corrida: a quién</w:t>
+            </w:r>
+          </w:p>
+        </w:tc>
+        <w:tc>
+          <w:tcPr>
+            <w:tcW w:type="dxa" w:w="5443"/>
+          </w:tcPr>
+          <w:p>
+            <w:r/>
+            <w:r>
+              <w:rPr>
+                <w:sz w:val="18"/>
+              </w:rPr>
+              <w:t>trabajadores con remuneración variable por día trabajado: en AutoFácil, los ejecutivos comerciales (comisión) con jornada de lunes a sábado. Pago de los domingos y festivos con el promedio de lo devengado en los días trabajados.</w:t>
+            </w:r>
+          </w:p>
+        </w:tc>
+        <w:tc>
+          <w:tcPr>
+            <w:tcW w:type="dxa" w:w="1984"/>
+          </w:tcPr>
+          <w:p>
+            <w:r/>
+            <w:r>
+              <w:rPr>
+                <w:sz w:val="18"/>
+              </w:rPr>
+              <w:t>art. 45 CT</w:t>
+            </w:r>
+          </w:p>
+        </w:tc>
+      </w:tr>
+      <w:tr>
+        <w:tc>
+          <w:tcPr>
+            <w:tcW w:type="dxa" w:w="1928"/>
+          </w:tcPr>
+          <w:p>
+            <w:r/>
+            <w:r>
+              <w:rPr>
+                <w:sz w:val="18"/>
+              </w:rPr>
+              <w:t>Factor del mes</w:t>
+            </w:r>
+          </w:p>
+        </w:tc>
+        <w:tc>
+          <w:tcPr>
+            <w:tcW w:type="dxa" w:w="5443"/>
+          </w:tcPr>
+          <w:p>
+            <w:r/>
+            <w:r>
+              <w:rPr>
+                <w:sz w:val="18"/>
+              </w:rPr>
+              <w:t>factor = 1 + (domingos + festivos del mes) ÷ (días lunes a sábado no feriados). Un feriado en domingo cuenta una sola vez. Cambia cada mes.</w:t>
+            </w:r>
+          </w:p>
+        </w:tc>
+        <w:tc>
+          <w:tcPr>
+            <w:tcW w:type="dxa" w:w="1984"/>
+          </w:tcPr>
+          <w:p>
+            <w:r/>
+            <w:r>
+              <w:rPr>
+                <w:sz w:val="18"/>
+              </w:rPr>
+              <w:t>semana_corrida_calc 1</w:t>
+            </w:r>
+          </w:p>
+        </w:tc>
+      </w:tr>
+      <w:tr>
+        <w:tc>
+          <w:tcPr>
+            <w:tcW w:type="dxa" w:w="1928"/>
+          </w:tcPr>
+          <w:p>
+            <w:r/>
+            <w:r>
+              <w:rPr>
+                <w:sz w:val="18"/>
+              </w:rPr>
+              <w:t>Modo fijo</w:t>
+            </w:r>
+          </w:p>
+        </w:tc>
+        <w:tc>
+          <w:tcPr>
+            <w:tcW w:type="dxa" w:w="5443"/>
+          </w:tcPr>
+          <w:p>
+            <w:r/>
+            <w:r>
+              <w:rPr>
+                <w:sz w:val="18"/>
+              </w:rPr>
+              <w:t>con semana_corrida_calc = 0 se usa el multiplicador fijo (1,1667 = +16,67%).</w:t>
+            </w:r>
+          </w:p>
+        </w:tc>
+        <w:tc>
+          <w:tcPr>
+            <w:tcW w:type="dxa" w:w="1984"/>
+          </w:tcPr>
+          <w:p>
+            <w:r/>
+            <w:r>
+              <w:rPr>
+                <w:sz w:val="18"/>
+              </w:rPr>
+              <w:t>semana_corrida 1,1667</w:t>
+            </w:r>
+          </w:p>
+        </w:tc>
+      </w:tr>
+      <w:tr>
+        <w:tc>
+          <w:tcPr>
+            <w:tcW w:type="dxa" w:w="1928"/>
+          </w:tcPr>
+          <w:p>
+            <w:r/>
+            <w:r>
+              <w:rPr>
+                <w:sz w:val="18"/>
+              </w:rPr>
+              <w:t>Sobre qué se aplica</w:t>
+            </w:r>
+          </w:p>
+        </w:tc>
+        <w:tc>
+          <w:tcPr>
+            <w:tcW w:type="dxa" w:w="5443"/>
+          </w:tcPr>
+          <w:p>
+            <w:r/>
+            <w:r>
+              <w:rPr>
+                <w:sz w:val="18"/>
+              </w:rPr>
+              <w:t>sobre el incentivo final de la comisión (base + bonos), antes de descuentos. La liquidación recibe la comisión ya multiplicada; no es una línea aparte.</w:t>
+            </w:r>
+          </w:p>
+        </w:tc>
+        <w:tc>
+          <w:tcPr>
+            <w:tcW w:type="dxa" w:w="1984"/>
+          </w:tcPr>
+          <w:p>
+            <w:r/>
+            <w:r>
+              <w:rPr>
+                <w:sz w:val="18"/>
+              </w:rPr>
+              <w:t>comision-ejecutivo.con_semana_corrida</w:t>
+            </w:r>
+          </w:p>
+        </w:tc>
+      </w:tr>
+      <w:tr>
+        <w:tc>
+          <w:tcPr>
+            <w:tcW w:type="dxa" w:w="1928"/>
+          </w:tcPr>
+          <w:p>
+            <w:r/>
+            <w:r>
+              <w:rPr>
+                <w:sz w:val="18"/>
+              </w:rPr>
+              <w:t>Semana corrida y finiquito</w:t>
+            </w:r>
+          </w:p>
+        </w:tc>
+        <w:tc>
+          <w:tcPr>
+            <w:tcW w:type="dxa" w:w="5443"/>
+          </w:tcPr>
+          <w:p>
+            <w:r/>
+            <w:r>
+              <w:rPr>
+                <w:sz w:val="18"/>
+              </w:rPr>
+              <w:t>entra en la base art. 172 y del feriado tal como se pagó cada mes (es remuneración variable).</w:t>
+            </w:r>
+          </w:p>
+        </w:tc>
+        <w:tc>
+          <w:tcPr>
+            <w:tcW w:type="dxa" w:w="1984"/>
+          </w:tcPr>
+          <w:p>
+            <w:r/>
+            <w:r>
+              <w:rPr>
+                <w:sz w:val="18"/>
+              </w:rPr>
+              <w:t>cap. 25.1</w:t>
+            </w:r>
+          </w:p>
+        </w:tc>
+      </w:tr>
+    </w:tbl>
+    <w:p>
+      <w:pPr>
+        <w:spacing w:after="40"/>
+      </w:pPr>
+    </w:p>
+    <w:p>
+      <w:pPr>
+        <w:spacing w:after="40"/>
+      </w:pPr>
+      <w:r>
+        <w:rPr>
+          <w:b/>
+          <w:i w:val="0"/>
+          <w:color w:val="1F4E79"/>
+        </w:rPr>
+        <w:t>Ejemplo numérico</w:t>
+      </w:r>
+    </w:p>
+    <w:tbl>
+      <w:tblPr>
+        <w:tblStyle w:val="TableGrid"/>
+        <w:tblW w:type="auto" w:w="0"/>
+        <w:jc w:val="center"/>
+        <w:tblLook w:firstColumn="1" w:firstRow="1" w:lastColumn="0" w:lastRow="0" w:noHBand="0" w:noVBand="1" w:val="04A0"/>
+      </w:tblPr>
+      <w:tblGrid>
+        <w:gridCol w:w="3249"/>
+        <w:gridCol w:w="3249"/>
+        <w:gridCol w:w="3249"/>
+      </w:tblGrid>
+      <w:tr>
+        <w:tc>
+          <w:tcPr>
+            <w:tcW w:type="dxa" w:w="2835"/>
+            <w:shd w:val="clear" w:color="auto" w:fill="1F4E79"/>
+          </w:tcPr>
+          <w:p>
+            <w:r/>
+            <w:r>
+              <w:rPr>
+                <w:b/>
+                <w:color w:val="FFFFFF"/>
+                <w:sz w:val="18"/>
+              </w:rPr>
+              <w:t>Caso</w:t>
+            </w:r>
+          </w:p>
+        </w:tc>
+        <w:tc>
+          <w:tcPr>
+            <w:tcW w:type="dxa" w:w="4819"/>
+            <w:shd w:val="clear" w:color="auto" w:fill="1F4E79"/>
+          </w:tcPr>
+          <w:p>
+            <w:r/>
+            <w:r>
+              <w:rPr>
+                <w:b/>
+                <w:color w:val="FFFFFF"/>
+                <w:sz w:val="18"/>
+              </w:rPr>
+              <w:t>Cálculo</w:t>
+            </w:r>
+          </w:p>
+        </w:tc>
+        <w:tc>
+          <w:tcPr>
+            <w:tcW w:type="dxa" w:w="1701"/>
+            <w:shd w:val="clear" w:color="auto" w:fill="1F4E79"/>
+          </w:tcPr>
+          <w:p>
+            <w:r/>
+            <w:r>
+              <w:rPr>
+                <w:b/>
+                <w:color w:val="FFFFFF"/>
+                <w:sz w:val="18"/>
+              </w:rPr>
+              <w:t>Resultado</w:t>
+            </w:r>
+          </w:p>
+        </w:tc>
+      </w:tr>
+      <w:tr>
+        <w:tc>
+          <w:tcPr>
+            <w:tcW w:type="dxa" w:w="2835"/>
+          </w:tcPr>
+          <w:p>
+            <w:r/>
+            <w:r>
+              <w:rPr>
+                <w:sz w:val="18"/>
+              </w:rPr>
+              <w:t>Hora extra, sueldo base $900.000, jornada general 44 h</w:t>
+            </w:r>
+          </w:p>
+        </w:tc>
+        <w:tc>
+          <w:tcPr>
+            <w:tcW w:type="dxa" w:w="4819"/>
+          </w:tcPr>
+          <w:p>
+            <w:r/>
+            <w:r>
+              <w:rPr>
+                <w:sz w:val="18"/>
+              </w:rPr>
+              <w:t>ordinaria 900.000 × 7 ÷ (30 × 44) = 4.772,73 → extra × 1,5 = 7.159,09</w:t>
+            </w:r>
+          </w:p>
+        </w:tc>
+        <w:tc>
+          <w:tcPr>
+            <w:tcW w:type="dxa" w:w="1701"/>
+          </w:tcPr>
+          <w:p>
+            <w:r/>
+            <w:r>
+              <w:rPr>
+                <w:sz w:val="18"/>
+              </w:rPr>
+              <w:t>$7.159 la hora</w:t>
+            </w:r>
+          </w:p>
+        </w:tc>
+      </w:tr>
+      <w:tr>
+        <w:tc>
+          <w:tcPr>
+            <w:tcW w:type="dxa" w:w="2835"/>
+          </w:tcPr>
+          <w:p>
+            <w:r/>
+            <w:r>
+              <w:rPr>
+                <w:sz w:val="18"/>
+              </w:rPr>
+              <w:t>10,5 horas en el mes</w:t>
+            </w:r>
+          </w:p>
+        </w:tc>
+        <w:tc>
+          <w:tcPr>
+            <w:tcW w:type="dxa" w:w="4819"/>
+          </w:tcPr>
+          <w:p>
+            <w:r/>
+            <w:r>
+              <w:rPr>
+                <w:sz w:val="18"/>
+              </w:rPr>
+              <w:t>900.000 × 7 ÷ 1.320 × 1,5 × 10,5 = 75.170,45</w:t>
+            </w:r>
+          </w:p>
+        </w:tc>
+        <w:tc>
+          <w:tcPr>
+            <w:tcW w:type="dxa" w:w="1701"/>
+          </w:tcPr>
+          <w:p>
+            <w:r/>
+            <w:r>
+              <w:rPr>
+                <w:sz w:val="18"/>
+              </w:rPr>
+              <w:t>$75.170 (Otro Imponible)</w:t>
+            </w:r>
+          </w:p>
+        </w:tc>
+      </w:tr>
+      <w:tr>
+        <w:tc>
+          <w:tcPr>
+            <w:tcW w:type="dxa" w:w="2835"/>
+          </w:tcPr>
+          <w:p>
+            <w:r/>
+            <w:r>
+              <w:rPr>
+                <w:sz w:val="18"/>
+              </w:rPr>
+              <w:t>Misma persona con 40 h marcada en la ficha</w:t>
+            </w:r>
+          </w:p>
+        </w:tc>
+        <w:tc>
+          <w:tcPr>
+            <w:tcW w:type="dxa" w:w="4819"/>
+          </w:tcPr>
+          <w:p>
+            <w:r/>
+            <w:r>
+              <w:rPr>
+                <w:sz w:val="18"/>
+              </w:rPr>
+              <w:t>ordinaria 900.000 × 7 ÷ 1.200 = 5.250 → extra 7.875 → 10,5 h</w:t>
+            </w:r>
+          </w:p>
+        </w:tc>
+        <w:tc>
+          <w:tcPr>
+            <w:tcW w:type="dxa" w:w="1701"/>
+          </w:tcPr>
+          <w:p>
+            <w:r/>
+            <w:r>
+              <w:rPr>
+                <w:sz w:val="18"/>
+              </w:rPr>
+              <w:t>$82.688</w:t>
+            </w:r>
+          </w:p>
+        </w:tc>
+      </w:tr>
+      <w:tr>
+        <w:tc>
+          <w:tcPr>
+            <w:tcW w:type="dxa" w:w="2835"/>
+          </w:tcPr>
+          <w:p>
+            <w:r/>
+            <w:r>
+              <w:rPr>
+                <w:sz w:val="18"/>
+              </w:rPr>
+              <w:t>Gerente con Art. 22</w:t>
+            </w:r>
+          </w:p>
+        </w:tc>
+        <w:tc>
+          <w:tcPr>
+            <w:tcW w:type="dxa" w:w="4819"/>
+          </w:tcPr>
+          <w:p>
+            <w:r/>
+            <w:r>
+              <w:rPr>
+                <w:sz w:val="18"/>
+              </w:rPr>
+              <w:t>—</w:t>
+            </w:r>
+          </w:p>
+        </w:tc>
+        <w:tc>
+          <w:tcPr>
+            <w:tcW w:type="dxa" w:w="1701"/>
+          </w:tcPr>
+          <w:p>
+            <w:r/>
+            <w:r>
+              <w:rPr>
+                <w:sz w:val="18"/>
+              </w:rPr>
+              <w:t>no aplica: el sistema no deja guardar</w:t>
+            </w:r>
+          </w:p>
+        </w:tc>
+      </w:tr>
+      <w:tr>
+        <w:tc>
+          <w:tcPr>
+            <w:tcW w:type="dxa" w:w="2835"/>
+          </w:tcPr>
+          <w:p>
+            <w:r/>
+            <w:r>
+              <w:rPr>
+                <w:sz w:val="18"/>
+              </w:rPr>
+              <w:t>Semana corrida septiembre 2026</w:t>
+            </w:r>
+          </w:p>
+        </w:tc>
+        <w:tc>
+          <w:tcPr>
+            <w:tcW w:type="dxa" w:w="4819"/>
+          </w:tcPr>
+          <w:p>
+            <w:r/>
+            <w:r>
+              <w:rPr>
+                <w:sz w:val="18"/>
+              </w:rPr>
+              <w:t>4 domingos + 2 festivos (vie 18 y sáb 19) = 6; días L-S no feriados = 30 − 4 − 2 = 24 → 1 + 6 ÷ 24</w:t>
+            </w:r>
+          </w:p>
+        </w:tc>
+        <w:tc>
+          <w:tcPr>
+            <w:tcW w:type="dxa" w:w="1701"/>
+          </w:tcPr>
+          <w:p>
+            <w:r/>
+            <w:r>
+              <w:rPr>
+                <w:sz w:val="18"/>
+              </w:rPr>
+              <w:t>× 1,25</w:t>
+            </w:r>
+          </w:p>
+        </w:tc>
+      </w:tr>
+      <w:tr>
+        <w:tc>
+          <w:tcPr>
+            <w:tcW w:type="dxa" w:w="2835"/>
+          </w:tcPr>
+          <w:p>
+            <w:r/>
+            <w:r>
+              <w:rPr>
+                <w:sz w:val="18"/>
+              </w:rPr>
+              <w:t>Semana corrida octubre 2026</w:t>
+            </w:r>
+          </w:p>
+        </w:tc>
+        <w:tc>
+          <w:tcPr>
+            <w:tcW w:type="dxa" w:w="4819"/>
+          </w:tcPr>
+          <w:p>
+            <w:r/>
+            <w:r>
+              <w:rPr>
+                <w:sz w:val="18"/>
+              </w:rPr>
+              <w:t>4 domingos + 2 festivos (lun 12 y sáb 31) = 6; L-S no feriados = 31 − 4 − 2 = 25 → 1 + 6 ÷ 25</w:t>
+            </w:r>
+          </w:p>
+        </w:tc>
+        <w:tc>
+          <w:tcPr>
+            <w:tcW w:type="dxa" w:w="1701"/>
+          </w:tcPr>
+          <w:p>
+            <w:r/>
+            <w:r>
+              <w:rPr>
+                <w:sz w:val="18"/>
+              </w:rPr>
+              <w:t>× 1,24</w:t>
+            </w:r>
+          </w:p>
+        </w:tc>
+      </w:tr>
+      <w:tr>
+        <w:tc>
+          <w:tcPr>
+            <w:tcW w:type="dxa" w:w="2835"/>
+          </w:tcPr>
+          <w:p>
+            <w:r/>
+            <w:r>
+              <w:rPr>
+                <w:sz w:val="18"/>
+              </w:rPr>
+              <w:t>Comisión de septiembre con incentivo final $600.000</w:t>
+            </w:r>
+          </w:p>
+        </w:tc>
+        <w:tc>
+          <w:tcPr>
+            <w:tcW w:type="dxa" w:w="4819"/>
+          </w:tcPr>
+          <w:p>
+            <w:r/>
+            <w:r>
+              <w:rPr>
+                <w:sz w:val="18"/>
+              </w:rPr>
+              <w:t>600.000 × 1,25 = 750.000 → llega a la liquidación de octubre como "Comisiones"</w:t>
+            </w:r>
+          </w:p>
+        </w:tc>
+        <w:tc>
+          <w:tcPr>
+            <w:tcW w:type="dxa" w:w="1701"/>
+          </w:tcPr>
+          <w:p>
+            <w:r/>
+            <w:r>
+              <w:rPr>
+                <w:sz w:val="18"/>
+              </w:rPr>
+              <w:t>$750.000</w:t>
+            </w:r>
+          </w:p>
+        </w:tc>
+      </w:tr>
+    </w:tbl>
+    <w:p>
+      <w:pPr>
+        <w:spacing w:after="40"/>
+      </w:pPr>
+    </w:p>
+    <w:tbl>
+      <w:tblPr>
+        <w:tblStyle w:val="TableGrid"/>
+        <w:tblW w:type="auto" w:w="0"/>
+        <w:tblLook w:firstColumn="1" w:firstRow="1" w:lastColumn="0" w:lastRow="0" w:noHBand="0" w:noVBand="1" w:val="04A0"/>
+      </w:tblPr>
+      <w:tblGrid>
+        <w:gridCol w:w="9746"/>
+      </w:tblGrid>
+      <w:tr>
+        <w:tc>
+          <w:tcPr>
+            <w:tcW w:type="dxa" w:w="9746"/>
+            <w:shd w:val="clear" w:color="auto" w:fill="E8F0F8"/>
+          </w:tcPr>
+          <w:p>
+            <w:r/>
+            <w:r>
+              <w:rPr>
+                <w:b/>
+                <w:sz w:val="19"/>
+              </w:rPr>
+              <w:t>🔒 Cómo cuadrar a mano</w:t>
+              <w:br/>
+            </w:r>
+            <w:r>
+              <w:rPr>
+                <w:sz w:val="19"/>
+              </w:rPr>
+              <w:t>Hora extra: sueldo base × 0,0079545 (44 h) o × 0,00875 (40 h) × horas; si la persona tiene jornada especial, usar sus horas semanales. Semana corrida: contar en el calendario los domingos y feriados del mes y los días lunes a sábado sin feriado; el factor está en Revisión de Comisiones junto a cada ejecutivo. Si un feriado nuevo no está en el mantenedor, el factor sale bajo: revisar Feriados.</w:t>
             </w:r>
           </w:p>
         </w:tc>

</xml_diff>

<commit_message>
docs: Manual de RRHH v2.8 — gratificación legal (art. 50) e impuesto único (base tributable, tramos UTM, APV, Isapre) con ejemplos numéricos (cap. 15.3); documentación v3.8 (v255.8)
Co-Authored-By: Claude Fable 5.1 <noreply@anthropic.com>
</commit_message>
<xml_diff>
--- a/api-gateway/public/mantenedores/documentacion/descargas/Manual-RRHH-Business-Suite.docx
+++ b/api-gateway/public/mantenedores/documentacion/descargas/Manual-RRHH-Business-Suite.docx
@@ -236,7 +236,7 @@
           <w:i w:val="0"/>
           <w:sz w:val="22"/>
         </w:rPr>
-        <w:t>Versión 2.7 · 17 de septiembre de 2026 · Suite v255.7</w:t>
+        <w:t>Versión 2.8 · 17 de septiembre de 2026 · Suite v255.8</w:t>
       </w:r>
     </w:p>
     <w:p>
@@ -868,6 +868,64 @@
                 <w:sz w:val="18"/>
               </w:rPr>
               <w:t>Cap. 15.2: horas extraordinarias (art. 32) y semana corrida (art. 45) con ejemplo.</w:t>
+            </w:r>
+          </w:p>
+        </w:tc>
+      </w:tr>
+      <w:tr>
+        <w:tc>
+          <w:tcPr>
+            <w:tcW w:type="dxa" w:w="907"/>
+          </w:tcPr>
+          <w:p>
+            <w:r/>
+            <w:r>
+              <w:rPr>
+                <w:sz w:val="18"/>
+              </w:rPr>
+              <w:t>2.8</w:t>
+            </w:r>
+          </w:p>
+        </w:tc>
+        <w:tc>
+          <w:tcPr>
+            <w:tcW w:type="dxa" w:w="1247"/>
+          </w:tcPr>
+          <w:p>
+            <w:r/>
+            <w:r>
+              <w:rPr>
+                <w:sz w:val="18"/>
+              </w:rPr>
+              <w:t>17-09-2026</w:t>
+            </w:r>
+          </w:p>
+        </w:tc>
+        <w:tc>
+          <w:tcPr>
+            <w:tcW w:type="dxa" w:w="2041"/>
+          </w:tcPr>
+          <w:p>
+            <w:r/>
+            <w:r>
+              <w:rPr>
+                <w:sz w:val="18"/>
+              </w:rPr>
+              <w:t>Patricio Escobar / Claude</w:t>
+            </w:r>
+          </w:p>
+        </w:tc>
+        <w:tc>
+          <w:tcPr>
+            <w:tcW w:type="dxa" w:w="5159"/>
+          </w:tcPr>
+          <w:p>
+            <w:r/>
+            <w:r>
+              <w:rPr>
+                <w:sz w:val="18"/>
+              </w:rPr>
+              <w:t>Cap. 15.3: gratificación legal (art. 50) e impuesto único (tramos UTM, base tributable, APV, Isapre) con ejemplos.</w:t>
             </w:r>
           </w:p>
         </w:tc>
@@ -15390,6 +15448,1311 @@
                 <w:sz w:val="19"/>
               </w:rPr>
               <w:t>Hora extra: sueldo base × 0,0079545 (44 h) o × 0,00875 (40 h) × horas; si la persona tiene jornada especial, usar sus horas semanales. Semana corrida: contar en el calendario los domingos y feriados del mes y los días lunes a sábado sin feriado; el factor está en Revisión de Comisiones junto a cada ejecutivo. Si un feriado nuevo no está en el mantenedor, el factor sale bajo: revisar Feriados.</w:t>
+            </w:r>
+          </w:p>
+        </w:tc>
+      </w:tr>
+    </w:tbl>
+    <w:p>
+      <w:pPr>
+        <w:spacing w:after="40"/>
+      </w:pPr>
+    </w:p>
+    <w:p>
+      <w:pPr>
+        <w:pStyle w:val="Heading3"/>
+      </w:pPr>
+      <w:r>
+        <w:t>15.3 Gratificación legal e impuesto único</w:t>
+      </w:r>
+    </w:p>
+    <w:p>
+      <w:pPr>
+        <w:spacing w:after="80"/>
+      </w:pPr>
+      <w:r>
+        <w:rPr>
+          <w:b w:val="0"/>
+          <w:i w:val="0"/>
+        </w:rPr>
+        <w:t>Las dos líneas de la liquidación que más preguntas generan. Ambas viven en calcLiquidacion() (gratificación) y shared/base-tributable.js + rh_impuesto_tramos (impuesto), con sus parámetros en Indicadores de Remuneraciones.</w:t>
+      </w:r>
+    </w:p>
+    <w:p>
+      <w:pPr>
+        <w:spacing w:after="40"/>
+      </w:pPr>
+      <w:r>
+        <w:rPr>
+          <w:b/>
+          <w:i w:val="0"/>
+          <w:color w:val="1F4E79"/>
+        </w:rPr>
+        <w:t>Gratificación legal (art. 50 CT)</w:t>
+      </w:r>
+    </w:p>
+    <w:tbl>
+      <w:tblPr>
+        <w:tblStyle w:val="TableGrid"/>
+        <w:tblW w:type="auto" w:w="0"/>
+        <w:jc w:val="center"/>
+        <w:tblLook w:firstColumn="1" w:firstRow="1" w:lastColumn="0" w:lastRow="0" w:noHBand="0" w:noVBand="1" w:val="04A0"/>
+      </w:tblPr>
+      <w:tblGrid>
+        <w:gridCol w:w="3249"/>
+        <w:gridCol w:w="3249"/>
+        <w:gridCol w:w="3249"/>
+      </w:tblGrid>
+      <w:tr>
+        <w:tc>
+          <w:tcPr>
+            <w:tcW w:type="dxa" w:w="1814"/>
+            <w:shd w:val="clear" w:color="auto" w:fill="1F4E79"/>
+          </w:tcPr>
+          <w:p>
+            <w:r/>
+            <w:r>
+              <w:rPr>
+                <w:b/>
+                <w:color w:val="FFFFFF"/>
+                <w:sz w:val="18"/>
+              </w:rPr>
+              <w:t>Concepto</w:t>
+            </w:r>
+          </w:p>
+        </w:tc>
+        <w:tc>
+          <w:tcPr>
+            <w:tcW w:type="dxa" w:w="5556"/>
+            <w:shd w:val="clear" w:color="auto" w:fill="1F4E79"/>
+          </w:tcPr>
+          <w:p>
+            <w:r/>
+            <w:r>
+              <w:rPr>
+                <w:b/>
+                <w:color w:val="FFFFFF"/>
+                <w:sz w:val="18"/>
+              </w:rPr>
+              <w:t>Regla / fórmula</w:t>
+            </w:r>
+          </w:p>
+        </w:tc>
+        <w:tc>
+          <w:tcPr>
+            <w:tcW w:type="dxa" w:w="1984"/>
+            <w:shd w:val="clear" w:color="auto" w:fill="1F4E79"/>
+          </w:tcPr>
+          <w:p>
+            <w:r/>
+            <w:r>
+              <w:rPr>
+                <w:b/>
+                <w:color w:val="FFFFFF"/>
+                <w:sz w:val="18"/>
+              </w:rPr>
+              <w:t>Parámetro</w:t>
+            </w:r>
+          </w:p>
+        </w:tc>
+      </w:tr>
+      <w:tr>
+        <w:tc>
+          <w:tcPr>
+            <w:tcW w:type="dxa" w:w="1814"/>
+          </w:tcPr>
+          <w:p>
+            <w:r/>
+            <w:r>
+              <w:rPr>
+                <w:sz w:val="18"/>
+              </w:rPr>
+              <w:t>Modalidad</w:t>
+            </w:r>
+          </w:p>
+        </w:tc>
+        <w:tc>
+          <w:tcPr>
+            <w:tcW w:type="dxa" w:w="5556"/>
+          </w:tcPr>
+          <w:p>
+            <w:r/>
+            <w:r>
+              <w:rPr>
+                <w:sz w:val="18"/>
+              </w:rPr>
+              <w:t>AutoFácil paga la gratificación del art. 50: 25% de lo devengado en el mes, con tope anual de 4,75 ingresos mínimos mensuales, pagada mes a mes (1/12 del tope). No se usa la del art. 47 (30% de las utilidades).</w:t>
+            </w:r>
+          </w:p>
+        </w:tc>
+        <w:tc>
+          <w:tcPr>
+            <w:tcW w:type="dxa" w:w="1984"/>
+          </w:tcPr>
+          <w:p>
+            <w:r/>
+            <w:r>
+              <w:rPr>
+                <w:sz w:val="18"/>
+              </w:rPr>
+              <w:t>contrato / anexo</w:t>
+            </w:r>
+          </w:p>
+        </w:tc>
+      </w:tr>
+      <w:tr>
+        <w:tc>
+          <w:tcPr>
+            <w:tcW w:type="dxa" w:w="1814"/>
+          </w:tcPr>
+          <w:p>
+            <w:r/>
+            <w:r>
+              <w:rPr>
+                <w:sz w:val="18"/>
+              </w:rPr>
+              <w:t>Base</w:t>
+            </w:r>
+          </w:p>
+        </w:tc>
+        <w:tc>
+          <w:tcPr>
+            <w:tcW w:type="dxa" w:w="5556"/>
+          </w:tcPr>
+          <w:p>
+            <w:r/>
+            <w:r>
+              <w:rPr>
+                <w:sz w:val="18"/>
+              </w:rPr>
+              <w:t>sueldo base (en 30avos) + comisiones + feriado con renta variable + otros imponibles del mes (bonos, horas extras, aguinaldos imponibles). No entran colación, movilización ni no imponibles.</w:t>
+            </w:r>
+          </w:p>
+        </w:tc>
+        <w:tc>
+          <w:tcPr>
+            <w:tcW w:type="dxa" w:w="1984"/>
+          </w:tcPr>
+          <w:p>
+            <w:r/>
+            <w:r>
+              <w:rPr>
+                <w:sz w:val="18"/>
+              </w:rPr>
+              <w:t>calcLiquidacion</w:t>
+            </w:r>
+          </w:p>
+        </w:tc>
+      </w:tr>
+      <w:tr>
+        <w:tc>
+          <w:tcPr>
+            <w:tcW w:type="dxa" w:w="1814"/>
+          </w:tcPr>
+          <w:p>
+            <w:r/>
+            <w:r>
+              <w:rPr>
+                <w:sz w:val="18"/>
+              </w:rPr>
+              <w:t>Tope mensual</w:t>
+            </w:r>
+          </w:p>
+        </w:tc>
+        <w:tc>
+          <w:tcPr>
+            <w:tcW w:type="dxa" w:w="5556"/>
+          </w:tcPr>
+          <w:p>
+            <w:r/>
+            <w:r>
+              <w:rPr>
+                <w:sz w:val="18"/>
+              </w:rPr>
+              <w:t>4,75 × IMM ÷ 12, prorrateado por días pagados (× días/30) cuando hay licencia, ausencia, ingreso o baja en el mes.</w:t>
+            </w:r>
+          </w:p>
+        </w:tc>
+        <w:tc>
+          <w:tcPr>
+            <w:tcW w:type="dxa" w:w="1984"/>
+          </w:tcPr>
+          <w:p>
+            <w:r/>
+            <w:r>
+              <w:rPr>
+                <w:sz w:val="18"/>
+              </w:rPr>
+              <w:t>rem_grat_tope_imm 4,75 · rem_imm $529.000 · rem_prorratea_topes 1</w:t>
+            </w:r>
+          </w:p>
+        </w:tc>
+      </w:tr>
+      <w:tr>
+        <w:tc>
+          <w:tcPr>
+            <w:tcW w:type="dxa" w:w="1814"/>
+          </w:tcPr>
+          <w:p>
+            <w:r/>
+            <w:r>
+              <w:rPr>
+                <w:sz w:val="18"/>
+              </w:rPr>
+              <w:t>Gratificación del mes</w:t>
+            </w:r>
+          </w:p>
+        </w:tc>
+        <w:tc>
+          <w:tcPr>
+            <w:tcW w:type="dxa" w:w="5556"/>
+          </w:tcPr>
+          <w:p>
+            <w:r/>
+            <w:r>
+              <w:rPr>
+                <w:sz w:val="18"/>
+              </w:rPr>
+              <w:t>mín( 25% × base , tope mensual ).</w:t>
+            </w:r>
+          </w:p>
+        </w:tc>
+        <w:tc>
+          <w:tcPr>
+            <w:tcW w:type="dxa" w:w="1984"/>
+          </w:tcPr>
+          <w:p>
+            <w:r/>
+            <w:r>
+              <w:rPr>
+                <w:sz w:val="18"/>
+              </w:rPr>
+            </w:r>
+          </w:p>
+        </w:tc>
+      </w:tr>
+      <w:tr>
+        <w:tc>
+          <w:tcPr>
+            <w:tcW w:type="dxa" w:w="1814"/>
+          </w:tcPr>
+          <w:p>
+            <w:r/>
+            <w:r>
+              <w:rPr>
+                <w:sz w:val="18"/>
+              </w:rPr>
+              <w:t>Efecto</w:t>
+            </w:r>
+          </w:p>
+        </w:tc>
+        <w:tc>
+          <w:tcPr>
+            <w:tcW w:type="dxa" w:w="5556"/>
+          </w:tcPr>
+          <w:p>
+            <w:r/>
+            <w:r>
+              <w:rPr>
+                <w:sz w:val="18"/>
+              </w:rPr>
+              <w:t>es imponible y tributable: entra en el total imponible, cotiza AFP/salud/AFC y paga impuesto; NO entra en la base del feriado proporcional (dictamen DT 836/046) pero SÍ en la base de las indemnizaciones (art. 172).</w:t>
+            </w:r>
+          </w:p>
+        </w:tc>
+        <w:tc>
+          <w:tcPr>
+            <w:tcW w:type="dxa" w:w="1984"/>
+          </w:tcPr>
+          <w:p>
+            <w:r/>
+            <w:r>
+              <w:rPr>
+                <w:sz w:val="18"/>
+              </w:rPr>
+              <w:t>cap. 25.1</w:t>
+            </w:r>
+          </w:p>
+        </w:tc>
+      </w:tr>
+      <w:tr>
+        <w:tc>
+          <w:tcPr>
+            <w:tcW w:type="dxa" w:w="1814"/>
+          </w:tcPr>
+          <w:p>
+            <w:r/>
+            <w:r>
+              <w:rPr>
+                <w:sz w:val="18"/>
+              </w:rPr>
+              <w:t>Cuándo cambia</w:t>
+            </w:r>
+          </w:p>
+        </w:tc>
+        <w:tc>
+          <w:tcPr>
+            <w:tcW w:type="dxa" w:w="5556"/>
+          </w:tcPr>
+          <w:p>
+            <w:r/>
+            <w:r>
+              <w:rPr>
+                <w:sz w:val="18"/>
+              </w:rPr>
+              <w:t>cada vez que sube el IMM (mantenedor: el motor IA de Previred lo propone los días 1–3). Un mes emitido no se recalcula.</w:t>
+            </w:r>
+          </w:p>
+        </w:tc>
+        <w:tc>
+          <w:tcPr>
+            <w:tcW w:type="dxa" w:w="1984"/>
+          </w:tcPr>
+          <w:p>
+            <w:r/>
+            <w:r>
+              <w:rPr>
+                <w:sz w:val="18"/>
+              </w:rPr>
+              <w:t>Indicadores de Remuneraciones</w:t>
+            </w:r>
+          </w:p>
+        </w:tc>
+      </w:tr>
+    </w:tbl>
+    <w:p>
+      <w:pPr>
+        <w:spacing w:after="40"/>
+      </w:pPr>
+    </w:p>
+    <w:tbl>
+      <w:tblPr>
+        <w:tblStyle w:val="TableGrid"/>
+        <w:tblW w:type="auto" w:w="0"/>
+        <w:jc w:val="center"/>
+        <w:tblLook w:firstColumn="1" w:firstRow="1" w:lastColumn="0" w:lastRow="0" w:noHBand="0" w:noVBand="1" w:val="04A0"/>
+      </w:tblPr>
+      <w:tblGrid>
+        <w:gridCol w:w="3249"/>
+        <w:gridCol w:w="3249"/>
+        <w:gridCol w:w="3249"/>
+      </w:tblGrid>
+      <w:tr>
+        <w:tc>
+          <w:tcPr>
+            <w:tcW w:type="dxa" w:w="3175"/>
+            <w:shd w:val="clear" w:color="auto" w:fill="1F4E79"/>
+          </w:tcPr>
+          <w:p>
+            <w:r/>
+            <w:r>
+              <w:rPr>
+                <w:b/>
+                <w:color w:val="FFFFFF"/>
+                <w:sz w:val="18"/>
+              </w:rPr>
+              <w:t>Caso (IMM $529.000 → tope mensual 4,75 × 529.000 ÷ 12 = $209.396)</w:t>
+            </w:r>
+          </w:p>
+        </w:tc>
+        <w:tc>
+          <w:tcPr>
+            <w:tcW w:type="dxa" w:w="4195"/>
+            <w:shd w:val="clear" w:color="auto" w:fill="1F4E79"/>
+          </w:tcPr>
+          <w:p>
+            <w:r/>
+            <w:r>
+              <w:rPr>
+                <w:b/>
+                <w:color w:val="FFFFFF"/>
+                <w:sz w:val="18"/>
+              </w:rPr>
+              <w:t>Cálculo</w:t>
+            </w:r>
+          </w:p>
+        </w:tc>
+        <w:tc>
+          <w:tcPr>
+            <w:tcW w:type="dxa" w:w="1984"/>
+            <w:shd w:val="clear" w:color="auto" w:fill="1F4E79"/>
+          </w:tcPr>
+          <w:p>
+            <w:r/>
+            <w:r>
+              <w:rPr>
+                <w:b/>
+                <w:color w:val="FFFFFF"/>
+                <w:sz w:val="18"/>
+              </w:rPr>
+              <w:t>Gratificación</w:t>
+            </w:r>
+          </w:p>
+        </w:tc>
+      </w:tr>
+      <w:tr>
+        <w:tc>
+          <w:tcPr>
+            <w:tcW w:type="dxa" w:w="3175"/>
+          </w:tcPr>
+          <w:p>
+            <w:r/>
+            <w:r>
+              <w:rPr>
+                <w:sz w:val="18"/>
+              </w:rPr>
+              <w:t>Sueldo base $600.000, sin variable</w:t>
+            </w:r>
+          </w:p>
+        </w:tc>
+        <w:tc>
+          <w:tcPr>
+            <w:tcW w:type="dxa" w:w="4195"/>
+          </w:tcPr>
+          <w:p>
+            <w:r/>
+            <w:r>
+              <w:rPr>
+                <w:sz w:val="18"/>
+              </w:rPr>
+              <w:t>25% = 150.000 &lt; 209.396</w:t>
+            </w:r>
+          </w:p>
+        </w:tc>
+        <w:tc>
+          <w:tcPr>
+            <w:tcW w:type="dxa" w:w="1984"/>
+          </w:tcPr>
+          <w:p>
+            <w:r/>
+            <w:r>
+              <w:rPr>
+                <w:sz w:val="18"/>
+              </w:rPr>
+              <w:t>$150.000</w:t>
+            </w:r>
+          </w:p>
+        </w:tc>
+      </w:tr>
+      <w:tr>
+        <w:tc>
+          <w:tcPr>
+            <w:tcW w:type="dxa" w:w="3175"/>
+          </w:tcPr>
+          <w:p>
+            <w:r/>
+            <w:r>
+              <w:rPr>
+                <w:sz w:val="18"/>
+              </w:rPr>
+              <w:t>Base del mes $837.833</w:t>
+            </w:r>
+          </w:p>
+        </w:tc>
+        <w:tc>
+          <w:tcPr>
+            <w:tcW w:type="dxa" w:w="4195"/>
+          </w:tcPr>
+          <w:p>
+            <w:r/>
+            <w:r>
+              <w:rPr>
+                <w:sz w:val="18"/>
+              </w:rPr>
+              <w:t>25% = 209.458 &gt; tope</w:t>
+            </w:r>
+          </w:p>
+        </w:tc>
+        <w:tc>
+          <w:tcPr>
+            <w:tcW w:type="dxa" w:w="1984"/>
+          </w:tcPr>
+          <w:p>
+            <w:r/>
+            <w:r>
+              <w:rPr>
+                <w:sz w:val="18"/>
+              </w:rPr>
+              <w:t>$209.396 (tope)</w:t>
+            </w:r>
+          </w:p>
+        </w:tc>
+      </w:tr>
+      <w:tr>
+        <w:tc>
+          <w:tcPr>
+            <w:tcW w:type="dxa" w:w="3175"/>
+          </w:tcPr>
+          <w:p>
+            <w:r/>
+            <w:r>
+              <w:rPr>
+                <w:sz w:val="18"/>
+              </w:rPr>
+              <w:t>Ejecutivo: sueldo $900.000 + comisiones $350.000</w:t>
+            </w:r>
+          </w:p>
+        </w:tc>
+        <w:tc>
+          <w:tcPr>
+            <w:tcW w:type="dxa" w:w="4195"/>
+          </w:tcPr>
+          <w:p>
+            <w:r/>
+            <w:r>
+              <w:rPr>
+                <w:sz w:val="18"/>
+              </w:rPr>
+              <w:t>25% de 1.250.000 = 312.500 &gt; tope</w:t>
+            </w:r>
+          </w:p>
+        </w:tc>
+        <w:tc>
+          <w:tcPr>
+            <w:tcW w:type="dxa" w:w="1984"/>
+          </w:tcPr>
+          <w:p>
+            <w:r/>
+            <w:r>
+              <w:rPr>
+                <w:sz w:val="18"/>
+              </w:rPr>
+              <w:t>$209.396 (tope)</w:t>
+            </w:r>
+          </w:p>
+        </w:tc>
+      </w:tr>
+      <w:tr>
+        <w:tc>
+          <w:tcPr>
+            <w:tcW w:type="dxa" w:w="3175"/>
+          </w:tcPr>
+          <w:p>
+            <w:r/>
+            <w:r>
+              <w:rPr>
+                <w:sz w:val="18"/>
+              </w:rPr>
+              <w:t>Sueldo $600.000 con licencia de 10 días (20 pagados)</w:t>
+            </w:r>
+          </w:p>
+        </w:tc>
+        <w:tc>
+          <w:tcPr>
+            <w:tcW w:type="dxa" w:w="4195"/>
+          </w:tcPr>
+          <w:p>
+            <w:r/>
+            <w:r>
+              <w:rPr>
+                <w:sz w:val="18"/>
+              </w:rPr>
+              <w:t>base 600.000 × 20/30 = 400.000 → 25% = 100.000; tope 209.396 × 20/30 = 139.597</w:t>
+            </w:r>
+          </w:p>
+        </w:tc>
+        <w:tc>
+          <w:tcPr>
+            <w:tcW w:type="dxa" w:w="1984"/>
+          </w:tcPr>
+          <w:p>
+            <w:r/>
+            <w:r>
+              <w:rPr>
+                <w:sz w:val="18"/>
+              </w:rPr>
+              <w:t>$100.000</w:t>
+            </w:r>
+          </w:p>
+        </w:tc>
+      </w:tr>
+    </w:tbl>
+    <w:p>
+      <w:pPr>
+        <w:spacing w:after="40"/>
+      </w:pPr>
+    </w:p>
+    <w:p>
+      <w:pPr>
+        <w:spacing w:after="40"/>
+      </w:pPr>
+      <w:r>
+        <w:rPr>
+          <w:b/>
+          <w:i w:val="0"/>
+          <w:color w:val="1F4E79"/>
+        </w:rPr>
+        <w:t>Impuesto único de segunda categoría (art. 42 N°1 y 43 LIR)</w:t>
+      </w:r>
+    </w:p>
+    <w:tbl>
+      <w:tblPr>
+        <w:tblStyle w:val="TableGrid"/>
+        <w:tblW w:type="auto" w:w="0"/>
+        <w:jc w:val="center"/>
+        <w:tblLook w:firstColumn="1" w:firstRow="1" w:lastColumn="0" w:lastRow="0" w:noHBand="0" w:noVBand="1" w:val="04A0"/>
+      </w:tblPr>
+      <w:tblGrid>
+        <w:gridCol w:w="3249"/>
+        <w:gridCol w:w="3249"/>
+        <w:gridCol w:w="3249"/>
+      </w:tblGrid>
+      <w:tr>
+        <w:tc>
+          <w:tcPr>
+            <w:tcW w:type="dxa" w:w="1814"/>
+            <w:shd w:val="clear" w:color="auto" w:fill="1F4E79"/>
+          </w:tcPr>
+          <w:p>
+            <w:r/>
+            <w:r>
+              <w:rPr>
+                <w:b/>
+                <w:color w:val="FFFFFF"/>
+                <w:sz w:val="18"/>
+              </w:rPr>
+              <w:t>Concepto</w:t>
+            </w:r>
+          </w:p>
+        </w:tc>
+        <w:tc>
+          <w:tcPr>
+            <w:tcW w:type="dxa" w:w="5556"/>
+            <w:shd w:val="clear" w:color="auto" w:fill="1F4E79"/>
+          </w:tcPr>
+          <w:p>
+            <w:r/>
+            <w:r>
+              <w:rPr>
+                <w:b/>
+                <w:color w:val="FFFFFF"/>
+                <w:sz w:val="18"/>
+              </w:rPr>
+              <w:t>Regla / fórmula</w:t>
+            </w:r>
+          </w:p>
+        </w:tc>
+        <w:tc>
+          <w:tcPr>
+            <w:tcW w:type="dxa" w:w="1984"/>
+            <w:shd w:val="clear" w:color="auto" w:fill="1F4E79"/>
+          </w:tcPr>
+          <w:p>
+            <w:r/>
+            <w:r>
+              <w:rPr>
+                <w:b/>
+                <w:color w:val="FFFFFF"/>
+                <w:sz w:val="18"/>
+              </w:rPr>
+              <w:t>Parámetro</w:t>
+            </w:r>
+          </w:p>
+        </w:tc>
+      </w:tr>
+      <w:tr>
+        <w:tc>
+          <w:tcPr>
+            <w:tcW w:type="dxa" w:w="1814"/>
+          </w:tcPr>
+          <w:p>
+            <w:r/>
+            <w:r>
+              <w:rPr>
+                <w:sz w:val="18"/>
+              </w:rPr>
+              <w:t>Base tributable</w:t>
+            </w:r>
+          </w:p>
+        </w:tc>
+        <w:tc>
+          <w:tcPr>
+            <w:tcW w:type="dxa" w:w="5556"/>
+          </w:tcPr>
+          <w:p>
+            <w:r/>
+            <w:r>
+              <w:rPr>
+                <w:sz w:val="18"/>
+              </w:rPr>
+              <w:t>total imponible − AFP − cotización de salud pactada (7% + adicional Isapre, con tope del 7% del tope imponible) − AFC trabajador − APV régimen B (tope 50 UF mensuales). Motor shared/base-tributable.js, el mismo de la DJ 1887.</w:t>
+            </w:r>
+          </w:p>
+        </w:tc>
+        <w:tc>
+          <w:tcPr>
+            <w:tcW w:type="dxa" w:w="1984"/>
+          </w:tcPr>
+          <w:p>
+            <w:r/>
+            <w:r>
+              <w:rPr>
+                <w:sz w:val="18"/>
+              </w:rPr>
+              <w:t>rem_apv_tope_uf 50</w:t>
+            </w:r>
+          </w:p>
+        </w:tc>
+      </w:tr>
+      <w:tr>
+        <w:tc>
+          <w:tcPr>
+            <w:tcW w:type="dxa" w:w="1814"/>
+          </w:tcPr>
+          <w:p>
+            <w:r/>
+            <w:r>
+              <w:rPr>
+                <w:sz w:val="18"/>
+              </w:rPr>
+              <w:t>Tramo</w:t>
+            </w:r>
+          </w:p>
+        </w:tc>
+        <w:tc>
+          <w:tcPr>
+            <w:tcW w:type="dxa" w:w="5556"/>
+          </w:tcPr>
+          <w:p>
+            <w:r/>
+            <w:r>
+              <w:rPr>
+                <w:sz w:val="18"/>
+              </w:rPr>
+              <w:t>base tributable ÷ UTM del mes → se ubica en la tabla; impuesto = base tributable × factor − rebaja (en UTM) × UTM; mínimo 0.</w:t>
+            </w:r>
+          </w:p>
+        </w:tc>
+        <w:tc>
+          <w:tcPr>
+            <w:tcW w:type="dxa" w:w="1984"/>
+          </w:tcPr>
+          <w:p>
+            <w:r/>
+            <w:r>
+              <w:rPr>
+                <w:sz w:val="18"/>
+              </w:rPr>
+              <w:t>rh_impuesto_tramos · UTM</w:t>
+            </w:r>
+          </w:p>
+        </w:tc>
+      </w:tr>
+      <w:tr>
+        <w:tc>
+          <w:tcPr>
+            <w:tcW w:type="dxa" w:w="1814"/>
+          </w:tcPr>
+          <w:p>
+            <w:r/>
+            <w:r>
+              <w:rPr>
+                <w:sz w:val="18"/>
+              </w:rPr>
+              <w:t>Tabla vigente (mensual, en UTM)</w:t>
+            </w:r>
+          </w:p>
+        </w:tc>
+        <w:tc>
+          <w:tcPr>
+            <w:tcW w:type="dxa" w:w="5556"/>
+          </w:tcPr>
+          <w:p>
+            <w:r/>
+            <w:r>
+              <w:rPr>
+                <w:sz w:val="18"/>
+              </w:rPr>
+              <w:t>0 – 13,5: exento · 13,5 – 30: 4% − 0,54 · 30 – 50: 8% − 1,74 · 50 – 70: 13,5% − 4,49 · 70 – 90: 23% − 11,14 · 90 – 120: 30,4% − 17,80 · 120 – 310: 35% − 23,32 · más de 310: 40% − 38,82.</w:t>
+            </w:r>
+          </w:p>
+        </w:tc>
+        <w:tc>
+          <w:tcPr>
+            <w:tcW w:type="dxa" w:w="1984"/>
+          </w:tcPr>
+          <w:p>
+            <w:r/>
+            <w:r>
+              <w:rPr>
+                <w:sz w:val="18"/>
+              </w:rPr>
+              <w:t>editable en Indicadores → Tramos</w:t>
+            </w:r>
+          </w:p>
+        </w:tc>
+      </w:tr>
+      <w:tr>
+        <w:tc>
+          <w:tcPr>
+            <w:tcW w:type="dxa" w:w="1814"/>
+          </w:tcPr>
+          <w:p>
+            <w:r/>
+            <w:r>
+              <w:rPr>
+                <w:sz w:val="18"/>
+              </w:rPr>
+              <w:t>Qué NO rebaja la base</w:t>
+            </w:r>
+          </w:p>
+        </w:tc>
+        <w:tc>
+          <w:tcPr>
+            <w:tcW w:type="dxa" w:w="5556"/>
+          </w:tcPr>
+          <w:p>
+            <w:r/>
+            <w:r>
+              <w:rPr>
+                <w:sz w:val="18"/>
+              </w:rPr>
+              <w:t>descuentos de préstamos, anticipos, cuotas de la Caja, seguro de cargas, descuentos varios: bajan el líquido, no el impuesto.</w:t>
+            </w:r>
+          </w:p>
+        </w:tc>
+        <w:tc>
+          <w:tcPr>
+            <w:tcW w:type="dxa" w:w="1984"/>
+          </w:tcPr>
+          <w:p>
+            <w:r/>
+            <w:r>
+              <w:rPr>
+                <w:sz w:val="18"/>
+              </w:rPr>
+            </w:r>
+          </w:p>
+        </w:tc>
+      </w:tr>
+      <w:tr>
+        <w:tc>
+          <w:tcPr>
+            <w:tcW w:type="dxa" w:w="1814"/>
+          </w:tcPr>
+          <w:p>
+            <w:r/>
+            <w:r>
+              <w:rPr>
+                <w:sz w:val="18"/>
+              </w:rPr>
+              <w:t>Efecto de un haber líquido</w:t>
+            </w:r>
+          </w:p>
+        </w:tc>
+        <w:tc>
+          <w:tcPr>
+            <w:tcW w:type="dxa" w:w="5556"/>
+          </w:tcPr>
+          <w:p>
+            <w:r/>
+            <w:r>
+              <w:rPr>
+                <w:sz w:val="18"/>
+              </w:rPr>
+              <w:t>cuando un adicional se marca Líquido e imponible, el bruto se busca por bisección para que, después de AFP, salud, AFC e impuesto, quede exactamente el líquido pactado: el bruto cambia por persona.</w:t>
+            </w:r>
+          </w:p>
+        </w:tc>
+        <w:tc>
+          <w:tcPr>
+            <w:tcW w:type="dxa" w:w="1984"/>
+          </w:tcPr>
+          <w:p>
+            <w:r/>
+            <w:r>
+              <w:rPr>
+                <w:sz w:val="18"/>
+              </w:rPr>
+              <w:t>Adicionales</w:t>
+            </w:r>
+          </w:p>
+        </w:tc>
+      </w:tr>
+      <w:tr>
+        <w:tc>
+          <w:tcPr>
+            <w:tcW w:type="dxa" w:w="1814"/>
+          </w:tcPr>
+          <w:p>
+            <w:r/>
+            <w:r>
+              <w:rPr>
+                <w:sz w:val="18"/>
+              </w:rPr>
+              <w:t>Declaración</w:t>
+            </w:r>
+          </w:p>
+        </w:tc>
+        <w:tc>
+          <w:tcPr>
+            <w:tcW w:type="dxa" w:w="5556"/>
+          </w:tcPr>
+          <w:p>
+            <w:r/>
+            <w:r>
+              <w:rPr>
+                <w:sz w:val="18"/>
+              </w:rPr>
+              <w:t>el impuesto retenido del mes va al F29 (código 048) y al LRE; el resumen anual a la DJ 1887 y al certificado de sueldos del trabajador.</w:t>
+            </w:r>
+          </w:p>
+        </w:tc>
+        <w:tc>
+          <w:tcPr>
+            <w:tcW w:type="dxa" w:w="1984"/>
+          </w:tcPr>
+          <w:p>
+            <w:r/>
+            <w:r>
+              <w:rPr>
+                <w:sz w:val="18"/>
+              </w:rPr>
+              <w:t>Contabilidad</w:t>
+            </w:r>
+          </w:p>
+        </w:tc>
+      </w:tr>
+    </w:tbl>
+    <w:p>
+      <w:pPr>
+        <w:spacing w:after="40"/>
+      </w:pPr>
+    </w:p>
+    <w:p>
+      <w:pPr>
+        <w:spacing w:after="40"/>
+      </w:pPr>
+      <w:r>
+        <w:rPr>
+          <w:b/>
+          <w:i w:val="0"/>
+          <w:color w:val="1F4E79"/>
+        </w:rPr>
+        <w:t>Ejemplo numérico (UTM $68.000, UF $39.500, AFP Modelo 10,58%)</w:t>
+      </w:r>
+    </w:p>
+    <w:tbl>
+      <w:tblPr>
+        <w:tblStyle w:val="TableGrid"/>
+        <w:tblW w:type="auto" w:w="0"/>
+        <w:jc w:val="center"/>
+        <w:tblLook w:firstColumn="1" w:firstRow="1" w:lastColumn="0" w:lastRow="0" w:noHBand="0" w:noVBand="1" w:val="04A0"/>
+      </w:tblPr>
+      <w:tblGrid>
+        <w:gridCol w:w="3249"/>
+        <w:gridCol w:w="3249"/>
+        <w:gridCol w:w="3249"/>
+      </w:tblGrid>
+      <w:tr>
+        <w:tc>
+          <w:tcPr>
+            <w:tcW w:type="dxa" w:w="2608"/>
+            <w:shd w:val="clear" w:color="auto" w:fill="1F4E79"/>
+          </w:tcPr>
+          <w:p>
+            <w:r/>
+            <w:r>
+              <w:rPr>
+                <w:b/>
+                <w:color w:val="FFFFFF"/>
+                <w:sz w:val="18"/>
+              </w:rPr>
+              <w:t>Caso</w:t>
+            </w:r>
+          </w:p>
+        </w:tc>
+        <w:tc>
+          <w:tcPr>
+            <w:tcW w:type="dxa" w:w="5046"/>
+            <w:shd w:val="clear" w:color="auto" w:fill="1F4E79"/>
+          </w:tcPr>
+          <w:p>
+            <w:r/>
+            <w:r>
+              <w:rPr>
+                <w:b/>
+                <w:color w:val="FFFFFF"/>
+                <w:sz w:val="18"/>
+              </w:rPr>
+              <w:t>Cálculo</w:t>
+            </w:r>
+          </w:p>
+        </w:tc>
+        <w:tc>
+          <w:tcPr>
+            <w:tcW w:type="dxa" w:w="1701"/>
+            <w:shd w:val="clear" w:color="auto" w:fill="1F4E79"/>
+          </w:tcPr>
+          <w:p>
+            <w:r/>
+            <w:r>
+              <w:rPr>
+                <w:b/>
+                <w:color w:val="FFFFFF"/>
+                <w:sz w:val="18"/>
+              </w:rPr>
+              <w:t>Impuesto</w:t>
+            </w:r>
+          </w:p>
+        </w:tc>
+      </w:tr>
+      <w:tr>
+        <w:tc>
+          <w:tcPr>
+            <w:tcW w:type="dxa" w:w="2608"/>
+          </w:tcPr>
+          <w:p>
+            <w:r/>
+            <w:r>
+              <w:rPr>
+                <w:sz w:val="18"/>
+              </w:rPr>
+              <w:t>Total imponible $1.459.396 (ejemplo del cap. 15.1)</w:t>
+            </w:r>
+          </w:p>
+        </w:tc>
+        <w:tc>
+          <w:tcPr>
+            <w:tcW w:type="dxa" w:w="5046"/>
+          </w:tcPr>
+          <w:p>
+            <w:r/>
+            <w:r>
+              <w:rPr>
+                <w:sz w:val="18"/>
+              </w:rPr>
+              <w:t>base 1.194.078 = 17,56 UTM → tramo 13,5–30: 1.194.078 × 4% − 0,54 × 68.000 = 47.763 − 36.720</w:t>
+            </w:r>
+          </w:p>
+        </w:tc>
+        <w:tc>
+          <w:tcPr>
+            <w:tcW w:type="dxa" w:w="1701"/>
+          </w:tcPr>
+          <w:p>
+            <w:r/>
+            <w:r>
+              <w:rPr>
+                <w:sz w:val="18"/>
+              </w:rPr>
+              <w:t>$11.043</w:t>
+            </w:r>
+          </w:p>
+        </w:tc>
+      </w:tr>
+      <w:tr>
+        <w:tc>
+          <w:tcPr>
+            <w:tcW w:type="dxa" w:w="2608"/>
+          </w:tcPr>
+          <w:p>
+            <w:r/>
+            <w:r>
+              <w:rPr>
+                <w:sz w:val="18"/>
+              </w:rPr>
+              <w:t>Total imponible $2.600.000, Fonasa</w:t>
+            </w:r>
+          </w:p>
+        </w:tc>
+        <w:tc>
+          <w:tcPr>
+            <w:tcW w:type="dxa" w:w="5046"/>
+          </w:tcPr>
+          <w:p>
+            <w:r/>
+            <w:r>
+              <w:rPr>
+                <w:sz w:val="18"/>
+              </w:rPr>
+              <w:t>AFP 275.080 · salud 182.000 · AFC 15.600 → base 2.127.320 = 31,28 UTM → tramo 30–50: 2.127.320 × 8% − 1,74 × 68.000 = 170.186 − 118.320</w:t>
+            </w:r>
+          </w:p>
+        </w:tc>
+        <w:tc>
+          <w:tcPr>
+            <w:tcW w:type="dxa" w:w="1701"/>
+          </w:tcPr>
+          <w:p>
+            <w:r/>
+            <w:r>
+              <w:rPr>
+                <w:sz w:val="18"/>
+              </w:rPr>
+              <w:t>$51.866</w:t>
+            </w:r>
+          </w:p>
+        </w:tc>
+      </w:tr>
+      <w:tr>
+        <w:tc>
+          <w:tcPr>
+            <w:tcW w:type="dxa" w:w="2608"/>
+          </w:tcPr>
+          <w:p>
+            <w:r/>
+            <w:r>
+              <w:rPr>
+                <w:sz w:val="18"/>
+              </w:rPr>
+              <w:t>Mismo caso con APV régimen B de $100.000</w:t>
+            </w:r>
+          </w:p>
+        </w:tc>
+        <w:tc>
+          <w:tcPr>
+            <w:tcW w:type="dxa" w:w="5046"/>
+          </w:tcPr>
+          <w:p>
+            <w:r/>
+            <w:r>
+              <w:rPr>
+                <w:sz w:val="18"/>
+              </w:rPr>
+              <w:t>base 2.027.320 = 29,81 UTM → baja al tramo 13,5–30: 2.027.320 × 4% − 36.720</w:t>
+            </w:r>
+          </w:p>
+        </w:tc>
+        <w:tc>
+          <w:tcPr>
+            <w:tcW w:type="dxa" w:w="1701"/>
+          </w:tcPr>
+          <w:p>
+            <w:r/>
+            <w:r>
+              <w:rPr>
+                <w:sz w:val="18"/>
+              </w:rPr>
+              <w:t>$44.373 (ahorra 7.493)</w:t>
+            </w:r>
+          </w:p>
+        </w:tc>
+      </w:tr>
+      <w:tr>
+        <w:tc>
+          <w:tcPr>
+            <w:tcW w:type="dxa" w:w="2608"/>
+          </w:tcPr>
+          <w:p>
+            <w:r/>
+            <w:r>
+              <w:rPr>
+                <w:sz w:val="18"/>
+              </w:rPr>
+              <w:t>Mismo caso con plan Isapre de 6 UF ($237.000)</w:t>
+            </w:r>
+          </w:p>
+        </w:tc>
+        <w:tc>
+          <w:tcPr>
+            <w:tcW w:type="dxa" w:w="5046"/>
+          </w:tcPr>
+          <w:p>
+            <w:r/>
+            <w:r>
+              <w:rPr>
+                <w:sz w:val="18"/>
+              </w:rPr>
+              <w:t>adicional Isapre = 237.000 − 182.000 = 55.000 (descuenta al líquido); salud deducible 237.000 (≤ 7% del tope imponible: 242.767) → base 2.072.320 = 30,48 UTM → 2.072.320 × 8% − 118.320</w:t>
+            </w:r>
+          </w:p>
+        </w:tc>
+        <w:tc>
+          <w:tcPr>
+            <w:tcW w:type="dxa" w:w="1701"/>
+          </w:tcPr>
+          <w:p>
+            <w:r/>
+            <w:r>
+              <w:rPr>
+                <w:sz w:val="18"/>
+              </w:rPr>
+              <w:t>$47.466 (el plan pactado rebaja el impuesto)</w:t>
+            </w:r>
+          </w:p>
+        </w:tc>
+      </w:tr>
+      <w:tr>
+        <w:tc>
+          <w:tcPr>
+            <w:tcW w:type="dxa" w:w="2608"/>
+          </w:tcPr>
+          <w:p>
+            <w:r/>
+            <w:r>
+              <w:rPr>
+                <w:sz w:val="18"/>
+              </w:rPr>
+              <w:t>Total imponible $850.000</w:t>
+            </w:r>
+          </w:p>
+        </w:tc>
+        <w:tc>
+          <w:tcPr>
+            <w:tcW w:type="dxa" w:w="5046"/>
+          </w:tcPr>
+          <w:p>
+            <w:r/>
+            <w:r>
+              <w:rPr>
+                <w:sz w:val="18"/>
+              </w:rPr>
+              <w:t>base ≈ 695.000 = 10,2 UTM &lt; 13,5</w:t>
+            </w:r>
+          </w:p>
+        </w:tc>
+        <w:tc>
+          <w:tcPr>
+            <w:tcW w:type="dxa" w:w="1701"/>
+          </w:tcPr>
+          <w:p>
+            <w:r/>
+            <w:r>
+              <w:rPr>
+                <w:sz w:val="18"/>
+              </w:rPr>
+              <w:t>$0 (exento)</w:t>
+            </w:r>
+          </w:p>
+        </w:tc>
+      </w:tr>
+    </w:tbl>
+    <w:p>
+      <w:pPr>
+        <w:spacing w:after="40"/>
+      </w:pPr>
+    </w:p>
+    <w:tbl>
+      <w:tblPr>
+        <w:tblStyle w:val="TableGrid"/>
+        <w:tblW w:type="auto" w:w="0"/>
+        <w:tblLook w:firstColumn="1" w:firstRow="1" w:lastColumn="0" w:lastRow="0" w:noHBand="0" w:noVBand="1" w:val="04A0"/>
+      </w:tblPr>
+      <w:tblGrid>
+        <w:gridCol w:w="9746"/>
+      </w:tblGrid>
+      <w:tr>
+        <w:tc>
+          <w:tcPr>
+            <w:tcW w:type="dxa" w:w="9746"/>
+            <w:shd w:val="clear" w:color="auto" w:fill="E8F0F8"/>
+          </w:tcPr>
+          <w:p>
+            <w:r/>
+            <w:r>
+              <w:rPr>
+                <w:b/>
+                <w:sz w:val="19"/>
+              </w:rPr>
+              <w:t>🔒 Cómo cuadrar a mano</w:t>
+              <w:br/>
+            </w:r>
+            <w:r>
+              <w:rPr>
+                <w:sz w:val="19"/>
+              </w:rPr>
+              <w:t>Gratificación: 25% de lo imponible del mes o $209.396 (con IMM $529.000), el menor; con menos de 30 días, ambos × días/30. Impuesto: restar al imponible AFP, salud pactada, AFC y APV; dividir por la UTM del mes; aplicar el factor del tramo y restar la rebaja × UTM. Si la liquidación no cuadra con la calculadora del SII, revisar primero la UTM y los tramos del mantenedor: un tramo desactualizado mueve a todo el equipo.</w:t>
             </w:r>
           </w:p>
         </w:tc>

</xml_diff>

<commit_message>
docs: Manual de RRHH v2.9 — reloj control Workera y su API (endpoints, caché, posibles faltas, atrasos, espejo de permisos) y reglas de licencias, permisos y ausencias con art. 160 N°3 y ejemplo numérico (caps. 9.1 y 10.1); documentación v3.9 (v255.9)
Co-Authored-By: Claude Fable 5.1 <noreply@anthropic.com>
</commit_message>
<xml_diff>
--- a/api-gateway/public/mantenedores/documentacion/descargas/Manual-RRHH-Business-Suite.docx
+++ b/api-gateway/public/mantenedores/documentacion/descargas/Manual-RRHH-Business-Suite.docx
@@ -236,7 +236,7 @@
           <w:i w:val="0"/>
           <w:sz w:val="22"/>
         </w:rPr>
-        <w:t>Versión 2.8 · 17 de septiembre de 2026 · Suite v255.8</w:t>
+        <w:t>Versión 2.9 · 17 de septiembre de 2026 · Suite v255.9</w:t>
       </w:r>
     </w:p>
     <w:p>
@@ -926,6 +926,64 @@
                 <w:sz w:val="18"/>
               </w:rPr>
               <w:t>Cap. 15.3: gratificación legal (art. 50) e impuesto único (tramos UTM, base tributable, APV, Isapre) con ejemplos.</w:t>
+            </w:r>
+          </w:p>
+        </w:tc>
+      </w:tr>
+      <w:tr>
+        <w:tc>
+          <w:tcPr>
+            <w:tcW w:type="dxa" w:w="907"/>
+          </w:tcPr>
+          <w:p>
+            <w:r/>
+            <w:r>
+              <w:rPr>
+                <w:sz w:val="18"/>
+              </w:rPr>
+              <w:t>2.9</w:t>
+            </w:r>
+          </w:p>
+        </w:tc>
+        <w:tc>
+          <w:tcPr>
+            <w:tcW w:type="dxa" w:w="1247"/>
+          </w:tcPr>
+          <w:p>
+            <w:r/>
+            <w:r>
+              <w:rPr>
+                <w:sz w:val="18"/>
+              </w:rPr>
+              <w:t>17-09-2026</w:t>
+            </w:r>
+          </w:p>
+        </w:tc>
+        <w:tc>
+          <w:tcPr>
+            <w:tcW w:type="dxa" w:w="2041"/>
+          </w:tcPr>
+          <w:p>
+            <w:r/>
+            <w:r>
+              <w:rPr>
+                <w:sz w:val="18"/>
+              </w:rPr>
+              <w:t>Patricio Escobar / Claude</w:t>
+            </w:r>
+          </w:p>
+        </w:tc>
+        <w:tc>
+          <w:tcPr>
+            <w:tcW w:type="dxa" w:w="5159"/>
+          </w:tcPr>
+          <w:p>
+            <w:r/>
+            <w:r>
+              <w:rPr>
+                <w:sz w:val="18"/>
+              </w:rPr>
+              <w:t>Cap. 9.1: reloj control Workera y su API (endpoints, caché, posibles faltas, atrasos, espejo); cap. 10.1: reglas de licencias, permisos y ausencias, art. 160 N°3, con ejemplo.</w:t>
             </w:r>
           </w:p>
         </w:tc>
@@ -8230,6 +8288,1114 @@
     </w:p>
     <w:p>
       <w:pPr>
+        <w:pStyle w:val="Heading3"/>
+      </w:pPr>
+      <w:r>
+        <w:t>9.1 El reloj control Workera y su API: cómo se conecta y qué se calcula</w:t>
+      </w:r>
+    </w:p>
+    <w:p>
+      <w:pPr>
+        <w:spacing w:after="80"/>
+      </w:pPr>
+      <w:r>
+        <w:rPr>
+          <w:b w:val="0"/>
+          <w:i w:val="0"/>
+        </w:rPr>
+        <w:t>Workera es la FUENTE ÚNICA de marcaciones: el sistema no tiene reloj propio ni digita marcas. Se consulta por API (cliente services/rrhh/src/workera.js), se guarda en caché y se cruza con lo que el propio sistema sabe. Documentación del proveedor: help.workera.com → Documentación de APIs.</w:t>
+      </w:r>
+    </w:p>
+    <w:tbl>
+      <w:tblPr>
+        <w:tblStyle w:val="TableGrid"/>
+        <w:tblW w:type="auto" w:w="0"/>
+        <w:jc w:val="center"/>
+        <w:tblLook w:firstColumn="1" w:firstRow="1" w:lastColumn="0" w:lastRow="0" w:noHBand="0" w:noVBand="1" w:val="04A0"/>
+      </w:tblPr>
+      <w:tblGrid>
+        <w:gridCol w:w="3249"/>
+        <w:gridCol w:w="3249"/>
+        <w:gridCol w:w="3249"/>
+      </w:tblGrid>
+      <w:tr>
+        <w:tc>
+          <w:tcPr>
+            <w:tcW w:type="dxa" w:w="1814"/>
+            <w:shd w:val="clear" w:color="auto" w:fill="1F4E79"/>
+          </w:tcPr>
+          <w:p>
+            <w:r/>
+            <w:r>
+              <w:rPr>
+                <w:b/>
+                <w:color w:val="FFFFFF"/>
+                <w:sz w:val="18"/>
+              </w:rPr>
+              <w:t>Pieza</w:t>
+            </w:r>
+          </w:p>
+        </w:tc>
+        <w:tc>
+          <w:tcPr>
+            <w:tcW w:type="dxa" w:w="5839"/>
+            <w:shd w:val="clear" w:color="auto" w:fill="1F4E79"/>
+          </w:tcPr>
+          <w:p>
+            <w:r/>
+            <w:r>
+              <w:rPr>
+                <w:b/>
+                <w:color w:val="FFFFFF"/>
+                <w:sz w:val="18"/>
+              </w:rPr>
+              <w:t>Cómo funciona</w:t>
+            </w:r>
+          </w:p>
+        </w:tc>
+        <w:tc>
+          <w:tcPr>
+            <w:tcW w:type="dxa" w:w="1701"/>
+            <w:shd w:val="clear" w:color="auto" w:fill="1F4E79"/>
+          </w:tcPr>
+          <w:p>
+            <w:r/>
+            <w:r>
+              <w:rPr>
+                <w:b/>
+                <w:color w:val="FFFFFF"/>
+                <w:sz w:val="18"/>
+              </w:rPr>
+              <w:t>Dónde / parámetro</w:t>
+            </w:r>
+          </w:p>
+        </w:tc>
+      </w:tr>
+      <w:tr>
+        <w:tc>
+          <w:tcPr>
+            <w:tcW w:type="dxa" w:w="1814"/>
+          </w:tcPr>
+          <w:p>
+            <w:r/>
+            <w:r>
+              <w:rPr>
+                <w:sz w:val="18"/>
+              </w:rPr>
+              <w:t>Autenticación</w:t>
+            </w:r>
+          </w:p>
+        </w:tc>
+        <w:tc>
+          <w:tcPr>
+            <w:tcW w:type="dxa" w:w="5839"/>
+          </w:tcPr>
+          <w:p>
+            <w:r/>
+            <w:r>
+              <w:rPr>
+                <w:sz w:val="18"/>
+              </w:rPr>
+              <w:t>headers API_USER y API_KEY en cada llamada; las credenciales viven SOLO en las variables de entorno de producción (Render). Sin ellas la card Asistencia responde "Workera no configurado" (503).</w:t>
+            </w:r>
+          </w:p>
+        </w:tc>
+        <w:tc>
+          <w:tcPr>
+            <w:tcW w:type="dxa" w:w="1701"/>
+          </w:tcPr>
+          <w:p>
+            <w:r/>
+            <w:r>
+              <w:rPr>
+                <w:sz w:val="18"/>
+              </w:rPr>
+              <w:t>WORKERA_API_USER / WORKERA_API_KEY</w:t>
+            </w:r>
+          </w:p>
+        </w:tc>
+      </w:tr>
+      <w:tr>
+        <w:tc>
+          <w:tcPr>
+            <w:tcW w:type="dxa" w:w="1814"/>
+          </w:tcPr>
+          <w:p>
+            <w:r/>
+            <w:r>
+              <w:rPr>
+                <w:sz w:val="18"/>
+              </w:rPr>
+              <w:t>Endpoints usados</w:t>
+            </w:r>
+          </w:p>
+        </w:tc>
+        <w:tc>
+          <w:tcPr>
+            <w:tcW w:type="dxa" w:w="5839"/>
+          </w:tcPr>
+          <w:p>
+            <w:r/>
+            <w:r>
+              <w:rPr>
+                <w:sz w:val="18"/>
+              </w:rPr>
+              <w:t>GET attendanceData?start&amp;end (marcaciones) · GET employee (trabajadores enrolados) · GET workshift/schedules?start&amp;end (turno asignado por día) · POST permission y DELETE permission/:id (salidas especiales = espejo de permisos). Base https://workera.com/apiClient/v1, paginado (~20 registros por página; se traen 6 páginas en paralelo).</w:t>
+            </w:r>
+          </w:p>
+        </w:tc>
+        <w:tc>
+          <w:tcPr>
+            <w:tcW w:type="dxa" w:w="1701"/>
+          </w:tcPr>
+          <w:p>
+            <w:r/>
+            <w:r>
+              <w:rPr>
+                <w:sz w:val="18"/>
+              </w:rPr>
+              <w:t>workera.js</w:t>
+            </w:r>
+          </w:p>
+        </w:tc>
+      </w:tr>
+      <w:tr>
+        <w:tc>
+          <w:tcPr>
+            <w:tcW w:type="dxa" w:w="1814"/>
+          </w:tcPr>
+          <w:p>
+            <w:r/>
+            <w:r>
+              <w:rPr>
+                <w:sz w:val="18"/>
+              </w:rPr>
+              <w:t>Llave</w:t>
+            </w:r>
+          </w:p>
+        </w:tc>
+        <w:tc>
+          <w:tcPr>
+            <w:tcW w:type="dxa" w:w="5839"/>
+          </w:tcPr>
+          <w:p>
+            <w:r/>
+            <w:r>
+              <w:rPr>
+                <w:sz w:val="18"/>
+              </w:rPr>
+              <w:t>el RUT (identification) normalizado sin puntos ni guion. Si el RUT de la Suite difiere del de Workera (extranjero con RUT definitivo), se mapea en rh_config.workera_rut_alias. Workera no permite editar el RUT por API.</w:t>
+            </w:r>
+          </w:p>
+        </w:tc>
+        <w:tc>
+          <w:tcPr>
+            <w:tcW w:type="dxa" w:w="1701"/>
+          </w:tcPr>
+          <w:p>
+            <w:r/>
+            <w:r>
+              <w:rPr>
+                <w:sz w:val="18"/>
+              </w:rPr>
+              <w:t>workera-alias.js</w:t>
+            </w:r>
+          </w:p>
+        </w:tc>
+      </w:tr>
+      <w:tr>
+        <w:tc>
+          <w:tcPr>
+            <w:tcW w:type="dxa" w:w="1814"/>
+          </w:tcPr>
+          <w:p>
+            <w:r/>
+            <w:r>
+              <w:rPr>
+                <w:sz w:val="18"/>
+              </w:rPr>
+              <w:t>Caché incremental</w:t>
+            </w:r>
+          </w:p>
+        </w:tc>
+        <w:tc>
+          <w:tcPr>
+            <w:tcW w:type="dxa" w:w="5839"/>
+          </w:tcPr>
+          <w:p>
+            <w:r/>
+            <w:r>
+              <w:rPr>
+                <w:sz w:val="18"/>
+              </w:rPr>
+              <w:t>tablas rh_workera_marcas (rut, fecha, hora, tipo, origen), rh_workera_horarios (turno del día) y rh_workera_sync (qué días ya se trajeron). Al abrir Asistencia se piden a Workera solo los días del rango que faltan; los últimos 3 días se refrescan si la última sincronización tiene más de 15 minutos (un reloj puede sincronizar tarde). Workera sigue mandando: el caché no se edita.</w:t>
+            </w:r>
+          </w:p>
+        </w:tc>
+        <w:tc>
+          <w:tcPr>
+            <w:tcW w:type="dxa" w:w="1701"/>
+          </w:tcPr>
+          <w:p>
+            <w:r/>
+            <w:r>
+              <w:rPr>
+                <w:sz w:val="18"/>
+              </w:rPr>
+              <w:t>asistencia.sincronizar</w:t>
+            </w:r>
+          </w:p>
+        </w:tc>
+      </w:tr>
+      <w:tr>
+        <w:tc>
+          <w:tcPr>
+            <w:tcW w:type="dxa" w:w="1814"/>
+          </w:tcPr>
+          <w:p>
+            <w:r/>
+            <w:r>
+              <w:rPr>
+                <w:sz w:val="18"/>
+              </w:rPr>
+              <w:t>Quién debe marcar</w:t>
+            </w:r>
+          </w:p>
+        </w:tc>
+        <w:tc>
+          <w:tcPr>
+            <w:tcW w:type="dxa" w:w="5839"/>
+          </w:tcPr>
+          <w:p>
+            <w:r/>
+            <w:r>
+              <w:rPr>
+                <w:sz w:val="18"/>
+              </w:rPr>
+              <w:t>universo del Directorio menos Art. 22 y Externos (pestaña Jornada). Sus días hábiles salen del mantenedor de Feriados.</w:t>
+            </w:r>
+          </w:p>
+        </w:tc>
+        <w:tc>
+          <w:tcPr>
+            <w:tcW w:type="dxa" w:w="1701"/>
+          </w:tcPr>
+          <w:p>
+            <w:r/>
+            <w:r>
+              <w:rPr>
+                <w:sz w:val="18"/>
+              </w:rPr>
+              <w:t>rh_fichas.jornada_*</w:t>
+            </w:r>
+          </w:p>
+        </w:tc>
+      </w:tr>
+      <w:tr>
+        <w:tc>
+          <w:tcPr>
+            <w:tcW w:type="dxa" w:w="1814"/>
+          </w:tcPr>
+          <w:p>
+            <w:r/>
+            <w:r>
+              <w:rPr>
+                <w:sz w:val="18"/>
+              </w:rPr>
+              <w:t>Día con marca</w:t>
+            </w:r>
+          </w:p>
+        </w:tc>
+        <w:tc>
+          <w:tcPr>
+            <w:tcW w:type="dxa" w:w="5839"/>
+          </w:tcPr>
+          <w:p>
+            <w:r/>
+            <w:r>
+              <w:rPr>
+                <w:sz w:val="18"/>
+              </w:rPr>
+              <w:t>primera entrada y última salida del día (todas las marcas del RUT en la fecha).</w:t>
+            </w:r>
+          </w:p>
+        </w:tc>
+        <w:tc>
+          <w:tcPr>
+            <w:tcW w:type="dxa" w:w="1701"/>
+          </w:tcPr>
+          <w:p>
+            <w:r/>
+            <w:r>
+              <w:rPr>
+                <w:sz w:val="18"/>
+              </w:rPr>
+              <w:t>rh_workera_marcas</w:t>
+            </w:r>
+          </w:p>
+        </w:tc>
+      </w:tr>
+      <w:tr>
+        <w:tc>
+          <w:tcPr>
+            <w:tcW w:type="dxa" w:w="1814"/>
+          </w:tcPr>
+          <w:p>
+            <w:r/>
+            <w:r>
+              <w:rPr>
+                <w:sz w:val="18"/>
+              </w:rPr>
+              <w:t>Día cubierto</w:t>
+            </w:r>
+          </w:p>
+        </w:tc>
+        <w:tc>
+          <w:tcPr>
+            <w:tcW w:type="dxa" w:w="5839"/>
+          </w:tcPr>
+          <w:p>
+            <w:r/>
+            <w:r>
+              <w:rPr>
+                <w:sz w:val="18"/>
+              </w:rPr>
+              <w:t>día hábil con vacación aprobada, licencia, permiso o ausencia registrada en el sistema que lo cubre.</w:t>
+            </w:r>
+          </w:p>
+        </w:tc>
+        <w:tc>
+          <w:tcPr>
+            <w:tcW w:type="dxa" w:w="1701"/>
+          </w:tcPr>
+          <w:p>
+            <w:r/>
+            <w:r>
+              <w:rPr>
+                <w:sz w:val="18"/>
+              </w:rPr>
+              <w:t>rh_vacaciones · rh_ausencias</w:t>
+            </w:r>
+          </w:p>
+        </w:tc>
+      </w:tr>
+      <w:tr>
+        <w:tc>
+          <w:tcPr>
+            <w:tcW w:type="dxa" w:w="1814"/>
+          </w:tcPr>
+          <w:p>
+            <w:r/>
+            <w:r>
+              <w:rPr>
+                <w:sz w:val="18"/>
+              </w:rPr>
+              <w:t>Posible falta</w:t>
+            </w:r>
+          </w:p>
+        </w:tc>
+        <w:tc>
+          <w:tcPr>
+            <w:tcW w:type="dxa" w:w="5839"/>
+          </w:tcPr>
+          <w:p>
+            <w:r/>
+            <w:r>
+              <w:rPr>
+                <w:sz w:val="18"/>
+              </w:rPr>
+              <w:t>día hábil ya transcurrido, de quien debe marcar, sin marca y sin cobertura. Es una hipótesis para verificar, no un descuento.</w:t>
+            </w:r>
+          </w:p>
+        </w:tc>
+        <w:tc>
+          <w:tcPr>
+            <w:tcW w:type="dxa" w:w="1701"/>
+          </w:tcPr>
+          <w:p>
+            <w:r/>
+            <w:r>
+              <w:rPr>
+                <w:sz w:val="18"/>
+              </w:rPr>
+              <w:t>pestaña Ausencias</w:t>
+            </w:r>
+          </w:p>
+        </w:tc>
+      </w:tr>
+      <w:tr>
+        <w:tc>
+          <w:tcPr>
+            <w:tcW w:type="dxa" w:w="1814"/>
+          </w:tcPr>
+          <w:p>
+            <w:r/>
+            <w:r>
+              <w:rPr>
+                <w:sz w:val="18"/>
+              </w:rPr>
+              <w:t>Atraso</w:t>
+            </w:r>
+          </w:p>
+        </w:tc>
+        <w:tc>
+          <w:tcPr>
+            <w:tcW w:type="dxa" w:w="5839"/>
+          </w:tcPr>
+          <w:p>
+            <w:r/>
+            <w:r>
+              <w:rPr>
+                <w:sz w:val="18"/>
+              </w:rPr>
+              <w:t>minutos entre la primera marca del día y la hora de inicio del turno asignado en Workera ese día, menos la tolerancia; si el día no tiene turno se usa la hora de entrada de referencia. Se muestran total de atrasos y minutos acumulados por persona.</w:t>
+            </w:r>
+          </w:p>
+        </w:tc>
+        <w:tc>
+          <w:tcPr>
+            <w:tcW w:type="dxa" w:w="1701"/>
+          </w:tcPr>
+          <w:p>
+            <w:r/>
+            <w:r>
+              <w:rPr>
+                <w:sz w:val="18"/>
+              </w:rPr>
+              <w:t>asistencia_tolerancia_min 5 · asistencia_hora_entrada 09:00</w:t>
+            </w:r>
+          </w:p>
+        </w:tc>
+      </w:tr>
+      <w:tr>
+        <w:tc>
+          <w:tcPr>
+            <w:tcW w:type="dxa" w:w="1814"/>
+          </w:tcPr>
+          <w:p>
+            <w:r/>
+            <w:r>
+              <w:rPr>
+                <w:sz w:val="18"/>
+              </w:rPr>
+              <w:t>No enrolado</w:t>
+            </w:r>
+          </w:p>
+        </w:tc>
+        <w:tc>
+          <w:tcPr>
+            <w:tcW w:type="dxa" w:w="5839"/>
+          </w:tcPr>
+          <w:p>
+            <w:r/>
+            <w:r>
+              <w:rPr>
+                <w:sz w:val="18"/>
+              </w:rPr>
+              <w:t>debe marcar según Jornada pero no existe en employee de Workera (crear y enrolar huella/rostro en el panel de Workera). Tener ficha sin marcas NO es no enrolado.</w:t>
+            </w:r>
+          </w:p>
+        </w:tc>
+        <w:tc>
+          <w:tcPr>
+            <w:tcW w:type="dxa" w:w="1701"/>
+          </w:tcPr>
+          <w:p>
+            <w:r/>
+            <w:r>
+              <w:rPr>
+                <w:sz w:val="18"/>
+              </w:rPr>
+              <w:t>pestaña No enrolados</w:t>
+            </w:r>
+          </w:p>
+        </w:tc>
+      </w:tr>
+      <w:tr>
+        <w:tc>
+          <w:tcPr>
+            <w:tcW w:type="dxa" w:w="1814"/>
+          </w:tcPr>
+          <w:p>
+            <w:r/>
+            <w:r>
+              <w:rPr>
+                <w:sz w:val="18"/>
+              </w:rPr>
+              <w:t>Espejo de permisos</w:t>
+            </w:r>
+          </w:p>
+        </w:tc>
+        <w:tc>
+          <w:tcPr>
+            <w:tcW w:type="dxa" w:w="5839"/>
+          </w:tcPr>
+          <w:p>
+            <w:r/>
+            <w:r>
+              <w:rPr>
+                <w:sz w:val="18"/>
+              </w:rPr>
+              <w:t>al aprobarse una vacación, licencia o permiso, se crea la salida especial equivalente en Workera (POST permission con el código del tipo) y se guarda su id en la fila (workera_permiso_id) para eliminarla si se anula. Solo se espejan los tipos con código en el panel de Workera; las ausencias injustificadas no se espejan.</w:t>
+            </w:r>
+          </w:p>
+        </w:tc>
+        <w:tc>
+          <w:tcPr>
+            <w:tcW w:type="dxa" w:w="1701"/>
+          </w:tcPr>
+          <w:p>
+            <w:r/>
+            <w:r>
+              <w:rPr>
+                <w:sz w:val="18"/>
+              </w:rPr>
+              <w:t>workera_permiso_vacaciones / _licencia / _singoce P01 / _congoce 001 / _otros</w:t>
+            </w:r>
+          </w:p>
+        </w:tc>
+      </w:tr>
+      <w:tr>
+        <w:tc>
+          <w:tcPr>
+            <w:tcW w:type="dxa" w:w="1814"/>
+          </w:tcPr>
+          <w:p>
+            <w:r/>
+            <w:r>
+              <w:rPr>
+                <w:sz w:val="18"/>
+              </w:rPr>
+              <w:t>Turnos</w:t>
+            </w:r>
+          </w:p>
+        </w:tc>
+        <w:tc>
+          <w:tcPr>
+            <w:tcW w:type="dxa" w:w="5839"/>
+          </w:tcPr>
+          <w:p>
+            <w:r/>
+            <w:r>
+              <w:rPr>
+                <w:sz w:val="18"/>
+              </w:rPr>
+              <w:t>los turnos y el enrolamiento se administran en el panel de Workera; el sistema los lee para los atrasos. El Calendario de turnos de la Suite (Jornada → Turnos) es el documento para el colaborador, no reemplaza la asignación en Workera.</w:t>
+            </w:r>
+          </w:p>
+        </w:tc>
+        <w:tc>
+          <w:tcPr>
+            <w:tcW w:type="dxa" w:w="1701"/>
+          </w:tcPr>
+          <w:p>
+            <w:r/>
+            <w:r>
+              <w:rPr>
+                <w:sz w:val="18"/>
+              </w:rPr>
+              <w:t>rh_turno_calendario</w:t>
+            </w:r>
+          </w:p>
+        </w:tc>
+      </w:tr>
+    </w:tbl>
+    <w:p>
+      <w:pPr>
+        <w:spacing w:after="40"/>
+      </w:pPr>
+    </w:p>
+    <w:p>
+      <w:pPr>
+        <w:spacing w:after="40"/>
+      </w:pPr>
+      <w:r>
+        <w:rPr>
+          <w:b/>
+          <w:i w:val="0"/>
+          <w:color w:val="1F4E79"/>
+        </w:rPr>
+        <w:t>Ejemplo (semana del 7 al 11 de septiembre 2026, tolerancia 5 min)</w:t>
+      </w:r>
+    </w:p>
+    <w:tbl>
+      <w:tblPr>
+        <w:tblStyle w:val="TableGrid"/>
+        <w:tblW w:type="auto" w:w="0"/>
+        <w:jc w:val="center"/>
+        <w:tblLook w:firstColumn="1" w:firstRow="1" w:lastColumn="0" w:lastRow="0" w:noHBand="0" w:noVBand="1" w:val="04A0"/>
+      </w:tblPr>
+      <w:tblGrid>
+        <w:gridCol w:w="2436"/>
+        <w:gridCol w:w="2436"/>
+        <w:gridCol w:w="2436"/>
+        <w:gridCol w:w="2436"/>
+      </w:tblGrid>
+      <w:tr>
+        <w:tc>
+          <w:tcPr>
+            <w:tcW w:type="dxa" w:w="907"/>
+            <w:shd w:val="clear" w:color="auto" w:fill="1F4E79"/>
+          </w:tcPr>
+          <w:p>
+            <w:r/>
+            <w:r>
+              <w:rPr>
+                <w:b/>
+                <w:color w:val="FFFFFF"/>
+                <w:sz w:val="18"/>
+              </w:rPr>
+              <w:t>Día</w:t>
+            </w:r>
+          </w:p>
+        </w:tc>
+        <w:tc>
+          <w:tcPr>
+            <w:tcW w:type="dxa" w:w="2608"/>
+            <w:shd w:val="clear" w:color="auto" w:fill="1F4E79"/>
+          </w:tcPr>
+          <w:p>
+            <w:r/>
+            <w:r>
+              <w:rPr>
+                <w:b/>
+                <w:color w:val="FFFFFF"/>
+                <w:sz w:val="18"/>
+              </w:rPr>
+              <w:t>Marcas en Workera</w:t>
+            </w:r>
+          </w:p>
+        </w:tc>
+        <w:tc>
+          <w:tcPr>
+            <w:tcW w:type="dxa" w:w="2494"/>
+            <w:shd w:val="clear" w:color="auto" w:fill="1F4E79"/>
+          </w:tcPr>
+          <w:p>
+            <w:r/>
+            <w:r>
+              <w:rPr>
+                <w:b/>
+                <w:color w:val="FFFFFF"/>
+                <w:sz w:val="18"/>
+              </w:rPr>
+              <w:t>Sistema</w:t>
+            </w:r>
+          </w:p>
+        </w:tc>
+        <w:tc>
+          <w:tcPr>
+            <w:tcW w:type="dxa" w:w="3345"/>
+            <w:shd w:val="clear" w:color="auto" w:fill="1F4E79"/>
+          </w:tcPr>
+          <w:p>
+            <w:r/>
+            <w:r>
+              <w:rPr>
+                <w:b/>
+                <w:color w:val="FFFFFF"/>
+                <w:sz w:val="18"/>
+              </w:rPr>
+              <w:t>Resultado</w:t>
+            </w:r>
+          </w:p>
+        </w:tc>
+      </w:tr>
+      <w:tr>
+        <w:tc>
+          <w:tcPr>
+            <w:tcW w:type="dxa" w:w="907"/>
+          </w:tcPr>
+          <w:p>
+            <w:r/>
+            <w:r>
+              <w:rPr>
+                <w:sz w:val="18"/>
+              </w:rPr>
+              <w:t>Lun 7</w:t>
+            </w:r>
+          </w:p>
+        </w:tc>
+        <w:tc>
+          <w:tcPr>
+            <w:tcW w:type="dxa" w:w="2608"/>
+          </w:tcPr>
+          <w:p>
+            <w:r/>
+            <w:r>
+              <w:rPr>
+                <w:sz w:val="18"/>
+              </w:rPr>
+              <w:t>09:03 – 18:10; turno 09:00</w:t>
+            </w:r>
+          </w:p>
+        </w:tc>
+        <w:tc>
+          <w:tcPr>
+            <w:tcW w:type="dxa" w:w="2494"/>
+          </w:tcPr>
+          <w:p>
+            <w:r/>
+            <w:r>
+              <w:rPr>
+                <w:sz w:val="18"/>
+              </w:rPr>
+              <w:t>—</w:t>
+            </w:r>
+          </w:p>
+        </w:tc>
+        <w:tc>
+          <w:tcPr>
+            <w:tcW w:type="dxa" w:w="3345"/>
+          </w:tcPr>
+          <w:p>
+            <w:r/>
+            <w:r>
+              <w:rPr>
+                <w:sz w:val="18"/>
+              </w:rPr>
+              <w:t>con marca; 3 min &lt; tolerancia → sin atraso</w:t>
+            </w:r>
+          </w:p>
+        </w:tc>
+      </w:tr>
+      <w:tr>
+        <w:tc>
+          <w:tcPr>
+            <w:tcW w:type="dxa" w:w="907"/>
+          </w:tcPr>
+          <w:p>
+            <w:r/>
+            <w:r>
+              <w:rPr>
+                <w:sz w:val="18"/>
+              </w:rPr>
+              <w:t>Mar 8</w:t>
+            </w:r>
+          </w:p>
+        </w:tc>
+        <w:tc>
+          <w:tcPr>
+            <w:tcW w:type="dxa" w:w="2608"/>
+          </w:tcPr>
+          <w:p>
+            <w:r/>
+            <w:r>
+              <w:rPr>
+                <w:sz w:val="18"/>
+              </w:rPr>
+              <w:t>09:22 – 18:05; turno 09:00</w:t>
+            </w:r>
+          </w:p>
+        </w:tc>
+        <w:tc>
+          <w:tcPr>
+            <w:tcW w:type="dxa" w:w="2494"/>
+          </w:tcPr>
+          <w:p>
+            <w:r/>
+            <w:r>
+              <w:rPr>
+                <w:sz w:val="18"/>
+              </w:rPr>
+              <w:t>—</w:t>
+            </w:r>
+          </w:p>
+        </w:tc>
+        <w:tc>
+          <w:tcPr>
+            <w:tcW w:type="dxa" w:w="3345"/>
+          </w:tcPr>
+          <w:p>
+            <w:r/>
+            <w:r>
+              <w:rPr>
+                <w:sz w:val="18"/>
+              </w:rPr>
+              <w:t>atraso de 17 min (22 − 5)</w:t>
+            </w:r>
+          </w:p>
+        </w:tc>
+      </w:tr>
+      <w:tr>
+        <w:tc>
+          <w:tcPr>
+            <w:tcW w:type="dxa" w:w="907"/>
+          </w:tcPr>
+          <w:p>
+            <w:r/>
+            <w:r>
+              <w:rPr>
+                <w:sz w:val="18"/>
+              </w:rPr>
+              <w:t>Mié 9</w:t>
+            </w:r>
+          </w:p>
+        </w:tc>
+        <w:tc>
+          <w:tcPr>
+            <w:tcW w:type="dxa" w:w="2608"/>
+          </w:tcPr>
+          <w:p>
+            <w:r/>
+            <w:r>
+              <w:rPr>
+                <w:sz w:val="18"/>
+              </w:rPr>
+              <w:t>sin marcas</w:t>
+            </w:r>
+          </w:p>
+        </w:tc>
+        <w:tc>
+          <w:tcPr>
+            <w:tcW w:type="dxa" w:w="2494"/>
+          </w:tcPr>
+          <w:p>
+            <w:r/>
+            <w:r>
+              <w:rPr>
+                <w:sz w:val="18"/>
+              </w:rPr>
+              <w:t>licencia médica 9–10 aprobada</w:t>
+            </w:r>
+          </w:p>
+        </w:tc>
+        <w:tc>
+          <w:tcPr>
+            <w:tcW w:type="dxa" w:w="3345"/>
+          </w:tcPr>
+          <w:p>
+            <w:r/>
+            <w:r>
+              <w:rPr>
+                <w:sz w:val="18"/>
+              </w:rPr>
+              <w:t>cubierto (y la licencia ya está espejada en Workera)</w:t>
+            </w:r>
+          </w:p>
+        </w:tc>
+      </w:tr>
+      <w:tr>
+        <w:tc>
+          <w:tcPr>
+            <w:tcW w:type="dxa" w:w="907"/>
+          </w:tcPr>
+          <w:p>
+            <w:r/>
+            <w:r>
+              <w:rPr>
+                <w:sz w:val="18"/>
+              </w:rPr>
+              <w:t>Jue 10</w:t>
+            </w:r>
+          </w:p>
+        </w:tc>
+        <w:tc>
+          <w:tcPr>
+            <w:tcW w:type="dxa" w:w="2608"/>
+          </w:tcPr>
+          <w:p>
+            <w:r/>
+            <w:r>
+              <w:rPr>
+                <w:sz w:val="18"/>
+              </w:rPr>
+              <w:t>sin marcas</w:t>
+            </w:r>
+          </w:p>
+        </w:tc>
+        <w:tc>
+          <w:tcPr>
+            <w:tcW w:type="dxa" w:w="2494"/>
+          </w:tcPr>
+          <w:p>
+            <w:r/>
+            <w:r>
+              <w:rPr>
+                <w:sz w:val="18"/>
+              </w:rPr>
+              <w:t>licencia médica 9–10</w:t>
+            </w:r>
+          </w:p>
+        </w:tc>
+        <w:tc>
+          <w:tcPr>
+            <w:tcW w:type="dxa" w:w="3345"/>
+          </w:tcPr>
+          <w:p>
+            <w:r/>
+            <w:r>
+              <w:rPr>
+                <w:sz w:val="18"/>
+              </w:rPr>
+              <w:t>cubierto</w:t>
+            </w:r>
+          </w:p>
+        </w:tc>
+      </w:tr>
+      <w:tr>
+        <w:tc>
+          <w:tcPr>
+            <w:tcW w:type="dxa" w:w="907"/>
+          </w:tcPr>
+          <w:p>
+            <w:r/>
+            <w:r>
+              <w:rPr>
+                <w:sz w:val="18"/>
+              </w:rPr>
+              <w:t>Vie 11</w:t>
+            </w:r>
+          </w:p>
+        </w:tc>
+        <w:tc>
+          <w:tcPr>
+            <w:tcW w:type="dxa" w:w="2608"/>
+          </w:tcPr>
+          <w:p>
+            <w:r/>
+            <w:r>
+              <w:rPr>
+                <w:sz w:val="18"/>
+              </w:rPr>
+              <w:t>sin marcas</w:t>
+            </w:r>
+          </w:p>
+        </w:tc>
+        <w:tc>
+          <w:tcPr>
+            <w:tcW w:type="dxa" w:w="2494"/>
+          </w:tcPr>
+          <w:p>
+            <w:r/>
+            <w:r>
+              <w:rPr>
+                <w:sz w:val="18"/>
+              </w:rPr>
+              <w:t>nada</w:t>
+            </w:r>
+          </w:p>
+        </w:tc>
+        <w:tc>
+          <w:tcPr>
+            <w:tcW w:type="dxa" w:w="3345"/>
+          </w:tcPr>
+          <w:p>
+            <w:r/>
+            <w:r>
+              <w:rPr>
+                <w:sz w:val="18"/>
+              </w:rPr>
+              <w:t>POSIBLE FALTA → RRHH confirma con la persona: registra ausencia injustificada (o permiso) o queda como día trabajado si hubo un problema del reloj</w:t>
+            </w:r>
+          </w:p>
+        </w:tc>
+      </w:tr>
+      <w:tr>
+        <w:tc>
+          <w:tcPr>
+            <w:tcW w:type="dxa" w:w="907"/>
+          </w:tcPr>
+          <w:p>
+            <w:r/>
+            <w:r>
+              <w:rPr>
+                <w:sz w:val="18"/>
+              </w:rPr>
+              <w:t>Resumen</w:t>
+            </w:r>
+          </w:p>
+        </w:tc>
+        <w:tc>
+          <w:tcPr>
+            <w:tcW w:type="dxa" w:w="2608"/>
+          </w:tcPr>
+          <w:p>
+            <w:r/>
+            <w:r>
+              <w:rPr>
+                <w:sz w:val="18"/>
+              </w:rPr>
+              <w:t>3 días con marca, 2 cubiertos, 1 posible falta, 17 min de atraso</w:t>
+            </w:r>
+          </w:p>
+        </w:tc>
+        <w:tc>
+          <w:tcPr>
+            <w:tcW w:type="dxa" w:w="2494"/>
+          </w:tcPr>
+          <w:p>
+            <w:r/>
+            <w:r>
+              <w:rPr>
+                <w:sz w:val="18"/>
+              </w:rPr>
+            </w:r>
+          </w:p>
+        </w:tc>
+        <w:tc>
+          <w:tcPr>
+            <w:tcW w:type="dxa" w:w="3345"/>
+          </w:tcPr>
+          <w:p>
+            <w:r/>
+            <w:r>
+              <w:rPr>
+                <w:sz w:val="18"/>
+              </w:rPr>
+              <w:t>antes de emitir remuneraciones</w:t>
+            </w:r>
+          </w:p>
+        </w:tc>
+      </w:tr>
+    </w:tbl>
+    <w:p>
+      <w:pPr>
+        <w:spacing w:after="40"/>
+      </w:pPr>
+    </w:p>
+    <w:tbl>
+      <w:tblPr>
+        <w:tblStyle w:val="TableGrid"/>
+        <w:tblW w:type="auto" w:w="0"/>
+        <w:tblLook w:firstColumn="1" w:firstRow="1" w:lastColumn="0" w:lastRow="0" w:noHBand="0" w:noVBand="1" w:val="04A0"/>
+      </w:tblPr>
+      <w:tblGrid>
+        <w:gridCol w:w="9746"/>
+      </w:tblGrid>
+      <w:tr>
+        <w:tc>
+          <w:tcPr>
+            <w:tcW w:type="dxa" w:w="9746"/>
+            <w:shd w:val="clear" w:color="auto" w:fill="FFF4CE"/>
+          </w:tcPr>
+          <w:p>
+            <w:r/>
+            <w:r>
+              <w:rPr>
+                <w:b/>
+                <w:sz w:val="19"/>
+              </w:rPr>
+              <w:t>⚠ OJO</w:t>
+              <w:br/>
+            </w:r>
+            <w:r>
+              <w:rPr>
+                <w:sz w:val="19"/>
+              </w:rPr>
+              <w:t>La API de Workera es lenta (minutos si se trae todo en serie): por eso existe el caché. Si un día aparece sin marcas para todo el equipo, primero revisar que el reloj sincronizó (los últimos 3 días se vuelven a pedir solos) antes de registrar ausencias. Nunca descontar en Remuneraciones desde la pestaña Ausencias sin haber confirmado con la persona.</w:t>
+            </w:r>
+          </w:p>
+        </w:tc>
+      </w:tr>
+    </w:tbl>
+    <w:p>
+      <w:pPr>
+        <w:spacing w:after="40"/>
+      </w:pPr>
+    </w:p>
+    <w:p>
+      <w:pPr>
         <w:spacing w:after="160"/>
         <w:jc w:val="center"/>
       </w:pPr>
@@ -8539,6 +9705,969 @@
       <w:r>
         <w:t>solo efecto en la liquidación (días trabajados) y en la nómina Edenred del mes siguiente.</w:t>
       </w:r>
+    </w:p>
+    <w:p>
+      <w:pPr>
+        <w:pStyle w:val="Heading3"/>
+      </w:pPr>
+      <w:r>
+        <w:t>10.1 Reglas y cálculo de licencias, permisos y ausencias</w:t>
+      </w:r>
+    </w:p>
+    <w:p>
+      <w:pPr>
+        <w:spacing w:after="80"/>
+      </w:pPr>
+      <w:r>
+        <w:rPr>
+          <w:b w:val="0"/>
+          <w:i w:val="0"/>
+        </w:rPr>
+        <w:t>Todo vive en rh_ausencias (tipo, fechas inclusive, medio día, días hábiles, adjunto, estado). Los tipos son paramétricos (rh_config.ausencia_tipos): LICENCIA MEDICA, PERMISO CON GOCE, PERMISO SIN GOCE, DIA ADMINISTRATIVO, TRAMITE, NACIMIENTO/MATRIMONIO/DUELO, OTRO, más AUSENCIA INJUSTIFICADA (la registra RRHH o la jefatura).</w:t>
+      </w:r>
+    </w:p>
+    <w:tbl>
+      <w:tblPr>
+        <w:tblStyle w:val="TableGrid"/>
+        <w:tblW w:type="auto" w:w="0"/>
+        <w:jc w:val="center"/>
+        <w:tblLook w:firstColumn="1" w:firstRow="1" w:lastColumn="0" w:lastRow="0" w:noHBand="0" w:noVBand="1" w:val="04A0"/>
+      </w:tblPr>
+      <w:tblGrid>
+        <w:gridCol w:w="3249"/>
+        <w:gridCol w:w="3249"/>
+        <w:gridCol w:w="3249"/>
+      </w:tblGrid>
+      <w:tr>
+        <w:tc>
+          <w:tcPr>
+            <w:tcW w:type="dxa" w:w="1928"/>
+            <w:shd w:val="clear" w:color="auto" w:fill="1F4E79"/>
+          </w:tcPr>
+          <w:p>
+            <w:r/>
+            <w:r>
+              <w:rPr>
+                <w:b/>
+                <w:color w:val="FFFFFF"/>
+                <w:sz w:val="18"/>
+              </w:rPr>
+              <w:t>Concepto</w:t>
+            </w:r>
+          </w:p>
+        </w:tc>
+        <w:tc>
+          <w:tcPr>
+            <w:tcW w:type="dxa" w:w="5556"/>
+            <w:shd w:val="clear" w:color="auto" w:fill="1F4E79"/>
+          </w:tcPr>
+          <w:p>
+            <w:r/>
+            <w:r>
+              <w:rPr>
+                <w:b/>
+                <w:color w:val="FFFFFF"/>
+                <w:sz w:val="18"/>
+              </w:rPr>
+              <w:t>Regla / fórmula</w:t>
+            </w:r>
+          </w:p>
+        </w:tc>
+        <w:tc>
+          <w:tcPr>
+            <w:tcW w:type="dxa" w:w="1871"/>
+            <w:shd w:val="clear" w:color="auto" w:fill="1F4E79"/>
+          </w:tcPr>
+          <w:p>
+            <w:r/>
+            <w:r>
+              <w:rPr>
+                <w:b/>
+                <w:color w:val="FFFFFF"/>
+                <w:sz w:val="18"/>
+              </w:rPr>
+              <w:t>Dónde</w:t>
+            </w:r>
+          </w:p>
+        </w:tc>
+      </w:tr>
+      <w:tr>
+        <w:tc>
+          <w:tcPr>
+            <w:tcW w:type="dxa" w:w="1928"/>
+          </w:tcPr>
+          <w:p>
+            <w:r/>
+            <w:r>
+              <w:rPr>
+                <w:sz w:val="18"/>
+              </w:rPr>
+              <w:t>Días hábiles del registro</w:t>
+            </w:r>
+          </w:p>
+        </w:tc>
+        <w:tc>
+          <w:tcPr>
+            <w:tcW w:type="dxa" w:w="5556"/>
+          </w:tcPr>
+          <w:p>
+            <w:r/>
+            <w:r>
+              <w:rPr>
+                <w:sz w:val="18"/>
+              </w:rPr>
+              <w:t>lunes a viernes sin feriados entre desde y hasta (motor único shared/feriados, el mismo de vacaciones); medio día = 0,5. Es lo que se informa y lo que descuenta Edenred.</w:t>
+            </w:r>
+          </w:p>
+        </w:tc>
+        <w:tc>
+          <w:tcPr>
+            <w:tcW w:type="dxa" w:w="1871"/>
+          </w:tcPr>
+          <w:p>
+            <w:r/>
+            <w:r>
+              <w:rPr>
+                <w:sz w:val="18"/>
+              </w:rPr>
+              <w:t>dias_habiles</w:t>
+            </w:r>
+          </w:p>
+        </w:tc>
+      </w:tr>
+      <w:tr>
+        <w:tc>
+          <w:tcPr>
+            <w:tcW w:type="dxa" w:w="1928"/>
+          </w:tcPr>
+          <w:p>
+            <w:r/>
+            <w:r>
+              <w:rPr>
+                <w:sz w:val="18"/>
+              </w:rPr>
+              <w:t>Quién aprueba</w:t>
+            </w:r>
+          </w:p>
+        </w:tc>
+        <w:tc>
+          <w:tcPr>
+            <w:tcW w:type="dxa" w:w="5556"/>
+          </w:tcPr>
+          <w:p>
+            <w:r/>
+            <w:r>
+              <w:rPr>
+                <w:sz w:val="18"/>
+              </w:rPr>
+              <w:t>permisos: la jefatura directa (id_supervisor) o RRHH (rh_aprobar); nadie se aprueba a sí mismo. Licencias y ausencias injustificadas quedan APROBADAS al registrarse (no hay flujo).</w:t>
+            </w:r>
+          </w:p>
+        </w:tc>
+        <w:tc>
+          <w:tcPr>
+            <w:tcW w:type="dxa" w:w="1871"/>
+          </w:tcPr>
+          <w:p>
+            <w:r/>
+            <w:r>
+              <w:rPr>
+                <w:sz w:val="18"/>
+              </w:rPr>
+              <w:t>estado</w:t>
+            </w:r>
+          </w:p>
+        </w:tc>
+      </w:tr>
+      <w:tr>
+        <w:tc>
+          <w:tcPr>
+            <w:tcW w:type="dxa" w:w="1928"/>
+          </w:tcPr>
+          <w:p>
+            <w:r/>
+            <w:r>
+              <w:rPr>
+                <w:sz w:val="18"/>
+              </w:rPr>
+              <w:t>Se pagan</w:t>
+            </w:r>
+          </w:p>
+        </w:tc>
+        <w:tc>
+          <w:tcPr>
+            <w:tcW w:type="dxa" w:w="5556"/>
+          </w:tcPr>
+          <w:p>
+            <w:r/>
+            <w:r>
+              <w:rPr>
+                <w:sz w:val="18"/>
+              </w:rPr>
+              <w:t>PERMISO CON GOCE, DIA ADMINISTRATIVO, TRAMITE, NACIMIENTO/MATRIMONIO/DUELO, OTRO y las vacaciones: no tocan la liquidación.</w:t>
+            </w:r>
+          </w:p>
+        </w:tc>
+        <w:tc>
+          <w:tcPr>
+            <w:tcW w:type="dxa" w:w="1871"/>
+          </w:tcPr>
+          <w:p>
+            <w:r/>
+            <w:r>
+              <w:rPr>
+                <w:sz w:val="18"/>
+              </w:rPr>
+              <w:t>cap. 15.1</w:t>
+            </w:r>
+          </w:p>
+        </w:tc>
+      </w:tr>
+      <w:tr>
+        <w:tc>
+          <w:tcPr>
+            <w:tcW w:type="dxa" w:w="1928"/>
+          </w:tcPr>
+          <w:p>
+            <w:r/>
+            <w:r>
+              <w:rPr>
+                <w:sz w:val="18"/>
+              </w:rPr>
+              <w:t>Descuentan días trabajados</w:t>
+            </w:r>
+          </w:p>
+        </w:tc>
+        <w:tc>
+          <w:tcPr>
+            <w:tcW w:type="dxa" w:w="5556"/>
+          </w:tcPr>
+          <w:p>
+            <w:r/>
+            <w:r>
+              <w:rPr>
+                <w:sz w:val="18"/>
+              </w:rPr>
+              <w:t>LICENCIA MEDICA, PERMISO SIN GOCE y AUSENCIA INJUSTIFICADA: días pagados = 30 − días CORRIDOS de esas ausencias dentro del mes (el día 31 no cuenta; una licencia que cruza el fin de semana descuenta también sábado y domingo). Sueldo, colación y movilización × días/30; los topes de gratificación y cotización también se prorratean.</w:t>
+            </w:r>
+          </w:p>
+        </w:tc>
+        <w:tc>
+          <w:tcPr>
+            <w:tcW w:type="dxa" w:w="1871"/>
+          </w:tcPr>
+          <w:p>
+            <w:r/>
+            <w:r>
+              <w:rPr>
+                <w:sz w:val="18"/>
+              </w:rPr>
+              <w:t>licenciasDelMes · calcLiquidacion</w:t>
+            </w:r>
+          </w:p>
+        </w:tc>
+      </w:tr>
+      <w:tr>
+        <w:tc>
+          <w:tcPr>
+            <w:tcW w:type="dxa" w:w="1928"/>
+          </w:tcPr>
+          <w:p>
+            <w:r/>
+            <w:r>
+              <w:rPr>
+                <w:sz w:val="18"/>
+              </w:rPr>
+              <w:t>Licencia médica</w:t>
+            </w:r>
+          </w:p>
+        </w:tc>
+        <w:tc>
+          <w:tcPr>
+            <w:tcW w:type="dxa" w:w="5556"/>
+          </w:tcPr>
+          <w:p>
+            <w:r/>
+            <w:r>
+              <w:rPr>
+                <w:sz w:val="18"/>
+              </w:rPr>
+              <w:t>la paga el subsidio (Isapre/Fonasa/COMPIN), no la empresa: por eso descuenta días. RRHH registra colaborador, inicio y término, adjunto opcional; correo al supervisor; espejo a Workera; Back Up activado el primer día y desactivado al día siguiente del último; Previred la informa como movimiento 3 (subsidio) con sus fechas.</w:t>
+            </w:r>
+          </w:p>
+        </w:tc>
+        <w:tc>
+          <w:tcPr>
+            <w:tcW w:type="dxa" w:w="1871"/>
+          </w:tcPr>
+          <w:p>
+            <w:r/>
+            <w:r>
+              <w:rPr>
+                <w:sz w:val="18"/>
+              </w:rPr>
+              <w:t>Licencias Médicas</w:t>
+            </w:r>
+          </w:p>
+        </w:tc>
+      </w:tr>
+      <w:tr>
+        <w:tc>
+          <w:tcPr>
+            <w:tcW w:type="dxa" w:w="1928"/>
+          </w:tcPr>
+          <w:p>
+            <w:r/>
+            <w:r>
+              <w:rPr>
+                <w:sz w:val="18"/>
+              </w:rPr>
+              <w:t>Licencia y Edenred</w:t>
+            </w:r>
+          </w:p>
+        </w:tc>
+        <w:tc>
+          <w:tcPr>
+            <w:tcW w:type="dxa" w:w="5556"/>
+          </w:tcPr>
+          <w:p>
+            <w:r/>
+            <w:r>
+              <w:rPr>
+                <w:sz w:val="18"/>
+              </w:rPr>
+              <w:t>los días hábiles de la licencia se restan en la nómina Edenred del mes SIGUIENTE (cap. 17).</w:t>
+            </w:r>
+          </w:p>
+        </w:tc>
+        <w:tc>
+          <w:tcPr>
+            <w:tcW w:type="dxa" w:w="1871"/>
+          </w:tcPr>
+          <w:p>
+            <w:r/>
+            <w:r>
+              <w:rPr>
+                <w:sz w:val="18"/>
+              </w:rPr>
+              <w:t>tipos_descuento</w:t>
+            </w:r>
+          </w:p>
+        </w:tc>
+      </w:tr>
+      <w:tr>
+        <w:tc>
+          <w:tcPr>
+            <w:tcW w:type="dxa" w:w="1928"/>
+          </w:tcPr>
+          <w:p>
+            <w:r/>
+            <w:r>
+              <w:rPr>
+                <w:sz w:val="18"/>
+              </w:rPr>
+              <w:t>Licencia y vacaciones</w:t>
+            </w:r>
+          </w:p>
+        </w:tc>
+        <w:tc>
+          <w:tcPr>
+            <w:tcW w:type="dxa" w:w="5556"/>
+          </w:tcPr>
+          <w:p>
+            <w:r/>
+            <w:r>
+              <w:rPr>
+                <w:sz w:val="18"/>
+              </w:rPr>
+              <w:t>los meses con licencia no cuentan como meses trabajados en la base del finiquito (art. 71, ORD. 2994/171); el devengo de vacaciones no se detiene.</w:t>
+            </w:r>
+          </w:p>
+        </w:tc>
+        <w:tc>
+          <w:tcPr>
+            <w:tcW w:type="dxa" w:w="1871"/>
+          </w:tcPr>
+          <w:p>
+            <w:r/>
+            <w:r>
+              <w:rPr>
+                <w:sz w:val="18"/>
+              </w:rPr>
+              <w:t>cap. 25.1</w:t>
+            </w:r>
+          </w:p>
+        </w:tc>
+      </w:tr>
+      <w:tr>
+        <w:tc>
+          <w:tcPr>
+            <w:tcW w:type="dxa" w:w="1928"/>
+          </w:tcPr>
+          <w:p>
+            <w:r/>
+            <w:r>
+              <w:rPr>
+                <w:sz w:val="18"/>
+              </w:rPr>
+              <w:t>Ausencia injustificada</w:t>
+            </w:r>
+          </w:p>
+        </w:tc>
+        <w:tc>
+          <w:tcPr>
+            <w:tcW w:type="dxa" w:w="5556"/>
+          </w:tcPr>
+          <w:p>
+            <w:r/>
+            <w:r>
+              <w:rPr>
+                <w:sz w:val="18"/>
+              </w:rPr>
+              <w:t>la registra RRHH o la jefatura directa; descuenta 30avos y Edenred; no se espeja a Workera; al guardarla el sistema evalúa el art. 160 N°3.</w:t>
+            </w:r>
+          </w:p>
+        </w:tc>
+        <w:tc>
+          <w:tcPr>
+            <w:tcW w:type="dxa" w:w="1871"/>
+          </w:tcPr>
+          <w:p>
+            <w:r/>
+            <w:r>
+              <w:rPr>
+                <w:sz w:val="18"/>
+              </w:rPr>
+              <w:t>evaluarArt160</w:t>
+            </w:r>
+          </w:p>
+        </w:tc>
+      </w:tr>
+      <w:tr>
+        <w:tc>
+          <w:tcPr>
+            <w:tcW w:type="dxa" w:w="1928"/>
+          </w:tcPr>
+          <w:p>
+            <w:r/>
+            <w:r>
+              <w:rPr>
+                <w:sz w:val="18"/>
+              </w:rPr>
+              <w:t>Art. 160 N°3 (automático)</w:t>
+            </w:r>
+          </w:p>
+        </w:tc>
+        <w:tc>
+          <w:tcPr>
+            <w:tcW w:type="dxa" w:w="5556"/>
+          </w:tcPr>
+          <w:p>
+            <w:r/>
+            <w:r>
+              <w:rPr>
+                <w:sz w:val="18"/>
+              </w:rPr>
+              <w:t>con las ausencias injustificadas APROBADAS del mes calendario: (a) dos días seguidos, (b) dos o más lunes, o (c) tres o más días en el mes → correo a RRHH con copia al supervisor + campana: se configura causal de despido sin indemnización. Es aviso: la decisión la toma Gerencia con asesoría legal.</w:t>
+            </w:r>
+          </w:p>
+        </w:tc>
+        <w:tc>
+          <w:tcPr>
+            <w:tcW w:type="dxa" w:w="1871"/>
+          </w:tcPr>
+          <w:p>
+            <w:r/>
+            <w:r>
+              <w:rPr>
+                <w:sz w:val="18"/>
+              </w:rPr>
+              <w:t>correo ⚠️ art. 160</w:t>
+            </w:r>
+          </w:p>
+        </w:tc>
+      </w:tr>
+      <w:tr>
+        <w:tc>
+          <w:tcPr>
+            <w:tcW w:type="dxa" w:w="1928"/>
+          </w:tcPr>
+          <w:p>
+            <w:r/>
+            <w:r>
+              <w:rPr>
+                <w:sz w:val="18"/>
+              </w:rPr>
+              <w:t>Permiso sin goce</w:t>
+            </w:r>
+          </w:p>
+        </w:tc>
+        <w:tc>
+          <w:tcPr>
+            <w:tcW w:type="dxa" w:w="5556"/>
+          </w:tcPr>
+          <w:p>
+            <w:r/>
+            <w:r>
+              <w:rPr>
+                <w:sz w:val="18"/>
+              </w:rPr>
+              <w:t>descuenta 30avos igual que la licencia; se espeja a Workera con el código P01.</w:t>
+            </w:r>
+          </w:p>
+        </w:tc>
+        <w:tc>
+          <w:tcPr>
+            <w:tcW w:type="dxa" w:w="1871"/>
+          </w:tcPr>
+          <w:p>
+            <w:r/>
+            <w:r>
+              <w:rPr>
+                <w:sz w:val="18"/>
+              </w:rPr>
+              <w:t>workera_permiso_singoce</w:t>
+            </w:r>
+          </w:p>
+        </w:tc>
+      </w:tr>
+      <w:tr>
+        <w:tc>
+          <w:tcPr>
+            <w:tcW w:type="dxa" w:w="1928"/>
+          </w:tcPr>
+          <w:p>
+            <w:r/>
+            <w:r>
+              <w:rPr>
+                <w:sz w:val="18"/>
+              </w:rPr>
+              <w:t>Resumen de licencias</w:t>
+            </w:r>
+          </w:p>
+        </w:tc>
+        <w:tc>
+          <w:tcPr>
+            <w:tcW w:type="dxa" w:w="5556"/>
+          </w:tcPr>
+          <w:p>
+            <w:r/>
+            <w:r>
+              <w:rPr>
+                <w:sz w:val="18"/>
+              </w:rPr>
+              <w:t>por mes de inicio (cantidad, personas, días hábiles), por persona (acumulado y última) y detalle exportable; una jefatura ve solo a su equipo. Alimenta el ausentismo de Indicadores RRHH.</w:t>
+            </w:r>
+          </w:p>
+        </w:tc>
+        <w:tc>
+          <w:tcPr>
+            <w:tcW w:type="dxa" w:w="1871"/>
+          </w:tcPr>
+          <w:p>
+            <w:r/>
+            <w:r>
+              <w:rPr>
+                <w:sz w:val="18"/>
+              </w:rPr>
+              <w:t>Licencias Médicas → Resumen</w:t>
+            </w:r>
+          </w:p>
+        </w:tc>
+      </w:tr>
+    </w:tbl>
+    <w:p>
+      <w:pPr>
+        <w:spacing w:after="40"/>
+      </w:pPr>
+    </w:p>
+    <w:p>
+      <w:pPr>
+        <w:spacing w:after="40"/>
+      </w:pPr>
+      <w:r>
+        <w:rPr>
+          <w:b/>
+          <w:i w:val="0"/>
+          <w:color w:val="1F4E79"/>
+        </w:rPr>
+        <w:t>Ejemplo numérico (septiembre 2026, sueldo base $900.000, colación $45.000, movilización $45.000, Asignación Celular $30.000)</w:t>
+      </w:r>
+    </w:p>
+    <w:tbl>
+      <w:tblPr>
+        <w:tblStyle w:val="TableGrid"/>
+        <w:tblW w:type="auto" w:w="0"/>
+        <w:jc w:val="center"/>
+        <w:tblLook w:firstColumn="1" w:firstRow="1" w:lastColumn="0" w:lastRow="0" w:noHBand="0" w:noVBand="1" w:val="04A0"/>
+      </w:tblPr>
+      <w:tblGrid>
+        <w:gridCol w:w="3249"/>
+        <w:gridCol w:w="3249"/>
+        <w:gridCol w:w="3249"/>
+      </w:tblGrid>
+      <w:tr>
+        <w:tc>
+          <w:tcPr>
+            <w:tcW w:type="dxa" w:w="2381"/>
+            <w:shd w:val="clear" w:color="auto" w:fill="1F4E79"/>
+          </w:tcPr>
+          <w:p>
+            <w:r/>
+            <w:r>
+              <w:rPr>
+                <w:b/>
+                <w:color w:val="FFFFFF"/>
+                <w:sz w:val="18"/>
+              </w:rPr>
+              <w:t>Caso</w:t>
+            </w:r>
+          </w:p>
+        </w:tc>
+        <w:tc>
+          <w:tcPr>
+            <w:tcW w:type="dxa" w:w="4706"/>
+            <w:shd w:val="clear" w:color="auto" w:fill="1F4E79"/>
+          </w:tcPr>
+          <w:p>
+            <w:r/>
+            <w:r>
+              <w:rPr>
+                <w:b/>
+                <w:color w:val="FFFFFF"/>
+                <w:sz w:val="18"/>
+              </w:rPr>
+              <w:t>Cálculo</w:t>
+            </w:r>
+          </w:p>
+        </w:tc>
+        <w:tc>
+          <w:tcPr>
+            <w:tcW w:type="dxa" w:w="2268"/>
+            <w:shd w:val="clear" w:color="auto" w:fill="1F4E79"/>
+          </w:tcPr>
+          <w:p>
+            <w:r/>
+            <w:r>
+              <w:rPr>
+                <w:b/>
+                <w:color w:val="FFFFFF"/>
+                <w:sz w:val="18"/>
+              </w:rPr>
+              <w:t>Efecto</w:t>
+            </w:r>
+          </w:p>
+        </w:tc>
+      </w:tr>
+      <w:tr>
+        <w:tc>
+          <w:tcPr>
+            <w:tcW w:type="dxa" w:w="2381"/>
+          </w:tcPr>
+          <w:p>
+            <w:r/>
+            <w:r>
+              <w:rPr>
+                <w:sz w:val="18"/>
+              </w:rPr>
+              <w:t>Licencia del jueves 10 al miércoles 16</w:t>
+            </w:r>
+          </w:p>
+        </w:tc>
+        <w:tc>
+          <w:tcPr>
+            <w:tcW w:type="dxa" w:w="4706"/>
+          </w:tcPr>
+          <w:p>
+            <w:r/>
+            <w:r>
+              <w:rPr>
+                <w:sz w:val="18"/>
+              </w:rPr>
+              <w:t>días hábiles: 5 (jue 10, vie 11, lun 14, mar 15, mié 16); días corridos en el mes: 7 (10 al 16, incluye sáb 12 y dom 13) → pagados 23/30</w:t>
+            </w:r>
+          </w:p>
+        </w:tc>
+        <w:tc>
+          <w:tcPr>
+            <w:tcW w:type="dxa" w:w="2268"/>
+          </w:tcPr>
+          <w:p>
+            <w:r/>
+            <w:r>
+              <w:rPr>
+                <w:sz w:val="18"/>
+              </w:rPr>
+              <w:t>sueldo 690.000 · colación 34.500 · movilización 34.500 · celular 30.000 (no se prorratea) · gratificación con tope × 23/30</w:t>
+            </w:r>
+          </w:p>
+        </w:tc>
+      </w:tr>
+      <w:tr>
+        <w:tc>
+          <w:tcPr>
+            <w:tcW w:type="dxa" w:w="2381"/>
+          </w:tcPr>
+          <w:p>
+            <w:r/>
+            <w:r>
+              <w:rPr>
+                <w:sz w:val="18"/>
+              </w:rPr>
+              <w:t>Edenred de octubre</w:t>
+            </w:r>
+          </w:p>
+        </w:tc>
+        <w:tc>
+          <w:tcPr>
+            <w:tcW w:type="dxa" w:w="4706"/>
+          </w:tcPr>
+          <w:p>
+            <w:r/>
+            <w:r>
+              <w:rPr>
+                <w:sz w:val="18"/>
+              </w:rPr>
+              <w:t>faltas de septiembre: 5 hábiles L-V (o los mismos 5 en L-S)</w:t>
+            </w:r>
+          </w:p>
+        </w:tc>
+        <w:tc>
+          <w:tcPr>
+            <w:tcW w:type="dxa" w:w="2268"/>
+          </w:tcPr>
+          <w:p>
+            <w:r/>
+            <w:r>
+              <w:rPr>
+                <w:sz w:val="18"/>
+              </w:rPr>
+              <w:t>−5 × 3.600 = −18.000</w:t>
+            </w:r>
+          </w:p>
+        </w:tc>
+      </w:tr>
+      <w:tr>
+        <w:tc>
+          <w:tcPr>
+            <w:tcW w:type="dxa" w:w="2381"/>
+          </w:tcPr>
+          <w:p>
+            <w:r/>
+            <w:r>
+              <w:rPr>
+                <w:sz w:val="18"/>
+              </w:rPr>
+              <w:t>Previred de septiembre</w:t>
+            </w:r>
+          </w:p>
+        </w:tc>
+        <w:tc>
+          <w:tcPr>
+            <w:tcW w:type="dxa" w:w="4706"/>
+          </w:tcPr>
+          <w:p>
+            <w:r/>
+            <w:r>
+              <w:rPr>
+                <w:sz w:val="18"/>
+              </w:rPr>
+              <w:t>movimiento 3 (subsidio) del 10-09 al 16-09</w:t>
+            </w:r>
+          </w:p>
+        </w:tc>
+        <w:tc>
+          <w:tcPr>
+            <w:tcW w:type="dxa" w:w="2268"/>
+          </w:tcPr>
+          <w:p>
+            <w:r/>
+            <w:r>
+              <w:rPr>
+                <w:sz w:val="18"/>
+              </w:rPr>
+              <w:t>archivo</w:t>
+            </w:r>
+          </w:p>
+        </w:tc>
+      </w:tr>
+      <w:tr>
+        <w:tc>
+          <w:tcPr>
+            <w:tcW w:type="dxa" w:w="2381"/>
+          </w:tcPr>
+          <w:p>
+            <w:r/>
+            <w:r>
+              <w:rPr>
+                <w:sz w:val="18"/>
+              </w:rPr>
+              <w:t>Back Up</w:t>
+            </w:r>
+          </w:p>
+        </w:tc>
+        <w:tc>
+          <w:tcPr>
+            <w:tcW w:type="dxa" w:w="4706"/>
+          </w:tcPr>
+          <w:p>
+            <w:r/>
+            <w:r>
+              <w:rPr>
+                <w:sz w:val="18"/>
+              </w:rPr>
+              <w:t>suplente activado el 10-09 a las 00:00, desactivado el 17-09</w:t>
+            </w:r>
+          </w:p>
+        </w:tc>
+        <w:tc>
+          <w:tcPr>
+            <w:tcW w:type="dxa" w:w="2268"/>
+          </w:tcPr>
+          <w:p>
+            <w:r/>
+            <w:r>
+              <w:rPr>
+                <w:sz w:val="18"/>
+              </w:rPr>
+              <w:t>correos a ambos</w:t>
+            </w:r>
+          </w:p>
+        </w:tc>
+      </w:tr>
+      <w:tr>
+        <w:tc>
+          <w:tcPr>
+            <w:tcW w:type="dxa" w:w="2381"/>
+          </w:tcPr>
+          <w:p>
+            <w:r/>
+            <w:r>
+              <w:rPr>
+                <w:sz w:val="18"/>
+              </w:rPr>
+              <w:t>Permiso con goce el lunes 21 (medio día)</w:t>
+            </w:r>
+          </w:p>
+        </w:tc>
+        <w:tc>
+          <w:tcPr>
+            <w:tcW w:type="dxa" w:w="4706"/>
+          </w:tcPr>
+          <w:p>
+            <w:r/>
+            <w:r>
+              <w:rPr>
+                <w:sz w:val="18"/>
+              </w:rPr>
+              <w:t>0,5 día hábil; no descuenta</w:t>
+            </w:r>
+          </w:p>
+        </w:tc>
+        <w:tc>
+          <w:tcPr>
+            <w:tcW w:type="dxa" w:w="2268"/>
+          </w:tcPr>
+          <w:p>
+            <w:r/>
+            <w:r>
+              <w:rPr>
+                <w:sz w:val="18"/>
+              </w:rPr>
+              <w:t>solo registro y Workera (001)</w:t>
+            </w:r>
+          </w:p>
+        </w:tc>
+      </w:tr>
+      <w:tr>
+        <w:tc>
+          <w:tcPr>
+            <w:tcW w:type="dxa" w:w="2381"/>
+          </w:tcPr>
+          <w:p>
+            <w:r/>
+            <w:r>
+              <w:rPr>
+                <w:sz w:val="18"/>
+              </w:rPr>
+              <w:t>Ausencias injustificadas: lunes 7 y lunes 28</w:t>
+            </w:r>
+          </w:p>
+        </w:tc>
+        <w:tc>
+          <w:tcPr>
+            <w:tcW w:type="dxa" w:w="4706"/>
+          </w:tcPr>
+          <w:p>
+            <w:r/>
+            <w:r>
+              <w:rPr>
+                <w:sz w:val="18"/>
+              </w:rPr>
+              <w:t>dos lunes en el mes → art. 160 N°3; días corridos 2 → pagados 28/30</w:t>
+            </w:r>
+          </w:p>
+        </w:tc>
+        <w:tc>
+          <w:tcPr>
+            <w:tcW w:type="dxa" w:w="2268"/>
+          </w:tcPr>
+          <w:p>
+            <w:r/>
+            <w:r>
+              <w:rPr>
+                <w:sz w:val="18"/>
+              </w:rPr>
+              <w:t>correo a RRHH cc supervisor; sueldo 840.000; Edenred de octubre −2 días</w:t>
+            </w:r>
+          </w:p>
+        </w:tc>
+      </w:tr>
+    </w:tbl>
+    <w:p>
+      <w:pPr>
+        <w:spacing w:after="40"/>
+      </w:pPr>
+    </w:p>
+    <w:tbl>
+      <w:tblPr>
+        <w:tblStyle w:val="TableGrid"/>
+        <w:tblW w:type="auto" w:w="0"/>
+        <w:tblLook w:firstColumn="1" w:firstRow="1" w:lastColumn="0" w:lastRow="0" w:noHBand="0" w:noVBand="1" w:val="04A0"/>
+      </w:tblPr>
+      <w:tblGrid>
+        <w:gridCol w:w="9746"/>
+      </w:tblGrid>
+      <w:tr>
+        <w:tc>
+          <w:tcPr>
+            <w:tcW w:type="dxa" w:w="9746"/>
+            <w:shd w:val="clear" w:color="auto" w:fill="E8F0F8"/>
+          </w:tcPr>
+          <w:p>
+            <w:r/>
+            <w:r>
+              <w:rPr>
+                <w:b/>
+                <w:sz w:val="19"/>
+              </w:rPr>
+              <w:t>🔒 Cómo cuadrar a mano</w:t>
+              <w:br/>
+            </w:r>
+            <w:r>
+              <w:rPr>
+                <w:sz w:val="19"/>
+              </w:rPr>
+              <w:t>Días pagados = 30 − días corridos de licencias, permisos sin goce y ausencias injustificadas dentro del mes (el 31 no existe). Todo lo demás se paga. Para Edenred se cuentan hábiles, no corridos. Si una licencia cruza de mes, cada mes descuenta su parte. El detalle "días trabajados" de la vista previa de la liquidación es editable por mes solo para corregir un caso puntual, con auditoría.</w:t>
+            </w:r>
+          </w:p>
+        </w:tc>
+      </w:tr>
+    </w:tbl>
+    <w:p>
+      <w:pPr>
+        <w:spacing w:after="40"/>
+      </w:pPr>
     </w:p>
     <w:p>
       <w:pPr>

</xml_diff>

<commit_message>
docs: Manual de RRHH v3.0 — Archivo Previred campo a campo (105 campos, movimientos de personal, códigos AFP/salud/mutual/CCAF) y Nómina Banco (CSV, códigos SBIF) con ejemplo (cap. 15.4); documentación v4.0 (v256.0)
Co-Authored-By: Claude Fable 5.1 <noreply@anthropic.com>
</commit_message>
<xml_diff>
--- a/api-gateway/public/mantenedores/documentacion/descargas/Manual-RRHH-Business-Suite.docx
+++ b/api-gateway/public/mantenedores/documentacion/descargas/Manual-RRHH-Business-Suite.docx
@@ -236,7 +236,7 @@
           <w:i w:val="0"/>
           <w:sz w:val="22"/>
         </w:rPr>
-        <w:t>Versión 2.9 · 17 de septiembre de 2026 · Suite v255.9</w:t>
+        <w:t>Versión 3.0 · 17 de septiembre de 2026 · Suite v256.0</w:t>
       </w:r>
     </w:p>
     <w:p>
@@ -984,6 +984,64 @@
                 <w:sz w:val="18"/>
               </w:rPr>
               <w:t>Cap. 9.1: reloj control Workera y su API (endpoints, caché, posibles faltas, atrasos, espejo); cap. 10.1: reglas de licencias, permisos y ausencias, art. 160 N°3, con ejemplo.</w:t>
+            </w:r>
+          </w:p>
+        </w:tc>
+      </w:tr>
+      <w:tr>
+        <w:tc>
+          <w:tcPr>
+            <w:tcW w:type="dxa" w:w="907"/>
+          </w:tcPr>
+          <w:p>
+            <w:r/>
+            <w:r>
+              <w:rPr>
+                <w:sz w:val="18"/>
+              </w:rPr>
+              <w:t>3.0</w:t>
+            </w:r>
+          </w:p>
+        </w:tc>
+        <w:tc>
+          <w:tcPr>
+            <w:tcW w:type="dxa" w:w="1247"/>
+          </w:tcPr>
+          <w:p>
+            <w:r/>
+            <w:r>
+              <w:rPr>
+                <w:sz w:val="18"/>
+              </w:rPr>
+              <w:t>17-09-2026</w:t>
+            </w:r>
+          </w:p>
+        </w:tc>
+        <w:tc>
+          <w:tcPr>
+            <w:tcW w:type="dxa" w:w="2041"/>
+          </w:tcPr>
+          <w:p>
+            <w:r/>
+            <w:r>
+              <w:rPr>
+                <w:sz w:val="18"/>
+              </w:rPr>
+              <w:t>Patricio Escobar / Claude</w:t>
+            </w:r>
+          </w:p>
+        </w:tc>
+        <w:tc>
+          <w:tcPr>
+            <w:tcW w:type="dxa" w:w="5159"/>
+          </w:tcPr>
+          <w:p>
+            <w:r/>
+            <w:r>
+              <w:rPr>
+                <w:sz w:val="18"/>
+              </w:rPr>
+              <w:t>Cap. 15.4: Archivo Previred (105 campos, movimientos, códigos) y Nómina Banco (CSV) con ejemplo de línea.</w:t>
             </w:r>
           </w:p>
         </w:tc>
@@ -18882,6 +18940,1997 @@
                 <w:sz w:val="19"/>
               </w:rPr>
               <w:t>Gratificación: 25% de lo imponible del mes o $209.396 (con IMM $529.000), el menor; con menos de 30 días, ambos × días/30. Impuesto: restar al imponible AFP, salud pactada, AFC y APV; dividir por la UTM del mes; aplicar el factor del tramo y restar la rebaja × UTM. Si la liquidación no cuadra con la calculadora del SII, revisar primero la UTM y los tramos del mantenedor: un tramo desactualizado mueve a todo el equipo.</w:t>
+            </w:r>
+          </w:p>
+        </w:tc>
+      </w:tr>
+    </w:tbl>
+    <w:p>
+      <w:pPr>
+        <w:spacing w:after="40"/>
+      </w:pPr>
+    </w:p>
+    <w:p>
+      <w:pPr>
+        <w:pStyle w:val="Heading3"/>
+      </w:pPr>
+      <w:r>
+        <w:t>15.4 Archivo Previred y Nómina Banco: qué llevan y de dónde sale cada campo</w:t>
+      </w:r>
+    </w:p>
+    <w:p>
+      <w:pPr>
+        <w:spacing w:after="80"/>
+      </w:pPr>
+      <w:r>
+        <w:rPr>
+          <w:b w:val="0"/>
+          <w:i w:val="0"/>
+        </w:rPr>
+        <w:t>Los dos archivos salen del libro EMITIDO (getPrevired y getNominaBanco): nunca se digitan, y si un dato falta el sistema avisa antes de generar. Regla: se corrige la FUENTE (ficha, catálogo, ausencia), no el archivo.</w:t>
+      </w:r>
+    </w:p>
+    <w:p>
+      <w:pPr>
+        <w:spacing w:after="40"/>
+      </w:pPr>
+      <w:r>
+        <w:rPr>
+          <w:b/>
+          <w:i w:val="0"/>
+          <w:color w:val="1F4E79"/>
+        </w:rPr>
+        <w:t>Archivo Previred (formato estándar de largo variable, 105 campos separados por ";", un trabajador por línea, previred_mmaaaa.txt)</w:t>
+      </w:r>
+    </w:p>
+    <w:tbl>
+      <w:tblPr>
+        <w:tblStyle w:val="TableGrid"/>
+        <w:tblW w:type="auto" w:w="0"/>
+        <w:jc w:val="center"/>
+        <w:tblLook w:firstColumn="1" w:firstRow="1" w:lastColumn="0" w:lastRow="0" w:noHBand="0" w:noVBand="1" w:val="04A0"/>
+      </w:tblPr>
+      <w:tblGrid>
+        <w:gridCol w:w="3249"/>
+        <w:gridCol w:w="3249"/>
+        <w:gridCol w:w="3249"/>
+      </w:tblGrid>
+      <w:tr>
+        <w:tc>
+          <w:tcPr>
+            <w:tcW w:type="dxa" w:w="1020"/>
+            <w:shd w:val="clear" w:color="auto" w:fill="1F4E79"/>
+          </w:tcPr>
+          <w:p>
+            <w:r/>
+            <w:r>
+              <w:rPr>
+                <w:b/>
+                <w:color w:val="FFFFFF"/>
+                <w:sz w:val="18"/>
+              </w:rPr>
+              <w:t>Campos</w:t>
+            </w:r>
+          </w:p>
+        </w:tc>
+        <w:tc>
+          <w:tcPr>
+            <w:tcW w:type="dxa" w:w="5783"/>
+            <w:shd w:val="clear" w:color="auto" w:fill="1F4E79"/>
+          </w:tcPr>
+          <w:p>
+            <w:r/>
+            <w:r>
+              <w:rPr>
+                <w:b/>
+                <w:color w:val="FFFFFF"/>
+                <w:sz w:val="18"/>
+              </w:rPr>
+              <w:t>Contenido</w:t>
+            </w:r>
+          </w:p>
+        </w:tc>
+        <w:tc>
+          <w:tcPr>
+            <w:tcW w:type="dxa" w:w="2551"/>
+            <w:shd w:val="clear" w:color="auto" w:fill="1F4E79"/>
+          </w:tcPr>
+          <w:p>
+            <w:r/>
+            <w:r>
+              <w:rPr>
+                <w:b/>
+                <w:color w:val="FFFFFF"/>
+                <w:sz w:val="18"/>
+              </w:rPr>
+              <w:t>De dónde sale</w:t>
+            </w:r>
+          </w:p>
+        </w:tc>
+      </w:tr>
+      <w:tr>
+        <w:tc>
+          <w:tcPr>
+            <w:tcW w:type="dxa" w:w="1020"/>
+          </w:tcPr>
+          <w:p>
+            <w:r/>
+            <w:r>
+              <w:rPr>
+                <w:sz w:val="18"/>
+              </w:rPr>
+              <w:t>1–7</w:t>
+            </w:r>
+          </w:p>
+        </w:tc>
+        <w:tc>
+          <w:tcPr>
+            <w:tcW w:type="dxa" w:w="5783"/>
+          </w:tcPr>
+          <w:p>
+            <w:r/>
+            <w:r>
+              <w:rPr>
+                <w:sz w:val="18"/>
+              </w:rPr>
+              <w:t>RUT y DV, apellido paterno, materno, nombres (en mayúsculas), sexo (M/F), nacionalidad (0 chileno, 1 extranjero).</w:t>
+            </w:r>
+          </w:p>
+        </w:tc>
+        <w:tc>
+          <w:tcPr>
+            <w:tcW w:type="dxa" w:w="2551"/>
+          </w:tcPr>
+          <w:p>
+            <w:r/>
+            <w:r>
+              <w:rPr>
+                <w:sz w:val="18"/>
+              </w:rPr>
+              <w:t>Usuarios · ficha (nacionalidad)</w:t>
+            </w:r>
+          </w:p>
+        </w:tc>
+      </w:tr>
+      <w:tr>
+        <w:tc>
+          <w:tcPr>
+            <w:tcW w:type="dxa" w:w="1020"/>
+          </w:tcPr>
+          <w:p>
+            <w:r/>
+            <w:r>
+              <w:rPr>
+                <w:sz w:val="18"/>
+              </w:rPr>
+              <w:t>8–14</w:t>
+            </w:r>
+          </w:p>
+        </w:tc>
+        <w:tc>
+          <w:tcPr>
+            <w:tcW w:type="dxa" w:w="5783"/>
+          </w:tcPr>
+          <w:p>
+            <w:r/>
+            <w:r>
+              <w:rPr>
+                <w:sz w:val="18"/>
+              </w:rPr>
+              <w:t>tipo de pago 01 (remuneraciones), período desde y hasta mmaaaa, régimen AFP, tipo de trabajador 0 (activo), días trabajados (los de la liquidación), tipo de línea 00.</w:t>
+            </w:r>
+          </w:p>
+        </w:tc>
+        <w:tc>
+          <w:tcPr>
+            <w:tcW w:type="dxa" w:w="2551"/>
+          </w:tcPr>
+          <w:p>
+            <w:r/>
+            <w:r>
+              <w:rPr>
+                <w:sz w:val="18"/>
+              </w:rPr>
+              <w:t>rh_liquidaciones.detalle.dias</w:t>
+            </w:r>
+          </w:p>
+        </w:tc>
+      </w:tr>
+      <w:tr>
+        <w:tc>
+          <w:tcPr>
+            <w:tcW w:type="dxa" w:w="1020"/>
+          </w:tcPr>
+          <w:p>
+            <w:r/>
+            <w:r>
+              <w:rPr>
+                <w:sz w:val="18"/>
+              </w:rPr>
+              <w:t>15–17</w:t>
+            </w:r>
+          </w:p>
+        </w:tc>
+        <w:tc>
+          <w:tcPr>
+            <w:tcW w:type="dxa" w:w="5783"/>
+          </w:tcPr>
+          <w:p>
+            <w:r/>
+            <w:r>
+              <w:rPr>
+                <w:sz w:val="18"/>
+              </w:rPr>
+              <w:t>movimiento de personal: 0 sin movimiento · 1 contratación (ingreso dentro del mes, fecha desde) · 2 retiro (finiquito del mes, fecha hasta) · 3 subsidio (licencia médica, desde/hasta). Prioridad: retiro &gt; licencia &gt; contratación.</w:t>
+            </w:r>
+          </w:p>
+        </w:tc>
+        <w:tc>
+          <w:tcPr>
+            <w:tcW w:type="dxa" w:w="2551"/>
+          </w:tcPr>
+          <w:p>
+            <w:r/>
+            <w:r>
+              <w:rPr>
+                <w:sz w:val="18"/>
+              </w:rPr>
+              <w:t>usuarios.fecha_ingreso · rh_finiquitos · rh_ausencias</w:t>
+            </w:r>
+          </w:p>
+        </w:tc>
+      </w:tr>
+      <w:tr>
+        <w:tc>
+          <w:tcPr>
+            <w:tcW w:type="dxa" w:w="1020"/>
+          </w:tcPr>
+          <w:p>
+            <w:r/>
+            <w:r>
+              <w:rPr>
+                <w:sz w:val="18"/>
+              </w:rPr>
+              <w:t>18–25</w:t>
+            </w:r>
+          </w:p>
+        </w:tc>
+        <w:tc>
+          <w:tcPr>
+            <w:tcW w:type="dxa" w:w="5783"/>
+          </w:tcPr>
+          <w:p>
+            <w:r/>
+            <w:r>
+              <w:rPr>
+                <w:sz w:val="18"/>
+              </w:rPr>
+              <w:t>tramo de asignación familiar (A/B/C, si no D), cargas simples (hijos marcados Carga Previred + otras), maternales, inválidas; monto de asignación (hoy 0: el motor no la paga en la liquidación → completar en Previred si aplica).</w:t>
+            </w:r>
+          </w:p>
+        </w:tc>
+        <w:tc>
+          <w:tcPr>
+            <w:tcW w:type="dxa" w:w="2551"/>
+          </w:tcPr>
+          <w:p>
+            <w:r/>
+            <w:r>
+              <w:rPr>
+                <w:sz w:val="18"/>
+              </w:rPr>
+              <w:t>rh_fichas.tramo_asignacion · rh_cargas es_carga</w:t>
+            </w:r>
+          </w:p>
+        </w:tc>
+      </w:tr>
+      <w:tr>
+        <w:tc>
+          <w:tcPr>
+            <w:tcW w:type="dxa" w:w="1020"/>
+          </w:tcPr>
+          <w:p>
+            <w:r/>
+            <w:r>
+              <w:rPr>
+                <w:sz w:val="18"/>
+              </w:rPr>
+              <w:t>26–29</w:t>
+            </w:r>
+          </w:p>
+        </w:tc>
+        <w:tc>
+          <w:tcPr>
+            <w:tcW w:type="dxa" w:w="5783"/>
+          </w:tcPr>
+          <w:p>
+            <w:r/>
+            <w:r>
+              <w:rPr>
+                <w:sz w:val="18"/>
+              </w:rPr>
+              <w:t>código AFP (Tabla Previred: Cuprum 03, Habitat 05, Provida 08, PlanVital 29, Capital 33, Modelo 34, Uno 35), renta imponible AFP (base de cotización topada), cotización AFP, SIS empleador.</w:t>
+            </w:r>
+          </w:p>
+        </w:tc>
+        <w:tc>
+          <w:tcPr>
+            <w:tcW w:type="dxa" w:w="2551"/>
+          </w:tcPr>
+          <w:p>
+            <w:r/>
+            <w:r>
+              <w:rPr>
+                <w:sz w:val="18"/>
+              </w:rPr>
+              <w:t>rh_afp_tasas.codigo_previred · detalle</w:t>
+            </w:r>
+          </w:p>
+        </w:tc>
+      </w:tr>
+      <w:tr>
+        <w:tc>
+          <w:tcPr>
+            <w:tcW w:type="dxa" w:w="1020"/>
+          </w:tcPr>
+          <w:p>
+            <w:r/>
+            <w:r>
+              <w:rPr>
+                <w:sz w:val="18"/>
+              </w:rPr>
+              <w:t>64–71</w:t>
+            </w:r>
+          </w:p>
+        </w:tc>
+        <w:tc>
+          <w:tcPr>
+            <w:tcW w:type="dxa" w:w="5783"/>
+          </w:tcPr>
+          <w:p>
+            <w:r/>
+            <w:r>
+              <w:rPr>
+                <w:sz w:val="18"/>
+              </w:rPr>
+              <w:t>Fonasa: renta imponible (campo 64), cotización 7% (70); mutual en 71 solo si la empresa no tiene mutual (cotiza al ISL).</w:t>
+            </w:r>
+          </w:p>
+        </w:tc>
+        <w:tc>
+          <w:tcPr>
+            <w:tcW w:type="dxa" w:w="2551"/>
+          </w:tcPr>
+          <w:p>
+            <w:r/>
+            <w:r>
+              <w:rPr>
+                <w:sz w:val="18"/>
+              </w:rPr>
+              <w:t>detalle.desc_salud · rh_previred_config.mutual</w:t>
+            </w:r>
+          </w:p>
+        </w:tc>
+      </w:tr>
+      <w:tr>
+        <w:tc>
+          <w:tcPr>
+            <w:tcW w:type="dxa" w:w="1020"/>
+          </w:tcPr>
+          <w:p>
+            <w:r/>
+            <w:r>
+              <w:rPr>
+                <w:sz w:val="18"/>
+              </w:rPr>
+              <w:t>75–81</w:t>
+            </w:r>
+          </w:p>
+        </w:tc>
+        <w:tc>
+          <w:tcPr>
+            <w:tcW w:type="dxa" w:w="5783"/>
+          </w:tcPr>
+          <w:p>
+            <w:r/>
+            <w:r>
+              <w:rPr>
+                <w:sz w:val="18"/>
+              </w:rPr>
+              <w:t>código de salud (Fonasa 07; Isapres por Tabla N°16 desde el catálogo), renta imponible Isapre, tipo de moneda del plan (1 pesos / 2 UF), monto del plan (UF con coma, o pesos), cotización 7% e importe adicional.</w:t>
+            </w:r>
+          </w:p>
+        </w:tc>
+        <w:tc>
+          <w:tcPr>
+            <w:tcW w:type="dxa" w:w="2551"/>
+          </w:tcPr>
+          <w:p>
+            <w:r/>
+            <w:r>
+              <w:rPr>
+                <w:sz w:val="18"/>
+              </w:rPr>
+              <w:t>catálogo SALUD · rh_fichas.plan_isapre_uf</w:t>
+            </w:r>
+          </w:p>
+        </w:tc>
+      </w:tr>
+      <w:tr>
+        <w:tc>
+          <w:tcPr>
+            <w:tcW w:type="dxa" w:w="1020"/>
+          </w:tcPr>
+          <w:p>
+            <w:r/>
+            <w:r>
+              <w:rPr>
+                <w:sz w:val="18"/>
+              </w:rPr>
+              <w:t>83–90</w:t>
+            </w:r>
+          </w:p>
+        </w:tc>
+        <w:tc>
+          <w:tcPr>
+            <w:tcW w:type="dxa" w:w="5783"/>
+          </w:tcPr>
+          <w:p>
+            <w:r/>
+            <w:r>
+              <w:rPr>
+                <w:sz w:val="18"/>
+              </w:rPr>
+              <w:t>CCAF de la empresa (Tabla N°18; 00 sin caja) y su renta; con CCAF y Fonasa, el 4,2% va en el 90 y hay que revisar la distribución 2,8% / CCAF en Previred.</w:t>
+            </w:r>
+          </w:p>
+        </w:tc>
+        <w:tc>
+          <w:tcPr>
+            <w:tcW w:type="dxa" w:w="2551"/>
+          </w:tcPr>
+          <w:p>
+            <w:r/>
+            <w:r>
+              <w:rPr>
+                <w:sz w:val="18"/>
+              </w:rPr>
+              <w:t>rh_previred_config.ccaf</w:t>
+            </w:r>
+          </w:p>
+        </w:tc>
+      </w:tr>
+      <w:tr>
+        <w:tc>
+          <w:tcPr>
+            <w:tcW w:type="dxa" w:w="1020"/>
+          </w:tcPr>
+          <w:p>
+            <w:r/>
+            <w:r>
+              <w:rPr>
+                <w:sz w:val="18"/>
+              </w:rPr>
+              <w:t>93</w:t>
+            </w:r>
+          </w:p>
+        </w:tc>
+        <w:tc>
+          <w:tcPr>
+            <w:tcW w:type="dxa" w:w="5783"/>
+          </w:tcPr>
+          <w:p>
+            <w:r/>
+            <w:r>
+              <w:rPr>
+                <w:sz w:val="18"/>
+              </w:rPr>
+              <w:t>jornada: 1 completa / 2 parcial.</w:t>
+            </w:r>
+          </w:p>
+        </w:tc>
+        <w:tc>
+          <w:tcPr>
+            <w:tcW w:type="dxa" w:w="2551"/>
+          </w:tcPr>
+          <w:p>
+            <w:r/>
+            <w:r>
+              <w:rPr>
+                <w:sz w:val="18"/>
+              </w:rPr>
+              <w:t>rh_fichas.jornada</w:t>
+            </w:r>
+          </w:p>
+        </w:tc>
+      </w:tr>
+      <w:tr>
+        <w:tc>
+          <w:tcPr>
+            <w:tcW w:type="dxa" w:w="1020"/>
+          </w:tcPr>
+          <w:p>
+            <w:r/>
+            <w:r>
+              <w:rPr>
+                <w:sz w:val="18"/>
+              </w:rPr>
+              <w:t>96–99</w:t>
+            </w:r>
+          </w:p>
+        </w:tc>
+        <w:tc>
+          <w:tcPr>
+            <w:tcW w:type="dxa" w:w="5783"/>
+          </w:tcPr>
+          <w:p>
+            <w:r/>
+            <w:r>
+              <w:rPr>
+                <w:sz w:val="18"/>
+              </w:rPr>
+              <w:t>mutualidad (Tabla N°19: ACHS 01, Mutual de Seguridad 02, IST 03), renta imponible, cotización mutual (0,93% + SANNA), sucursal.</w:t>
+            </w:r>
+          </w:p>
+        </w:tc>
+        <w:tc>
+          <w:tcPr>
+            <w:tcW w:type="dxa" w:w="2551"/>
+          </w:tcPr>
+          <w:p>
+            <w:r/>
+            <w:r>
+              <w:rPr>
+                <w:sz w:val="18"/>
+              </w:rPr>
+              <w:t>rh_previred_config.mutual · detalle.aporte_mutual</w:t>
+            </w:r>
+          </w:p>
+        </w:tc>
+      </w:tr>
+      <w:tr>
+        <w:tc>
+          <w:tcPr>
+            <w:tcW w:type="dxa" w:w="1020"/>
+          </w:tcPr>
+          <w:p>
+            <w:r/>
+            <w:r>
+              <w:rPr>
+                <w:sz w:val="18"/>
+              </w:rPr>
+              <w:t>100–102</w:t>
+            </w:r>
+          </w:p>
+        </w:tc>
+        <w:tc>
+          <w:tcPr>
+            <w:tcW w:type="dxa" w:w="5783"/>
+          </w:tcPr>
+          <w:p>
+            <w:r/>
+            <w:r>
+              <w:rPr>
+                <w:sz w:val="18"/>
+              </w:rPr>
+              <w:t>renta imponible AFC (topada a 131,9 UF), cotización trabajador 0,6% (solo indefinidos), aporte empleador 2,4% / 3%.</w:t>
+            </w:r>
+          </w:p>
+        </w:tc>
+        <w:tc>
+          <w:tcPr>
+            <w:tcW w:type="dxa" w:w="2551"/>
+          </w:tcPr>
+          <w:p>
+            <w:r/>
+            <w:r>
+              <w:rPr>
+                <w:sz w:val="18"/>
+              </w:rPr>
+              <w:t>detalle.base_afc, desc_afc, aporte_afc_emp</w:t>
+            </w:r>
+          </w:p>
+        </w:tc>
+      </w:tr>
+      <w:tr>
+        <w:tc>
+          <w:tcPr>
+            <w:tcW w:type="dxa" w:w="1020"/>
+          </w:tcPr>
+          <w:p>
+            <w:r/>
+            <w:r>
+              <w:rPr>
+                <w:sz w:val="18"/>
+              </w:rPr>
+              <w:t>Avisos previos</w:t>
+            </w:r>
+          </w:p>
+        </w:tc>
+        <w:tc>
+          <w:tcPr>
+            <w:tcW w:type="dxa" w:w="5783"/>
+          </w:tcPr>
+          <w:p>
+            <w:r/>
+            <w:r>
+              <w:rPr>
+                <w:sz w:val="18"/>
+              </w:rPr>
+              <w:t>RUT inválido (línea omitida), AFP sin código, salud sin código, sin sexo, licencia en el mes (revisar renta del mes anterior), retiro/contratación informados, cargas con tramo distinto de D.</w:t>
+            </w:r>
+          </w:p>
+        </w:tc>
+        <w:tc>
+          <w:tcPr>
+            <w:tcW w:type="dxa" w:w="2551"/>
+          </w:tcPr>
+          <w:p>
+            <w:r/>
+            <w:r>
+              <w:rPr>
+                <w:sz w:val="18"/>
+              </w:rPr>
+              <w:t>pantalla antes de descargar</w:t>
+            </w:r>
+          </w:p>
+        </w:tc>
+      </w:tr>
+      <w:tr>
+        <w:tc>
+          <w:tcPr>
+            <w:tcW w:type="dxa" w:w="1020"/>
+          </w:tcPr>
+          <w:p>
+            <w:r/>
+            <w:r>
+              <w:rPr>
+                <w:sz w:val="18"/>
+              </w:rPr>
+              <w:t>Pensionado</w:t>
+            </w:r>
+          </w:p>
+        </w:tc>
+        <w:tc>
+          <w:tcPr>
+            <w:tcW w:type="dxa" w:w="5783"/>
+          </w:tcPr>
+          <w:p>
+            <w:r/>
+            <w:r>
+              <w:rPr>
+                <w:sz w:val="18"/>
+              </w:rPr>
+              <w:t>sin AFP, sin AFC ni SIS; salud igual (Tabla N°7 tipo de trabajador).</w:t>
+            </w:r>
+          </w:p>
+        </w:tc>
+        <w:tc>
+          <w:tcPr>
+            <w:tcW w:type="dxa" w:w="2551"/>
+          </w:tcPr>
+          <w:p>
+            <w:r/>
+            <w:r>
+              <w:rPr>
+                <w:sz w:val="18"/>
+              </w:rPr>
+              <w:t>rh_fichas.pensionado</w:t>
+            </w:r>
+          </w:p>
+        </w:tc>
+      </w:tr>
+      <w:tr>
+        <w:tc>
+          <w:tcPr>
+            <w:tcW w:type="dxa" w:w="1020"/>
+          </w:tcPr>
+          <w:p>
+            <w:r/>
+            <w:r>
+              <w:rPr>
+                <w:sz w:val="18"/>
+              </w:rPr>
+              <w:t>Cuándo y dónde</w:t>
+            </w:r>
+          </w:p>
+        </w:tc>
+        <w:tc>
+          <w:tcPr>
+            <w:tcW w:type="dxa" w:w="5783"/>
+          </w:tcPr>
+          <w:p>
+            <w:r/>
+            <w:r>
+              <w:rPr>
+                <w:sz w:val="18"/>
+              </w:rPr>
+              <w:t>con el mes emitido; subir en previred.com → Ingreso Electrónico → Remuneraciones y pagar; plazo legal día 10 (13 pago electrónico). Un término hecho fuera de Finiquitos se marca a mano como retiro.</w:t>
+            </w:r>
+          </w:p>
+        </w:tc>
+        <w:tc>
+          <w:tcPr>
+            <w:tcW w:type="dxa" w:w="2551"/>
+          </w:tcPr>
+          <w:p>
+            <w:r/>
+            <w:r>
+              <w:rPr>
+                <w:sz w:val="18"/>
+              </w:rPr>
+            </w:r>
+          </w:p>
+        </w:tc>
+      </w:tr>
+    </w:tbl>
+    <w:p>
+      <w:pPr>
+        <w:spacing w:after="40"/>
+      </w:pPr>
+    </w:p>
+    <w:p>
+      <w:pPr>
+        <w:spacing w:after="40"/>
+      </w:pPr>
+      <w:r>
+        <w:rPr>
+          <w:b/>
+          <w:i w:val="0"/>
+          <w:color w:val="1F4E79"/>
+        </w:rPr>
+        <w:t>Ejemplo (colaboradora del cap. 15.1: septiembre 2026, 30 días, AFP Modelo, Fonasa, indefinida, sin cargas, Mutual de Seguridad, sin CCAF)</w:t>
+      </w:r>
+    </w:p>
+    <w:tbl>
+      <w:tblPr>
+        <w:tblStyle w:val="TableGrid"/>
+        <w:tblW w:type="auto" w:w="0"/>
+        <w:jc w:val="center"/>
+        <w:tblLook w:firstColumn="1" w:firstRow="1" w:lastColumn="0" w:lastRow="0" w:noHBand="0" w:noVBand="1" w:val="04A0"/>
+      </w:tblPr>
+      <w:tblGrid>
+        <w:gridCol w:w="3249"/>
+        <w:gridCol w:w="3249"/>
+        <w:gridCol w:w="3249"/>
+      </w:tblGrid>
+      <w:tr>
+        <w:tc>
+          <w:tcPr>
+            <w:tcW w:type="dxa" w:w="1701"/>
+            <w:shd w:val="clear" w:color="auto" w:fill="1F4E79"/>
+          </w:tcPr>
+          <w:p>
+            <w:r/>
+            <w:r>
+              <w:rPr>
+                <w:b/>
+                <w:color w:val="FFFFFF"/>
+                <w:sz w:val="18"/>
+              </w:rPr>
+              <w:t>Campo</w:t>
+            </w:r>
+          </w:p>
+        </w:tc>
+        <w:tc>
+          <w:tcPr>
+            <w:tcW w:type="dxa" w:w="3402"/>
+            <w:shd w:val="clear" w:color="auto" w:fill="1F4E79"/>
+          </w:tcPr>
+          <w:p>
+            <w:r/>
+            <w:r>
+              <w:rPr>
+                <w:b/>
+                <w:color w:val="FFFFFF"/>
+                <w:sz w:val="18"/>
+              </w:rPr>
+              <w:t>Valor</w:t>
+            </w:r>
+          </w:p>
+        </w:tc>
+        <w:tc>
+          <w:tcPr>
+            <w:tcW w:type="dxa" w:w="4252"/>
+            <w:shd w:val="clear" w:color="auto" w:fill="1F4E79"/>
+          </w:tcPr>
+          <w:p>
+            <w:r/>
+            <w:r>
+              <w:rPr>
+                <w:b/>
+                <w:color w:val="FFFFFF"/>
+                <w:sz w:val="18"/>
+              </w:rPr>
+              <w:t>Por qué</w:t>
+            </w:r>
+          </w:p>
+        </w:tc>
+      </w:tr>
+      <w:tr>
+        <w:tc>
+          <w:tcPr>
+            <w:tcW w:type="dxa" w:w="1701"/>
+          </w:tcPr>
+          <w:p>
+            <w:r/>
+            <w:r>
+              <w:rPr>
+                <w:sz w:val="18"/>
+              </w:rPr>
+              <w:t>1–2</w:t>
+            </w:r>
+          </w:p>
+        </w:tc>
+        <w:tc>
+          <w:tcPr>
+            <w:tcW w:type="dxa" w:w="3402"/>
+          </w:tcPr>
+          <w:p>
+            <w:r/>
+            <w:r>
+              <w:rPr>
+                <w:sz w:val="18"/>
+              </w:rPr>
+              <w:t>12345678 ; 9</w:t>
+            </w:r>
+          </w:p>
+        </w:tc>
+        <w:tc>
+          <w:tcPr>
+            <w:tcW w:type="dxa" w:w="4252"/>
+          </w:tcPr>
+          <w:p>
+            <w:r/>
+            <w:r>
+              <w:rPr>
+                <w:sz w:val="18"/>
+              </w:rPr>
+              <w:t>RUT sin puntos, DV aparte</w:t>
+            </w:r>
+          </w:p>
+        </w:tc>
+      </w:tr>
+      <w:tr>
+        <w:tc>
+          <w:tcPr>
+            <w:tcW w:type="dxa" w:w="1701"/>
+          </w:tcPr>
+          <w:p>
+            <w:r/>
+            <w:r>
+              <w:rPr>
+                <w:sz w:val="18"/>
+              </w:rPr>
+              <w:t>3–6</w:t>
+            </w:r>
+          </w:p>
+        </w:tc>
+        <w:tc>
+          <w:tcPr>
+            <w:tcW w:type="dxa" w:w="3402"/>
+          </w:tcPr>
+          <w:p>
+            <w:r/>
+            <w:r>
+              <w:rPr>
+                <w:sz w:val="18"/>
+              </w:rPr>
+              <w:t>GONZALEZ ; ROJAS ; MARIA JOSE ; F</w:t>
+            </w:r>
+          </w:p>
+        </w:tc>
+        <w:tc>
+          <w:tcPr>
+            <w:tcW w:type="dxa" w:w="4252"/>
+          </w:tcPr>
+          <w:p>
+            <w:r/>
+            <w:r>
+              <w:rPr>
+                <w:sz w:val="18"/>
+              </w:rPr>
+              <w:t>Usuarios, en mayúsculas</w:t>
+            </w:r>
+          </w:p>
+        </w:tc>
+      </w:tr>
+      <w:tr>
+        <w:tc>
+          <w:tcPr>
+            <w:tcW w:type="dxa" w:w="1701"/>
+          </w:tcPr>
+          <w:p>
+            <w:r/>
+            <w:r>
+              <w:rPr>
+                <w:sz w:val="18"/>
+              </w:rPr>
+              <w:t>9–10</w:t>
+            </w:r>
+          </w:p>
+        </w:tc>
+        <w:tc>
+          <w:tcPr>
+            <w:tcW w:type="dxa" w:w="3402"/>
+          </w:tcPr>
+          <w:p>
+            <w:r/>
+            <w:r>
+              <w:rPr>
+                <w:sz w:val="18"/>
+              </w:rPr>
+              <w:t>092026 ; 092026</w:t>
+            </w:r>
+          </w:p>
+        </w:tc>
+        <w:tc>
+          <w:tcPr>
+            <w:tcW w:type="dxa" w:w="4252"/>
+          </w:tcPr>
+          <w:p>
+            <w:r/>
+            <w:r>
+              <w:rPr>
+                <w:sz w:val="18"/>
+              </w:rPr>
+              <w:t>período mmaaaa</w:t>
+            </w:r>
+          </w:p>
+        </w:tc>
+      </w:tr>
+      <w:tr>
+        <w:tc>
+          <w:tcPr>
+            <w:tcW w:type="dxa" w:w="1701"/>
+          </w:tcPr>
+          <w:p>
+            <w:r/>
+            <w:r>
+              <w:rPr>
+                <w:sz w:val="18"/>
+              </w:rPr>
+              <w:t>13</w:t>
+            </w:r>
+          </w:p>
+        </w:tc>
+        <w:tc>
+          <w:tcPr>
+            <w:tcW w:type="dxa" w:w="3402"/>
+          </w:tcPr>
+          <w:p>
+            <w:r/>
+            <w:r>
+              <w:rPr>
+                <w:sz w:val="18"/>
+              </w:rPr>
+              <w:t>30</w:t>
+            </w:r>
+          </w:p>
+        </w:tc>
+        <w:tc>
+          <w:tcPr>
+            <w:tcW w:type="dxa" w:w="4252"/>
+          </w:tcPr>
+          <w:p>
+            <w:r/>
+            <w:r>
+              <w:rPr>
+                <w:sz w:val="18"/>
+              </w:rPr>
+              <w:t>días trabajados de la liquidación</w:t>
+            </w:r>
+          </w:p>
+        </w:tc>
+      </w:tr>
+      <w:tr>
+        <w:tc>
+          <w:tcPr>
+            <w:tcW w:type="dxa" w:w="1701"/>
+          </w:tcPr>
+          <w:p>
+            <w:r/>
+            <w:r>
+              <w:rPr>
+                <w:sz w:val="18"/>
+              </w:rPr>
+              <w:t>15–17</w:t>
+            </w:r>
+          </w:p>
+        </w:tc>
+        <w:tc>
+          <w:tcPr>
+            <w:tcW w:type="dxa" w:w="3402"/>
+          </w:tcPr>
+          <w:p>
+            <w:r/>
+            <w:r>
+              <w:rPr>
+                <w:sz w:val="18"/>
+              </w:rPr>
+              <w:t>0 ; (vacío) ; (vacío)</w:t>
+            </w:r>
+          </w:p>
+        </w:tc>
+        <w:tc>
+          <w:tcPr>
+            <w:tcW w:type="dxa" w:w="4252"/>
+          </w:tcPr>
+          <w:p>
+            <w:r/>
+            <w:r>
+              <w:rPr>
+                <w:sz w:val="18"/>
+              </w:rPr>
+              <w:t>sin movimiento (si hubiera tenido la licencia del 10 al 16: 3 ; 10-09-2026 ; 16-09-2026)</w:t>
+            </w:r>
+          </w:p>
+        </w:tc>
+      </w:tr>
+      <w:tr>
+        <w:tc>
+          <w:tcPr>
+            <w:tcW w:type="dxa" w:w="1701"/>
+          </w:tcPr>
+          <w:p>
+            <w:r/>
+            <w:r>
+              <w:rPr>
+                <w:sz w:val="18"/>
+              </w:rPr>
+              <w:t>18–21</w:t>
+            </w:r>
+          </w:p>
+        </w:tc>
+        <w:tc>
+          <w:tcPr>
+            <w:tcW w:type="dxa" w:w="3402"/>
+          </w:tcPr>
+          <w:p>
+            <w:r/>
+            <w:r>
+              <w:rPr>
+                <w:sz w:val="18"/>
+              </w:rPr>
+              <w:t>D ; 0 ; 0 ; 0</w:t>
+            </w:r>
+          </w:p>
+        </w:tc>
+        <w:tc>
+          <w:tcPr>
+            <w:tcW w:type="dxa" w:w="4252"/>
+          </w:tcPr>
+          <w:p>
+            <w:r/>
+            <w:r>
+              <w:rPr>
+                <w:sz w:val="18"/>
+              </w:rPr>
+              <w:t>sin asignación familiar</w:t>
+            </w:r>
+          </w:p>
+        </w:tc>
+      </w:tr>
+      <w:tr>
+        <w:tc>
+          <w:tcPr>
+            <w:tcW w:type="dxa" w:w="1701"/>
+          </w:tcPr>
+          <w:p>
+            <w:r/>
+            <w:r>
+              <w:rPr>
+                <w:sz w:val="18"/>
+              </w:rPr>
+              <w:t>26–29</w:t>
+            </w:r>
+          </w:p>
+        </w:tc>
+        <w:tc>
+          <w:tcPr>
+            <w:tcW w:type="dxa" w:w="3402"/>
+          </w:tcPr>
+          <w:p>
+            <w:r/>
+            <w:r>
+              <w:rPr>
+                <w:sz w:val="18"/>
+              </w:rPr>
+              <w:t>34 ; 1459396 ; 154404 ; 27437</w:t>
+            </w:r>
+          </w:p>
+        </w:tc>
+        <w:tc>
+          <w:tcPr>
+            <w:tcW w:type="dxa" w:w="4252"/>
+          </w:tcPr>
+          <w:p>
+            <w:r/>
+            <w:r>
+              <w:rPr>
+                <w:sz w:val="18"/>
+              </w:rPr>
+              <w:t>AFP Modelo; base topada; 10,58%; SIS 1,88%</w:t>
+            </w:r>
+          </w:p>
+        </w:tc>
+      </w:tr>
+      <w:tr>
+        <w:tc>
+          <w:tcPr>
+            <w:tcW w:type="dxa" w:w="1701"/>
+          </w:tcPr>
+          <w:p>
+            <w:r/>
+            <w:r>
+              <w:rPr>
+                <w:sz w:val="18"/>
+              </w:rPr>
+              <w:t>64 / 70 / 71</w:t>
+            </w:r>
+          </w:p>
+        </w:tc>
+        <w:tc>
+          <w:tcPr>
+            <w:tcW w:type="dxa" w:w="3402"/>
+          </w:tcPr>
+          <w:p>
+            <w:r/>
+            <w:r>
+              <w:rPr>
+                <w:sz w:val="18"/>
+              </w:rPr>
+              <w:t>1459396 ; 102158 ; 0</w:t>
+            </w:r>
+          </w:p>
+        </w:tc>
+        <w:tc>
+          <w:tcPr>
+            <w:tcW w:type="dxa" w:w="4252"/>
+          </w:tcPr>
+          <w:p>
+            <w:r/>
+            <w:r>
+              <w:rPr>
+                <w:sz w:val="18"/>
+              </w:rPr>
+              <w:t>Fonasa: renta y 7%; mutual no va aquí porque la empresa tiene Mutual de Seguridad</w:t>
+            </w:r>
+          </w:p>
+        </w:tc>
+      </w:tr>
+      <w:tr>
+        <w:tc>
+          <w:tcPr>
+            <w:tcW w:type="dxa" w:w="1701"/>
+          </w:tcPr>
+          <w:p>
+            <w:r/>
+            <w:r>
+              <w:rPr>
+                <w:sz w:val="18"/>
+              </w:rPr>
+              <w:t>75 / 77–81</w:t>
+            </w:r>
+          </w:p>
+        </w:tc>
+        <w:tc>
+          <w:tcPr>
+            <w:tcW w:type="dxa" w:w="3402"/>
+          </w:tcPr>
+          <w:p>
+            <w:r/>
+            <w:r>
+              <w:rPr>
+                <w:sz w:val="18"/>
+              </w:rPr>
+              <w:t>07 ; 0 ; 0 ; 0 ; 0 ; 0</w:t>
+            </w:r>
+          </w:p>
+        </w:tc>
+        <w:tc>
+          <w:tcPr>
+            <w:tcW w:type="dxa" w:w="4252"/>
+          </w:tcPr>
+          <w:p>
+            <w:r/>
+            <w:r>
+              <w:rPr>
+                <w:sz w:val="18"/>
+              </w:rPr>
+              <w:t>Fonasa: los campos de Isapre en 0</w:t>
+            </w:r>
+          </w:p>
+        </w:tc>
+      </w:tr>
+      <w:tr>
+        <w:tc>
+          <w:tcPr>
+            <w:tcW w:type="dxa" w:w="1701"/>
+          </w:tcPr>
+          <w:p>
+            <w:r/>
+            <w:r>
+              <w:rPr>
+                <w:sz w:val="18"/>
+              </w:rPr>
+              <w:t>83–84 / 90</w:t>
+            </w:r>
+          </w:p>
+        </w:tc>
+        <w:tc>
+          <w:tcPr>
+            <w:tcW w:type="dxa" w:w="3402"/>
+          </w:tcPr>
+          <w:p>
+            <w:r/>
+            <w:r>
+              <w:rPr>
+                <w:sz w:val="18"/>
+              </w:rPr>
+              <w:t>00 ; 0 ; 0</w:t>
+            </w:r>
+          </w:p>
+        </w:tc>
+        <w:tc>
+          <w:tcPr>
+            <w:tcW w:type="dxa" w:w="4252"/>
+          </w:tcPr>
+          <w:p>
+            <w:r/>
+            <w:r>
+              <w:rPr>
+                <w:sz w:val="18"/>
+              </w:rPr>
+              <w:t>sin CCAF</w:t>
+            </w:r>
+          </w:p>
+        </w:tc>
+      </w:tr>
+      <w:tr>
+        <w:tc>
+          <w:tcPr>
+            <w:tcW w:type="dxa" w:w="1701"/>
+          </w:tcPr>
+          <w:p>
+            <w:r/>
+            <w:r>
+              <w:rPr>
+                <w:sz w:val="18"/>
+              </w:rPr>
+              <w:t>96–98</w:t>
+            </w:r>
+          </w:p>
+        </w:tc>
+        <w:tc>
+          <w:tcPr>
+            <w:tcW w:type="dxa" w:w="3402"/>
+          </w:tcPr>
+          <w:p>
+            <w:r/>
+            <w:r>
+              <w:rPr>
+                <w:sz w:val="18"/>
+              </w:rPr>
+              <w:t>02 ; 1459396 ; 14010</w:t>
+            </w:r>
+          </w:p>
+        </w:tc>
+        <w:tc>
+          <w:tcPr>
+            <w:tcW w:type="dxa" w:w="4252"/>
+          </w:tcPr>
+          <w:p>
+            <w:r/>
+            <w:r>
+              <w:rPr>
+                <w:sz w:val="18"/>
+              </w:rPr>
+              <w:t>Mutual de Seguridad; renta; 0,93% + SANNA 0,03% = 13.572 + 438</w:t>
+            </w:r>
+          </w:p>
+        </w:tc>
+      </w:tr>
+      <w:tr>
+        <w:tc>
+          <w:tcPr>
+            <w:tcW w:type="dxa" w:w="1701"/>
+          </w:tcPr>
+          <w:p>
+            <w:r/>
+            <w:r>
+              <w:rPr>
+                <w:sz w:val="18"/>
+              </w:rPr>
+              <w:t>100–102</w:t>
+            </w:r>
+          </w:p>
+        </w:tc>
+        <w:tc>
+          <w:tcPr>
+            <w:tcW w:type="dxa" w:w="3402"/>
+          </w:tcPr>
+          <w:p>
+            <w:r/>
+            <w:r>
+              <w:rPr>
+                <w:sz w:val="18"/>
+              </w:rPr>
+              <w:t>1459396 ; 8756 ; 35026</w:t>
+            </w:r>
+          </w:p>
+        </w:tc>
+        <w:tc>
+          <w:tcPr>
+            <w:tcW w:type="dxa" w:w="4252"/>
+          </w:tcPr>
+          <w:p>
+            <w:r/>
+            <w:r>
+              <w:rPr>
+                <w:sz w:val="18"/>
+              </w:rPr>
+              <w:t>AFC: base, 0,6% trabajador, 2,4% empleador (indefinida)</w:t>
+            </w:r>
+          </w:p>
+        </w:tc>
+      </w:tr>
+      <w:tr>
+        <w:tc>
+          <w:tcPr>
+            <w:tcW w:type="dxa" w:w="1701"/>
+          </w:tcPr>
+          <w:p>
+            <w:r/>
+            <w:r>
+              <w:rPr>
+                <w:sz w:val="18"/>
+              </w:rPr>
+              <w:t>Cotizaciones a pagar por ella</w:t>
+            </w:r>
+          </w:p>
+        </w:tc>
+        <w:tc>
+          <w:tcPr>
+            <w:tcW w:type="dxa" w:w="3402"/>
+          </w:tcPr>
+          <w:p>
+            <w:r/>
+            <w:r>
+              <w:rPr>
+                <w:sz w:val="18"/>
+              </w:rPr>
+              <w:t>154.404 + 27.437 + 102.158 + 14.010 + 8.756 + 35.026</w:t>
+            </w:r>
+          </w:p>
+        </w:tc>
+        <w:tc>
+          <w:tcPr>
+            <w:tcW w:type="dxa" w:w="4252"/>
+          </w:tcPr>
+          <w:p>
+            <w:r/>
+            <w:r>
+              <w:rPr>
+                <w:sz w:val="18"/>
+              </w:rPr>
+              <w:t>$341.791 (trabajador 265.318 + empleador 76.473)</w:t>
+            </w:r>
+          </w:p>
+        </w:tc>
+      </w:tr>
+    </w:tbl>
+    <w:p>
+      <w:pPr>
+        <w:spacing w:after="40"/>
+      </w:pPr>
+    </w:p>
+    <w:p>
+      <w:pPr>
+        <w:spacing w:after="40"/>
+      </w:pPr>
+      <w:r>
+        <w:rPr>
+          <w:b/>
+          <w:i w:val="0"/>
+          <w:color w:val="1F4E79"/>
+        </w:rPr>
+        <w:t>Nómina Banco (CSV de transferencias en lote, nomina-sueldos-AAAA-MM.csv)</w:t>
+      </w:r>
+    </w:p>
+    <w:tbl>
+      <w:tblPr>
+        <w:tblStyle w:val="TableGrid"/>
+        <w:tblW w:type="auto" w:w="0"/>
+        <w:jc w:val="center"/>
+        <w:tblLook w:firstColumn="1" w:firstRow="1" w:lastColumn="0" w:lastRow="0" w:noHBand="0" w:noVBand="1" w:val="04A0"/>
+      </w:tblPr>
+      <w:tblGrid>
+        <w:gridCol w:w="3249"/>
+        <w:gridCol w:w="3249"/>
+        <w:gridCol w:w="3249"/>
+      </w:tblGrid>
+      <w:tr>
+        <w:tc>
+          <w:tcPr>
+            <w:tcW w:type="dxa" w:w="1701"/>
+            <w:shd w:val="clear" w:color="auto" w:fill="1F4E79"/>
+          </w:tcPr>
+          <w:p>
+            <w:r/>
+            <w:r>
+              <w:rPr>
+                <w:b/>
+                <w:color w:val="FFFFFF"/>
+                <w:sz w:val="18"/>
+              </w:rPr>
+              <w:t>Columna</w:t>
+            </w:r>
+          </w:p>
+        </w:tc>
+        <w:tc>
+          <w:tcPr>
+            <w:tcW w:type="dxa" w:w="4819"/>
+            <w:shd w:val="clear" w:color="auto" w:fill="1F4E79"/>
+          </w:tcPr>
+          <w:p>
+            <w:r/>
+            <w:r>
+              <w:rPr>
+                <w:b/>
+                <w:color w:val="FFFFFF"/>
+                <w:sz w:val="18"/>
+              </w:rPr>
+              <w:t>Contenido</w:t>
+            </w:r>
+          </w:p>
+        </w:tc>
+        <w:tc>
+          <w:tcPr>
+            <w:tcW w:type="dxa" w:w="2835"/>
+            <w:shd w:val="clear" w:color="auto" w:fill="1F4E79"/>
+          </w:tcPr>
+          <w:p>
+            <w:r/>
+            <w:r>
+              <w:rPr>
+                <w:b/>
+                <w:color w:val="FFFFFF"/>
+                <w:sz w:val="18"/>
+              </w:rPr>
+              <w:t>De dónde sale</w:t>
+            </w:r>
+          </w:p>
+        </w:tc>
+      </w:tr>
+      <w:tr>
+        <w:tc>
+          <w:tcPr>
+            <w:tcW w:type="dxa" w:w="1701"/>
+          </w:tcPr>
+          <w:p>
+            <w:r/>
+            <w:r>
+              <w:rPr>
+                <w:sz w:val="18"/>
+              </w:rPr>
+              <w:t>RUT</w:t>
+            </w:r>
+          </w:p>
+        </w:tc>
+        <w:tc>
+          <w:tcPr>
+            <w:tcW w:type="dxa" w:w="4819"/>
+          </w:tcPr>
+          <w:p>
+            <w:r/>
+            <w:r>
+              <w:rPr>
+                <w:sz w:val="18"/>
+              </w:rPr>
+              <w:t>sin puntos, con guion y DV.</w:t>
+            </w:r>
+          </w:p>
+        </w:tc>
+        <w:tc>
+          <w:tcPr>
+            <w:tcW w:type="dxa" w:w="2835"/>
+          </w:tcPr>
+          <w:p>
+            <w:r/>
+            <w:r>
+              <w:rPr>
+                <w:sz w:val="18"/>
+              </w:rPr>
+              <w:t>Usuarios</w:t>
+            </w:r>
+          </w:p>
+        </w:tc>
+      </w:tr>
+      <w:tr>
+        <w:tc>
+          <w:tcPr>
+            <w:tcW w:type="dxa" w:w="1701"/>
+          </w:tcPr>
+          <w:p>
+            <w:r/>
+            <w:r>
+              <w:rPr>
+                <w:sz w:val="18"/>
+              </w:rPr>
+              <w:t>NOMBRE</w:t>
+            </w:r>
+          </w:p>
+        </w:tc>
+        <w:tc>
+          <w:tcPr>
+            <w:tcW w:type="dxa" w:w="4819"/>
+          </w:tcPr>
+          <w:p>
+            <w:r/>
+            <w:r>
+              <w:rPr>
+                <w:sz w:val="18"/>
+              </w:rPr>
+              <w:t>nombre y apellido.</w:t>
+            </w:r>
+          </w:p>
+        </w:tc>
+        <w:tc>
+          <w:tcPr>
+            <w:tcW w:type="dxa" w:w="2835"/>
+          </w:tcPr>
+          <w:p>
+            <w:r/>
+            <w:r>
+              <w:rPr>
+                <w:sz w:val="18"/>
+              </w:rPr>
+              <w:t>Usuarios</w:t>
+            </w:r>
+          </w:p>
+        </w:tc>
+      </w:tr>
+      <w:tr>
+        <w:tc>
+          <w:tcPr>
+            <w:tcW w:type="dxa" w:w="1701"/>
+          </w:tcPr>
+          <w:p>
+            <w:r/>
+            <w:r>
+              <w:rPr>
+                <w:sz w:val="18"/>
+              </w:rPr>
+              <w:t>BANCO / COD BANCO</w:t>
+            </w:r>
+          </w:p>
+        </w:tc>
+        <w:tc>
+          <w:tcPr>
+            <w:tcW w:type="dxa" w:w="4819"/>
+          </w:tcPr>
+          <w:p>
+            <w:r/>
+            <w:r>
+              <w:rPr>
+                <w:sz w:val="18"/>
+              </w:rPr>
+              <w:t>nombre del banco de la ficha y su código SBIF del catálogo (Chile 001, Internacional 009, Estado 012, Scotiabank 014, BCI 016, BICE 028, Santander 037, Itaú 039, Security 049, Falabella 051, Ripley 053, Consorcio 055, Coopeuch 672, Tenpo/Mercado Pago 730).</w:t>
+            </w:r>
+          </w:p>
+        </w:tc>
+        <w:tc>
+          <w:tcPr>
+            <w:tcW w:type="dxa" w:w="2835"/>
+          </w:tcPr>
+          <w:p>
+            <w:r/>
+            <w:r>
+              <w:rPr>
+                <w:sz w:val="18"/>
+              </w:rPr>
+              <w:t>rh_fichas.banco_pago · catálogo BANCO</w:t>
+            </w:r>
+          </w:p>
+        </w:tc>
+      </w:tr>
+      <w:tr>
+        <w:tc>
+          <w:tcPr>
+            <w:tcW w:type="dxa" w:w="1701"/>
+          </w:tcPr>
+          <w:p>
+            <w:r/>
+            <w:r>
+              <w:rPr>
+                <w:sz w:val="18"/>
+              </w:rPr>
+              <w:t>TIPO CUENTA</w:t>
+            </w:r>
+          </w:p>
+        </w:tc>
+        <w:tc>
+          <w:tcPr>
+            <w:tcW w:type="dxa" w:w="4819"/>
+          </w:tcPr>
+          <w:p>
+            <w:r/>
+            <w:r>
+              <w:rPr>
+                <w:sz w:val="18"/>
+              </w:rPr>
+              <w:t>CORRIENTE, VISTA, AHORRO o CUENTA RUT (si el tipo o el banco dicen RUT, el número es el RUT sin DV).</w:t>
+            </w:r>
+          </w:p>
+        </w:tc>
+        <w:tc>
+          <w:tcPr>
+            <w:tcW w:type="dxa" w:w="2835"/>
+          </w:tcPr>
+          <w:p>
+            <w:r/>
+            <w:r>
+              <w:rPr>
+                <w:sz w:val="18"/>
+              </w:rPr>
+              <w:t>rh_fichas.tipo_cuenta_pago</w:t>
+            </w:r>
+          </w:p>
+        </w:tc>
+      </w:tr>
+      <w:tr>
+        <w:tc>
+          <w:tcPr>
+            <w:tcW w:type="dxa" w:w="1701"/>
+          </w:tcPr>
+          <w:p>
+            <w:r/>
+            <w:r>
+              <w:rPr>
+                <w:sz w:val="18"/>
+              </w:rPr>
+              <w:t>N° CUENTA</w:t>
+            </w:r>
+          </w:p>
+        </w:tc>
+        <w:tc>
+          <w:tcPr>
+            <w:tcW w:type="dxa" w:w="4819"/>
+          </w:tcPr>
+          <w:p>
+            <w:r/>
+            <w:r>
+              <w:rPr>
+                <w:sz w:val="18"/>
+              </w:rPr>
+              <w:t>sin puntos, guiones ni espacios.</w:t>
+            </w:r>
+          </w:p>
+        </w:tc>
+        <w:tc>
+          <w:tcPr>
+            <w:tcW w:type="dxa" w:w="2835"/>
+          </w:tcPr>
+          <w:p>
+            <w:r/>
+            <w:r>
+              <w:rPr>
+                <w:sz w:val="18"/>
+              </w:rPr>
+              <w:t>rh_fichas.num_cuenta_pago</w:t>
+            </w:r>
+          </w:p>
+        </w:tc>
+      </w:tr>
+      <w:tr>
+        <w:tc>
+          <w:tcPr>
+            <w:tcW w:type="dxa" w:w="1701"/>
+          </w:tcPr>
+          <w:p>
+            <w:r/>
+            <w:r>
+              <w:rPr>
+                <w:sz w:val="18"/>
+              </w:rPr>
+              <w:t>MONTO</w:t>
+            </w:r>
+          </w:p>
+        </w:tc>
+        <w:tc>
+          <w:tcPr>
+            <w:tcW w:type="dxa" w:w="4819"/>
+          </w:tcPr>
+          <w:p>
+            <w:r/>
+            <w:r>
+              <w:rPr>
+                <w:sz w:val="18"/>
+              </w:rPr>
+              <w:t>líquido a pagar de la liquidación emitida (cap. 15.1). Líquido 0 se omite con aviso.</w:t>
+            </w:r>
+          </w:p>
+        </w:tc>
+        <w:tc>
+          <w:tcPr>
+            <w:tcW w:type="dxa" w:w="2835"/>
+          </w:tcPr>
+          <w:p>
+            <w:r/>
+            <w:r>
+              <w:rPr>
+                <w:sz w:val="18"/>
+              </w:rPr>
+              <w:t>rh_liquidaciones.liquido</w:t>
+            </w:r>
+          </w:p>
+        </w:tc>
+      </w:tr>
+      <w:tr>
+        <w:tc>
+          <w:tcPr>
+            <w:tcW w:type="dxa" w:w="1701"/>
+          </w:tcPr>
+          <w:p>
+            <w:r/>
+            <w:r>
+              <w:rPr>
+                <w:sz w:val="18"/>
+              </w:rPr>
+              <w:t>EMAIL / GLOSA</w:t>
+            </w:r>
+          </w:p>
+        </w:tc>
+        <w:tc>
+          <w:tcPr>
+            <w:tcW w:type="dxa" w:w="4819"/>
+          </w:tcPr>
+          <w:p>
+            <w:r/>
+            <w:r>
+              <w:rPr>
+                <w:sz w:val="18"/>
+              </w:rPr>
+              <w:t>correo del colaborador y "SUELDO AAAA-MM".</w:t>
+            </w:r>
+          </w:p>
+        </w:tc>
+        <w:tc>
+          <w:tcPr>
+            <w:tcW w:type="dxa" w:w="2835"/>
+          </w:tcPr>
+          <w:p>
+            <w:r/>
+            <w:r>
+              <w:rPr>
+                <w:sz w:val="18"/>
+              </w:rPr>
+              <w:t>Usuarios</w:t>
+            </w:r>
+          </w:p>
+        </w:tc>
+      </w:tr>
+      <w:tr>
+        <w:tc>
+          <w:tcPr>
+            <w:tcW w:type="dxa" w:w="1701"/>
+          </w:tcPr>
+          <w:p>
+            <w:r/>
+            <w:r>
+              <w:rPr>
+                <w:sz w:val="18"/>
+              </w:rPr>
+              <w:t>Avisos previos</w:t>
+            </w:r>
+          </w:p>
+        </w:tc>
+        <w:tc>
+          <w:tcPr>
+            <w:tcW w:type="dxa" w:w="4819"/>
+          </w:tcPr>
+          <w:p>
+            <w:r/>
+            <w:r>
+              <w:rPr>
+                <w:sz w:val="18"/>
+              </w:rPr>
+              <w:t>falta banco o cuenta, banco sin código SBIF: corregir en Colaboradores → Previsión y Pago antes de pagar.</w:t>
+            </w:r>
+          </w:p>
+        </w:tc>
+        <w:tc>
+          <w:tcPr>
+            <w:tcW w:type="dxa" w:w="2835"/>
+          </w:tcPr>
+          <w:p>
+            <w:r/>
+            <w:r>
+              <w:rPr>
+                <w:sz w:val="18"/>
+              </w:rPr>
+              <w:t>pantalla</w:t>
+            </w:r>
+          </w:p>
+        </w:tc>
+      </w:tr>
+      <w:tr>
+        <w:tc>
+          <w:tcPr>
+            <w:tcW w:type="dxa" w:w="1701"/>
+          </w:tcPr>
+          <w:p>
+            <w:r/>
+            <w:r>
+              <w:rPr>
+                <w:sz w:val="18"/>
+              </w:rPr>
+              <w:t>Quién lo usa</w:t>
+            </w:r>
+          </w:p>
+        </w:tc>
+        <w:tc>
+          <w:tcPr>
+            <w:tcW w:type="dxa" w:w="4819"/>
+          </w:tcPr>
+          <w:p>
+            <w:r/>
+            <w:r>
+              <w:rPr>
+                <w:sz w:val="18"/>
+              </w:rPr>
+              <w:t>Tesorería lo carga en el portal del banco como pago masivo. Los anticipos ya pagados por TEF (cap. 14) no vuelven a salir: su descuento ya rebajó el líquido.</w:t>
+            </w:r>
+          </w:p>
+        </w:tc>
+        <w:tc>
+          <w:tcPr>
+            <w:tcW w:type="dxa" w:w="2835"/>
+          </w:tcPr>
+          <w:p>
+            <w:r/>
+            <w:r>
+              <w:rPr>
+                <w:sz w:val="18"/>
+              </w:rPr>
+              <w:t>Tesorería</w:t>
+            </w:r>
+          </w:p>
+        </w:tc>
+      </w:tr>
+      <w:tr>
+        <w:tc>
+          <w:tcPr>
+            <w:tcW w:type="dxa" w:w="1701"/>
+          </w:tcPr>
+          <w:p>
+            <w:r/>
+            <w:r>
+              <w:rPr>
+                <w:sz w:val="18"/>
+              </w:rPr>
+              <w:t>Cuadratura</w:t>
+            </w:r>
+          </w:p>
+        </w:tc>
+        <w:tc>
+          <w:tcPr>
+            <w:tcW w:type="dxa" w:w="4819"/>
+          </w:tcPr>
+          <w:p>
+            <w:r/>
+            <w:r>
+              <w:rPr>
+                <w:sz w:val="18"/>
+              </w:rPr>
+              <w:t>Σ MONTO del CSV = Σ líquidos del libro emitido = total de la Nómina Banco que muestra el mensaje de descarga. La liquidación impresa lleva la misma cuenta al pie.</w:t>
+            </w:r>
+          </w:p>
+        </w:tc>
+        <w:tc>
+          <w:tcPr>
+            <w:tcW w:type="dxa" w:w="2835"/>
+          </w:tcPr>
+          <w:p>
+            <w:r/>
+            <w:r>
+              <w:rPr>
+                <w:sz w:val="18"/>
+              </w:rPr>
+            </w:r>
+          </w:p>
+        </w:tc>
+      </w:tr>
+    </w:tbl>
+    <w:p>
+      <w:pPr>
+        <w:spacing w:after="40"/>
+      </w:pPr>
+    </w:p>
+    <w:tbl>
+      <w:tblPr>
+        <w:tblStyle w:val="TableGrid"/>
+        <w:tblW w:type="auto" w:w="0"/>
+        <w:jc w:val="center"/>
+        <w:tblLook w:firstColumn="1" w:firstRow="1" w:lastColumn="0" w:lastRow="0" w:noHBand="0" w:noVBand="1" w:val="04A0"/>
+      </w:tblPr>
+      <w:tblGrid>
+        <w:gridCol w:w="4873"/>
+        <w:gridCol w:w="4873"/>
+      </w:tblGrid>
+      <w:tr>
+        <w:tc>
+          <w:tcPr>
+            <w:tcW w:type="dxa" w:w="1701"/>
+            <w:shd w:val="clear" w:color="auto" w:fill="1F4E79"/>
+          </w:tcPr>
+          <w:p>
+            <w:r/>
+            <w:r>
+              <w:rPr>
+                <w:b/>
+                <w:color w:val="FFFFFF"/>
+                <w:sz w:val="18"/>
+              </w:rPr>
+              <w:t>Ejemplo de fila</w:t>
+            </w:r>
+          </w:p>
+        </w:tc>
+        <w:tc>
+          <w:tcPr>
+            <w:tcW w:type="dxa" w:w="7654"/>
+            <w:shd w:val="clear" w:color="auto" w:fill="1F4E79"/>
+          </w:tcPr>
+          <w:p>
+            <w:r/>
+            <w:r>
+              <w:rPr>
+                <w:b/>
+                <w:color w:val="FFFFFF"/>
+                <w:sz w:val="18"/>
+              </w:rPr>
+              <w:t>12345678-9;Maria Jose Gonzalez;BANCO SANTANDER;037;CORRIENTE;0001234567;1223035;mgonzalez@autofacilchile.cl;SUELDO 2026-09</w:t>
+            </w:r>
+          </w:p>
+        </w:tc>
+      </w:tr>
+    </w:tbl>
+    <w:p>
+      <w:pPr>
+        <w:spacing w:after="40"/>
+      </w:pPr>
+    </w:p>
+    <w:tbl>
+      <w:tblPr>
+        <w:tblStyle w:val="TableGrid"/>
+        <w:tblW w:type="auto" w:w="0"/>
+        <w:tblLook w:firstColumn="1" w:firstRow="1" w:lastColumn="0" w:lastRow="0" w:noHBand="0" w:noVBand="1" w:val="04A0"/>
+      </w:tblPr>
+      <w:tblGrid>
+        <w:gridCol w:w="9746"/>
+      </w:tblGrid>
+      <w:tr>
+        <w:tc>
+          <w:tcPr>
+            <w:tcW w:type="dxa" w:w="9746"/>
+            <w:shd w:val="clear" w:color="auto" w:fill="E8F0F8"/>
+          </w:tcPr>
+          <w:p>
+            <w:r/>
+            <w:r>
+              <w:rPr>
+                <w:b/>
+                <w:sz w:val="19"/>
+              </w:rPr>
+              <w:t>🔒 Cómo cuadrar a mano</w:t>
+              <w:br/>
+            </w:r>
+            <w:r>
+              <w:rPr>
+                <w:sz w:val="19"/>
+              </w:rPr>
+              <w:t>Previred: por persona, renta imponible = base de cotización de la liquidación; AFP = renta × tasa de su AFP; salud = 7%; AFC = 0,6% / 2,4% (o 3%) solo si es indefinida; mutual = 0,96% (0,93 + 0,03 SANNA); SIS = 1,88%. La suma del archivo debe coincidir con los pasivos previsionales del asiento de remuneraciones del mes. Nómina Banco: total = suma de líquidos; si difiere, alguien quedó omitido por líquido 0 o faltó una cuenta (ver avisos).</w:t>
             </w:r>
           </w:p>
         </w:tc>

</xml_diff>

<commit_message>
docs: Manual de RRHH v3.1 — LRE código a código con fila de ejemplo (cap. 15.5) y certificado de antigüedad: reglas, texto, folio y QR (cap. 23.1); documentación v4.1 (v256.1)
Co-Authored-By: Claude Fable 5.1 <noreply@anthropic.com>
</commit_message>
<xml_diff>
--- a/api-gateway/public/mantenedores/documentacion/descargas/Manual-RRHH-Business-Suite.docx
+++ b/api-gateway/public/mantenedores/documentacion/descargas/Manual-RRHH-Business-Suite.docx
@@ -236,7 +236,7 @@
           <w:i w:val="0"/>
           <w:sz w:val="22"/>
         </w:rPr>
-        <w:t>Versión 3.0 · 17 de septiembre de 2026 · Suite v256.0</w:t>
+        <w:t>Versión 3.1 · 17 de septiembre de 2026 · Suite v256.1</w:t>
       </w:r>
     </w:p>
     <w:p>
@@ -1042,6 +1042,64 @@
                 <w:sz w:val="18"/>
               </w:rPr>
               <w:t>Cap. 15.4: Archivo Previred (105 campos, movimientos, códigos) y Nómina Banco (CSV) con ejemplo de línea.</w:t>
+            </w:r>
+          </w:p>
+        </w:tc>
+      </w:tr>
+      <w:tr>
+        <w:tc>
+          <w:tcPr>
+            <w:tcW w:type="dxa" w:w="907"/>
+          </w:tcPr>
+          <w:p>
+            <w:r/>
+            <w:r>
+              <w:rPr>
+                <w:sz w:val="18"/>
+              </w:rPr>
+              <w:t>3.1</w:t>
+            </w:r>
+          </w:p>
+        </w:tc>
+        <w:tc>
+          <w:tcPr>
+            <w:tcW w:type="dxa" w:w="1247"/>
+          </w:tcPr>
+          <w:p>
+            <w:r/>
+            <w:r>
+              <w:rPr>
+                <w:sz w:val="18"/>
+              </w:rPr>
+              <w:t>17-09-2026</w:t>
+            </w:r>
+          </w:p>
+        </w:tc>
+        <w:tc>
+          <w:tcPr>
+            <w:tcW w:type="dxa" w:w="2041"/>
+          </w:tcPr>
+          <w:p>
+            <w:r/>
+            <w:r>
+              <w:rPr>
+                <w:sz w:val="18"/>
+              </w:rPr>
+              <w:t>Patricio Escobar / Claude</w:t>
+            </w:r>
+          </w:p>
+        </w:tc>
+        <w:tc>
+          <w:tcPr>
+            <w:tcW w:type="dxa" w:w="5159"/>
+          </w:tcPr>
+          <w:p>
+            <w:r/>
+            <w:r>
+              <w:rPr>
+                <w:sz w:val="18"/>
+              </w:rPr>
+              <w:t>Cap. 15.5: LRE código a código con fila de ejemplo; cap. 23.1: certificado de antigüedad (reglas, texto, folio y QR).</w:t>
             </w:r>
           </w:p>
         </w:tc>
@@ -20931,6 +20989,1259 @@
                 <w:sz w:val="19"/>
               </w:rPr>
               <w:t>Previred: por persona, renta imponible = base de cotización de la liquidación; AFP = renta × tasa de su AFP; salud = 7%; AFC = 0,6% / 2,4% (o 3%) solo si es indefinida; mutual = 0,96% (0,93 + 0,03 SANNA); SIS = 1,88%. La suma del archivo debe coincidir con los pasivos previsionales del asiento de remuneraciones del mes. Nómina Banco: total = suma de líquidos; si difiere, alguien quedó omitido por líquido 0 o faltó una cuenta (ver avisos).</w:t>
+            </w:r>
+          </w:p>
+        </w:tc>
+      </w:tr>
+    </w:tbl>
+    <w:p>
+      <w:pPr>
+        <w:spacing w:after="40"/>
+      </w:pPr>
+    </w:p>
+    <w:p>
+      <w:pPr>
+        <w:pStyle w:val="Heading3"/>
+      </w:pPr>
+      <w:r>
+        <w:t>15.5 LRE — Libro de Remuneraciones Electrónico</w:t>
+      </w:r>
+    </w:p>
+    <w:p>
+      <w:pPr>
+        <w:spacing w:after="80"/>
+      </w:pPr>
+      <w:r>
+        <w:rPr>
+          <w:b w:val="0"/>
+          <w:i w:val="0"/>
+        </w:rPr>
+        <w:t>Obligación mensual ante la Dirección del Trabajo (Ley 21.327): un CSV con los códigos del Manual LRE, un trabajador por fila. Vive en Contabilidad → LRE (permiso ctb_lre; Administrador, Contabilidad y Tesorería) y se arma solo desde el libro EMITIDO; si el mes no está emitido en el motor, cae al auxiliar de AVSOFT (referencial, sin desglose fino).</w:t>
+      </w:r>
+    </w:p>
+    <w:tbl>
+      <w:tblPr>
+        <w:tblStyle w:val="TableGrid"/>
+        <w:tblW w:type="auto" w:w="0"/>
+        <w:jc w:val="center"/>
+        <w:tblLook w:firstColumn="1" w:firstRow="1" w:lastColumn="0" w:lastRow="0" w:noHBand="0" w:noVBand="1" w:val="04A0"/>
+      </w:tblPr>
+      <w:tblGrid>
+        <w:gridCol w:w="3249"/>
+        <w:gridCol w:w="3249"/>
+        <w:gridCol w:w="3249"/>
+      </w:tblGrid>
+      <w:tr>
+        <w:tc>
+          <w:tcPr>
+            <w:tcW w:type="dxa" w:w="2041"/>
+            <w:shd w:val="clear" w:color="auto" w:fill="1F4E79"/>
+          </w:tcPr>
+          <w:p>
+            <w:r/>
+            <w:r>
+              <w:rPr>
+                <w:b/>
+                <w:color w:val="FFFFFF"/>
+                <w:sz w:val="18"/>
+              </w:rPr>
+              <w:t>Bloque / códigos</w:t>
+            </w:r>
+          </w:p>
+        </w:tc>
+        <w:tc>
+          <w:tcPr>
+            <w:tcW w:type="dxa" w:w="5329"/>
+            <w:shd w:val="clear" w:color="auto" w:fill="1F4E79"/>
+          </w:tcPr>
+          <w:p>
+            <w:r/>
+            <w:r>
+              <w:rPr>
+                <w:b/>
+                <w:color w:val="FFFFFF"/>
+                <w:sz w:val="18"/>
+              </w:rPr>
+              <w:t>Contenido</w:t>
+            </w:r>
+          </w:p>
+        </w:tc>
+        <w:tc>
+          <w:tcPr>
+            <w:tcW w:type="dxa" w:w="1984"/>
+            <w:shd w:val="clear" w:color="auto" w:fill="1F4E79"/>
+          </w:tcPr>
+          <w:p>
+            <w:r/>
+            <w:r>
+              <w:rPr>
+                <w:b/>
+                <w:color w:val="FFFFFF"/>
+                <w:sz w:val="18"/>
+              </w:rPr>
+              <w:t>De dónde sale</w:t>
+            </w:r>
+          </w:p>
+        </w:tc>
+      </w:tr>
+      <w:tr>
+        <w:tc>
+          <w:tcPr>
+            <w:tcW w:type="dxa" w:w="2041"/>
+          </w:tcPr>
+          <w:p>
+            <w:r/>
+            <w:r>
+              <w:rPr>
+                <w:sz w:val="18"/>
+              </w:rPr>
+              <w:t>1101–1152 identificación</w:t>
+            </w:r>
+          </w:p>
+        </w:tc>
+        <w:tc>
+          <w:tcPr>
+            <w:tcW w:type="dxa" w:w="5329"/>
+          </w:tcPr>
+          <w:p>
+            <w:r/>
+            <w:r>
+              <w:rPr>
+                <w:sz w:val="18"/>
+              </w:rPr>
+              <w:t>RUT (1101), fecha de ingreso dd/mm/aaaa (1102), tipo de contrato 13 indefinido (1105), régimen previsional 13114 (1106), tipo de trabajador 1 activo (1170), AFP según Tabla N°9 (1141: Provida 6, PlanVital 11, Cuprum 13, Habitat 14, Uno 19, Capital 31, Modelo 103; 100 si no calza), salud Tabla N°11 (1143: Fonasa 102, Cruz Blanca 1, Banmédica 3, Colmena 4, Consalud 9, Vida Tres 12, Nueva Masvida 43, Esencial 44), jornada 1, tipo de línea 1, técnico 2.</w:t>
+            </w:r>
+          </w:p>
+        </w:tc>
+        <w:tc>
+          <w:tcPr>
+            <w:tcW w:type="dxa" w:w="1984"/>
+          </w:tcPr>
+          <w:p>
+            <w:r/>
+            <w:r>
+              <w:rPr>
+                <w:sz w:val="18"/>
+              </w:rPr>
+              <w:t>Usuarios · ficha · detalle de la liquidación</w:t>
+            </w:r>
+          </w:p>
+        </w:tc>
+      </w:tr>
+      <w:tr>
+        <w:tc>
+          <w:tcPr>
+            <w:tcW w:type="dxa" w:w="2041"/>
+          </w:tcPr>
+          <w:p>
+            <w:r/>
+            <w:r>
+              <w:rPr>
+                <w:sz w:val="18"/>
+              </w:rPr>
+              <w:t>1115–1131 tiempo</w:t>
+            </w:r>
+          </w:p>
+        </w:tc>
+        <w:tc>
+          <w:tcPr>
+            <w:tcW w:type="dxa" w:w="5329"/>
+          </w:tcPr>
+          <w:p>
+            <w:r/>
+            <w:r>
+              <w:rPr>
+                <w:sz w:val="18"/>
+              </w:rPr>
+              <w:t>días trabajados (1115), días de licencia médica corridos en el mes (1116, tope 30), y ceros en 1118/1155/1157/1131.</w:t>
+            </w:r>
+          </w:p>
+        </w:tc>
+        <w:tc>
+          <w:tcPr>
+            <w:tcW w:type="dxa" w:w="1984"/>
+          </w:tcPr>
+          <w:p>
+            <w:r/>
+            <w:r>
+              <w:rPr>
+                <w:sz w:val="18"/>
+              </w:rPr>
+              <w:t>liquidación · rh_ausencias</w:t>
+            </w:r>
+          </w:p>
+        </w:tc>
+      </w:tr>
+      <w:tr>
+        <w:tc>
+          <w:tcPr>
+            <w:tcW w:type="dxa" w:w="2041"/>
+          </w:tcPr>
+          <w:p>
+            <w:r/>
+            <w:r>
+              <w:rPr>
+                <w:sz w:val="18"/>
+              </w:rPr>
+              <w:t>2101–2113 haberes imponibles</w:t>
+            </w:r>
+          </w:p>
+        </w:tc>
+        <w:tc>
+          <w:tcPr>
+            <w:tcW w:type="dxa" w:w="5329"/>
+          </w:tcPr>
+          <w:p>
+            <w:r/>
+            <w:r>
+              <w:rPr>
+                <w:sz w:val="18"/>
+              </w:rPr>
+              <w:t>sueldo base (2101), comisiones (2103), gratificación (2106), otros imponibles (2113).</w:t>
+            </w:r>
+          </w:p>
+        </w:tc>
+        <w:tc>
+          <w:tcPr>
+            <w:tcW w:type="dxa" w:w="1984"/>
+          </w:tcPr>
+          <w:p>
+            <w:r/>
+            <w:r>
+              <w:rPr>
+                <w:sz w:val="18"/>
+              </w:rPr>
+              <w:t>detalle</w:t>
+            </w:r>
+          </w:p>
+        </w:tc>
+      </w:tr>
+      <w:tr>
+        <w:tc>
+          <w:tcPr>
+            <w:tcW w:type="dxa" w:w="2041"/>
+          </w:tcPr>
+          <w:p>
+            <w:r/>
+            <w:r>
+              <w:rPr>
+                <w:sz w:val="18"/>
+              </w:rPr>
+              <w:t>2301–2306 no imponibles</w:t>
+            </w:r>
+          </w:p>
+        </w:tc>
+        <w:tc>
+          <w:tcPr>
+            <w:tcW w:type="dxa" w:w="5329"/>
+          </w:tcPr>
+          <w:p>
+            <w:r/>
+            <w:r>
+              <w:rPr>
+                <w:sz w:val="18"/>
+              </w:rPr>
+              <w:t>colación (2301), movilización (2302), otros no imponibles (2306).</w:t>
+            </w:r>
+          </w:p>
+        </w:tc>
+        <w:tc>
+          <w:tcPr>
+            <w:tcW w:type="dxa" w:w="1984"/>
+          </w:tcPr>
+          <w:p>
+            <w:r/>
+            <w:r>
+              <w:rPr>
+                <w:sz w:val="18"/>
+              </w:rPr>
+              <w:t>detalle</w:t>
+            </w:r>
+          </w:p>
+        </w:tc>
+      </w:tr>
+      <w:tr>
+        <w:tc>
+          <w:tcPr>
+            <w:tcW w:type="dxa" w:w="2041"/>
+          </w:tcPr>
+          <w:p>
+            <w:r/>
+            <w:r>
+              <w:rPr>
+                <w:sz w:val="18"/>
+              </w:rPr>
+              <w:t>3141–3183 descuentos</w:t>
+            </w:r>
+          </w:p>
+        </w:tc>
+        <w:tc>
+          <w:tcPr>
+            <w:tcW w:type="dxa" w:w="5329"/>
+          </w:tcPr>
+          <w:p>
+            <w:r/>
+            <w:r>
+              <w:rPr>
+                <w:sz w:val="18"/>
+              </w:rPr>
+              <w:t>AFP (3141), salud 7% (3143), adicional Isapre (3144), AFC (3151), impuesto único (3161), otros descuentos (3183).</w:t>
+            </w:r>
+          </w:p>
+        </w:tc>
+        <w:tc>
+          <w:tcPr>
+            <w:tcW w:type="dxa" w:w="1984"/>
+          </w:tcPr>
+          <w:p>
+            <w:r/>
+            <w:r>
+              <w:rPr>
+                <w:sz w:val="18"/>
+              </w:rPr>
+              <w:t>detalle</w:t>
+            </w:r>
+          </w:p>
+        </w:tc>
+      </w:tr>
+      <w:tr>
+        <w:tc>
+          <w:tcPr>
+            <w:tcW w:type="dxa" w:w="2041"/>
+          </w:tcPr>
+          <w:p>
+            <w:r/>
+            <w:r>
+              <w:rPr>
+                <w:sz w:val="18"/>
+              </w:rPr>
+              <w:t>4151–4155 aportes empleador</w:t>
+            </w:r>
+          </w:p>
+        </w:tc>
+        <w:tc>
+          <w:tcPr>
+            <w:tcW w:type="dxa" w:w="5329"/>
+          </w:tcPr>
+          <w:p>
+            <w:r/>
+            <w:r>
+              <w:rPr>
+                <w:sz w:val="18"/>
+              </w:rPr>
+              <w:t>AFC empleador (4151), mutual + SANNA (4152: la DT los declara juntos), SIS (4155).</w:t>
+            </w:r>
+          </w:p>
+        </w:tc>
+        <w:tc>
+          <w:tcPr>
+            <w:tcW w:type="dxa" w:w="1984"/>
+          </w:tcPr>
+          <w:p>
+            <w:r/>
+            <w:r>
+              <w:rPr>
+                <w:sz w:val="18"/>
+              </w:rPr>
+              <w:t>detalle</w:t>
+            </w:r>
+          </w:p>
+        </w:tc>
+      </w:tr>
+      <w:tr>
+        <w:tc>
+          <w:tcPr>
+            <w:tcW w:type="dxa" w:w="2041"/>
+          </w:tcPr>
+          <w:p>
+            <w:r/>
+            <w:r>
+              <w:rPr>
+                <w:sz w:val="18"/>
+              </w:rPr>
+              <w:t>5201–5564 totales</w:t>
+            </w:r>
+          </w:p>
+        </w:tc>
+        <w:tc>
+          <w:tcPr>
+            <w:tcW w:type="dxa" w:w="5329"/>
+          </w:tcPr>
+          <w:p>
+            <w:r/>
+            <w:r>
+              <w:rPr>
+                <w:sz w:val="18"/>
+              </w:rPr>
+              <w:t>total haberes (5201), imponible (5210), no imponible (5230), total descuentos (5301), impuesto (5361), cotizaciones (5341 = AFP + salud + adicional + AFC), otros descuentos (5302 = descuentos − impuesto − cotizaciones), aportes (5410), líquido (5501).</w:t>
+            </w:r>
+          </w:p>
+        </w:tc>
+        <w:tc>
+          <w:tcPr>
+            <w:tcW w:type="dxa" w:w="1984"/>
+          </w:tcPr>
+          <w:p>
+            <w:r/>
+            <w:r>
+              <w:rPr>
+                <w:sz w:val="18"/>
+              </w:rPr>
+              <w:t>detalle</w:t>
+            </w:r>
+          </w:p>
+        </w:tc>
+      </w:tr>
+      <w:tr>
+        <w:tc>
+          <w:tcPr>
+            <w:tcW w:type="dxa" w:w="2041"/>
+          </w:tcPr>
+          <w:p>
+            <w:r/>
+            <w:r>
+              <w:rPr>
+                <w:sz w:val="18"/>
+              </w:rPr>
+              <w:t>Archivo</w:t>
+            </w:r>
+          </w:p>
+        </w:tc>
+        <w:tc>
+          <w:tcPr>
+            <w:tcW w:type="dxa" w:w="5329"/>
+          </w:tcPr>
+          <w:p>
+            <w:r/>
+            <w:r>
+              <w:rPr>
+                <w:sz w:val="18"/>
+              </w:rPr>
+              <w:t>CSV nombrado &lt;RUT empresa&gt;_AAAAMM.csv; solo se incluyen las columnas que la empresa usa más las obligatorias (49 códigos).</w:t>
+            </w:r>
+          </w:p>
+        </w:tc>
+        <w:tc>
+          <w:tcPr>
+            <w:tcW w:type="dxa" w:w="1984"/>
+          </w:tcPr>
+          <w:p>
+            <w:r/>
+            <w:r>
+              <w:rPr>
+                <w:sz w:val="18"/>
+              </w:rPr>
+              <w:t>LRE_COLS</w:t>
+            </w:r>
+          </w:p>
+        </w:tc>
+      </w:tr>
+      <w:tr>
+        <w:tc>
+          <w:tcPr>
+            <w:tcW w:type="dxa" w:w="2041"/>
+          </w:tcPr>
+          <w:p>
+            <w:r/>
+            <w:r>
+              <w:rPr>
+                <w:sz w:val="18"/>
+              </w:rPr>
+              <w:t>Cuadratura</w:t>
+            </w:r>
+          </w:p>
+        </w:tc>
+        <w:tc>
+          <w:tcPr>
+            <w:tcW w:type="dxa" w:w="5329"/>
+          </w:tcPr>
+          <w:p>
+            <w:r/>
+            <w:r>
+              <w:rPr>
+                <w:sz w:val="18"/>
+              </w:rPr>
+              <w:t>5201 = 5210 + 5230 · 5301 = 5341 + 5361 + 5302 · 5501 = 5201 − 5301. Los totales del LRE deben calzar con el asiento de remuneraciones, el F29 (impuesto código 048 = Σ 3161) y el Archivo Previred (Σ 3141/3143/3151 y 4151/4152/4155).</w:t>
+            </w:r>
+          </w:p>
+        </w:tc>
+        <w:tc>
+          <w:tcPr>
+            <w:tcW w:type="dxa" w:w="1984"/>
+          </w:tcPr>
+          <w:p>
+            <w:r/>
+            <w:r>
+              <w:rPr>
+                <w:sz w:val="18"/>
+              </w:rPr>
+              <w:t>Cierre de Mes</w:t>
+            </w:r>
+          </w:p>
+        </w:tc>
+      </w:tr>
+      <w:tr>
+        <w:tc>
+          <w:tcPr>
+            <w:tcW w:type="dxa" w:w="2041"/>
+          </w:tcPr>
+          <w:p>
+            <w:r/>
+            <w:r>
+              <w:rPr>
+                <w:sz w:val="18"/>
+              </w:rPr>
+              <w:t>Cuándo</w:t>
+            </w:r>
+          </w:p>
+        </w:tc>
+        <w:tc>
+          <w:tcPr>
+            <w:tcW w:type="dxa" w:w="5329"/>
+          </w:tcPr>
+          <w:p>
+            <w:r/>
+            <w:r>
+              <w:rPr>
+                <w:sz w:val="18"/>
+              </w:rPr>
+              <w:t>con el mes emitido, antes del plazo de la DT (día 15 del mes siguiente). Se sube en el portal Mi DT → LRE.</w:t>
+            </w:r>
+          </w:p>
+        </w:tc>
+        <w:tc>
+          <w:tcPr>
+            <w:tcW w:type="dxa" w:w="1984"/>
+          </w:tcPr>
+          <w:p>
+            <w:r/>
+            <w:r>
+              <w:rPr>
+                <w:sz w:val="18"/>
+              </w:rPr>
+              <w:t>Contabilidad</w:t>
+            </w:r>
+          </w:p>
+        </w:tc>
+      </w:tr>
+    </w:tbl>
+    <w:p>
+      <w:pPr>
+        <w:spacing w:after="40"/>
+      </w:pPr>
+    </w:p>
+    <w:p>
+      <w:pPr>
+        <w:spacing w:after="40"/>
+      </w:pPr>
+      <w:r>
+        <w:rPr>
+          <w:b/>
+          <w:i w:val="0"/>
+          <w:color w:val="1F4E79"/>
+        </w:rPr>
+        <w:t>Ejemplo: fila de la colaboradora del cap. 15.1 (septiembre 2026)</w:t>
+      </w:r>
+    </w:p>
+    <w:tbl>
+      <w:tblPr>
+        <w:tblStyle w:val="TableGrid"/>
+        <w:tblW w:type="auto" w:w="0"/>
+        <w:jc w:val="center"/>
+        <w:tblLook w:firstColumn="1" w:firstRow="1" w:lastColumn="0" w:lastRow="0" w:noHBand="0" w:noVBand="1" w:val="04A0"/>
+      </w:tblPr>
+      <w:tblGrid>
+        <w:gridCol w:w="2436"/>
+        <w:gridCol w:w="2436"/>
+        <w:gridCol w:w="2436"/>
+        <w:gridCol w:w="2436"/>
+      </w:tblGrid>
+      <w:tr>
+        <w:tc>
+          <w:tcPr>
+            <w:tcW w:type="dxa" w:w="2154"/>
+            <w:shd w:val="clear" w:color="auto" w:fill="1F4E79"/>
+          </w:tcPr>
+          <w:p>
+            <w:r/>
+            <w:r>
+              <w:rPr>
+                <w:b/>
+                <w:color w:val="FFFFFF"/>
+                <w:sz w:val="18"/>
+              </w:rPr>
+              <w:t>Código</w:t>
+            </w:r>
+          </w:p>
+        </w:tc>
+        <w:tc>
+          <w:tcPr>
+            <w:tcW w:type="dxa" w:w="2494"/>
+            <w:shd w:val="clear" w:color="auto" w:fill="1F4E79"/>
+          </w:tcPr>
+          <w:p>
+            <w:r/>
+            <w:r>
+              <w:rPr>
+                <w:b/>
+                <w:color w:val="FFFFFF"/>
+                <w:sz w:val="18"/>
+              </w:rPr>
+              <w:t>Valor</w:t>
+            </w:r>
+          </w:p>
+        </w:tc>
+        <w:tc>
+          <w:tcPr>
+            <w:tcW w:type="dxa" w:w="2154"/>
+            <w:shd w:val="clear" w:color="auto" w:fill="1F4E79"/>
+          </w:tcPr>
+          <w:p>
+            <w:r/>
+            <w:r>
+              <w:rPr>
+                <w:b/>
+                <w:color w:val="FFFFFF"/>
+                <w:sz w:val="18"/>
+              </w:rPr>
+              <w:t>Código</w:t>
+            </w:r>
+          </w:p>
+        </w:tc>
+        <w:tc>
+          <w:tcPr>
+            <w:tcW w:type="dxa" w:w="2551"/>
+            <w:shd w:val="clear" w:color="auto" w:fill="1F4E79"/>
+          </w:tcPr>
+          <w:p>
+            <w:r/>
+            <w:r>
+              <w:rPr>
+                <w:b/>
+                <w:color w:val="FFFFFF"/>
+                <w:sz w:val="18"/>
+              </w:rPr>
+              <w:t>Valor</w:t>
+            </w:r>
+          </w:p>
+        </w:tc>
+      </w:tr>
+      <w:tr>
+        <w:tc>
+          <w:tcPr>
+            <w:tcW w:type="dxa" w:w="2154"/>
+          </w:tcPr>
+          <w:p>
+            <w:r/>
+            <w:r>
+              <w:rPr>
+                <w:sz w:val="18"/>
+              </w:rPr>
+              <w:t>1101 / 1102</w:t>
+            </w:r>
+          </w:p>
+        </w:tc>
+        <w:tc>
+          <w:tcPr>
+            <w:tcW w:type="dxa" w:w="2494"/>
+          </w:tcPr>
+          <w:p>
+            <w:r/>
+            <w:r>
+              <w:rPr>
+                <w:sz w:val="18"/>
+              </w:rPr>
+              <w:t>12345678-9 / 01/03/2021</w:t>
+            </w:r>
+          </w:p>
+        </w:tc>
+        <w:tc>
+          <w:tcPr>
+            <w:tcW w:type="dxa" w:w="2154"/>
+          </w:tcPr>
+          <w:p>
+            <w:r/>
+            <w:r>
+              <w:rPr>
+                <w:sz w:val="18"/>
+              </w:rPr>
+              <w:t>1105 / 1106 / 1170</w:t>
+            </w:r>
+          </w:p>
+        </w:tc>
+        <w:tc>
+          <w:tcPr>
+            <w:tcW w:type="dxa" w:w="2551"/>
+          </w:tcPr>
+          <w:p>
+            <w:r/>
+            <w:r>
+              <w:rPr>
+                <w:sz w:val="18"/>
+              </w:rPr>
+              <w:t>13 / 13114 / 1</w:t>
+            </w:r>
+          </w:p>
+        </w:tc>
+      </w:tr>
+      <w:tr>
+        <w:tc>
+          <w:tcPr>
+            <w:tcW w:type="dxa" w:w="2154"/>
+          </w:tcPr>
+          <w:p>
+            <w:r/>
+            <w:r>
+              <w:rPr>
+                <w:sz w:val="18"/>
+              </w:rPr>
+              <w:t>1141 / 1143</w:t>
+            </w:r>
+          </w:p>
+        </w:tc>
+        <w:tc>
+          <w:tcPr>
+            <w:tcW w:type="dxa" w:w="2494"/>
+          </w:tcPr>
+          <w:p>
+            <w:r/>
+            <w:r>
+              <w:rPr>
+                <w:sz w:val="18"/>
+              </w:rPr>
+              <w:t>103 (Modelo) / 102 (Fonasa)</w:t>
+            </w:r>
+          </w:p>
+        </w:tc>
+        <w:tc>
+          <w:tcPr>
+            <w:tcW w:type="dxa" w:w="2154"/>
+          </w:tcPr>
+          <w:p>
+            <w:r/>
+            <w:r>
+              <w:rPr>
+                <w:sz w:val="18"/>
+              </w:rPr>
+              <w:t>1115 / 1116</w:t>
+            </w:r>
+          </w:p>
+        </w:tc>
+        <w:tc>
+          <w:tcPr>
+            <w:tcW w:type="dxa" w:w="2551"/>
+          </w:tcPr>
+          <w:p>
+            <w:r/>
+            <w:r>
+              <w:rPr>
+                <w:sz w:val="18"/>
+              </w:rPr>
+              <w:t>30 / (vacío)</w:t>
+            </w:r>
+          </w:p>
+        </w:tc>
+      </w:tr>
+      <w:tr>
+        <w:tc>
+          <w:tcPr>
+            <w:tcW w:type="dxa" w:w="2154"/>
+          </w:tcPr>
+          <w:p>
+            <w:r/>
+            <w:r>
+              <w:rPr>
+                <w:sz w:val="18"/>
+              </w:rPr>
+              <w:t>2101 sueldo</w:t>
+            </w:r>
+          </w:p>
+        </w:tc>
+        <w:tc>
+          <w:tcPr>
+            <w:tcW w:type="dxa" w:w="2494"/>
+          </w:tcPr>
+          <w:p>
+            <w:r/>
+            <w:r>
+              <w:rPr>
+                <w:sz w:val="18"/>
+              </w:rPr>
+              <w:t>900.000</w:t>
+            </w:r>
+          </w:p>
+        </w:tc>
+        <w:tc>
+          <w:tcPr>
+            <w:tcW w:type="dxa" w:w="2154"/>
+          </w:tcPr>
+          <w:p>
+            <w:r/>
+            <w:r>
+              <w:rPr>
+                <w:sz w:val="18"/>
+              </w:rPr>
+              <w:t>2103 comisiones</w:t>
+            </w:r>
+          </w:p>
+        </w:tc>
+        <w:tc>
+          <w:tcPr>
+            <w:tcW w:type="dxa" w:w="2551"/>
+          </w:tcPr>
+          <w:p>
+            <w:r/>
+            <w:r>
+              <w:rPr>
+                <w:sz w:val="18"/>
+              </w:rPr>
+              <w:t>350.000</w:t>
+            </w:r>
+          </w:p>
+        </w:tc>
+      </w:tr>
+      <w:tr>
+        <w:tc>
+          <w:tcPr>
+            <w:tcW w:type="dxa" w:w="2154"/>
+          </w:tcPr>
+          <w:p>
+            <w:r/>
+            <w:r>
+              <w:rPr>
+                <w:sz w:val="18"/>
+              </w:rPr>
+              <w:t>2106 gratificación</w:t>
+            </w:r>
+          </w:p>
+        </w:tc>
+        <w:tc>
+          <w:tcPr>
+            <w:tcW w:type="dxa" w:w="2494"/>
+          </w:tcPr>
+          <w:p>
+            <w:r/>
+            <w:r>
+              <w:rPr>
+                <w:sz w:val="18"/>
+              </w:rPr>
+              <w:t>209.396</w:t>
+            </w:r>
+          </w:p>
+        </w:tc>
+        <w:tc>
+          <w:tcPr>
+            <w:tcW w:type="dxa" w:w="2154"/>
+          </w:tcPr>
+          <w:p>
+            <w:r/>
+            <w:r>
+              <w:rPr>
+                <w:sz w:val="18"/>
+              </w:rPr>
+              <w:t>2301 / 2302</w:t>
+            </w:r>
+          </w:p>
+        </w:tc>
+        <w:tc>
+          <w:tcPr>
+            <w:tcW w:type="dxa" w:w="2551"/>
+          </w:tcPr>
+          <w:p>
+            <w:r/>
+            <w:r>
+              <w:rPr>
+                <w:sz w:val="18"/>
+              </w:rPr>
+              <w:t>45.000 / 45.000</w:t>
+            </w:r>
+          </w:p>
+        </w:tc>
+      </w:tr>
+      <w:tr>
+        <w:tc>
+          <w:tcPr>
+            <w:tcW w:type="dxa" w:w="2154"/>
+          </w:tcPr>
+          <w:p>
+            <w:r/>
+            <w:r>
+              <w:rPr>
+                <w:sz w:val="18"/>
+              </w:rPr>
+              <w:t>3141 AFP</w:t>
+            </w:r>
+          </w:p>
+        </w:tc>
+        <w:tc>
+          <w:tcPr>
+            <w:tcW w:type="dxa" w:w="2494"/>
+          </w:tcPr>
+          <w:p>
+            <w:r/>
+            <w:r>
+              <w:rPr>
+                <w:sz w:val="18"/>
+              </w:rPr>
+              <w:t>154.404</w:t>
+            </w:r>
+          </w:p>
+        </w:tc>
+        <w:tc>
+          <w:tcPr>
+            <w:tcW w:type="dxa" w:w="2154"/>
+          </w:tcPr>
+          <w:p>
+            <w:r/>
+            <w:r>
+              <w:rPr>
+                <w:sz w:val="18"/>
+              </w:rPr>
+              <w:t>3143 salud</w:t>
+            </w:r>
+          </w:p>
+        </w:tc>
+        <w:tc>
+          <w:tcPr>
+            <w:tcW w:type="dxa" w:w="2551"/>
+          </w:tcPr>
+          <w:p>
+            <w:r/>
+            <w:r>
+              <w:rPr>
+                <w:sz w:val="18"/>
+              </w:rPr>
+              <w:t>102.158</w:t>
+            </w:r>
+          </w:p>
+        </w:tc>
+      </w:tr>
+      <w:tr>
+        <w:tc>
+          <w:tcPr>
+            <w:tcW w:type="dxa" w:w="2154"/>
+          </w:tcPr>
+          <w:p>
+            <w:r/>
+            <w:r>
+              <w:rPr>
+                <w:sz w:val="18"/>
+              </w:rPr>
+              <w:t>3151 AFC</w:t>
+            </w:r>
+          </w:p>
+        </w:tc>
+        <w:tc>
+          <w:tcPr>
+            <w:tcW w:type="dxa" w:w="2494"/>
+          </w:tcPr>
+          <w:p>
+            <w:r/>
+            <w:r>
+              <w:rPr>
+                <w:sz w:val="18"/>
+              </w:rPr>
+              <w:t>8.756</w:t>
+            </w:r>
+          </w:p>
+        </w:tc>
+        <w:tc>
+          <w:tcPr>
+            <w:tcW w:type="dxa" w:w="2154"/>
+          </w:tcPr>
+          <w:p>
+            <w:r/>
+            <w:r>
+              <w:rPr>
+                <w:sz w:val="18"/>
+              </w:rPr>
+              <w:t>3161 impuesto</w:t>
+            </w:r>
+          </w:p>
+        </w:tc>
+        <w:tc>
+          <w:tcPr>
+            <w:tcW w:type="dxa" w:w="2551"/>
+          </w:tcPr>
+          <w:p>
+            <w:r/>
+            <w:r>
+              <w:rPr>
+                <w:sz w:val="18"/>
+              </w:rPr>
+              <w:t>11.043</w:t>
+            </w:r>
+          </w:p>
+        </w:tc>
+      </w:tr>
+      <w:tr>
+        <w:tc>
+          <w:tcPr>
+            <w:tcW w:type="dxa" w:w="2154"/>
+          </w:tcPr>
+          <w:p>
+            <w:r/>
+            <w:r>
+              <w:rPr>
+                <w:sz w:val="18"/>
+              </w:rPr>
+              <w:t>3183 otros descuentos</w:t>
+            </w:r>
+          </w:p>
+        </w:tc>
+        <w:tc>
+          <w:tcPr>
+            <w:tcW w:type="dxa" w:w="2494"/>
+          </w:tcPr>
+          <w:p>
+            <w:r/>
+            <w:r>
+              <w:rPr>
+                <w:sz w:val="18"/>
+              </w:rPr>
+              <w:t>50.000</w:t>
+            </w:r>
+          </w:p>
+        </w:tc>
+        <w:tc>
+          <w:tcPr>
+            <w:tcW w:type="dxa" w:w="2154"/>
+          </w:tcPr>
+          <w:p>
+            <w:r/>
+            <w:r>
+              <w:rPr>
+                <w:sz w:val="18"/>
+              </w:rPr>
+              <w:t>4151 / 4152 / 4155</w:t>
+            </w:r>
+          </w:p>
+        </w:tc>
+        <w:tc>
+          <w:tcPr>
+            <w:tcW w:type="dxa" w:w="2551"/>
+          </w:tcPr>
+          <w:p>
+            <w:r/>
+            <w:r>
+              <w:rPr>
+                <w:sz w:val="18"/>
+              </w:rPr>
+              <w:t>35.026 / 14.010 / 27.437</w:t>
+            </w:r>
+          </w:p>
+        </w:tc>
+      </w:tr>
+      <w:tr>
+        <w:tc>
+          <w:tcPr>
+            <w:tcW w:type="dxa" w:w="2154"/>
+          </w:tcPr>
+          <w:p>
+            <w:r/>
+            <w:r>
+              <w:rPr>
+                <w:sz w:val="18"/>
+              </w:rPr>
+              <w:t>5201 total haberes</w:t>
+            </w:r>
+          </w:p>
+        </w:tc>
+        <w:tc>
+          <w:tcPr>
+            <w:tcW w:type="dxa" w:w="2494"/>
+          </w:tcPr>
+          <w:p>
+            <w:r/>
+            <w:r>
+              <w:rPr>
+                <w:sz w:val="18"/>
+              </w:rPr>
+              <w:t>1.549.396</w:t>
+            </w:r>
+          </w:p>
+        </w:tc>
+        <w:tc>
+          <w:tcPr>
+            <w:tcW w:type="dxa" w:w="2154"/>
+          </w:tcPr>
+          <w:p>
+            <w:r/>
+            <w:r>
+              <w:rPr>
+                <w:sz w:val="18"/>
+              </w:rPr>
+              <w:t>5210 / 5230</w:t>
+            </w:r>
+          </w:p>
+        </w:tc>
+        <w:tc>
+          <w:tcPr>
+            <w:tcW w:type="dxa" w:w="2551"/>
+          </w:tcPr>
+          <w:p>
+            <w:r/>
+            <w:r>
+              <w:rPr>
+                <w:sz w:val="18"/>
+              </w:rPr>
+              <w:t>1.459.396 / 90.000</w:t>
+            </w:r>
+          </w:p>
+        </w:tc>
+      </w:tr>
+      <w:tr>
+        <w:tc>
+          <w:tcPr>
+            <w:tcW w:type="dxa" w:w="2154"/>
+          </w:tcPr>
+          <w:p>
+            <w:r/>
+            <w:r>
+              <w:rPr>
+                <w:sz w:val="18"/>
+              </w:rPr>
+              <w:t>5301 total descuentos</w:t>
+            </w:r>
+          </w:p>
+        </w:tc>
+        <w:tc>
+          <w:tcPr>
+            <w:tcW w:type="dxa" w:w="2494"/>
+          </w:tcPr>
+          <w:p>
+            <w:r/>
+            <w:r>
+              <w:rPr>
+                <w:sz w:val="18"/>
+              </w:rPr>
+              <w:t>326.361</w:t>
+            </w:r>
+          </w:p>
+        </w:tc>
+        <w:tc>
+          <w:tcPr>
+            <w:tcW w:type="dxa" w:w="2154"/>
+          </w:tcPr>
+          <w:p>
+            <w:r/>
+            <w:r>
+              <w:rPr>
+                <w:sz w:val="18"/>
+              </w:rPr>
+              <w:t>5341 / 5361 / 5302</w:t>
+            </w:r>
+          </w:p>
+        </w:tc>
+        <w:tc>
+          <w:tcPr>
+            <w:tcW w:type="dxa" w:w="2551"/>
+          </w:tcPr>
+          <w:p>
+            <w:r/>
+            <w:r>
+              <w:rPr>
+                <w:sz w:val="18"/>
+              </w:rPr>
+              <w:t>265.318 / 11.043 / 50.000</w:t>
+            </w:r>
+          </w:p>
+        </w:tc>
+      </w:tr>
+      <w:tr>
+        <w:tc>
+          <w:tcPr>
+            <w:tcW w:type="dxa" w:w="2154"/>
+          </w:tcPr>
+          <w:p>
+            <w:r/>
+            <w:r>
+              <w:rPr>
+                <w:sz w:val="18"/>
+              </w:rPr>
+              <w:t>5410 aportes</w:t>
+            </w:r>
+          </w:p>
+        </w:tc>
+        <w:tc>
+          <w:tcPr>
+            <w:tcW w:type="dxa" w:w="2494"/>
+          </w:tcPr>
+          <w:p>
+            <w:r/>
+            <w:r>
+              <w:rPr>
+                <w:sz w:val="18"/>
+              </w:rPr>
+              <w:t>76.473</w:t>
+            </w:r>
+          </w:p>
+        </w:tc>
+        <w:tc>
+          <w:tcPr>
+            <w:tcW w:type="dxa" w:w="2154"/>
+          </w:tcPr>
+          <w:p>
+            <w:r/>
+            <w:r>
+              <w:rPr>
+                <w:sz w:val="18"/>
+              </w:rPr>
+              <w:t>5501 líquido</w:t>
+            </w:r>
+          </w:p>
+        </w:tc>
+        <w:tc>
+          <w:tcPr>
+            <w:tcW w:type="dxa" w:w="2551"/>
+          </w:tcPr>
+          <w:p>
+            <w:r/>
+            <w:r>
+              <w:rPr>
+                <w:sz w:val="18"/>
+              </w:rPr>
+              <w:t>1.223.035</w:t>
+            </w:r>
+          </w:p>
+        </w:tc>
+      </w:tr>
+    </w:tbl>
+    <w:p>
+      <w:pPr>
+        <w:spacing w:after="40"/>
+      </w:pPr>
+    </w:p>
+    <w:tbl>
+      <w:tblPr>
+        <w:tblStyle w:val="TableGrid"/>
+        <w:tblW w:type="auto" w:w="0"/>
+        <w:tblLook w:firstColumn="1" w:firstRow="1" w:lastColumn="0" w:lastRow="0" w:noHBand="0" w:noVBand="1" w:val="04A0"/>
+      </w:tblPr>
+      <w:tblGrid>
+        <w:gridCol w:w="9746"/>
+      </w:tblGrid>
+      <w:tr>
+        <w:tc>
+          <w:tcPr>
+            <w:tcW w:type="dxa" w:w="9746"/>
+            <w:shd w:val="clear" w:color="auto" w:fill="E8F0F8"/>
+          </w:tcPr>
+          <w:p>
+            <w:r/>
+            <w:r>
+              <w:rPr>
+                <w:b/>
+                <w:sz w:val="19"/>
+              </w:rPr>
+              <w:t>🔒 Cómo cuadrar a mano</w:t>
+              <w:br/>
+            </w:r>
+            <w:r>
+              <w:rPr>
+                <w:sz w:val="19"/>
+              </w:rPr>
+              <w:t>Sumar por columna: Σ 5501 = total de la Nómina Banco; Σ 3161 = impuesto del F29; Σ (3141 + 3143 + 3144 + 3151) + Σ (4151 + 4152 + 4155) = total del Archivo Previred. Si el LRE dice fuente AVSOFT, el mes no está emitido en el motor: emitir primero.</w:t>
             </w:r>
           </w:p>
         </w:tc>
@@ -26903,6 +28214,881 @@
       <w:r>
         <w:t>Respaldo legal: Ley 19.799 (arts. 3 y 5), art. 9 CT (contrato), art. 177 CT (finiquito: la ratificación ante ministro de fe o el finiquito electrónico de la DT sigue siendo obligatoria), art. 58 CT (descuentos acordados, tope 15%), art. 11 CT (anexos por aumentos y ascensos).</w:t>
       </w:r>
+    </w:p>
+    <w:p>
+      <w:pPr>
+        <w:pStyle w:val="Heading3"/>
+      </w:pPr>
+      <w:r>
+        <w:t>23.1 Certificado de antigüedad: reglas, texto y verificación</w:t>
+      </w:r>
+    </w:p>
+    <w:p>
+      <w:pPr>
+        <w:spacing w:after="80"/>
+      </w:pPr>
+      <w:r>
+        <w:rPr>
+          <w:b w:val="0"/>
+          <w:i w:val="0"/>
+        </w:rPr>
+        <w:t>Autoservicio: cada colaborador emite su certificado al instante desde la card Certificado de Antigüedad; RRHH lo emite para terceros. Motor: rrhh.controller (estadoCertUsuario / certEmitir) + shared/verificacion.js (folio y QR) + rrhh-core.mesesAntiguedad (el mismo del finiquito).</w:t>
+      </w:r>
+    </w:p>
+    <w:tbl>
+      <w:tblPr>
+        <w:tblStyle w:val="TableGrid"/>
+        <w:tblW w:type="auto" w:w="0"/>
+        <w:jc w:val="center"/>
+        <w:tblLook w:firstColumn="1" w:firstRow="1" w:lastColumn="0" w:lastRow="0" w:noHBand="0" w:noVBand="1" w:val="04A0"/>
+      </w:tblPr>
+      <w:tblGrid>
+        <w:gridCol w:w="3249"/>
+        <w:gridCol w:w="3249"/>
+        <w:gridCol w:w="3249"/>
+      </w:tblGrid>
+      <w:tr>
+        <w:tc>
+          <w:tcPr>
+            <w:tcW w:type="dxa" w:w="1701"/>
+            <w:shd w:val="clear" w:color="auto" w:fill="1F4E79"/>
+          </w:tcPr>
+          <w:p>
+            <w:r/>
+            <w:r>
+              <w:rPr>
+                <w:b/>
+                <w:color w:val="FFFFFF"/>
+                <w:sz w:val="18"/>
+              </w:rPr>
+              <w:t>Concepto</w:t>
+            </w:r>
+          </w:p>
+        </w:tc>
+        <w:tc>
+          <w:tcPr>
+            <w:tcW w:type="dxa" w:w="5953"/>
+            <w:shd w:val="clear" w:color="auto" w:fill="1F4E79"/>
+          </w:tcPr>
+          <w:p>
+            <w:r/>
+            <w:r>
+              <w:rPr>
+                <w:b/>
+                <w:color w:val="FFFFFF"/>
+                <w:sz w:val="18"/>
+              </w:rPr>
+              <w:t>Regla</w:t>
+            </w:r>
+          </w:p>
+        </w:tc>
+        <w:tc>
+          <w:tcPr>
+            <w:tcW w:type="dxa" w:w="1701"/>
+            <w:shd w:val="clear" w:color="auto" w:fill="1F4E79"/>
+          </w:tcPr>
+          <w:p>
+            <w:r/>
+            <w:r>
+              <w:rPr>
+                <w:b/>
+                <w:color w:val="FFFFFF"/>
+                <w:sz w:val="18"/>
+              </w:rPr>
+              <w:t>Parámetro / fuente</w:t>
+            </w:r>
+          </w:p>
+        </w:tc>
+      </w:tr>
+      <w:tr>
+        <w:tc>
+          <w:tcPr>
+            <w:tcW w:type="dxa" w:w="1701"/>
+          </w:tcPr>
+          <w:p>
+            <w:r/>
+            <w:r>
+              <w:rPr>
+                <w:sz w:val="18"/>
+              </w:rPr>
+              <w:t>Quién puede</w:t>
+            </w:r>
+          </w:p>
+        </w:tc>
+        <w:tc>
+          <w:tcPr>
+            <w:tcW w:type="dxa" w:w="5953"/>
+          </w:tcPr>
+          <w:p>
+            <w:r/>
+            <w:r>
+              <w:rPr>
+                <w:sz w:val="18"/>
+              </w:rPr>
+              <w:t>el propio colaborador si tiene fecha de ingreso registrada, lleva al menos N meses (bajo eso se asume plazo fijo y lo emite RRHH) y no emitió otro en los últimos D días. RRHH (rh_aprobar) emite para cualquiera sin esas dos restricciones.</w:t>
+            </w:r>
+          </w:p>
+        </w:tc>
+        <w:tc>
+          <w:tcPr>
+            <w:tcW w:type="dxa" w:w="1701"/>
+          </w:tcPr>
+          <w:p>
+            <w:r/>
+            <w:r>
+              <w:rPr>
+                <w:sz w:val="18"/>
+              </w:rPr>
+              <w:t>cert_min_meses 7 · cert_cooldown_dias 15</w:t>
+            </w:r>
+          </w:p>
+        </w:tc>
+      </w:tr>
+      <w:tr>
+        <w:tc>
+          <w:tcPr>
+            <w:tcW w:type="dxa" w:w="1701"/>
+          </w:tcPr>
+          <w:p>
+            <w:r/>
+            <w:r>
+              <w:rPr>
+                <w:sz w:val="18"/>
+              </w:rPr>
+              <w:t>Antigüedad</w:t>
+            </w:r>
+          </w:p>
+        </w:tc>
+        <w:tc>
+          <w:tcPr>
+            <w:tcW w:type="dxa" w:w="5953"/>
+          </w:tcPr>
+          <w:p>
+            <w:r/>
+            <w:r>
+              <w:rPr>
+                <w:sz w:val="18"/>
+              </w:rPr>
+              <w:t>meses enteros entre la fecha de ingreso y hoy (Chile): años = meses ÷ 12, resto en meses. Texto "3 años y 4 meses" / "1 año" / "8 meses". Se calcula a la fecha de EMISIÓN; una copia reimpresa conserva la antigüedad original.</w:t>
+            </w:r>
+          </w:p>
+        </w:tc>
+        <w:tc>
+          <w:tcPr>
+            <w:tcW w:type="dxa" w:w="1701"/>
+          </w:tcPr>
+          <w:p>
+            <w:r/>
+            <w:r>
+              <w:rPr>
+                <w:sz w:val="18"/>
+              </w:rPr>
+              <w:t>usuarios.fecha_ingreso · rrhh-core.mesesAntiguedad</w:t>
+            </w:r>
+          </w:p>
+        </w:tc>
+      </w:tr>
+      <w:tr>
+        <w:tc>
+          <w:tcPr>
+            <w:tcW w:type="dxa" w:w="1701"/>
+          </w:tcPr>
+          <w:p>
+            <w:r/>
+            <w:r>
+              <w:rPr>
+                <w:sz w:val="18"/>
+              </w:rPr>
+              <w:t>Texto</w:t>
+            </w:r>
+          </w:p>
+        </w:tc>
+        <w:tc>
+          <w:tcPr>
+            <w:tcW w:type="dxa" w:w="5953"/>
+          </w:tcPr>
+          <w:p>
+            <w:r/>
+            <w:r>
+              <w:rPr>
+                <w:sz w:val="18"/>
+              </w:rPr>
+              <w:t>plantillas cert_cuerpo y cert_cierre con variables {don} {nombre} {rut} {fecha_ingreso} {cargo} {antiguedad} {interesado} {fecha_emision}; género según el sexo de la ficha (don/doña, del interesado/de la interesada). Se editan en Mantenedores → Saludos y Certificados RRHH.</w:t>
+            </w:r>
+          </w:p>
+        </w:tc>
+        <w:tc>
+          <w:tcPr>
+            <w:tcW w:type="dxa" w:w="1701"/>
+          </w:tcPr>
+          <w:p>
+            <w:r/>
+            <w:r>
+              <w:rPr>
+                <w:sz w:val="18"/>
+              </w:rPr>
+              <w:t>rh_config cert_*</w:t>
+            </w:r>
+          </w:p>
+        </w:tc>
+      </w:tr>
+      <w:tr>
+        <w:tc>
+          <w:tcPr>
+            <w:tcW w:type="dxa" w:w="1701"/>
+          </w:tcPr>
+          <w:p>
+            <w:r/>
+            <w:r>
+              <w:rPr>
+                <w:sz w:val="18"/>
+              </w:rPr>
+              <w:t>Datos</w:t>
+            </w:r>
+          </w:p>
+        </w:tc>
+        <w:tc>
+          <w:tcPr>
+            <w:tcW w:type="dxa" w:w="5953"/>
+          </w:tcPr>
+          <w:p>
+            <w:r/>
+            <w:r>
+              <w:rPr>
+                <w:sz w:val="18"/>
+              </w:rPr>
+              <w:t>nombre completo, RUT formateado (motor rut-core), cargo (o Colaborador/a si no tiene), fecha de ingreso en letras, fecha de emisión en letras.</w:t>
+            </w:r>
+          </w:p>
+        </w:tc>
+        <w:tc>
+          <w:tcPr>
+            <w:tcW w:type="dxa" w:w="1701"/>
+          </w:tcPr>
+          <w:p>
+            <w:r/>
+            <w:r>
+              <w:rPr>
+                <w:sz w:val="18"/>
+              </w:rPr>
+              <w:t>Usuarios</w:t>
+            </w:r>
+          </w:p>
+        </w:tc>
+      </w:tr>
+      <w:tr>
+        <w:tc>
+          <w:tcPr>
+            <w:tcW w:type="dxa" w:w="1701"/>
+          </w:tcPr>
+          <w:p>
+            <w:r/>
+            <w:r>
+              <w:rPr>
+                <w:sz w:val="18"/>
+              </w:rPr>
+              <w:t>Folio y QR</w:t>
+            </w:r>
+          </w:p>
+        </w:tc>
+        <w:tc>
+          <w:tcPr>
+            <w:tcW w:type="dxa" w:w="5953"/>
+          </w:tcPr>
+          <w:p>
+            <w:r/>
+            <w:r>
+              <w:rPr>
+                <w:sz w:val="18"/>
+              </w:rPr>
+              <w:t>registrarVerificable crea un código único (12 bytes aleatorios) con un snapshot inmutable (cargo, ingreso, antigüedad), quién emitió, firma FES (nombre, cargo, IP) y hash SHA-256. El QR lleva a https://afbs.autofacilchile.cl/verificar/&lt;código&gt;: página pública que confirma autenticidad mostrando datos mínimos. Si el registro original cambia, el snapshot no.</w:t>
+            </w:r>
+          </w:p>
+        </w:tc>
+        <w:tc>
+          <w:tcPr>
+            <w:tcW w:type="dxa" w:w="1701"/>
+          </w:tcPr>
+          <w:p>
+            <w:r/>
+            <w:r>
+              <w:rPr>
+                <w:sz w:val="18"/>
+              </w:rPr>
+              <w:t>documentos_verificables (tipo CERT_ANTIGUEDAD)</w:t>
+            </w:r>
+          </w:p>
+        </w:tc>
+      </w:tr>
+      <w:tr>
+        <w:tc>
+          <w:tcPr>
+            <w:tcW w:type="dxa" w:w="1701"/>
+          </w:tcPr>
+          <w:p>
+            <w:r/>
+            <w:r>
+              <w:rPr>
+                <w:sz w:val="18"/>
+              </w:rPr>
+              <w:t>Firma</w:t>
+            </w:r>
+          </w:p>
+        </w:tc>
+        <w:tc>
+          <w:tcPr>
+            <w:tcW w:type="dxa" w:w="5953"/>
+          </w:tcPr>
+          <w:p>
+            <w:r/>
+            <w:r>
+              <w:rPr>
+                <w:sz w:val="18"/>
+              </w:rPr>
+              <w:t>FES de quien emite (el propio colaborador en autoservicio o RRHH), con cargo e IP. No lleva firma manuscrita: la verificación es el QR.</w:t>
+            </w:r>
+          </w:p>
+        </w:tc>
+        <w:tc>
+          <w:tcPr>
+            <w:tcW w:type="dxa" w:w="1701"/>
+          </w:tcPr>
+          <w:p>
+            <w:r/>
+            <w:r>
+              <w:rPr>
+                <w:sz w:val="18"/>
+              </w:rPr>
+              <w:t>rh_certificados</w:t>
+            </w:r>
+          </w:p>
+        </w:tc>
+      </w:tr>
+      <w:tr>
+        <w:tc>
+          <w:tcPr>
+            <w:tcW w:type="dxa" w:w="1701"/>
+          </w:tcPr>
+          <w:p>
+            <w:r/>
+            <w:r>
+              <w:rPr>
+                <w:sz w:val="18"/>
+              </w:rPr>
+              <w:t>Historial</w:t>
+            </w:r>
+          </w:p>
+        </w:tc>
+        <w:tc>
+          <w:tcPr>
+            <w:tcW w:type="dxa" w:w="5953"/>
+          </w:tcPr>
+          <w:p>
+            <w:r/>
+            <w:r>
+              <w:rPr>
+                <w:sz w:val="18"/>
+              </w:rPr>
+              <w:t>cada uno ve sus certificados emitidos y puede reimprimir una copia fiel (mismo folio, misma antigüedad); RRHH ve todos.</w:t>
+            </w:r>
+          </w:p>
+        </w:tc>
+        <w:tc>
+          <w:tcPr>
+            <w:tcW w:type="dxa" w:w="1701"/>
+          </w:tcPr>
+          <w:p>
+            <w:r/>
+            <w:r>
+              <w:rPr>
+                <w:sz w:val="18"/>
+              </w:rPr>
+              <w:t>certHistorial</w:t>
+            </w:r>
+          </w:p>
+        </w:tc>
+      </w:tr>
+      <w:tr>
+        <w:tc>
+          <w:tcPr>
+            <w:tcW w:type="dxa" w:w="1701"/>
+          </w:tcPr>
+          <w:p>
+            <w:r/>
+            <w:r>
+              <w:rPr>
+                <w:sz w:val="18"/>
+              </w:rPr>
+              <w:t>Solicitud a RRHH</w:t>
+            </w:r>
+          </w:p>
+        </w:tc>
+        <w:tc>
+          <w:tcPr>
+            <w:tcW w:type="dxa" w:w="5953"/>
+          </w:tcPr>
+          <w:p>
+            <w:r/>
+            <w:r>
+              <w:rPr>
+                <w:sz w:val="18"/>
+              </w:rPr>
+              <w:t>quien no puede autoemitir (sin fecha de ingreso, plazo fijo, cooldown) deja una solicitud con motivo; RRHH recibe campana y la resuelve EMITIDA (con la fecha de ingreso) o RECHAZADA (con motivo); el solicitante recibe campana.</w:t>
+            </w:r>
+          </w:p>
+        </w:tc>
+        <w:tc>
+          <w:tcPr>
+            <w:tcW w:type="dxa" w:w="1701"/>
+          </w:tcPr>
+          <w:p>
+            <w:r/>
+            <w:r>
+              <w:rPr>
+                <w:sz w:val="18"/>
+              </w:rPr>
+              <w:t>rh_antiguedad</w:t>
+            </w:r>
+          </w:p>
+        </w:tc>
+      </w:tr>
+      <w:tr>
+        <w:tc>
+          <w:tcPr>
+            <w:tcW w:type="dxa" w:w="1701"/>
+          </w:tcPr>
+          <w:p>
+            <w:r/>
+            <w:r>
+              <w:rPr>
+                <w:sz w:val="18"/>
+              </w:rPr>
+              <w:t>Auditoría</w:t>
+            </w:r>
+          </w:p>
+        </w:tc>
+        <w:tc>
+          <w:tcPr>
+            <w:tcW w:type="dxa" w:w="5953"/>
+          </w:tcPr>
+          <w:p>
+            <w:r/>
+            <w:r>
+              <w:rPr>
+                <w:sz w:val="18"/>
+              </w:rPr>
+              <w:t>cada emisión y resolución queda en Auditoría (quién, cuándo, folio).</w:t>
+            </w:r>
+          </w:p>
+        </w:tc>
+        <w:tc>
+          <w:tcPr>
+            <w:tcW w:type="dxa" w:w="1701"/>
+          </w:tcPr>
+          <w:p>
+            <w:r/>
+            <w:r>
+              <w:rPr>
+                <w:sz w:val="18"/>
+              </w:rPr>
+              <w:t>auditoria_movimientos</w:t>
+            </w:r>
+          </w:p>
+        </w:tc>
+      </w:tr>
+    </w:tbl>
+    <w:p>
+      <w:pPr>
+        <w:spacing w:after="40"/>
+      </w:pPr>
+    </w:p>
+    <w:p>
+      <w:pPr>
+        <w:spacing w:after="40"/>
+      </w:pPr>
+      <w:r>
+        <w:rPr>
+          <w:b/>
+          <w:i w:val="0"/>
+          <w:color w:val="1F4E79"/>
+        </w:rPr>
+        <w:t>Ejemplo</w:t>
+      </w:r>
+    </w:p>
+    <w:tbl>
+      <w:tblPr>
+        <w:tblStyle w:val="TableGrid"/>
+        <w:tblW w:type="auto" w:w="0"/>
+        <w:jc w:val="center"/>
+        <w:tblLook w:firstColumn="1" w:firstRow="1" w:lastColumn="0" w:lastRow="0" w:noHBand="0" w:noVBand="1" w:val="04A0"/>
+      </w:tblPr>
+      <w:tblGrid>
+        <w:gridCol w:w="3249"/>
+        <w:gridCol w:w="3249"/>
+        <w:gridCol w:w="3249"/>
+      </w:tblGrid>
+      <w:tr>
+        <w:tc>
+          <w:tcPr>
+            <w:tcW w:type="dxa" w:w="2608"/>
+            <w:shd w:val="clear" w:color="auto" w:fill="1F4E79"/>
+          </w:tcPr>
+          <w:p>
+            <w:r/>
+            <w:r>
+              <w:rPr>
+                <w:b/>
+                <w:color w:val="FFFFFF"/>
+                <w:sz w:val="18"/>
+              </w:rPr>
+              <w:t>Paso</w:t>
+            </w:r>
+          </w:p>
+        </w:tc>
+        <w:tc>
+          <w:tcPr>
+            <w:tcW w:type="dxa" w:w="4762"/>
+            <w:shd w:val="clear" w:color="auto" w:fill="1F4E79"/>
+          </w:tcPr>
+          <w:p>
+            <w:r/>
+            <w:r>
+              <w:rPr>
+                <w:b/>
+                <w:color w:val="FFFFFF"/>
+                <w:sz w:val="18"/>
+              </w:rPr>
+              <w:t>Detalle</w:t>
+            </w:r>
+          </w:p>
+        </w:tc>
+        <w:tc>
+          <w:tcPr>
+            <w:tcW w:type="dxa" w:w="1984"/>
+            <w:shd w:val="clear" w:color="auto" w:fill="1F4E79"/>
+          </w:tcPr>
+          <w:p>
+            <w:r/>
+            <w:r>
+              <w:rPr>
+                <w:b/>
+                <w:color w:val="FFFFFF"/>
+                <w:sz w:val="18"/>
+              </w:rPr>
+              <w:t>Resultado</w:t>
+            </w:r>
+          </w:p>
+        </w:tc>
+      </w:tr>
+      <w:tr>
+        <w:tc>
+          <w:tcPr>
+            <w:tcW w:type="dxa" w:w="2608"/>
+          </w:tcPr>
+          <w:p>
+            <w:r/>
+            <w:r>
+              <w:rPr>
+                <w:sz w:val="18"/>
+              </w:rPr>
+              <w:t>Colaboradora ingresada el 01-03-2021 pide su certificado el 17-09-2026</w:t>
+            </w:r>
+          </w:p>
+        </w:tc>
+        <w:tc>
+          <w:tcPr>
+            <w:tcW w:type="dxa" w:w="4762"/>
+          </w:tcPr>
+          <w:p>
+            <w:r/>
+            <w:r>
+              <w:rPr>
+                <w:sz w:val="18"/>
+              </w:rPr>
+              <w:t>fecha de ingreso registrada; 66 meses ≥ 7; último certificado hace 40 días ≥ 15</w:t>
+            </w:r>
+          </w:p>
+        </w:tc>
+        <w:tc>
+          <w:tcPr>
+            <w:tcW w:type="dxa" w:w="1984"/>
+          </w:tcPr>
+          <w:p>
+            <w:r/>
+            <w:r>
+              <w:rPr>
+                <w:sz w:val="18"/>
+              </w:rPr>
+              <w:t>puede autoemitir</w:t>
+            </w:r>
+          </w:p>
+        </w:tc>
+      </w:tr>
+      <w:tr>
+        <w:tc>
+          <w:tcPr>
+            <w:tcW w:type="dxa" w:w="2608"/>
+          </w:tcPr>
+          <w:p>
+            <w:r/>
+            <w:r>
+              <w:rPr>
+                <w:sz w:val="18"/>
+              </w:rPr>
+              <w:t>Antigüedad</w:t>
+            </w:r>
+          </w:p>
+        </w:tc>
+        <w:tc>
+          <w:tcPr>
+            <w:tcW w:type="dxa" w:w="4762"/>
+          </w:tcPr>
+          <w:p>
+            <w:r/>
+            <w:r>
+              <w:rPr>
+                <w:sz w:val="18"/>
+              </w:rPr>
+              <w:t>66 meses = 5 años y 6 meses</w:t>
+            </w:r>
+          </w:p>
+        </w:tc>
+        <w:tc>
+          <w:tcPr>
+            <w:tcW w:type="dxa" w:w="1984"/>
+          </w:tcPr>
+          <w:p>
+            <w:r/>
+            <w:r>
+              <w:rPr>
+                <w:sz w:val="18"/>
+              </w:rPr>
+              <w:t>"5 años y 6 meses"</w:t>
+            </w:r>
+          </w:p>
+        </w:tc>
+      </w:tr>
+      <w:tr>
+        <w:tc>
+          <w:tcPr>
+            <w:tcW w:type="dxa" w:w="2608"/>
+          </w:tcPr>
+          <w:p>
+            <w:r/>
+            <w:r>
+              <w:rPr>
+                <w:sz w:val="18"/>
+              </w:rPr>
+              <w:t>Texto</w:t>
+            </w:r>
+          </w:p>
+        </w:tc>
+        <w:tc>
+          <w:tcPr>
+            <w:tcW w:type="dxa" w:w="4762"/>
+          </w:tcPr>
+          <w:p>
+            <w:r/>
+            <w:r>
+              <w:rPr>
+                <w:sz w:val="18"/>
+              </w:rPr>
+              <w:t>"Auto Fácil SpA … certifica que doña MARÍA JOSÉ GONZÁLEZ ROJAS, cédula … presta servicios desde el 1 de marzo de 2021 a la fecha, desempeñándose actualmente en el cargo de Analista de Operaciones, con una antigüedad de 5 años y 6 meses. Se extiende … a solicitud de la interesada … con fecha 17 de septiembre de 2026."</w:t>
+            </w:r>
+          </w:p>
+        </w:tc>
+        <w:tc>
+          <w:tcPr>
+            <w:tcW w:type="dxa" w:w="1984"/>
+          </w:tcPr>
+          <w:p>
+            <w:r/>
+            <w:r>
+              <w:rPr>
+                <w:sz w:val="18"/>
+              </w:rPr>
+              <w:t>certificado imprimible con QR</w:t>
+            </w:r>
+          </w:p>
+        </w:tc>
+      </w:tr>
+      <w:tr>
+        <w:tc>
+          <w:tcPr>
+            <w:tcW w:type="dxa" w:w="2608"/>
+          </w:tcPr>
+          <w:p>
+            <w:r/>
+            <w:r>
+              <w:rPr>
+                <w:sz w:val="18"/>
+              </w:rPr>
+              <w:t>Folio</w:t>
+            </w:r>
+          </w:p>
+        </w:tc>
+        <w:tc>
+          <w:tcPr>
+            <w:tcW w:type="dxa" w:w="4762"/>
+          </w:tcPr>
+          <w:p>
+            <w:r/>
+            <w:r>
+              <w:rPr>
+                <w:sz w:val="18"/>
+              </w:rPr>
+              <w:t>código único, snapshot {cargo, fecha_ingreso, antiguedad}, firmante María José (FES, IP), hash</w:t>
+            </w:r>
+          </w:p>
+        </w:tc>
+        <w:tc>
+          <w:tcPr>
+            <w:tcW w:type="dxa" w:w="1984"/>
+          </w:tcPr>
+          <w:p>
+            <w:r/>
+            <w:r>
+              <w:rPr>
+                <w:sz w:val="18"/>
+              </w:rPr>
+              <w:t>/verificar/&lt;código&gt; → "Documento auténtico"</w:t>
+            </w:r>
+          </w:p>
+        </w:tc>
+      </w:tr>
+      <w:tr>
+        <w:tc>
+          <w:tcPr>
+            <w:tcW w:type="dxa" w:w="2608"/>
+          </w:tcPr>
+          <w:p>
+            <w:r/>
+            <w:r>
+              <w:rPr>
+                <w:sz w:val="18"/>
+              </w:rPr>
+              <w:t>Si vuelve a pedirlo el 25-09</w:t>
+            </w:r>
+          </w:p>
+        </w:tc>
+        <w:tc>
+          <w:tcPr>
+            <w:tcW w:type="dxa" w:w="4762"/>
+          </w:tcPr>
+          <w:p>
+            <w:r/>
+            <w:r>
+              <w:rPr>
+                <w:sz w:val="18"/>
+              </w:rPr>
+              <w:t>han pasado 8 días &lt; 15</w:t>
+            </w:r>
+          </w:p>
+        </w:tc>
+        <w:tc>
+          <w:tcPr>
+            <w:tcW w:type="dxa" w:w="1984"/>
+          </w:tcPr>
+          <w:p>
+            <w:r/>
+            <w:r>
+              <w:rPr>
+                <w:sz w:val="18"/>
+              </w:rPr>
+              <w:t>bloqueado: "Podrás emitir otro en 7 días"; puede reimprimir la copia o pedirlo a RRHH</w:t>
+            </w:r>
+          </w:p>
+        </w:tc>
+      </w:tr>
+      <w:tr>
+        <w:tc>
+          <w:tcPr>
+            <w:tcW w:type="dxa" w:w="2608"/>
+          </w:tcPr>
+          <w:p>
+            <w:r/>
+            <w:r>
+              <w:rPr>
+                <w:sz w:val="18"/>
+              </w:rPr>
+              <w:t>Colaborador con 4 meses</w:t>
+            </w:r>
+          </w:p>
+        </w:tc>
+        <w:tc>
+          <w:tcPr>
+            <w:tcW w:type="dxa" w:w="4762"/>
+          </w:tcPr>
+          <w:p>
+            <w:r/>
+            <w:r>
+              <w:rPr>
+                <w:sz w:val="18"/>
+              </w:rPr>
+              <w:t>4 &lt; 7 → contrato a plazo fijo</w:t>
+            </w:r>
+          </w:p>
+        </w:tc>
+        <w:tc>
+          <w:tcPr>
+            <w:tcW w:type="dxa" w:w="1984"/>
+          </w:tcPr>
+          <w:p>
+            <w:r/>
+            <w:r>
+              <w:rPr>
+                <w:sz w:val="18"/>
+              </w:rPr>
+              <w:t>solicita a RRHH con motivo; RRHH lo emite desde la misma card</w:t>
+            </w:r>
+          </w:p>
+        </w:tc>
+      </w:tr>
+    </w:tbl>
+    <w:p>
+      <w:pPr>
+        <w:spacing w:after="40"/>
+      </w:pPr>
+    </w:p>
+    <w:tbl>
+      <w:tblPr>
+        <w:tblStyle w:val="TableGrid"/>
+        <w:tblW w:type="auto" w:w="0"/>
+        <w:tblLook w:firstColumn="1" w:firstRow="1" w:lastColumn="0" w:lastRow="0" w:noHBand="0" w:noVBand="1" w:val="04A0"/>
+      </w:tblPr>
+      <w:tblGrid>
+        <w:gridCol w:w="9746"/>
+      </w:tblGrid>
+      <w:tr>
+        <w:tc>
+          <w:tcPr>
+            <w:tcW w:type="dxa" w:w="9746"/>
+            <w:shd w:val="clear" w:color="auto" w:fill="FFF4CE"/>
+          </w:tcPr>
+          <w:p>
+            <w:r/>
+            <w:r>
+              <w:rPr>
+                <w:b/>
+                <w:sz w:val="19"/>
+              </w:rPr>
+              <w:t>⚠ OJO</w:t>
+              <w:br/>
+            </w:r>
+            <w:r>
+              <w:rPr>
+                <w:sz w:val="19"/>
+              </w:rPr>
+              <w:t>El certificado dice lo que dice la ficha: si la fecha de ingreso o el cargo están mal en Usuarios, sale mal y queda firmado. La antigüedad NO considera años previos declarados (esos solo sirven para el feriado progresivo): un certificado de antigüedad es de la relación laboral con AutoFácil.</w:t>
+            </w:r>
+          </w:p>
+        </w:tc>
+      </w:tr>
+    </w:tbl>
+    <w:p>
+      <w:pPr>
+        <w:spacing w:after="40"/>
+      </w:pPr>
     </w:p>
     <w:p>
       <w:pPr>

</xml_diff>